<commit_message>
updated assignmnet doc and and html page
</commit_message>
<xml_diff>
--- a/DF_TermProject_Spring2026.docx
+++ b/DF_TermProject_Spring2026.docx
@@ -1,6 +1,6 @@
 
 <file path=word/document.xml><?xml version="1.0" encoding="utf-8"?>
-<w:document xmlns:wpc="http://schemas.microsoft.com/office/word/2010/wordprocessingCanvas" xmlns:cx="http://schemas.microsoft.com/office/drawing/2014/chartex" xmlns:mc="http://schemas.openxmlformats.org/markup-compatibility/2006" xmlns:o="urn:schemas-microsoft-com:office:office" xmlns:r="http://schemas.openxmlformats.org/officeDocument/2006/relationships" xmlns:m="http://schemas.openxmlformats.org/officeDocument/2006/math" xmlns:v="urn:schemas-microsoft-com:vml" xmlns:wp14="http://schemas.microsoft.com/office/word/2010/wordprocessingDrawing" xmlns:wp="http://schemas.openxmlformats.org/drawingml/2006/wordprocessingDrawing" xmlns:w10="urn:schemas-microsoft-com:office:word" xmlns:w="http://schemas.openxmlformats.org/wordprocessingml/2006/main" xmlns:w14="http://schemas.microsoft.com/office/word/2010/wordml" xmlns:w15="http://schemas.microsoft.com/office/word/2012/wordml" xmlns:w16se="http://schemas.microsoft.com/office/word/2015/wordml/symex" xmlns:wpg="http://schemas.microsoft.com/office/word/2010/wordprocessingGroup" xmlns:wpi="http://schemas.microsoft.com/office/word/2010/wordprocessingInk" xmlns:wne="http://schemas.microsoft.com/office/word/2006/wordml" xmlns:wps="http://schemas.microsoft.com/office/word/2010/wordprocessingShape" mc:Ignorable="w14 w15 w16se wp14">
+<w:document xmlns:wpc="http://schemas.microsoft.com/office/word/2010/wordprocessingCanvas" xmlns:cx="http://schemas.microsoft.com/office/drawing/2014/chartex" xmlns:cx1="http://schemas.microsoft.com/office/drawing/2015/9/8/chartex" xmlns:cx2="http://schemas.microsoft.com/office/drawing/2015/10/21/chartex" xmlns:cx3="http://schemas.microsoft.com/office/drawing/2016/5/9/chartex" xmlns:cx4="http://schemas.microsoft.com/office/drawing/2016/5/10/chartex" xmlns:cx5="http://schemas.microsoft.com/office/drawing/2016/5/11/chartex" xmlns:cx6="http://schemas.microsoft.com/office/drawing/2016/5/12/chartex" xmlns:cx7="http://schemas.microsoft.com/office/drawing/2016/5/13/chartex" xmlns:cx8="http://schemas.microsoft.com/office/drawing/2016/5/14/chartex" xmlns:mc="http://schemas.openxmlformats.org/markup-compatibility/2006" xmlns:aink="http://schemas.microsoft.com/office/drawing/2016/ink" xmlns:am3d="http://schemas.microsoft.com/office/drawing/2017/model3d" xmlns:o="urn:schemas-microsoft-com:office:office" xmlns:oel="http://schemas.microsoft.com/office/2019/extlst" xmlns:r="http://schemas.openxmlformats.org/officeDocument/2006/relationships" xmlns:m="http://schemas.openxmlformats.org/officeDocument/2006/math" xmlns:v="urn:schemas-microsoft-com:vml" xmlns:wp14="http://schemas.microsoft.com/office/word/2010/wordprocessingDrawing" xmlns:wp="http://schemas.openxmlformats.org/drawingml/2006/wordprocessingDrawing" xmlns:w10="urn:schemas-microsoft-com:office:word" xmlns:w="http://schemas.openxmlformats.org/wordprocessingml/2006/main" xmlns:w14="http://schemas.microsoft.com/office/word/2010/wordml" xmlns:w15="http://schemas.microsoft.com/office/word/2012/wordml" xmlns:w16cex="http://schemas.microsoft.com/office/word/2018/wordml/cex" xmlns:w16cid="http://schemas.microsoft.com/office/word/2016/wordml/cid" xmlns:w16="http://schemas.microsoft.com/office/word/2018/wordml" xmlns:w16du="http://schemas.microsoft.com/office/word/2023/wordml/word16du" xmlns:w16sdtdh="http://schemas.microsoft.com/office/word/2020/wordml/sdtdatahash" xmlns:w16sdtfl="http://schemas.microsoft.com/office/word/2024/wordml/sdtformatlock" xmlns:w16se="http://schemas.microsoft.com/office/word/2015/wordml/symex" xmlns:wpg="http://schemas.microsoft.com/office/word/2010/wordprocessingGroup" xmlns:wpi="http://schemas.microsoft.com/office/word/2010/wordprocessingInk" xmlns:wne="http://schemas.microsoft.com/office/word/2006/wordml" xmlns:wps="http://schemas.microsoft.com/office/word/2010/wordprocessingShape" mc:Ignorable="w14 w15 w16se w16cid w16 w16cex w16sdtdh w16sdtfl w16du wp14">
   <w:body>
     <w:p>
       <w:pPr>
@@ -61,15 +61,7 @@
           <w:bCs/>
           <w:color w:val="1F3864"/>
         </w:rPr>
-        <w:t xml:space="preserve">Total Marks: 100   |   Weeks Covered: 1 </w:t>
-      </w:r>
-      <w:r>
-        <w:rPr>
-          <w:b/>
-          <w:bCs/>
-          <w:color w:val="1F3864"/>
-        </w:rPr>
-        <w:t>– 16   |   CLO: CLO1, CLO2, CLO3</w:t>
+        <w:t>Total Marks: 100   |   Weeks Covered: 1 – 16   |   CLO: CLO1, CLO2, CLO3</w:t>
       </w:r>
     </w:p>
     <w:p>
@@ -108,19 +100,7 @@
         <w:rPr>
           <w:color w:val="000000"/>
         </w:rPr>
-        <w:t xml:space="preserve"> static web application across three isolated software environments: Development, Staging, and Production. Each env</w:t>
-      </w:r>
-      <w:r>
-        <w:rPr>
-          <w:color w:val="000000"/>
-        </w:rPr>
-        <w:t>ironment has its own dedicated CI workflow (triggered on a Pull Request) and its own dedicated CD workflow (triggered on a merge/push), giving six GitHub Actions workflow files in total. Each team member authors exactly one workflow file and exactly one we</w:t>
-      </w:r>
-      <w:r>
-        <w:rPr>
-          <w:color w:val="000000"/>
-        </w:rPr>
-        <w:t>b page.</w:t>
+        <w:t xml:space="preserve"> static web application across three isolated software environments: Development, Staging, and Production. Each environment has its own dedicated CI workflow (triggered on a Pull Request) and its own dedicated CD workflow (triggered on a merge/push), giving six GitHub Actions workflow files in total. Each team member authors exactly one workflow file and exactly one web page.</w:t>
       </w:r>
     </w:p>
     <w:p/>
@@ -166,13 +146,7 @@
         <w:rPr>
           <w:color w:val="000000"/>
         </w:rPr>
-        <w:t>Design and implement six GitHub Actions workflow files: ci-dev.y</w:t>
-      </w:r>
-      <w:r>
-        <w:rPr>
-          <w:color w:val="000000"/>
-        </w:rPr>
-        <w:t>ml, cd-dev.yml, ci-staging.yml, cd-staging.yml, ci-prod.yml, and cd-prod.yml.</w:t>
+        <w:t>Design and implement six GitHub Actions workflow files: ci-dev.yml, cd-dev.yml, ci-staging.yml, cd-staging.yml, ci-prod.yml, and cd-prod.yml.</w:t>
       </w:r>
     </w:p>
     <w:p>
@@ -204,13 +178,7 @@
         <w:rPr>
           <w:color w:val="000000"/>
         </w:rPr>
-        <w:t xml:space="preserve">Build and push environment-tagged Docker images to Docker Hub </w:t>
-      </w:r>
-      <w:r>
-        <w:rPr>
-          <w:color w:val="000000"/>
-        </w:rPr>
-        <w:t>from each CI pipeline.</w:t>
+        <w:t>Build and push environment-tagged Docker images to Docker Hub from each CI pipeline.</w:t>
       </w:r>
     </w:p>
     <w:p>
@@ -258,13 +226,7 @@
         <w:rPr>
           <w:color w:val="000000"/>
         </w:rPr>
-        <w:t>Demonstrate end-to-end automa</w:t>
-      </w:r>
-      <w:r>
-        <w:rPr>
-          <w:color w:val="000000"/>
-        </w:rPr>
-        <w:t>ted delivery from a code push on a feature branch to a live deployment on the appropriate Render service.</w:t>
+        <w:t>Demonstrate end-to-end automated delivery from a code push on a feature branch to a live deployment on the appropriate Render service.</w:t>
       </w:r>
     </w:p>
     <w:p/>
@@ -289,13 +251,7 @@
         <w:rPr>
           <w:color w:val="000000"/>
         </w:rPr>
-        <w:t>Group Size: Five (5) students per group. A group of six is permitted; in that case the Team Lead must add an extra row to Tabl</w:t>
-      </w:r>
-      <w:r>
-        <w:rPr>
-          <w:color w:val="000000"/>
-        </w:rPr>
-        <w:t>e 1 and assign one additional page (contact.html).</w:t>
+        <w:t>Group Size: Five (5) students per group. A group of six is permitted; in that case the Team Lead must add an extra row to Table 1 and assign one additional page (contact.html).</w:t>
       </w:r>
     </w:p>
     <w:p>
@@ -327,13 +283,7 @@
         <w:rPr>
           <w:color w:val="000000"/>
         </w:rPr>
-        <w:t>New Repository: Students MUST create a brand-new GitHub repository for this Term Project. Do NOT reuse or fork any repository</w:t>
-      </w:r>
-      <w:r>
-        <w:rPr>
-          <w:color w:val="000000"/>
-        </w:rPr>
-        <w:t xml:space="preserve"> from any previous assignment.</w:t>
+        <w:t>New Repository: Students MUST create a brand-new GitHub repository for this Term Project. Do NOT reuse or fork any repository from any previous assignment.</w:t>
       </w:r>
     </w:p>
     <w:p>
@@ -365,13 +315,7 @@
         <w:rPr>
           <w:color w:val="000000"/>
         </w:rPr>
-        <w:t>Secre</w:t>
-      </w:r>
-      <w:r>
-        <w:rPr>
-          <w:color w:val="000000"/>
-        </w:rPr>
-        <w:t>ts Ownership: All GitHub secrets and environment configurations must be created by the Team Lead using the TL's own Docker Hub and Render credentials. No team member other than the TL should create or modify secrets.</w:t>
+        <w:t>Secrets Ownership: All GitHub secrets and environment configurations must be created by the Team Lead using the TL's own Docker Hub and Render credentials. No team member other than the TL should create or modify secrets.</w:t>
       </w:r>
     </w:p>
     <w:p>
@@ -387,13 +331,7 @@
         <w:rPr>
           <w:color w:val="000000"/>
         </w:rPr>
-        <w:t>All deployments MUST be triggered via t</w:t>
-      </w:r>
-      <w:r>
-        <w:rPr>
-          <w:color w:val="000000"/>
-        </w:rPr>
-        <w:t>he GitHub Actions CD pipelines. Manual deployment on Render is NOT permitted after the initial service setup.</w:t>
+        <w:t>All deployments MUST be triggered via the GitHub Actions CD pipelines. Manual deployment on Render is NOT permitted after the initial service setup.</w:t>
       </w:r>
     </w:p>
     <w:p>
@@ -442,13 +380,7 @@
         <w:rPr>
           <w:color w:val="000000"/>
         </w:rPr>
-        <w:t>Each team member must wor</w:t>
-      </w:r>
-      <w:r>
-        <w:rPr>
-          <w:color w:val="000000"/>
-        </w:rPr>
-        <w:t>k on their own feature branch and open a Pull Request (PR) targeting the develop branch.</w:t>
+        <w:t>Each team member must work on their own feature branch and open a Pull Request (PR) targeting the develop branch.</w:t>
       </w:r>
     </w:p>
     <w:p>
@@ -464,13 +396,7 @@
         <w:rPr>
           <w:color w:val="000000"/>
         </w:rPr>
-        <w:t>No JavaScript of any kind is permitted. All pages must be built exclusively using HTML5 and CSS3. Forms must use HTML-only attributes (no JS event listeners, no fetch,</w:t>
-      </w:r>
-      <w:r>
-        <w:rPr>
-          <w:color w:val="000000"/>
-        </w:rPr>
-        <w:t xml:space="preserve"> no XMLHttpRequest).</w:t>
+        <w:t>No JavaScript of any kind is permitted. All pages must be built exclusively using HTML5 and CSS3. Forms must use HTML-only attributes (no JS event listeners, no fetch, no XMLHttpRequest).</w:t>
       </w:r>
     </w:p>
     <w:p>
@@ -518,14 +444,14 @@
         <w:tblLook w:val="04A0" w:firstRow="1" w:lastRow="0" w:firstColumn="1" w:lastColumn="0" w:noHBand="0" w:noVBand="1"/>
       </w:tblPr>
       <w:tblGrid>
-        <w:gridCol w:w="446"/>
-        <w:gridCol w:w="1190"/>
-        <w:gridCol w:w="1190"/>
-        <w:gridCol w:w="1621"/>
-        <w:gridCol w:w="1114"/>
-        <w:gridCol w:w="1114"/>
-        <w:gridCol w:w="1997"/>
-        <w:gridCol w:w="1406"/>
+        <w:gridCol w:w="427"/>
+        <w:gridCol w:w="1101"/>
+        <w:gridCol w:w="1177"/>
+        <w:gridCol w:w="1492"/>
+        <w:gridCol w:w="1032"/>
+        <w:gridCol w:w="1032"/>
+        <w:gridCol w:w="2521"/>
+        <w:gridCol w:w="1296"/>
       </w:tblGrid>
       <w:tr>
         <w:tc>
@@ -694,17 +620,7 @@
                 <w:sz w:val="20"/>
                 <w:szCs w:val="20"/>
               </w:rPr>
-              <w:t>Assig</w:t>
-            </w:r>
-            <w:r>
-              <w:rPr>
-                <w:b/>
-                <w:bCs/>
-                <w:color w:val="FFFFFF"/>
-                <w:sz w:val="20"/>
-                <w:szCs w:val="20"/>
-              </w:rPr>
-              <w:t>ned Workflow File</w:t>
+              <w:t>Assigned Workflow File</w:t>
             </w:r>
           </w:p>
         </w:tc>
@@ -880,7 +796,10 @@
           </w:tcPr>
           <w:p>
             <w:r>
-              <w:t>Aziz6587-cell</w:t>
+              <w:t>a</w:t>
+            </w:r>
+            <w:r>
+              <w:t>ziz6587-cell</w:t>
             </w:r>
           </w:p>
         </w:tc>
@@ -1033,8 +952,6 @@
             <w:r>
               <w:t>2</w:t>
             </w:r>
-            <w:bookmarkStart w:id="0" w:name="_GoBack"/>
-            <w:bookmarkEnd w:id="0"/>
           </w:p>
         </w:tc>
         <w:tc>
@@ -1055,7 +972,11 @@
             </w:tcMar>
             <w:vAlign w:val="center"/>
           </w:tcPr>
-          <w:p/>
+          <w:p>
+            <w:r>
+              <w:t>Arslan Ali</w:t>
+            </w:r>
+          </w:p>
         </w:tc>
         <w:tc>
           <w:tcPr>
@@ -1075,7 +996,11 @@
             </w:tcMar>
             <w:vAlign w:val="center"/>
           </w:tcPr>
-          <w:p/>
+          <w:p>
+            <w:r>
+              <w:t>ali0arslan8</w:t>
+            </w:r>
+          </w:p>
         </w:tc>
         <w:tc>
           <w:tcPr>
@@ -1095,7 +1020,11 @@
             </w:tcMar>
             <w:vAlign w:val="center"/>
           </w:tcPr>
-          <w:p/>
+          <w:p>
+            <w:r>
+              <w:t>member</w:t>
+            </w:r>
+          </w:p>
         </w:tc>
         <w:tc>
           <w:tcPr>
@@ -1115,7 +1044,11 @@
             </w:tcMar>
             <w:vAlign w:val="center"/>
           </w:tcPr>
-          <w:p/>
+          <w:p>
+            <w:r>
+              <w:t>cd-dev</w:t>
+            </w:r>
+          </w:p>
         </w:tc>
         <w:tc>
           <w:tcPr>
@@ -1135,7 +1068,11 @@
             </w:tcMar>
             <w:vAlign w:val="center"/>
           </w:tcPr>
-          <w:p/>
+          <w:p>
+            <w:r>
+              <w:t>lahore</w:t>
+            </w:r>
+          </w:p>
         </w:tc>
         <w:tc>
           <w:tcPr>
@@ -1155,7 +1092,11 @@
             </w:tcMar>
             <w:vAlign w:val="center"/>
           </w:tcPr>
-          <w:p/>
+          <w:p>
+            <w:r>
+              <w:t>features/ali0arslan8/lahore</w:t>
+            </w:r>
+          </w:p>
         </w:tc>
         <w:tc>
           <w:tcPr>
@@ -1175,7 +1116,11 @@
             </w:tcMar>
             <w:vAlign w:val="center"/>
           </w:tcPr>
-          <w:p/>
+          <w:p>
+            <w:r>
+              <w:t>n</w:t>
+            </w:r>
+          </w:p>
         </w:tc>
       </w:tr>
       <w:tr>
@@ -1718,15 +1663,7 @@
           <w:iCs/>
           <w:color w:val="595959"/>
         </w:rPr>
-        <w:t xml:space="preserve">[Paste Render Development </w:t>
-      </w:r>
-      <w:r>
-        <w:rPr>
-          <w:i/>
-          <w:iCs/>
-          <w:color w:val="595959"/>
-        </w:rPr>
-        <w:t>Service URL Here]</w:t>
+        <w:t>[Paste Render Development Service URL Here]</w:t>
       </w:r>
     </w:p>
     <w:p>
@@ -1871,6 +1808,7 @@
                 <w:sz w:val="20"/>
                 <w:szCs w:val="20"/>
               </w:rPr>
+              <w:lastRenderedPageBreak/>
               <w:t>Environment</w:t>
             </w:r>
           </w:p>
@@ -2006,7 +1944,6 @@
                 <w:sz w:val="20"/>
                 <w:szCs w:val="20"/>
               </w:rPr>
-              <w:lastRenderedPageBreak/>
               <w:t>Development</w:t>
             </w:r>
           </w:p>
@@ -2036,15 +1973,7 @@
                 <w:sz w:val="20"/>
                 <w:szCs w:val="20"/>
               </w:rPr>
-              <w:t>Active development; CI tri</w:t>
-            </w:r>
-            <w:r>
-              <w:rPr>
-                <w:color w:val="000000"/>
-                <w:sz w:val="20"/>
-                <w:szCs w:val="20"/>
-              </w:rPr>
-              <w:t>ggered on every PR to develop</w:t>
+              <w:t>Active development; CI triggered on every PR to develop</w:t>
             </w:r>
           </w:p>
         </w:tc>
@@ -2284,15 +2213,7 @@
                 <w:sz w:val="20"/>
                 <w:szCs w:val="20"/>
               </w:rPr>
-              <w:t>Live public site; CI triggered on</w:t>
-            </w:r>
-            <w:r>
-              <w:rPr>
-                <w:color w:val="000000"/>
-                <w:sz w:val="20"/>
-                <w:szCs w:val="20"/>
-              </w:rPr>
-              <w:t xml:space="preserve"> every PR to main</w:t>
+              <w:t>Live public site; CI triggered on every PR to main</w:t>
             </w:r>
           </w:p>
         </w:tc>
@@ -2365,13 +2286,7 @@
         <w:rPr>
           <w:color w:val="000000"/>
         </w:rPr>
-        <w:t xml:space="preserve">The Team Lead sets up the repository, Dockerfile, shared stylesheet (style.css), and all six CI/CD workflow files. Each team member is individually responsible for building one </w:t>
-      </w:r>
-      <w:r>
-        <w:rPr>
-          <w:color w:val="000000"/>
-        </w:rPr>
-        <w:t>destination page (HTML + CSS) and authoring one workflow file – either a CI or a CD workflow for any one environment.</w:t>
+        <w:t>The Team Lead sets up the repository, Dockerfile, shared stylesheet (style.css), and all six CI/CD workflow files. Each team member is individually responsible for building one destination page (HTML + CSS) and authoring one workflow file – either a CI or a CD workflow for any one environment.</w:t>
       </w:r>
     </w:p>
     <w:p/>
@@ -2664,15 +2579,7 @@
                 <w:sz w:val="20"/>
                 <w:szCs w:val="20"/>
               </w:rPr>
-              <w:t xml:space="preserve">A welcoming landing page </w:t>
-            </w:r>
-            <w:r>
-              <w:rPr>
-                <w:color w:val="000000"/>
-                <w:sz w:val="20"/>
-                <w:szCs w:val="20"/>
-              </w:rPr>
-              <w:t>introducing PakVista, with a hero section, a brief paragraph about Pakistan's tourism, and navigation links to all five destination pages.</w:t>
+              <w:t>A welcoming landing page introducing PakVista, with a hero section, a brief paragraph about Pakistan's tourism, and navigation links to all five destination pages.</w:t>
             </w:r>
           </w:p>
         </w:tc>
@@ -2797,15 +2704,7 @@
                 <w:sz w:val="20"/>
                 <w:szCs w:val="20"/>
               </w:rPr>
-              <w:t xml:space="preserve">Dedicated page for Lahore covering the Badshahi Mosque, Lahore Fort, and </w:t>
-            </w:r>
-            <w:r>
-              <w:rPr>
-                <w:color w:val="000000"/>
-                <w:sz w:val="20"/>
-                <w:szCs w:val="20"/>
-              </w:rPr>
-              <w:t>Shalimar Gardens, with descriptive paragraphs and an HTML-only image placeholder section.</w:t>
+              <w:t>Dedicated page for Lahore covering the Badshahi Mosque, Lahore Fort, and Shalimar Gardens, with descriptive paragraphs and an HTML-only image placeholder section.</w:t>
             </w:r>
           </w:p>
         </w:tc>
@@ -2930,15 +2829,7 @@
                 <w:sz w:val="20"/>
                 <w:szCs w:val="20"/>
               </w:rPr>
-              <w:t xml:space="preserve">Dedicated page for Hunza Valley covering Rakaposhi viewpoint, Attabad Lake, and Baltit Fort, with descriptive paragraphs and an HTML-only </w:t>
-            </w:r>
-            <w:r>
-              <w:rPr>
-                <w:color w:val="000000"/>
-                <w:sz w:val="20"/>
-                <w:szCs w:val="20"/>
-              </w:rPr>
-              <w:t>image placeholder section.</w:t>
+              <w:t>Dedicated page for Hunza Valley covering Rakaposhi viewpoint, Attabad Lake, and Baltit Fort, with descriptive paragraphs and an HTML-only image placeholder section.</w:t>
             </w:r>
           </w:p>
         </w:tc>
@@ -3211,13 +3102,7 @@
         <w:rPr>
           <w:color w:val="000000"/>
         </w:rPr>
-        <w:t xml:space="preserve">Each team member must </w:t>
-      </w:r>
-      <w:r>
-        <w:rPr>
-          <w:color w:val="000000"/>
-        </w:rPr>
-        <w:t>author exactly one workflow file. The Team Lead authors the remaining workflow files as part of the repository setup.</w:t>
+        <w:t>Each team member must author exactly one workflow file. The Team Lead authors the remaining workflow files as part of the repository setup.</w:t>
       </w:r>
     </w:p>
     <w:p/>
@@ -3448,6 +3333,7 @@
                 <w:sz w:val="20"/>
                 <w:szCs w:val="20"/>
               </w:rPr>
+              <w:lastRenderedPageBreak/>
               <w:t>1</w:t>
             </w:r>
           </w:p>
@@ -3566,32 +3452,15 @@
                 <w:sz w:val="20"/>
                 <w:szCs w:val="20"/>
               </w:rPr>
-              <w:t xml:space="preserve">Assigned to </w:t>
-            </w:r>
-            <w:r>
-              <w:rPr>
-                <w:color w:val="000000"/>
-                <w:sz w:val="20"/>
-                <w:szCs w:val="20"/>
-              </w:rPr>
-              <w:t>Member 1 (Team Lead): Checkout,</w:t>
-            </w:r>
-            <w:r>
-              <w:rPr>
-                <w:color w:val="000000"/>
-                <w:sz w:val="20"/>
-                <w:szCs w:val="20"/>
-              </w:rPr>
-              <w:t xml:space="preserve"> HTML &amp; CSS Linting, Building with </w:t>
-            </w:r>
-            <w:r>
-              <w:rPr>
-                <w:color w:val="000000"/>
-                <w:sz w:val="20"/>
-                <w:szCs w:val="20"/>
-              </w:rPr>
-              <w:lastRenderedPageBreak/>
-              <w:t>Parcel,</w:t>
+              <w:t>Assigned to Member 1 (Team Lead): Checkout,</w:t>
+            </w:r>
+            <w:r>
+              <w:rPr>
+                <w:color w:val="000000"/>
+                <w:sz w:val="20"/>
+                <w:szCs w:val="20"/>
+              </w:rPr>
+              <w:t xml:space="preserve"> HTML &amp; CSS Linting, Building with Parcel,</w:t>
             </w:r>
             <w:r>
               <w:rPr>
@@ -3635,7 +3504,6 @@
                 <w:sz w:val="20"/>
                 <w:szCs w:val="20"/>
               </w:rPr>
-              <w:lastRenderedPageBreak/>
               <w:t>2</w:t>
             </w:r>
           </w:p>
@@ -3754,15 +3622,7 @@
                 <w:sz w:val="20"/>
                 <w:szCs w:val="20"/>
               </w:rPr>
-              <w:t xml:space="preserve">Assigned to Member 2: Checkout, declare </w:t>
-            </w:r>
-            <w:r>
-              <w:rPr>
-                <w:color w:val="000000"/>
-                <w:sz w:val="20"/>
-                <w:szCs w:val="20"/>
-              </w:rPr>
-              <w:t>environment: development, curl POST to RENDER_DEPLOY_HOOK_DEV_URL, output confirmation.</w:t>
+              <w:t>Assigned to Member 2: Checkout, declare environment: development, curl POST to RENDER_DEPLOY_HOOK_DEV_URL, output confirmation.</w:t>
             </w:r>
           </w:p>
         </w:tc>
@@ -3932,15 +3792,7 @@
                 <w:sz w:val="20"/>
                 <w:szCs w:val="20"/>
               </w:rPr>
-              <w:t xml:space="preserve">Docker Login, Build, Tag </w:t>
-            </w:r>
-            <w:r>
-              <w:rPr>
-                <w:color w:val="000000"/>
-                <w:sz w:val="20"/>
-                <w:szCs w:val="20"/>
-              </w:rPr>
-              <w:t>(:staging-latest, :staging-&lt;sha&gt;), Push to Docker Hub.</w:t>
+              <w:t>Docker Login, Build, Tag (:staging-latest, :staging-&lt;sha&gt;), Push to Docker Hub.</w:t>
             </w:r>
           </w:p>
         </w:tc>
@@ -4441,13 +4293,7 @@
         <w:rPr>
           <w:color w:val="000000"/>
         </w:rPr>
-        <w:t>Each team member independently follows the complete GitFlow for their</w:t>
-      </w:r>
-      <w:r>
-        <w:rPr>
-          <w:color w:val="000000"/>
-        </w:rPr>
-        <w:t xml:space="preserve"> assigned page and workflow file:</w:t>
+        <w:t>Each team member independently follows the complete GitFlow for their assigned page and workflow file:</w:t>
       </w:r>
     </w:p>
     <w:p>
@@ -4496,13 +4342,7 @@
         <w:rPr>
           <w:color w:val="000000"/>
         </w:rPr>
-        <w:t>Build the assigned HTML page with appropriate content. Link the page to t</w:t>
-      </w:r>
-      <w:r>
-        <w:rPr>
-          <w:color w:val="000000"/>
-        </w:rPr>
-        <w:t>he shared style.css. No JavaScript permitted.</w:t>
+        <w:t>Build the assigned HTML page with appropriate content. Link the page to the shared style.css. No JavaScript permitted.</w:t>
       </w:r>
     </w:p>
     <w:p>
@@ -4550,13 +4390,7 @@
         <w:rPr>
           <w:color w:val="000000"/>
         </w:rPr>
-        <w:t>Op</w:t>
-      </w:r>
-      <w:r>
-        <w:rPr>
-          <w:color w:val="000000"/>
-        </w:rPr>
-        <w:t>en a Pull Request (PR) targeting the develop branch. The CI workflow for the development environment (ci-dev.yml) fires automatically. Verify all steps pass.</w:t>
+        <w:t>Open a Pull Request (PR) targeting the develop branch. The CI workflow for the development environment (ci-dev.yml) fires automatically. Verify all steps pass.</w:t>
       </w:r>
     </w:p>
     <w:p>
@@ -4572,13 +4406,7 @@
         <w:rPr>
           <w:color w:val="000000"/>
         </w:rPr>
-        <w:t xml:space="preserve">Request a review from the Team Lead. Once CI passes and the PR is approved, the Team Lead merges </w:t>
-      </w:r>
-      <w:r>
-        <w:rPr>
-          <w:color w:val="000000"/>
-        </w:rPr>
-        <w:t>it. The merge triggers the CD pipeline (cd-dev.yml) and deploys the updated site to the Render development service.</w:t>
+        <w:t>Request a review from the Team Lead. Once CI passes and the PR is approved, the Team Lead merges it. The merge triggers the CD pipeline (cd-dev.yml) and deploys the updated site to the Render development service.</w:t>
       </w:r>
     </w:p>
     <w:p/>
@@ -4604,16 +4432,7 @@
           <w:sz w:val="19"/>
           <w:szCs w:val="19"/>
         </w:rPr>
-        <w:t>Feature Branch → PR to develop → ci-dev.yml builds &amp; pushes :dev-latest → PR merged → push on develop → cd-dev.yml</w:t>
-      </w:r>
-      <w:r>
-        <w:rPr>
-          <w:rFonts w:ascii="Courier New" w:eastAsia="Courier New" w:hAnsi="Courier New" w:cs="Courier New"/>
-          <w:color w:val="1F3864"/>
-          <w:sz w:val="19"/>
-          <w:szCs w:val="19"/>
-        </w:rPr>
-        <w:t xml:space="preserve"> deploys to pakvista-dev on Render → Live PakVista Development updated.</w:t>
+        <w:t>Feature Branch → PR to develop → ci-dev.yml builds &amp; pushes :dev-latest → PR merged → push on develop → cd-dev.yml deploys to pakvista-dev on Render → Live PakVista Development updated.</w:t>
       </w:r>
     </w:p>
     <w:p/>
@@ -4664,13 +4483,7 @@
         <w:rPr>
           <w:color w:val="000000"/>
         </w:rPr>
-        <w:t>Creat</w:t>
-      </w:r>
-      <w:r>
-        <w:rPr>
-          <w:color w:val="000000"/>
-        </w:rPr>
-        <w:t>e a new public GitHub repository named pakvista-cicd (or a name agreed by the team). Do NOT clone or fork any existing repository.</w:t>
+        <w:t>Create a new public GitHub repository named pakvista-cicd (or a name agreed by the team). Do NOT clone or fork any existing repository.</w:t>
       </w:r>
     </w:p>
     <w:p>
@@ -4686,13 +4499,7 @@
         <w:rPr>
           <w:color w:val="000000"/>
         </w:rPr>
-        <w:t xml:space="preserve">Create the develop, staging, and main branches. Set develop as the default working branch. The promotion flow is: develop → </w:t>
-      </w:r>
-      <w:r>
-        <w:rPr>
-          <w:color w:val="000000"/>
-        </w:rPr>
-        <w:t>staging → main.</w:t>
+        <w:t>Create the develop, staging, and main branches. Set develop as the default working branch. The promotion flow is: develop → staging → main.</w:t>
       </w:r>
     </w:p>
     <w:p>
@@ -4786,15 +4593,7 @@
           <w:bCs/>
           <w:color w:val="000000"/>
         </w:rPr>
-        <w:t>Require the corresponding CI status check to pass before merging (ci-dev for develop; ci-staging for staging; ci-prod for m</w:t>
-      </w:r>
-      <w:r>
-        <w:rPr>
-          <w:b/>
-          <w:bCs/>
-          <w:color w:val="000000"/>
-        </w:rPr>
-        <w:t>ain).</w:t>
+        <w:t>Require the corresponding CI status check to pass before merging (ci-dev for develop; ci-staging for staging; ci-prod for main).</w:t>
       </w:r>
     </w:p>
     <w:p>
@@ -4830,13 +4629,7 @@
         <w:rPr>
           <w:color w:val="000000"/>
         </w:rPr>
-        <w:t>The Team Lead must sign up on Render (render.com) and create three separate Web Services, one per environment, each connected to the Team Lead's Dock</w:t>
-      </w:r>
-      <w:r>
-        <w:rPr>
-          <w:color w:val="000000"/>
-        </w:rPr>
-        <w:t>er Hub image repository. The deploy hook URL for each service is obtained from: Render Dashboard → Service → Settings → Deploy Hook.</w:t>
+        <w:t>The Team Lead must sign up on Render (render.com) and create three separate Web Services, one per environment, each connected to the Team Lead's Docker Hub image repository. The deploy hook URL for each service is obtained from: Render Dashboard → Service → Settings → Deploy Hook.</w:t>
       </w:r>
     </w:p>
     <w:p/>
@@ -5356,15 +5149,7 @@
                 <w:sz w:val="20"/>
                 <w:szCs w:val="20"/>
               </w:rPr>
-              <w:t>Store in GitHub 'production'</w:t>
-            </w:r>
-            <w:r>
-              <w:rPr>
-                <w:color w:val="000000"/>
-                <w:sz w:val="20"/>
-                <w:szCs w:val="20"/>
-              </w:rPr>
-              <w:t xml:space="preserve"> environment</w:t>
+              <w:t>Store in GitHub 'production' environment</w:t>
             </w:r>
           </w:p>
         </w:tc>
@@ -5850,15 +5635,7 @@
                 <w:sz w:val="20"/>
                 <w:szCs w:val="20"/>
               </w:rPr>
-              <w:t xml:space="preserve">Shared stylesheet enforcing consistent visual identity across all </w:t>
-            </w:r>
-            <w:r>
-              <w:rPr>
-                <w:color w:val="000000"/>
-                <w:sz w:val="20"/>
-                <w:szCs w:val="20"/>
-              </w:rPr>
-              <w:t>pages</w:t>
+              <w:t>Shared stylesheet enforcing consistent visual identity across all pages</w:t>
             </w:r>
           </w:p>
         </w:tc>
@@ -6044,15 +5821,7 @@
                 <w:sz w:val="20"/>
                 <w:szCs w:val="20"/>
               </w:rPr>
-              <w:t xml:space="preserve">CD workflow for Development </w:t>
-            </w:r>
-            <w:r>
-              <w:rPr>
-                <w:color w:val="000000"/>
-                <w:sz w:val="20"/>
-                <w:szCs w:val="20"/>
-              </w:rPr>
-              <w:t>– triggered on push to develop</w:t>
+              <w:t>CD workflow for Development – triggered on push to develop</w:t>
             </w:r>
           </w:p>
         </w:tc>
@@ -6380,10 +6149,7 @@
       </w:pPr>
       <w:r>
         <w:lastRenderedPageBreak/>
-        <w:t xml:space="preserve">GITHUB </w:t>
-      </w:r>
-      <w:r>
-        <w:t>ENVIRONMENTS &amp; SECRETS (MANDATORY)</w:t>
+        <w:t>GITHUB ENVIRONMENTS &amp; SECRETS (MANDATORY)</w:t>
       </w:r>
     </w:p>
     <w:p>
@@ -6394,13 +6160,7 @@
         <w:rPr>
           <w:color w:val="000000"/>
         </w:rPr>
-        <w:t>The Team Lead is responsible for creating all three GitHub Environments and all secrets listed below. The TL is the repository admin and the credentials belong exclusively to the TL's Docker Hub and Render accounts. No ot</w:t>
-      </w:r>
-      <w:r>
-        <w:rPr>
-          <w:color w:val="000000"/>
-        </w:rPr>
-        <w:t>her team member should create or modify secrets.</w:t>
+        <w:t>The Team Lead is responsible for creating all three GitHub Environments and all secrets listed below. The TL is the repository admin and the credentials belong exclusively to the TL's Docker Hub and Render accounts. No other team member should create or modify secrets.</w:t>
       </w:r>
     </w:p>
     <w:p/>
@@ -6495,13 +6255,7 @@
         <w:rPr>
           <w:color w:val="000000"/>
         </w:rPr>
-        <w:t xml:space="preserve">Table 5: </w:t>
-      </w:r>
-      <w:r>
-        <w:rPr>
-          <w:color w:val="000000"/>
-        </w:rPr>
-        <w:t>Secrets Configuration Reference</w:t>
+        <w:t>Table 5: Secrets Configuration Reference</w:t>
       </w:r>
     </w:p>
     <w:p/>
@@ -6812,15 +6566,7 @@
                 <w:sz w:val="20"/>
                 <w:szCs w:val="20"/>
               </w:rPr>
-              <w:t xml:space="preserve">Team </w:t>
-            </w:r>
-            <w:r>
-              <w:rPr>
-                <w:color w:val="000000"/>
-                <w:sz w:val="20"/>
-                <w:szCs w:val="20"/>
-              </w:rPr>
-              <w:t>Lead's Docker Hub Personal Access Token (PAT) generated from Docker Hub → Account Settings → Security. Reference: https://docs.docker.com/security/for-developers/access-tokens/</w:t>
+              <w:t>Team Lead's Docker Hub Personal Access Token (PAT) generated from Docker Hub → Account Settings → Security. Reference: https://docs.docker.com/security/for-developers/access-tokens/</w:t>
             </w:r>
           </w:p>
         </w:tc>
@@ -6913,15 +6659,7 @@
                 <w:sz w:val="20"/>
                 <w:szCs w:val="20"/>
               </w:rPr>
-              <w:t xml:space="preserve">Deploy-hook webhook URL </w:t>
-            </w:r>
-            <w:r>
-              <w:rPr>
-                <w:color w:val="000000"/>
-                <w:sz w:val="20"/>
-                <w:szCs w:val="20"/>
-              </w:rPr>
-              <w:t>from the pakvista-dev Render service. Added inside the 'development' environment secrets.</w:t>
+              <w:t>Deploy-hook webhook URL from the pakvista-dev Render service. Added inside the 'development' environment secrets.</w:t>
             </w:r>
           </w:p>
         </w:tc>
@@ -7126,17 +6864,7 @@
           <w:sz w:val="20"/>
           <w:szCs w:val="20"/>
         </w:rPr>
-        <w:t xml:space="preserve">Reference: GitHub Encrypted Secrets – </w:t>
-      </w:r>
-      <w:r>
-        <w:rPr>
-          <w:i/>
-          <w:iCs/>
-          <w:color w:val="595959"/>
-          <w:sz w:val="20"/>
-          <w:szCs w:val="20"/>
-        </w:rPr>
-        <w:t>https://docs.github.com/en/actions/security-guides/encrypted-secrets | GitHub Environments – https://docs.github.com/en/actions/deployment/targeting-different-environments/using-environments-for-deployment</w:t>
+        <w:t>Reference: GitHub Encrypted Secrets – https://docs.github.com/en/actions/security-guides/encrypted-secrets | GitHub Environments – https://docs.github.com/en/actions/deployment/targeting-different-environments/using-environments-for-deployment</w:t>
       </w:r>
     </w:p>
     <w:p/>
@@ -7157,13 +6885,7 @@
         <w:rPr>
           <w:color w:val="000000"/>
         </w:rPr>
-        <w:t>There are three CI workf</w:t>
-      </w:r>
-      <w:r>
-        <w:rPr>
-          <w:color w:val="000000"/>
-        </w:rPr>
-        <w:t>low files, one per environment. All three follow the same structure; the only differences are the trigger branch, the image tags, and the file name.</w:t>
+        <w:t>There are three CI workflow files, one per environment. All three follow the same structure; the only differences are the trigger branch, the image tags, and the file name.</w:t>
       </w:r>
     </w:p>
     <w:p/>
@@ -7714,13 +7436,7 @@
         <w:rPr>
           <w:color w:val="000000"/>
         </w:rPr>
-        <w:t xml:space="preserve">Each CI workflow must </w:t>
-      </w:r>
-      <w:r>
-        <w:rPr>
-          <w:color w:val="000000"/>
-        </w:rPr>
-        <w:t>include the following steps in the stated order:</w:t>
+        <w:t>Each CI workflow must include the following steps in the stated order:</w:t>
       </w:r>
     </w:p>
     <w:p/>
@@ -7851,17 +7567,7 @@
           <w:sz w:val="20"/>
           <w:szCs w:val="20"/>
         </w:rPr>
-        <w:t xml:space="preserve">Reference: https://github.com/docker/login-action | </w:t>
-      </w:r>
-      <w:r>
-        <w:rPr>
-          <w:i/>
-          <w:iCs/>
-          <w:color w:val="595959"/>
-          <w:sz w:val="20"/>
-          <w:szCs w:val="20"/>
-        </w:rPr>
-        <w:t>https://docs.docker.com/security/for-developers/access-tokens/</w:t>
+        <w:t>Reference: https://github.com/docker/login-action | https://docs.docker.com/security/for-developers/access-tokens/</w:t>
       </w:r>
     </w:p>
     <w:p/>
@@ -8058,15 +7764,7 @@
           <w:bCs/>
           <w:color w:val="000000"/>
         </w:rPr>
-        <w:t>The CI status check must be register</w:t>
-      </w:r>
-      <w:r>
-        <w:rPr>
-          <w:b/>
-          <w:bCs/>
-          <w:color w:val="000000"/>
-        </w:rPr>
-        <w:t>ed as a required check in the Branch Protection Rules on the target branch</w:t>
+        <w:t>The CI status check must be registered as a required check in the Branch Protection Rules on the target branch</w:t>
       </w:r>
       <w:r>
         <w:rPr>
@@ -8108,13 +7806,7 @@
         <w:rPr>
           <w:color w:val="000000"/>
         </w:rPr>
-        <w:t>There are three CD workflow files, one per environment. All three follow the same structure; the on</w:t>
-      </w:r>
-      <w:r>
-        <w:rPr>
-          <w:color w:val="000000"/>
-        </w:rPr>
-        <w:t>ly differences are the trigger branch, the GitHub Environment declared, and the deploy hook secret name.</w:t>
+        <w:t>There are three CD workflow files, one per environment. All three follow the same structure; the only differences are the trigger branch, the GitHub Environment declared, and the deploy hook secret name.</w:t>
       </w:r>
     </w:p>
     <w:p/>
@@ -8402,15 +8094,7 @@
                 <w:sz w:val="20"/>
                 <w:szCs w:val="20"/>
               </w:rPr>
-              <w:t xml:space="preserve">RENDER_DEPLOY_HOOK_DEV_URL (in </w:t>
-            </w:r>
-            <w:r>
-              <w:rPr>
-                <w:color w:val="000000"/>
-                <w:sz w:val="20"/>
-                <w:szCs w:val="20"/>
-              </w:rPr>
-              <w:t>'development' env)</w:t>
+              <w:t>RENDER_DEPLOY_HOOK_DEV_URL (in 'development' env)</w:t>
             </w:r>
           </w:p>
         </w:tc>
@@ -8673,13 +8357,7 @@
         <w:rPr>
           <w:color w:val="000000"/>
         </w:rPr>
-        <w:t>Each CD workflow must include the following</w:t>
-      </w:r>
-      <w:r>
-        <w:rPr>
-          <w:color w:val="000000"/>
-        </w:rPr>
-        <w:t xml:space="preserve"> steps in the stated order:</w:t>
+        <w:t>Each CD workflow must include the following steps in the stated order:</w:t>
       </w:r>
     </w:p>
     <w:p/>
@@ -8744,13 +8422,7 @@
         <w:rPr>
           <w:color w:val="000000"/>
         </w:rPr>
-        <w:t>The job must declare the appropriate GitHub Environment (environment: devel</w:t>
-      </w:r>
-      <w:r>
-        <w:rPr>
-          <w:color w:val="000000"/>
-        </w:rPr>
-        <w:t>opment | staging | production) so that the environment-level deploy hook secret is injected into the job.</w:t>
+        <w:t>The job must declare the appropriate GitHub Environment (environment: development | staging | production) so that the environment-level deploy hook secret is injected into the job.</w:t>
       </w:r>
     </w:p>
     <w:p>
@@ -8790,13 +8462,7 @@
         <w:rPr>
           <w:color w:val="000000"/>
         </w:rPr>
-        <w:t xml:space="preserve">Send an </w:t>
-      </w:r>
-      <w:r>
-        <w:rPr>
-          <w:color w:val="000000"/>
-        </w:rPr>
-        <w:t>HTTP POST request to the Render deploy hook URL using curl:</w:t>
+        <w:t>Send an HTTP POST request to the Render deploy hook URL using curl:</w:t>
       </w:r>
     </w:p>
     <w:p>
@@ -8841,16 +8507,7 @@
           <w:sz w:val="20"/>
           <w:szCs w:val="20"/>
         </w:rPr>
-        <w:t>curl -X POST ${{ secrets.RENDER_DEPLOY_HOOK_PROD_</w:t>
-      </w:r>
-      <w:r>
-        <w:rPr>
-          <w:rFonts w:ascii="Courier New" w:eastAsia="Courier New" w:hAnsi="Courier New" w:cs="Courier New"/>
-          <w:color w:val="C7254E"/>
-          <w:sz w:val="20"/>
-          <w:szCs w:val="20"/>
-        </w:rPr>
-        <w:t>URL }}    # cd-prod.yml</w:t>
+        <w:t>curl -X POST ${{ secrets.RENDER_DEPLOY_HOOK_PROD_URL }}    # cd-prod.yml</w:t>
       </w:r>
     </w:p>
     <w:p>
@@ -8891,13 +8548,7 @@
         <w:rPr>
           <w:color w:val="000000"/>
         </w:rPr>
-        <w:t>Output a timestamped deployment confirmat</w:t>
-      </w:r>
-      <w:r>
-        <w:rPr>
-          <w:color w:val="000000"/>
-        </w:rPr>
-        <w:t>ion message as the final step using echo, e.g.: echo "Deployment to &lt;environment&gt; triggered at $(date)"</w:t>
+        <w:t>Output a timestamped deployment confirmation message as the final step using echo, e.g.: echo "Deployment to &lt;environment&gt; triggered at $(date)"</w:t>
       </w:r>
     </w:p>
     <w:p>
@@ -8953,13 +8604,7 @@
         <w:rPr>
           <w:color w:val="000000"/>
         </w:rPr>
-        <w:t xml:space="preserve">The job must </w:t>
-      </w:r>
-      <w:r>
-        <w:rPr>
-          <w:color w:val="000000"/>
-        </w:rPr>
-        <w:t>NOT contain any Docker build or push steps – those responsibilities belong exclusively to the CI workflows.</w:t>
+        <w:t>The job must NOT contain any Docker build or push steps – those responsibilities belong exclusively to the CI workflows.</w:t>
       </w:r>
     </w:p>
     <w:p>
@@ -8975,13 +8620,7 @@
         <w:rPr>
           <w:color w:val="000000"/>
         </w:rPr>
-        <w:t xml:space="preserve">The workflow must be triggered only on push events to the specified branch (no workflow_dispatch or schedule triggers are required, though they may </w:t>
-      </w:r>
-      <w:r>
-        <w:rPr>
-          <w:color w:val="000000"/>
-        </w:rPr>
-        <w:t>be added as extras).</w:t>
+        <w:t>The workflow must be triggered only on push events to the specified branch (no workflow_dispatch or schedule triggers are required, though they may be added as extras).</w:t>
       </w:r>
     </w:p>
     <w:p/>
@@ -9024,13 +8663,7 @@
         <w:rPr>
           <w:color w:val="000000"/>
         </w:rPr>
-        <w:t>Base image: nginx:alpine (official Nginx image on Alpine Linux). Reference: https://hub.docker.com/_/n</w:t>
-      </w:r>
-      <w:r>
-        <w:rPr>
-          <w:color w:val="000000"/>
-        </w:rPr>
-        <w:t>ginx</w:t>
+        <w:t>Base image: nginx:alpine (official Nginx image on Alpine Linux). Reference: https://hub.docker.com/_/nginx</w:t>
       </w:r>
     </w:p>
     <w:p>
@@ -9094,13 +8727,7 @@
         <w:rPr>
           <w:color w:val="000000"/>
         </w:rPr>
-        <w:t xml:space="preserve">The </w:t>
-      </w:r>
-      <w:r>
-        <w:rPr>
-          <w:color w:val="000000"/>
-        </w:rPr>
-        <w:t>Dockerfile must be placed in the repository root (not in a subdirectory).</w:t>
+        <w:t>The Dockerfile must be placed in the repository root (not in a subdirectory).</w:t>
       </w:r>
     </w:p>
     <w:p/>
@@ -9188,17 +8815,7 @@
           <w:sz w:val="20"/>
           <w:szCs w:val="20"/>
         </w:rPr>
-        <w:t>Reference – Docker Official nginx Image: https://hu</w:t>
-      </w:r>
-      <w:r>
-        <w:rPr>
-          <w:i/>
-          <w:iCs/>
-          <w:color w:val="595959"/>
-          <w:sz w:val="20"/>
-          <w:szCs w:val="20"/>
-        </w:rPr>
-        <w:t>b.docker.com/_/nginx | Dockerfile Reference: https://docs.docker.com/reference/dockerfile/</w:t>
+        <w:t>Reference – Docker Official nginx Image: https://hub.docker.com/_/nginx | Dockerfile Reference: https://docs.docker.com/reference/dockerfile/</w:t>
       </w:r>
     </w:p>
     <w:p/>
@@ -9218,13 +8835,7 @@
         <w:rPr>
           <w:color w:val="000000"/>
         </w:rPr>
-        <w:t>All pages must comply with the following standards. Pages not meeting these requirements will not receive full marks for the page development</w:t>
-      </w:r>
-      <w:r>
-        <w:rPr>
-          <w:color w:val="000000"/>
-        </w:rPr>
-        <w:t xml:space="preserve"> task.</w:t>
+        <w:t>All pages must comply with the following standards. Pages not meeting these requirements will not receive full marks for the page development task.</w:t>
       </w:r>
     </w:p>
     <w:p/>
@@ -9289,13 +8900,7 @@
         <w:rPr>
           <w:color w:val="000000"/>
         </w:rPr>
-        <w:t>Every</w:t>
-      </w:r>
-      <w:r>
-        <w:rPr>
-          <w:color w:val="000000"/>
-        </w:rPr>
-        <w:t xml:space="preserve"> page must contain a consistent navigation bar (&lt;nav&gt;) with anchor links to all five destination pages and the home page.</w:t>
+        <w:t>Every page must contain a consistent navigation bar (&lt;nav&gt;) with anchor links to all five destination pages and the home page.</w:t>
       </w:r>
     </w:p>
     <w:p>
@@ -9327,13 +8932,7 @@
         <w:rPr>
           <w:color w:val="000000"/>
         </w:rPr>
-        <w:t>No JavaScript: &lt;script&gt; tags, inline</w:t>
-      </w:r>
-      <w:r>
-        <w:rPr>
-          <w:color w:val="000000"/>
-        </w:rPr>
-        <w:t xml:space="preserve"> event handlers (onclick, onsubmit, etc.), and external .js file links are strictly prohibited.</w:t>
+        <w:t>No JavaScript: &lt;script&gt; tags, inline event handlers (onclick, onsubmit, etc.), and external .js file links are strictly prohibited.</w:t>
       </w:r>
     </w:p>
     <w:p>
@@ -9349,13 +8948,7 @@
         <w:rPr>
           <w:color w:val="000000"/>
         </w:rPr>
-        <w:t>All images must use HTML &lt;figure&gt; and &lt;figcaption&gt; elements with descriptive alt attributes. Actual image files are optional; a styled empty &lt;div class="img-pla</w:t>
-      </w:r>
-      <w:r>
-        <w:rPr>
-          <w:color w:val="000000"/>
-        </w:rPr>
-        <w:t>ceholder"&gt; with a descriptive label inside is acceptable.</w:t>
+        <w:t>All images must use HTML &lt;figure&gt; and &lt;figcaption&gt; elements with descriptive alt attributes. Actual image files are optional; a styled empty &lt;div class="img-placeholder"&gt; with a descriptive label inside is acceptable.</w:t>
       </w:r>
     </w:p>
     <w:p>
@@ -9387,17 +8980,7 @@
           <w:sz w:val="20"/>
           <w:szCs w:val="20"/>
         </w:rPr>
-        <w:t>Reference – HTML5 Specification: https://html.spec.whatwg.org/ | MDN HTML Reference: http</w:t>
-      </w:r>
-      <w:r>
-        <w:rPr>
-          <w:i/>
-          <w:iCs/>
-          <w:color w:val="595959"/>
-          <w:sz w:val="20"/>
-          <w:szCs w:val="20"/>
-        </w:rPr>
-        <w:t>s://developer.mozilla.org/en-US/docs/Web/HTML</w:t>
+        <w:t>Reference – HTML5 Specification: https://html.spec.whatwg.org/ | MDN HTML Reference: https://developer.mozilla.org/en-US/docs/Web/HTML</w:t>
       </w:r>
     </w:p>
     <w:p/>
@@ -9418,13 +9001,7 @@
         <w:rPr>
           <w:color w:val="000000"/>
         </w:rPr>
-        <w:t xml:space="preserve">The Team Lead must create a shared style.css in the repository root. All team members must link their page to this file and must NOT create separate CSS files. Additional inline </w:t>
-      </w:r>
-      <w:r>
-        <w:rPr>
-          <w:color w:val="000000"/>
-        </w:rPr>
-        <w:t>&lt;style&gt; blocks within individual pages are permitted for minor page-specific overrides only.</w:t>
+        <w:t>The Team Lead must create a shared style.css in the repository root. All team members must link their page to this file and must NOT create separate CSS files. Additional inline &lt;style&gt; blocks within individual pages are permitted for minor page-specific overrides only.</w:t>
       </w:r>
     </w:p>
     <w:p/>
@@ -9457,13 +9034,7 @@
         <w:rPr>
           <w:color w:val="000000"/>
         </w:rPr>
-        <w:t xml:space="preserve">Provide base styles for: body, h1–h3, p, a, nav, ul/li, table, th, </w:t>
-      </w:r>
-      <w:r>
-        <w:rPr>
-          <w:color w:val="000000"/>
-        </w:rPr>
-        <w:t>td, footer.</w:t>
+        <w:t>Provide base styles for: body, h1–h3, p, a, nav, ul/li, table, th, td, footer.</w:t>
       </w:r>
     </w:p>
     <w:p>
@@ -9495,13 +9066,7 @@
         <w:rPr>
           <w:color w:val="000000"/>
         </w:rPr>
-        <w:t>Provide a .img-placeholder class that renders an empty box (e.g., 200px × 150px, with a border and background colour) as a stand-in for actual</w:t>
-      </w:r>
-      <w:r>
-        <w:rPr>
-          <w:color w:val="000000"/>
-        </w:rPr>
-        <w:t xml:space="preserve"> images.</w:t>
+        <w:t>Provide a .img-placeholder class that renders an empty box (e.g., 200px × 150px, with a border and background colour) as a stand-in for actual images.</w:t>
       </w:r>
     </w:p>
     <w:p>
@@ -9549,17 +9114,7 @@
           <w:sz w:val="20"/>
           <w:szCs w:val="20"/>
         </w:rPr>
-        <w:t>Reference – CSS Reference: https://developer</w:t>
-      </w:r>
-      <w:r>
-        <w:rPr>
-          <w:i/>
-          <w:iCs/>
-          <w:color w:val="595959"/>
-          <w:sz w:val="20"/>
-          <w:szCs w:val="20"/>
-        </w:rPr>
-        <w:t>.mozilla.org/en-US/docs/Web/CSS | CSS Custom Properties: https://developer.mozilla.org/en-US/docs/Web/CSS/Using_CSS_custom_properties</w:t>
+        <w:t>Reference – CSS Reference: https://developer.mozilla.org/en-US/docs/Web/CSS | CSS Custom Properties: https://developer.mozilla.org/en-US/docs/Web/CSS/Using_CSS_custom_properties</w:t>
       </w:r>
     </w:p>
     <w:p/>
@@ -9745,17 +9300,7 @@
                 <w:sz w:val="20"/>
                 <w:szCs w:val="20"/>
               </w:rPr>
-              <w:t>Key Ste</w:t>
-            </w:r>
-            <w:r>
-              <w:rPr>
-                <w:b/>
-                <w:bCs/>
-                <w:color w:val="FFFFFF"/>
-                <w:sz w:val="20"/>
-                <w:szCs w:val="20"/>
-              </w:rPr>
-              <w:t>ps</w:t>
+              <w:t>Key Steps</w:t>
             </w:r>
           </w:p>
         </w:tc>
@@ -9995,15 +9540,7 @@
                 <w:sz w:val="20"/>
                 <w:szCs w:val="20"/>
               </w:rPr>
-              <w:t>Checkout → env: development → curl POST RENDER_DEPLOY_HOOK_DEV_URL</w:t>
-            </w:r>
-            <w:r>
-              <w:rPr>
-                <w:color w:val="000000"/>
-                <w:sz w:val="20"/>
-                <w:szCs w:val="20"/>
-              </w:rPr>
-              <w:t xml:space="preserve"> → echo confirmation</w:t>
+              <w:t>Checkout → env: development → curl POST RENDER_DEPLOY_HOOK_DEV_URL → echo confirmation</w:t>
             </w:r>
           </w:p>
         </w:tc>
@@ -10243,15 +9780,7 @@
                 <w:sz w:val="20"/>
                 <w:szCs w:val="20"/>
               </w:rPr>
-              <w:t xml:space="preserve">Checkout → env: staging → curl POST </w:t>
-            </w:r>
-            <w:r>
-              <w:rPr>
-                <w:color w:val="000000"/>
-                <w:sz w:val="20"/>
-                <w:szCs w:val="20"/>
-              </w:rPr>
-              <w:t>RENDER_DEPLOY_HOOK_STAGING_URL → echo confirmation</w:t>
+              <w:t>Checkout → env: staging → curl POST RENDER_DEPLOY_HOOK_STAGING_URL → echo confirmation</w:t>
             </w:r>
           </w:p>
         </w:tc>
@@ -10491,15 +10020,7 @@
                 <w:sz w:val="20"/>
                 <w:szCs w:val="20"/>
               </w:rPr>
-              <w:t xml:space="preserve">Checkout → env: </w:t>
-            </w:r>
-            <w:r>
-              <w:rPr>
-                <w:color w:val="000000"/>
-                <w:sz w:val="20"/>
-                <w:szCs w:val="20"/>
-              </w:rPr>
-              <w:t>production → curl POST RENDER_DEPLOY_HOOK_PROD_URL → echo confirmation</w:t>
+              <w:t>Checkout → env: production → curl POST RENDER_DEPLOY_HOOK_PROD_URL → echo confirmation</w:t>
             </w:r>
           </w:p>
         </w:tc>
@@ -10547,13 +10068,7 @@
         <w:rPr>
           <w:color w:val="000000"/>
         </w:rPr>
-        <w:t xml:space="preserve">Create a new GitHub repository from scratch (pakvista-cicd or team-agreed name). Do </w:t>
-      </w:r>
-      <w:r>
-        <w:rPr>
-          <w:color w:val="000000"/>
-        </w:rPr>
-        <w:t>NOT reuse any previous repository.</w:t>
+        <w:t>Create a new GitHub repository from scratch (pakvista-cicd or team-agreed name). Do NOT reuse any previous repository.</w:t>
       </w:r>
     </w:p>
     <w:p>
@@ -10585,13 +10100,7 @@
         <w:rPr>
           <w:color w:val="000000"/>
         </w:rPr>
-        <w:t>Apply Branch Protection Rules on develop, staging, and main – require CI to pass and require at least one review before</w:t>
-      </w:r>
-      <w:r>
-        <w:rPr>
-          <w:color w:val="000000"/>
-        </w:rPr>
-        <w:t xml:space="preserve"> merging.</w:t>
+        <w:t>Apply Branch Protection Rules on develop, staging, and main – require CI to pass and require at least one review before merging.</w:t>
       </w:r>
     </w:p>
     <w:p>
@@ -10623,13 +10132,7 @@
         <w:rPr>
           <w:color w:val="000000"/>
         </w:rPr>
-        <w:t xml:space="preserve">Create three Render Web Services (pakvista-dev, pakvista-staging, pakvista-prod) each connected to the TL's Docker Hub image. Copy each </w:t>
-      </w:r>
-      <w:r>
-        <w:rPr>
-          <w:color w:val="000000"/>
-        </w:rPr>
-        <w:t>deploy hook URL and store it in the correct GitHub Environment secret.</w:t>
+        <w:t>Create three Render Web Services (pakvista-dev, pakvista-staging, pakvista-prod) each connected to the TL's Docker Hub image. Copy each deploy hook URL and store it in the correct GitHub Environment secret.</w:t>
       </w:r>
     </w:p>
     <w:p>
@@ -10661,13 +10164,7 @@
         <w:rPr>
           <w:color w:val="000000"/>
         </w:rPr>
-        <w:t xml:space="preserve">Set up the initial repository structure: commit style.css, the Dockerfile, and a skeleton index.html (Home / Welcome </w:t>
-      </w:r>
-      <w:r>
-        <w:rPr>
-          <w:color w:val="000000"/>
-        </w:rPr>
-        <w:t>page).</w:t>
+        <w:t>Set up the initial repository structure: commit style.css, the Dockerfile, and a skeleton index.html (Home / Welcome page).</w:t>
       </w:r>
     </w:p>
     <w:p>
@@ -10716,13 +10213,7 @@
           <w:color w:val="000000"/>
         </w:rPr>
         <w:lastRenderedPageBreak/>
-        <w:t xml:space="preserve">After all five PRs </w:t>
-      </w:r>
-      <w:r>
-        <w:rPr>
-          <w:color w:val="000000"/>
-        </w:rPr>
-        <w:t>are merged into develop, promote the changes: open a PR from develop → staging, merge it; then from staging → main, merge it. Verify the CI and CD pipelines fire correctly for each promotion.</w:t>
+        <w:t>After all five PRs are merged into develop, promote the changes: open a PR from develop → staging, merge it; then from staging → main, merge it. Verify the CI and CD pipelines fire correctly for each promotion.</w:t>
       </w:r>
     </w:p>
     <w:p/>
@@ -10747,13 +10238,7 @@
         <w:rPr>
           <w:color w:val="000000"/>
         </w:rPr>
-        <w:t>Create a personal fea</w:t>
-      </w:r>
-      <w:r>
-        <w:rPr>
-          <w:color w:val="000000"/>
-        </w:rPr>
-        <w:t>ture branch from develop using the convention: feature/&lt;github-username&gt;/&lt;page-name&gt;.</w:t>
+        <w:t>Create a personal feature branch from develop using the convention: feature/&lt;github-username&gt;/&lt;page-name&gt;.</w:t>
       </w:r>
     </w:p>
     <w:p>
@@ -10785,13 +10270,7 @@
         <w:rPr>
           <w:color w:val="000000"/>
         </w:rPr>
-        <w:t>Author the assigned workflow file (Table 3) in .</w:t>
-      </w:r>
-      <w:r>
-        <w:rPr>
-          <w:color w:val="000000"/>
-        </w:rPr>
-        <w:t>github/workflows/. The workflow must be syntactically correct, well-commented YAML.</w:t>
+        <w:t>Author the assigned workflow file (Table 3) in .github/workflows/. The workflow must be syntactically correct, well-commented YAML.</w:t>
       </w:r>
     </w:p>
     <w:p>
@@ -10823,13 +10302,7 @@
         <w:rPr>
           <w:color w:val="000000"/>
         </w:rPr>
-        <w:t>Open a Pull Request targeting the develop branch with a meaningful PR description.</w:t>
-      </w:r>
-      <w:r>
-        <w:rPr>
-          <w:color w:val="000000"/>
-        </w:rPr>
-        <w:t xml:space="preserve"> Verify the CI workflow (ci-dev.yml) fires and all steps pass.</w:t>
+        <w:t>Open a Pull Request targeting the develop branch with a meaningful PR description. Verify the CI workflow (ci-dev.yml) fires and all steps pass.</w:t>
       </w:r>
     </w:p>
     <w:p>
@@ -10861,13 +10334,7 @@
         <w:rPr>
           <w:color w:val="000000"/>
         </w:rPr>
-        <w:t xml:space="preserve">Verify the live PakVista Development site on Render reflects the </w:t>
-      </w:r>
-      <w:r>
-        <w:rPr>
-          <w:color w:val="000000"/>
-        </w:rPr>
-        <w:t>newly added page.</w:t>
+        <w:t>Verify the live PakVista Development site on Render reflects the newly added page.</w:t>
       </w:r>
     </w:p>
     <w:p>
@@ -11050,17 +10517,7 @@
                 <w:sz w:val="20"/>
                 <w:szCs w:val="20"/>
               </w:rPr>
-              <w:t xml:space="preserve">Max </w:t>
-            </w:r>
-            <w:r>
-              <w:rPr>
-                <w:b/>
-                <w:bCs/>
-                <w:color w:val="FFFFFF"/>
-                <w:sz w:val="20"/>
-                <w:szCs w:val="20"/>
-              </w:rPr>
-              <w:t>Marks</w:t>
+              <w:t>Max Marks</w:t>
             </w:r>
           </w:p>
         </w:tc>
@@ -11288,15 +10745,7 @@
                 <w:sz w:val="20"/>
                 <w:szCs w:val="20"/>
               </w:rPr>
-              <w:t xml:space="preserve">Version the Term Project document </w:t>
-            </w:r>
-            <w:r>
-              <w:rPr>
-                <w:color w:val="000000"/>
-                <w:sz w:val="20"/>
-                <w:szCs w:val="20"/>
-              </w:rPr>
-              <w:t>(TermProject_Spring2026.docx) inside the repo root; each member fills their row in Table 1 including Assigned Workflow File and Assigned Page.</w:t>
+              <w:t>Version the Term Project document (TermProject_Spring2026.docx) inside the repo root; each member fills their row in Table 1 including Assigned Workflow File and Assigned Page.</w:t>
             </w:r>
           </w:p>
         </w:tc>
@@ -11459,15 +10908,7 @@
                 <w:sz w:val="20"/>
                 <w:szCs w:val="20"/>
               </w:rPr>
-              <w:t xml:space="preserve">Create three GitHub </w:t>
-            </w:r>
-            <w:r>
-              <w:rPr>
-                <w:color w:val="000000"/>
-                <w:sz w:val="20"/>
-                <w:szCs w:val="20"/>
-              </w:rPr>
-              <w:t>Environments: development, staging, production.</w:t>
+              <w:t>Create three GitHub Environments: development, staging, production.</w:t>
             </w:r>
           </w:p>
         </w:tc>
@@ -11661,15 +11102,7 @@
                 <w:sz w:val="20"/>
                 <w:szCs w:val="20"/>
               </w:rPr>
-              <w:t xml:space="preserve">Configure three environment-level secrets: RENDER_DEPLOY_HOOK_DEV_URL, </w:t>
-            </w:r>
-            <w:r>
-              <w:rPr>
-                <w:color w:val="000000"/>
-                <w:sz w:val="20"/>
-                <w:szCs w:val="20"/>
-              </w:rPr>
-              <w:t>RENDER_DEPLOY_HOOK_STAGING_URL, RENDER_DEPLOY_HOOK_PROD_URL inside their respective GitHub Environments.</w:t>
+              <w:t>Configure three environment-level secrets: RENDER_DEPLOY_HOOK_DEV_URL, RENDER_DEPLOY_HOOK_STAGING_URL, RENDER_DEPLOY_HOOK_PROD_URL inside their respective GitHub Environments.</w:t>
             </w:r>
           </w:p>
         </w:tc>
@@ -11831,8 +11264,31 @@
                 <w:sz w:val="21"/>
                 <w:szCs w:val="21"/>
               </w:rPr>
-              <w:t xml:space="preserve">HTML Page Development </w:t>
-            </w:r>
+              <w:t>HTML Page Development (Full Git &amp; GitHub Flow)</w:t>
+            </w:r>
+          </w:p>
+        </w:tc>
+        <w:tc>
+          <w:tcPr>
+            <w:tcW w:w="2000" w:type="dxa"/>
+            <w:tcBorders>
+              <w:top w:val="single" w:sz="1" w:space="0" w:color="AAAAAA"/>
+              <w:left w:val="single" w:sz="1" w:space="0" w:color="AAAAAA"/>
+              <w:bottom w:val="single" w:sz="1" w:space="0" w:color="AAAAAA"/>
+              <w:right w:val="single" w:sz="1" w:space="0" w:color="AAAAAA"/>
+            </w:tcBorders>
+            <w:shd w:val="clear" w:color="auto" w:fill="D5E8F0"/>
+            <w:tcMar>
+              <w:top w:w="80" w:type="dxa"/>
+              <w:left w:w="120" w:type="dxa"/>
+              <w:bottom w:w="80" w:type="dxa"/>
+              <w:right w:w="120" w:type="dxa"/>
+            </w:tcMar>
+          </w:tcPr>
+          <w:p>
+            <w:pPr>
+              <w:jc w:val="center"/>
+            </w:pPr>
             <w:r>
               <w:rPr>
                 <w:b/>
@@ -11841,26 +11297,29 @@
                 <w:sz w:val="21"/>
                 <w:szCs w:val="21"/>
               </w:rPr>
-              <w:t>(Full Git &amp; GitHub Flow)</w:t>
-            </w:r>
-          </w:p>
-        </w:tc>
-        <w:tc>
-          <w:tcPr>
-            <w:tcW w:w="2000" w:type="dxa"/>
-            <w:tcBorders>
-              <w:top w:val="single" w:sz="1" w:space="0" w:color="AAAAAA"/>
-              <w:left w:val="single" w:sz="1" w:space="0" w:color="AAAAAA"/>
-              <w:bottom w:val="single" w:sz="1" w:space="0" w:color="AAAAAA"/>
-              <w:right w:val="single" w:sz="1" w:space="0" w:color="AAAAAA"/>
-            </w:tcBorders>
-            <w:shd w:val="clear" w:color="auto" w:fill="D5E8F0"/>
-            <w:tcMar>
-              <w:top w:w="80" w:type="dxa"/>
-              <w:left w:w="120" w:type="dxa"/>
-              <w:bottom w:w="80" w:type="dxa"/>
-              <w:right w:w="120" w:type="dxa"/>
-            </w:tcMar>
+              <w:t>20 Marks</w:t>
+            </w:r>
+          </w:p>
+        </w:tc>
+      </w:tr>
+      <w:tr>
+        <w:tc>
+          <w:tcPr>
+            <w:tcW w:w="500" w:type="dxa"/>
+            <w:tcBorders>
+              <w:top w:val="single" w:sz="1" w:space="0" w:color="AAAAAA"/>
+              <w:left w:val="single" w:sz="1" w:space="0" w:color="AAAAAA"/>
+              <w:bottom w:val="single" w:sz="1" w:space="0" w:color="AAAAAA"/>
+              <w:right w:val="single" w:sz="1" w:space="0" w:color="AAAAAA"/>
+            </w:tcBorders>
+            <w:shd w:val="clear" w:color="auto" w:fill="EBF3FA"/>
+            <w:tcMar>
+              <w:top w:w="80" w:type="dxa"/>
+              <w:left w:w="120" w:type="dxa"/>
+              <w:bottom w:w="80" w:type="dxa"/>
+              <w:right w:w="120" w:type="dxa"/>
+            </w:tcMar>
+            <w:vAlign w:val="center"/>
           </w:tcPr>
           <w:p>
             <w:pPr>
@@ -11870,33 +11329,326 @@
               <w:rPr>
                 <w:b/>
                 <w:bCs/>
+                <w:color w:val="000000"/>
+                <w:sz w:val="20"/>
+                <w:szCs w:val="20"/>
+              </w:rPr>
+              <w:t>7</w:t>
+            </w:r>
+          </w:p>
+        </w:tc>
+        <w:tc>
+          <w:tcPr>
+            <w:tcW w:w="6860" w:type="dxa"/>
+            <w:tcBorders>
+              <w:top w:val="single" w:sz="1" w:space="0" w:color="AAAAAA"/>
+              <w:left w:val="single" w:sz="1" w:space="0" w:color="AAAAAA"/>
+              <w:bottom w:val="single" w:sz="1" w:space="0" w:color="AAAAAA"/>
+              <w:right w:val="single" w:sz="1" w:space="0" w:color="AAAAAA"/>
+            </w:tcBorders>
+            <w:shd w:val="clear" w:color="auto" w:fill="EBF3FA"/>
+            <w:tcMar>
+              <w:top w:w="80" w:type="dxa"/>
+              <w:left w:w="120" w:type="dxa"/>
+              <w:bottom w:w="80" w:type="dxa"/>
+              <w:right w:w="120" w:type="dxa"/>
+            </w:tcMar>
+            <w:vAlign w:val="center"/>
+          </w:tcPr>
+          <w:p>
+            <w:r>
+              <w:rPr>
+                <w:color w:val="000000"/>
+                <w:sz w:val="20"/>
+                <w:szCs w:val="20"/>
+              </w:rPr>
+              <w:t>Each member creates their feature branch using the correct naming convention (feature/&lt;username&gt;/&lt;page-name&gt;).</w:t>
+            </w:r>
+          </w:p>
+        </w:tc>
+        <w:tc>
+          <w:tcPr>
+            <w:tcW w:w="2000" w:type="dxa"/>
+            <w:tcBorders>
+              <w:top w:val="single" w:sz="1" w:space="0" w:color="AAAAAA"/>
+              <w:left w:val="single" w:sz="1" w:space="0" w:color="AAAAAA"/>
+              <w:bottom w:val="single" w:sz="1" w:space="0" w:color="AAAAAA"/>
+              <w:right w:val="single" w:sz="1" w:space="0" w:color="AAAAAA"/>
+            </w:tcBorders>
+            <w:shd w:val="clear" w:color="auto" w:fill="EBF3FA"/>
+            <w:tcMar>
+              <w:top w:w="80" w:type="dxa"/>
+              <w:left w:w="120" w:type="dxa"/>
+              <w:bottom w:w="80" w:type="dxa"/>
+              <w:right w:w="120" w:type="dxa"/>
+            </w:tcMar>
+            <w:vAlign w:val="center"/>
+          </w:tcPr>
+          <w:p>
+            <w:pPr>
+              <w:jc w:val="center"/>
+            </w:pPr>
+            <w:r>
+              <w:rPr>
+                <w:color w:val="000000"/>
+                <w:sz w:val="20"/>
+                <w:szCs w:val="20"/>
+              </w:rPr>
+              <w:t>4</w:t>
+            </w:r>
+          </w:p>
+        </w:tc>
+      </w:tr>
+      <w:tr>
+        <w:tc>
+          <w:tcPr>
+            <w:tcW w:w="500" w:type="dxa"/>
+            <w:tcBorders>
+              <w:top w:val="single" w:sz="1" w:space="0" w:color="AAAAAA"/>
+              <w:left w:val="single" w:sz="1" w:space="0" w:color="AAAAAA"/>
+              <w:bottom w:val="single" w:sz="1" w:space="0" w:color="AAAAAA"/>
+              <w:right w:val="single" w:sz="1" w:space="0" w:color="AAAAAA"/>
+            </w:tcBorders>
+            <w:shd w:val="clear" w:color="auto" w:fill="FFFFFF"/>
+            <w:tcMar>
+              <w:top w:w="80" w:type="dxa"/>
+              <w:left w:w="120" w:type="dxa"/>
+              <w:bottom w:w="80" w:type="dxa"/>
+              <w:right w:w="120" w:type="dxa"/>
+            </w:tcMar>
+            <w:vAlign w:val="center"/>
+          </w:tcPr>
+          <w:p>
+            <w:pPr>
+              <w:jc w:val="center"/>
+            </w:pPr>
+            <w:r>
+              <w:rPr>
+                <w:b/>
+                <w:bCs/>
+                <w:color w:val="000000"/>
+                <w:sz w:val="20"/>
+                <w:szCs w:val="20"/>
+              </w:rPr>
+              <w:t>8</w:t>
+            </w:r>
+          </w:p>
+        </w:tc>
+        <w:tc>
+          <w:tcPr>
+            <w:tcW w:w="6860" w:type="dxa"/>
+            <w:tcBorders>
+              <w:top w:val="single" w:sz="1" w:space="0" w:color="AAAAAA"/>
+              <w:left w:val="single" w:sz="1" w:space="0" w:color="AAAAAA"/>
+              <w:bottom w:val="single" w:sz="1" w:space="0" w:color="AAAAAA"/>
+              <w:right w:val="single" w:sz="1" w:space="0" w:color="AAAAAA"/>
+            </w:tcBorders>
+            <w:shd w:val="clear" w:color="auto" w:fill="FFFFFF"/>
+            <w:tcMar>
+              <w:top w:w="80" w:type="dxa"/>
+              <w:left w:w="120" w:type="dxa"/>
+              <w:bottom w:w="80" w:type="dxa"/>
+              <w:right w:w="120" w:type="dxa"/>
+            </w:tcMar>
+            <w:vAlign w:val="center"/>
+          </w:tcPr>
+          <w:p>
+            <w:r>
+              <w:rPr>
+                <w:color w:val="000000"/>
+                <w:sz w:val="20"/>
+                <w:szCs w:val="20"/>
+              </w:rPr>
+              <w:t>Each member builds their assigned HTML page with complete, relevant content (no Lorem Ipsum), linked to shared style.css, no JavaScript.</w:t>
+            </w:r>
+          </w:p>
+        </w:tc>
+        <w:tc>
+          <w:tcPr>
+            <w:tcW w:w="2000" w:type="dxa"/>
+            <w:tcBorders>
+              <w:top w:val="single" w:sz="1" w:space="0" w:color="AAAAAA"/>
+              <w:left w:val="single" w:sz="1" w:space="0" w:color="AAAAAA"/>
+              <w:bottom w:val="single" w:sz="1" w:space="0" w:color="AAAAAA"/>
+              <w:right w:val="single" w:sz="1" w:space="0" w:color="AAAAAA"/>
+            </w:tcBorders>
+            <w:shd w:val="clear" w:color="auto" w:fill="FFFFFF"/>
+            <w:tcMar>
+              <w:top w:w="80" w:type="dxa"/>
+              <w:left w:w="120" w:type="dxa"/>
+              <w:bottom w:w="80" w:type="dxa"/>
+              <w:right w:w="120" w:type="dxa"/>
+            </w:tcMar>
+            <w:vAlign w:val="center"/>
+          </w:tcPr>
+          <w:p>
+            <w:pPr>
+              <w:jc w:val="center"/>
+            </w:pPr>
+            <w:r>
+              <w:rPr>
+                <w:color w:val="000000"/>
+                <w:sz w:val="20"/>
+                <w:szCs w:val="20"/>
+              </w:rPr>
+              <w:t>10</w:t>
+            </w:r>
+          </w:p>
+        </w:tc>
+      </w:tr>
+      <w:tr>
+        <w:tc>
+          <w:tcPr>
+            <w:tcW w:w="500" w:type="dxa"/>
+            <w:tcBorders>
+              <w:top w:val="single" w:sz="1" w:space="0" w:color="AAAAAA"/>
+              <w:left w:val="single" w:sz="1" w:space="0" w:color="AAAAAA"/>
+              <w:bottom w:val="single" w:sz="1" w:space="0" w:color="AAAAAA"/>
+              <w:right w:val="single" w:sz="1" w:space="0" w:color="AAAAAA"/>
+            </w:tcBorders>
+            <w:shd w:val="clear" w:color="auto" w:fill="EBF3FA"/>
+            <w:tcMar>
+              <w:top w:w="80" w:type="dxa"/>
+              <w:left w:w="120" w:type="dxa"/>
+              <w:bottom w:w="80" w:type="dxa"/>
+              <w:right w:w="120" w:type="dxa"/>
+            </w:tcMar>
+            <w:vAlign w:val="center"/>
+          </w:tcPr>
+          <w:p>
+            <w:pPr>
+              <w:jc w:val="center"/>
+            </w:pPr>
+            <w:r>
+              <w:rPr>
+                <w:b/>
+                <w:bCs/>
+                <w:color w:val="000000"/>
+                <w:sz w:val="20"/>
+                <w:szCs w:val="20"/>
+              </w:rPr>
+              <w:t>9</w:t>
+            </w:r>
+          </w:p>
+        </w:tc>
+        <w:tc>
+          <w:tcPr>
+            <w:tcW w:w="6860" w:type="dxa"/>
+            <w:tcBorders>
+              <w:top w:val="single" w:sz="1" w:space="0" w:color="AAAAAA"/>
+              <w:left w:val="single" w:sz="1" w:space="0" w:color="AAAAAA"/>
+              <w:bottom w:val="single" w:sz="1" w:space="0" w:color="AAAAAA"/>
+              <w:right w:val="single" w:sz="1" w:space="0" w:color="AAAAAA"/>
+            </w:tcBorders>
+            <w:shd w:val="clear" w:color="auto" w:fill="EBF3FA"/>
+            <w:tcMar>
+              <w:top w:w="80" w:type="dxa"/>
+              <w:left w:w="120" w:type="dxa"/>
+              <w:bottom w:w="80" w:type="dxa"/>
+              <w:right w:w="120" w:type="dxa"/>
+            </w:tcMar>
+            <w:vAlign w:val="center"/>
+          </w:tcPr>
+          <w:p>
+            <w:r>
+              <w:rPr>
+                <w:color w:val="000000"/>
+                <w:sz w:val="20"/>
+                <w:szCs w:val="20"/>
+              </w:rPr>
+              <w:t>Each member opens a PR targeting develop with a meaningful description; CI passes before merge.</w:t>
+            </w:r>
+            <w:r>
+              <w:rPr>
+                <w:color w:val="000000"/>
+                <w:sz w:val="20"/>
+                <w:szCs w:val="20"/>
+              </w:rPr>
+              <w:t xml:space="preserve"> </w:t>
+            </w:r>
+          </w:p>
+        </w:tc>
+        <w:tc>
+          <w:tcPr>
+            <w:tcW w:w="2000" w:type="dxa"/>
+            <w:tcBorders>
+              <w:top w:val="single" w:sz="1" w:space="0" w:color="AAAAAA"/>
+              <w:left w:val="single" w:sz="1" w:space="0" w:color="AAAAAA"/>
+              <w:bottom w:val="single" w:sz="1" w:space="0" w:color="AAAAAA"/>
+              <w:right w:val="single" w:sz="1" w:space="0" w:color="AAAAAA"/>
+            </w:tcBorders>
+            <w:shd w:val="clear" w:color="auto" w:fill="EBF3FA"/>
+            <w:tcMar>
+              <w:top w:w="80" w:type="dxa"/>
+              <w:left w:w="120" w:type="dxa"/>
+              <w:bottom w:w="80" w:type="dxa"/>
+              <w:right w:w="120" w:type="dxa"/>
+            </w:tcMar>
+            <w:vAlign w:val="center"/>
+          </w:tcPr>
+          <w:p>
+            <w:pPr>
+              <w:jc w:val="center"/>
+            </w:pPr>
+            <w:r>
+              <w:rPr>
+                <w:color w:val="000000"/>
+                <w:sz w:val="20"/>
+                <w:szCs w:val="20"/>
+              </w:rPr>
+              <w:t>6</w:t>
+            </w:r>
+          </w:p>
+        </w:tc>
+      </w:tr>
+      <w:tr>
+        <w:tc>
+          <w:tcPr>
+            <w:tcW w:w="7360" w:type="dxa"/>
+            <w:gridSpan w:val="2"/>
+            <w:tcBorders>
+              <w:top w:val="single" w:sz="1" w:space="0" w:color="AAAAAA"/>
+              <w:left w:val="single" w:sz="1" w:space="0" w:color="AAAAAA"/>
+              <w:bottom w:val="single" w:sz="1" w:space="0" w:color="AAAAAA"/>
+              <w:right w:val="single" w:sz="1" w:space="0" w:color="AAAAAA"/>
+            </w:tcBorders>
+            <w:shd w:val="clear" w:color="auto" w:fill="D5E8F0"/>
+            <w:tcMar>
+              <w:top w:w="80" w:type="dxa"/>
+              <w:left w:w="120" w:type="dxa"/>
+              <w:bottom w:w="80" w:type="dxa"/>
+              <w:right w:w="120" w:type="dxa"/>
+            </w:tcMar>
+          </w:tcPr>
+          <w:p>
+            <w:r>
+              <w:rPr>
+                <w:b/>
+                <w:bCs/>
                 <w:color w:val="1F3864"/>
                 <w:sz w:val="21"/>
                 <w:szCs w:val="21"/>
               </w:rPr>
-              <w:t>20 Marks</w:t>
-            </w:r>
-          </w:p>
-        </w:tc>
-      </w:tr>
-      <w:tr>
-        <w:tc>
-          <w:tcPr>
-            <w:tcW w:w="500" w:type="dxa"/>
-            <w:tcBorders>
-              <w:top w:val="single" w:sz="1" w:space="0" w:color="AAAAAA"/>
-              <w:left w:val="single" w:sz="1" w:space="0" w:color="AAAAAA"/>
-              <w:bottom w:val="single" w:sz="1" w:space="0" w:color="AAAAAA"/>
-              <w:right w:val="single" w:sz="1" w:space="0" w:color="AAAAAA"/>
-            </w:tcBorders>
-            <w:shd w:val="clear" w:color="auto" w:fill="EBF3FA"/>
-            <w:tcMar>
-              <w:top w:w="80" w:type="dxa"/>
-              <w:left w:w="120" w:type="dxa"/>
-              <w:bottom w:w="80" w:type="dxa"/>
-              <w:right w:w="120" w:type="dxa"/>
-            </w:tcMar>
-            <w:vAlign w:val="center"/>
+              <w:t>CI Pipelines – Build &amp; Push Docker Images (ci-dev, ci-staging, ci-prod)</w:t>
+            </w:r>
+          </w:p>
+        </w:tc>
+        <w:tc>
+          <w:tcPr>
+            <w:tcW w:w="2000" w:type="dxa"/>
+            <w:tcBorders>
+              <w:top w:val="single" w:sz="1" w:space="0" w:color="AAAAAA"/>
+              <w:left w:val="single" w:sz="1" w:space="0" w:color="AAAAAA"/>
+              <w:bottom w:val="single" w:sz="1" w:space="0" w:color="AAAAAA"/>
+              <w:right w:val="single" w:sz="1" w:space="0" w:color="AAAAAA"/>
+            </w:tcBorders>
+            <w:shd w:val="clear" w:color="auto" w:fill="D5E8F0"/>
+            <w:tcMar>
+              <w:top w:w="80" w:type="dxa"/>
+              <w:left w:w="120" w:type="dxa"/>
+              <w:bottom w:w="80" w:type="dxa"/>
+              <w:right w:w="120" w:type="dxa"/>
+            </w:tcMar>
           </w:tcPr>
           <w:p>
             <w:pPr>
@@ -11906,46 +11658,19 @@
               <w:rPr>
                 <w:b/>
                 <w:bCs/>
-                <w:color w:val="000000"/>
-                <w:sz w:val="20"/>
-                <w:szCs w:val="20"/>
-              </w:rPr>
-              <w:t>7</w:t>
-            </w:r>
-          </w:p>
-        </w:tc>
-        <w:tc>
-          <w:tcPr>
-            <w:tcW w:w="6860" w:type="dxa"/>
-            <w:tcBorders>
-              <w:top w:val="single" w:sz="1" w:space="0" w:color="AAAAAA"/>
-              <w:left w:val="single" w:sz="1" w:space="0" w:color="AAAAAA"/>
-              <w:bottom w:val="single" w:sz="1" w:space="0" w:color="AAAAAA"/>
-              <w:right w:val="single" w:sz="1" w:space="0" w:color="AAAAAA"/>
-            </w:tcBorders>
-            <w:shd w:val="clear" w:color="auto" w:fill="EBF3FA"/>
-            <w:tcMar>
-              <w:top w:w="80" w:type="dxa"/>
-              <w:left w:w="120" w:type="dxa"/>
-              <w:bottom w:w="80" w:type="dxa"/>
-              <w:right w:w="120" w:type="dxa"/>
-            </w:tcMar>
-            <w:vAlign w:val="center"/>
-          </w:tcPr>
-          <w:p>
-            <w:r>
-              <w:rPr>
-                <w:color w:val="000000"/>
-                <w:sz w:val="20"/>
-                <w:szCs w:val="20"/>
-              </w:rPr>
-              <w:t>Each member creates their feature branch using the correct naming convention (feature/&lt;username&gt;/&lt;page-name&gt;).</w:t>
-            </w:r>
-          </w:p>
-        </w:tc>
-        <w:tc>
-          <w:tcPr>
-            <w:tcW w:w="2000" w:type="dxa"/>
+                <w:color w:val="1F3864"/>
+                <w:sz w:val="21"/>
+                <w:szCs w:val="21"/>
+              </w:rPr>
+              <w:t>25 Marks</w:t>
+            </w:r>
+          </w:p>
+        </w:tc>
+      </w:tr>
+      <w:tr>
+        <w:tc>
+          <w:tcPr>
+            <w:tcW w:w="500" w:type="dxa"/>
             <w:tcBorders>
               <w:top w:val="single" w:sz="1" w:space="0" w:color="AAAAAA"/>
               <w:left w:val="single" w:sz="1" w:space="0" w:color="AAAAAA"/>
@@ -11967,26 +11692,55 @@
             </w:pPr>
             <w:r>
               <w:rPr>
-                <w:color w:val="000000"/>
-                <w:sz w:val="20"/>
-                <w:szCs w:val="20"/>
-              </w:rPr>
-              <w:t>4</w:t>
-            </w:r>
-          </w:p>
-        </w:tc>
-      </w:tr>
-      <w:tr>
-        <w:tc>
-          <w:tcPr>
-            <w:tcW w:w="500" w:type="dxa"/>
-            <w:tcBorders>
-              <w:top w:val="single" w:sz="1" w:space="0" w:color="AAAAAA"/>
-              <w:left w:val="single" w:sz="1" w:space="0" w:color="AAAAAA"/>
-              <w:bottom w:val="single" w:sz="1" w:space="0" w:color="AAAAAA"/>
-              <w:right w:val="single" w:sz="1" w:space="0" w:color="AAAAAA"/>
-            </w:tcBorders>
-            <w:shd w:val="clear" w:color="auto" w:fill="FFFFFF"/>
+                <w:b/>
+                <w:bCs/>
+                <w:color w:val="000000"/>
+                <w:sz w:val="20"/>
+                <w:szCs w:val="20"/>
+              </w:rPr>
+              <w:t>10</w:t>
+            </w:r>
+          </w:p>
+        </w:tc>
+        <w:tc>
+          <w:tcPr>
+            <w:tcW w:w="6860" w:type="dxa"/>
+            <w:tcBorders>
+              <w:top w:val="single" w:sz="1" w:space="0" w:color="AAAAAA"/>
+              <w:left w:val="single" w:sz="1" w:space="0" w:color="AAAAAA"/>
+              <w:bottom w:val="single" w:sz="1" w:space="0" w:color="AAAAAA"/>
+              <w:right w:val="single" w:sz="1" w:space="0" w:color="AAAAAA"/>
+            </w:tcBorders>
+            <w:shd w:val="clear" w:color="auto" w:fill="EBF3FA"/>
+            <w:tcMar>
+              <w:top w:w="80" w:type="dxa"/>
+              <w:left w:w="120" w:type="dxa"/>
+              <w:bottom w:w="80" w:type="dxa"/>
+              <w:right w:w="120" w:type="dxa"/>
+            </w:tcMar>
+            <w:vAlign w:val="center"/>
+          </w:tcPr>
+          <w:p>
+            <w:r>
+              <w:rPr>
+                <w:color w:val="000000"/>
+                <w:sz w:val="20"/>
+                <w:szCs w:val="20"/>
+              </w:rPr>
+              <w:t>ci-dev.yml: correct pull_request trigger targeting develop, all five mandatory steps present and correctly configured.</w:t>
+            </w:r>
+          </w:p>
+        </w:tc>
+        <w:tc>
+          <w:tcPr>
+            <w:tcW w:w="2000" w:type="dxa"/>
+            <w:tcBorders>
+              <w:top w:val="single" w:sz="1" w:space="0" w:color="AAAAAA"/>
+              <w:left w:val="single" w:sz="1" w:space="0" w:color="AAAAAA"/>
+              <w:bottom w:val="single" w:sz="1" w:space="0" w:color="AAAAAA"/>
+              <w:right w:val="single" w:sz="1" w:space="0" w:color="AAAAAA"/>
+            </w:tcBorders>
+            <w:shd w:val="clear" w:color="auto" w:fill="EBF3FA"/>
             <w:tcMar>
               <w:top w:w="80" w:type="dxa"/>
               <w:left w:w="120" w:type="dxa"/>
@@ -12001,8 +11755,6 @@
             </w:pPr>
             <w:r>
               <w:rPr>
-                <w:b/>
-                <w:bCs/>
                 <w:color w:val="000000"/>
                 <w:sz w:val="20"/>
                 <w:szCs w:val="20"/>
@@ -12011,46 +11763,11 @@
             </w:r>
           </w:p>
         </w:tc>
-        <w:tc>
-          <w:tcPr>
-            <w:tcW w:w="6860" w:type="dxa"/>
-            <w:tcBorders>
-              <w:top w:val="single" w:sz="1" w:space="0" w:color="AAAAAA"/>
-              <w:left w:val="single" w:sz="1" w:space="0" w:color="AAAAAA"/>
-              <w:bottom w:val="single" w:sz="1" w:space="0" w:color="AAAAAA"/>
-              <w:right w:val="single" w:sz="1" w:space="0" w:color="AAAAAA"/>
-            </w:tcBorders>
-            <w:shd w:val="clear" w:color="auto" w:fill="FFFFFF"/>
-            <w:tcMar>
-              <w:top w:w="80" w:type="dxa"/>
-              <w:left w:w="120" w:type="dxa"/>
-              <w:bottom w:w="80" w:type="dxa"/>
-              <w:right w:w="120" w:type="dxa"/>
-            </w:tcMar>
-            <w:vAlign w:val="center"/>
-          </w:tcPr>
-          <w:p>
-            <w:r>
-              <w:rPr>
-                <w:color w:val="000000"/>
-                <w:sz w:val="20"/>
-                <w:szCs w:val="20"/>
-              </w:rPr>
-              <w:t>Each member builds their assigned HTML page with complete, relevant content (no Lorem Ipsum), linked to</w:t>
-            </w:r>
-            <w:r>
-              <w:rPr>
-                <w:color w:val="000000"/>
-                <w:sz w:val="20"/>
-                <w:szCs w:val="20"/>
-              </w:rPr>
-              <w:t xml:space="preserve"> shared style.css, no JavaScript.</w:t>
-            </w:r>
-          </w:p>
-        </w:tc>
-        <w:tc>
-          <w:tcPr>
-            <w:tcW w:w="2000" w:type="dxa"/>
+      </w:tr>
+      <w:tr>
+        <w:tc>
+          <w:tcPr>
+            <w:tcW w:w="500" w:type="dxa"/>
             <w:tcBorders>
               <w:top w:val="single" w:sz="1" w:space="0" w:color="AAAAAA"/>
               <w:left w:val="single" w:sz="1" w:space="0" w:color="AAAAAA"/>
@@ -12072,26 +11789,55 @@
             </w:pPr>
             <w:r>
               <w:rPr>
-                <w:color w:val="000000"/>
-                <w:sz w:val="20"/>
-                <w:szCs w:val="20"/>
-              </w:rPr>
-              <w:t>10</w:t>
-            </w:r>
-          </w:p>
-        </w:tc>
-      </w:tr>
-      <w:tr>
-        <w:tc>
-          <w:tcPr>
-            <w:tcW w:w="500" w:type="dxa"/>
-            <w:tcBorders>
-              <w:top w:val="single" w:sz="1" w:space="0" w:color="AAAAAA"/>
-              <w:left w:val="single" w:sz="1" w:space="0" w:color="AAAAAA"/>
-              <w:bottom w:val="single" w:sz="1" w:space="0" w:color="AAAAAA"/>
-              <w:right w:val="single" w:sz="1" w:space="0" w:color="AAAAAA"/>
-            </w:tcBorders>
-            <w:shd w:val="clear" w:color="auto" w:fill="EBF3FA"/>
+                <w:b/>
+                <w:bCs/>
+                <w:color w:val="000000"/>
+                <w:sz w:val="20"/>
+                <w:szCs w:val="20"/>
+              </w:rPr>
+              <w:t>11</w:t>
+            </w:r>
+          </w:p>
+        </w:tc>
+        <w:tc>
+          <w:tcPr>
+            <w:tcW w:w="6860" w:type="dxa"/>
+            <w:tcBorders>
+              <w:top w:val="single" w:sz="1" w:space="0" w:color="AAAAAA"/>
+              <w:left w:val="single" w:sz="1" w:space="0" w:color="AAAAAA"/>
+              <w:bottom w:val="single" w:sz="1" w:space="0" w:color="AAAAAA"/>
+              <w:right w:val="single" w:sz="1" w:space="0" w:color="AAAAAA"/>
+            </w:tcBorders>
+            <w:shd w:val="clear" w:color="auto" w:fill="FFFFFF"/>
+            <w:tcMar>
+              <w:top w:w="80" w:type="dxa"/>
+              <w:left w:w="120" w:type="dxa"/>
+              <w:bottom w:w="80" w:type="dxa"/>
+              <w:right w:w="120" w:type="dxa"/>
+            </w:tcMar>
+            <w:vAlign w:val="center"/>
+          </w:tcPr>
+          <w:p>
+            <w:r>
+              <w:rPr>
+                <w:color w:val="000000"/>
+                <w:sz w:val="20"/>
+                <w:szCs w:val="20"/>
+              </w:rPr>
+              <w:t>ci-staging.yml: correct pull_request trigger targeting staging, environment-specific image tags (:staging-latest, :staging-&lt;sha&gt;), push to Docker Hub succeeds.</w:t>
+            </w:r>
+          </w:p>
+        </w:tc>
+        <w:tc>
+          <w:tcPr>
+            <w:tcW w:w="2000" w:type="dxa"/>
+            <w:tcBorders>
+              <w:top w:val="single" w:sz="1" w:space="0" w:color="AAAAAA"/>
+              <w:left w:val="single" w:sz="1" w:space="0" w:color="AAAAAA"/>
+              <w:bottom w:val="single" w:sz="1" w:space="0" w:color="AAAAAA"/>
+              <w:right w:val="single" w:sz="1" w:space="0" w:color="AAAAAA"/>
+            </w:tcBorders>
+            <w:shd w:val="clear" w:color="auto" w:fill="FFFFFF"/>
             <w:tcMar>
               <w:top w:w="80" w:type="dxa"/>
               <w:left w:w="120" w:type="dxa"/>
@@ -12106,56 +11852,19 @@
             </w:pPr>
             <w:r>
               <w:rPr>
-                <w:b/>
-                <w:bCs/>
-                <w:color w:val="000000"/>
-                <w:sz w:val="20"/>
-                <w:szCs w:val="20"/>
-              </w:rPr>
-              <w:t>9</w:t>
-            </w:r>
-          </w:p>
-        </w:tc>
-        <w:tc>
-          <w:tcPr>
-            <w:tcW w:w="6860" w:type="dxa"/>
-            <w:tcBorders>
-              <w:top w:val="single" w:sz="1" w:space="0" w:color="AAAAAA"/>
-              <w:left w:val="single" w:sz="1" w:space="0" w:color="AAAAAA"/>
-              <w:bottom w:val="single" w:sz="1" w:space="0" w:color="AAAAAA"/>
-              <w:right w:val="single" w:sz="1" w:space="0" w:color="AAAAAA"/>
-            </w:tcBorders>
-            <w:shd w:val="clear" w:color="auto" w:fill="EBF3FA"/>
-            <w:tcMar>
-              <w:top w:w="80" w:type="dxa"/>
-              <w:left w:w="120" w:type="dxa"/>
-              <w:bottom w:w="80" w:type="dxa"/>
-              <w:right w:w="120" w:type="dxa"/>
-            </w:tcMar>
-            <w:vAlign w:val="center"/>
-          </w:tcPr>
-          <w:p>
-            <w:r>
-              <w:rPr>
-                <w:color w:val="000000"/>
-                <w:sz w:val="20"/>
-                <w:szCs w:val="20"/>
-              </w:rPr>
-              <w:t>Each member opens a PR targeting develop with a meaningful description; CI passes before merge.</w:t>
-            </w:r>
-            <w:r>
-              <w:rPr>
-                <w:color w:val="000000"/>
-                <w:sz w:val="20"/>
-                <w:szCs w:val="20"/>
-              </w:rPr>
-              <w:t xml:space="preserve"> </w:t>
-            </w:r>
-          </w:p>
-        </w:tc>
-        <w:tc>
-          <w:tcPr>
-            <w:tcW w:w="2000" w:type="dxa"/>
+                <w:color w:val="000000"/>
+                <w:sz w:val="20"/>
+                <w:szCs w:val="20"/>
+              </w:rPr>
+              <w:t>8</w:t>
+            </w:r>
+          </w:p>
+        </w:tc>
+      </w:tr>
+      <w:tr>
+        <w:tc>
+          <w:tcPr>
+            <w:tcW w:w="500" w:type="dxa"/>
             <w:tcBorders>
               <w:top w:val="single" w:sz="1" w:space="0" w:color="AAAAAA"/>
               <w:left w:val="single" w:sz="1" w:space="0" w:color="AAAAAA"/>
@@ -12177,11 +11886,74 @@
             </w:pPr>
             <w:r>
               <w:rPr>
-                <w:color w:val="000000"/>
-                <w:sz w:val="20"/>
-                <w:szCs w:val="20"/>
-              </w:rPr>
-              <w:t>6</w:t>
+                <w:b/>
+                <w:bCs/>
+                <w:color w:val="000000"/>
+                <w:sz w:val="20"/>
+                <w:szCs w:val="20"/>
+              </w:rPr>
+              <w:t>12</w:t>
+            </w:r>
+          </w:p>
+        </w:tc>
+        <w:tc>
+          <w:tcPr>
+            <w:tcW w:w="6860" w:type="dxa"/>
+            <w:tcBorders>
+              <w:top w:val="single" w:sz="1" w:space="0" w:color="AAAAAA"/>
+              <w:left w:val="single" w:sz="1" w:space="0" w:color="AAAAAA"/>
+              <w:bottom w:val="single" w:sz="1" w:space="0" w:color="AAAAAA"/>
+              <w:right w:val="single" w:sz="1" w:space="0" w:color="AAAAAA"/>
+            </w:tcBorders>
+            <w:shd w:val="clear" w:color="auto" w:fill="EBF3FA"/>
+            <w:tcMar>
+              <w:top w:w="80" w:type="dxa"/>
+              <w:left w:w="120" w:type="dxa"/>
+              <w:bottom w:w="80" w:type="dxa"/>
+              <w:right w:w="120" w:type="dxa"/>
+            </w:tcMar>
+            <w:vAlign w:val="center"/>
+          </w:tcPr>
+          <w:p>
+            <w:r>
+              <w:rPr>
+                <w:color w:val="000000"/>
+                <w:sz w:val="20"/>
+                <w:szCs w:val="20"/>
+              </w:rPr>
+              <w:t>ci-prod.yml: correct pull_request trigger targeting main, environment-specific image tags (:prod-latest, :prod-&lt;sha&gt;), push to Docker Hub succeeds.</w:t>
+            </w:r>
+          </w:p>
+        </w:tc>
+        <w:tc>
+          <w:tcPr>
+            <w:tcW w:w="2000" w:type="dxa"/>
+            <w:tcBorders>
+              <w:top w:val="single" w:sz="1" w:space="0" w:color="AAAAAA"/>
+              <w:left w:val="single" w:sz="1" w:space="0" w:color="AAAAAA"/>
+              <w:bottom w:val="single" w:sz="1" w:space="0" w:color="AAAAAA"/>
+              <w:right w:val="single" w:sz="1" w:space="0" w:color="AAAAAA"/>
+            </w:tcBorders>
+            <w:shd w:val="clear" w:color="auto" w:fill="EBF3FA"/>
+            <w:tcMar>
+              <w:top w:w="80" w:type="dxa"/>
+              <w:left w:w="120" w:type="dxa"/>
+              <w:bottom w:w="80" w:type="dxa"/>
+              <w:right w:w="120" w:type="dxa"/>
+            </w:tcMar>
+            <w:vAlign w:val="center"/>
+          </w:tcPr>
+          <w:p>
+            <w:pPr>
+              <w:jc w:val="center"/>
+            </w:pPr>
+            <w:r>
+              <w:rPr>
+                <w:color w:val="000000"/>
+                <w:sz w:val="20"/>
+                <w:szCs w:val="20"/>
+              </w:rPr>
+              <w:t>9</w:t>
             </w:r>
           </w:p>
         </w:tc>
@@ -12214,7 +11986,7 @@
                 <w:sz w:val="21"/>
                 <w:szCs w:val="21"/>
               </w:rPr>
-              <w:t>CI Pipelines – Build &amp; Push Docker Images (ci-dev, ci-staging, ci-prod)</w:t>
+              <w:t>CD Pipelines – Automated Deployment to Render (cd-dev, cd-staging, cd-prod)</w:t>
             </w:r>
           </w:p>
         </w:tc>
@@ -12247,7 +12019,7 @@
                 <w:sz w:val="21"/>
                 <w:szCs w:val="21"/>
               </w:rPr>
-              <w:t>25 Marks</w:t>
+              <w:t>20 Marks</w:t>
             </w:r>
           </w:p>
         </w:tc>
@@ -12283,7 +12055,8 @@
                 <w:sz w:val="20"/>
                 <w:szCs w:val="20"/>
               </w:rPr>
-              <w:t>10</w:t>
+              <w:lastRenderedPageBreak/>
+              <w:t>13</w:t>
             </w:r>
           </w:p>
         </w:tc>
@@ -12312,15 +12085,7 @@
                 <w:sz w:val="20"/>
                 <w:szCs w:val="20"/>
               </w:rPr>
-              <w:t xml:space="preserve">ci-dev.yml: correct </w:t>
-            </w:r>
-            <w:r>
-              <w:rPr>
-                <w:color w:val="000000"/>
-                <w:sz w:val="20"/>
-                <w:szCs w:val="20"/>
-              </w:rPr>
-              <w:t>pull_request trigger targeting develop, all five mandatory steps present and correctly configured.</w:t>
+              <w:t>cd-dev.yml: correct push trigger on develop, declares environment: development, curl POST to RENDER_DEPLOY_HOOK_DEV_URL, echo confirmation.</w:t>
             </w:r>
           </w:p>
         </w:tc>
@@ -12352,7 +12117,7 @@
                 <w:sz w:val="20"/>
                 <w:szCs w:val="20"/>
               </w:rPr>
-              <w:t>8</w:t>
+              <w:t>6</w:t>
             </w:r>
           </w:p>
         </w:tc>
@@ -12388,7 +12153,7 @@
                 <w:sz w:val="20"/>
                 <w:szCs w:val="20"/>
               </w:rPr>
-              <w:t>11</w:t>
+              <w:t>14</w:t>
             </w:r>
           </w:p>
         </w:tc>
@@ -12417,15 +12182,7 @@
                 <w:sz w:val="20"/>
                 <w:szCs w:val="20"/>
               </w:rPr>
-              <w:t xml:space="preserve">ci-staging.yml: correct pull_request trigger targeting staging, environment-specific image tags (:staging-latest, :staging-&lt;sha&gt;), push to Docker Hub </w:t>
-            </w:r>
-            <w:r>
-              <w:rPr>
-                <w:color w:val="000000"/>
-                <w:sz w:val="20"/>
-                <w:szCs w:val="20"/>
-              </w:rPr>
-              <w:t>succeeds.</w:t>
+              <w:t>cd-staging.yml: correct push trigger on staging, declares environment: staging, curl POST to RENDER_DEPLOY_HOOK_STAGING_URL, echo confirmation.</w:t>
             </w:r>
           </w:p>
         </w:tc>
@@ -12457,7 +12214,7 @@
                 <w:sz w:val="20"/>
                 <w:szCs w:val="20"/>
               </w:rPr>
-              <w:t>8</w:t>
+              <w:t>7</w:t>
             </w:r>
           </w:p>
         </w:tc>
@@ -12493,7 +12250,7 @@
                 <w:sz w:val="20"/>
                 <w:szCs w:val="20"/>
               </w:rPr>
-              <w:t>12</w:t>
+              <w:t>15</w:t>
             </w:r>
           </w:p>
         </w:tc>
@@ -12522,7 +12279,7 @@
                 <w:sz w:val="20"/>
                 <w:szCs w:val="20"/>
               </w:rPr>
-              <w:t>ci-prod.yml: correct pull_request trigger targeting main, environment-specific image tags (:prod-latest, :prod-&lt;sha&gt;), push to Docker Hub succeeds.</w:t>
+              <w:t>cd-prod.yml: correct push trigger on main, declares environment: production, curl POST to RENDER_DEPLOY_HOOK_PROD_URL, echo confirmation. Live production PakVista on Render displays all five pages.</w:t>
             </w:r>
           </w:p>
         </w:tc>
@@ -12554,7 +12311,7 @@
                 <w:sz w:val="20"/>
                 <w:szCs w:val="20"/>
               </w:rPr>
-              <w:t>9</w:t>
+              <w:t>7</w:t>
             </w:r>
           </w:p>
         </w:tc>
@@ -12587,7 +12344,7 @@
                 <w:sz w:val="21"/>
                 <w:szCs w:val="21"/>
               </w:rPr>
-              <w:t>CD Pipelines – Automated Deployment to Render (cd-dev, cd-staging, cd-prod)</w:t>
+              <w:t>End-to-End Verification, Screenshots &amp; Reflection</w:t>
             </w:r>
           </w:p>
         </w:tc>
@@ -12620,7 +12377,7 @@
                 <w:sz w:val="21"/>
                 <w:szCs w:val="21"/>
               </w:rPr>
-              <w:t>20 Marks</w:t>
+              <w:t>10 Marks</w:t>
             </w:r>
           </w:p>
         </w:tc>
@@ -12656,8 +12413,7 @@
                 <w:sz w:val="20"/>
                 <w:szCs w:val="20"/>
               </w:rPr>
-              <w:lastRenderedPageBreak/>
-              <w:t>13</w:t>
+              <w:t>16</w:t>
             </w:r>
           </w:p>
         </w:tc>
@@ -12686,7 +12442,7 @@
                 <w:sz w:val="20"/>
                 <w:szCs w:val="20"/>
               </w:rPr>
-              <w:t>cd-dev.yml: correct push trigger on develop, declares environment: development, curl POST to RENDER_DEPLOY_HOOK_DEV_URL, echo confirmation.</w:t>
+              <w:t>Screenshots: all six workflow runs (CI + CD per environment), Docker Hub image tags, three live Render service URLs with all pages accessible.</w:t>
             </w:r>
           </w:p>
         </w:tc>
@@ -12718,7 +12474,7 @@
                 <w:sz w:val="20"/>
                 <w:szCs w:val="20"/>
               </w:rPr>
-              <w:t>6</w:t>
+              <w:t>5</w:t>
             </w:r>
           </w:p>
         </w:tc>
@@ -12754,7 +12510,7 @@
                 <w:sz w:val="20"/>
                 <w:szCs w:val="20"/>
               </w:rPr>
-              <w:t>14</w:t>
+              <w:t>17</w:t>
             </w:r>
           </w:p>
         </w:tc>
@@ -12783,380 +12539,7 @@
                 <w:sz w:val="20"/>
                 <w:szCs w:val="20"/>
               </w:rPr>
-              <w:t xml:space="preserve">cd-staging.yml: correct push trigger on staging, declares environment: staging, curl POST to </w:t>
-            </w:r>
-            <w:r>
-              <w:rPr>
-                <w:color w:val="000000"/>
-                <w:sz w:val="20"/>
-                <w:szCs w:val="20"/>
-              </w:rPr>
-              <w:t>RENDER_DEPLOY_HOOK_STAGING_URL, echo confirmation.</w:t>
-            </w:r>
-          </w:p>
-        </w:tc>
-        <w:tc>
-          <w:tcPr>
-            <w:tcW w:w="2000" w:type="dxa"/>
-            <w:tcBorders>
-              <w:top w:val="single" w:sz="1" w:space="0" w:color="AAAAAA"/>
-              <w:left w:val="single" w:sz="1" w:space="0" w:color="AAAAAA"/>
-              <w:bottom w:val="single" w:sz="1" w:space="0" w:color="AAAAAA"/>
-              <w:right w:val="single" w:sz="1" w:space="0" w:color="AAAAAA"/>
-            </w:tcBorders>
-            <w:shd w:val="clear" w:color="auto" w:fill="FFFFFF"/>
-            <w:tcMar>
-              <w:top w:w="80" w:type="dxa"/>
-              <w:left w:w="120" w:type="dxa"/>
-              <w:bottom w:w="80" w:type="dxa"/>
-              <w:right w:w="120" w:type="dxa"/>
-            </w:tcMar>
-            <w:vAlign w:val="center"/>
-          </w:tcPr>
-          <w:p>
-            <w:pPr>
-              <w:jc w:val="center"/>
-            </w:pPr>
-            <w:r>
-              <w:rPr>
-                <w:color w:val="000000"/>
-                <w:sz w:val="20"/>
-                <w:szCs w:val="20"/>
-              </w:rPr>
-              <w:t>7</w:t>
-            </w:r>
-          </w:p>
-        </w:tc>
-      </w:tr>
-      <w:tr>
-        <w:tc>
-          <w:tcPr>
-            <w:tcW w:w="500" w:type="dxa"/>
-            <w:tcBorders>
-              <w:top w:val="single" w:sz="1" w:space="0" w:color="AAAAAA"/>
-              <w:left w:val="single" w:sz="1" w:space="0" w:color="AAAAAA"/>
-              <w:bottom w:val="single" w:sz="1" w:space="0" w:color="AAAAAA"/>
-              <w:right w:val="single" w:sz="1" w:space="0" w:color="AAAAAA"/>
-            </w:tcBorders>
-            <w:shd w:val="clear" w:color="auto" w:fill="EBF3FA"/>
-            <w:tcMar>
-              <w:top w:w="80" w:type="dxa"/>
-              <w:left w:w="120" w:type="dxa"/>
-              <w:bottom w:w="80" w:type="dxa"/>
-              <w:right w:w="120" w:type="dxa"/>
-            </w:tcMar>
-            <w:vAlign w:val="center"/>
-          </w:tcPr>
-          <w:p>
-            <w:pPr>
-              <w:jc w:val="center"/>
-            </w:pPr>
-            <w:r>
-              <w:rPr>
-                <w:b/>
-                <w:bCs/>
-                <w:color w:val="000000"/>
-                <w:sz w:val="20"/>
-                <w:szCs w:val="20"/>
-              </w:rPr>
-              <w:t>15</w:t>
-            </w:r>
-          </w:p>
-        </w:tc>
-        <w:tc>
-          <w:tcPr>
-            <w:tcW w:w="6860" w:type="dxa"/>
-            <w:tcBorders>
-              <w:top w:val="single" w:sz="1" w:space="0" w:color="AAAAAA"/>
-              <w:left w:val="single" w:sz="1" w:space="0" w:color="AAAAAA"/>
-              <w:bottom w:val="single" w:sz="1" w:space="0" w:color="AAAAAA"/>
-              <w:right w:val="single" w:sz="1" w:space="0" w:color="AAAAAA"/>
-            </w:tcBorders>
-            <w:shd w:val="clear" w:color="auto" w:fill="EBF3FA"/>
-            <w:tcMar>
-              <w:top w:w="80" w:type="dxa"/>
-              <w:left w:w="120" w:type="dxa"/>
-              <w:bottom w:w="80" w:type="dxa"/>
-              <w:right w:w="120" w:type="dxa"/>
-            </w:tcMar>
-            <w:vAlign w:val="center"/>
-          </w:tcPr>
-          <w:p>
-            <w:r>
-              <w:rPr>
-                <w:color w:val="000000"/>
-                <w:sz w:val="20"/>
-                <w:szCs w:val="20"/>
-              </w:rPr>
-              <w:t>cd-prod.yml: correct push trigger on main, declares environment: production, curl POST to RENDER_DEPLOY_HOOK_PROD_URL, echo confirmation. Live production PakVista on Render displays all five pages.</w:t>
-            </w:r>
-          </w:p>
-        </w:tc>
-        <w:tc>
-          <w:tcPr>
-            <w:tcW w:w="2000" w:type="dxa"/>
-            <w:tcBorders>
-              <w:top w:val="single" w:sz="1" w:space="0" w:color="AAAAAA"/>
-              <w:left w:val="single" w:sz="1" w:space="0" w:color="AAAAAA"/>
-              <w:bottom w:val="single" w:sz="1" w:space="0" w:color="AAAAAA"/>
-              <w:right w:val="single" w:sz="1" w:space="0" w:color="AAAAAA"/>
-            </w:tcBorders>
-            <w:shd w:val="clear" w:color="auto" w:fill="EBF3FA"/>
-            <w:tcMar>
-              <w:top w:w="80" w:type="dxa"/>
-              <w:left w:w="120" w:type="dxa"/>
-              <w:bottom w:w="80" w:type="dxa"/>
-              <w:right w:w="120" w:type="dxa"/>
-            </w:tcMar>
-            <w:vAlign w:val="center"/>
-          </w:tcPr>
-          <w:p>
-            <w:pPr>
-              <w:jc w:val="center"/>
-            </w:pPr>
-            <w:r>
-              <w:rPr>
-                <w:color w:val="000000"/>
-                <w:sz w:val="20"/>
-                <w:szCs w:val="20"/>
-              </w:rPr>
-              <w:t>7</w:t>
-            </w:r>
-          </w:p>
-        </w:tc>
-      </w:tr>
-      <w:tr>
-        <w:tc>
-          <w:tcPr>
-            <w:tcW w:w="7360" w:type="dxa"/>
-            <w:gridSpan w:val="2"/>
-            <w:tcBorders>
-              <w:top w:val="single" w:sz="1" w:space="0" w:color="AAAAAA"/>
-              <w:left w:val="single" w:sz="1" w:space="0" w:color="AAAAAA"/>
-              <w:bottom w:val="single" w:sz="1" w:space="0" w:color="AAAAAA"/>
-              <w:right w:val="single" w:sz="1" w:space="0" w:color="AAAAAA"/>
-            </w:tcBorders>
-            <w:shd w:val="clear" w:color="auto" w:fill="D5E8F0"/>
-            <w:tcMar>
-              <w:top w:w="80" w:type="dxa"/>
-              <w:left w:w="120" w:type="dxa"/>
-              <w:bottom w:w="80" w:type="dxa"/>
-              <w:right w:w="120" w:type="dxa"/>
-            </w:tcMar>
-          </w:tcPr>
-          <w:p>
-            <w:r>
-              <w:rPr>
-                <w:b/>
-                <w:bCs/>
-                <w:color w:val="1F3864"/>
-                <w:sz w:val="21"/>
-                <w:szCs w:val="21"/>
-              </w:rPr>
-              <w:t>End-to-End Verification, Screenshots &amp; Reflection</w:t>
-            </w:r>
-          </w:p>
-        </w:tc>
-        <w:tc>
-          <w:tcPr>
-            <w:tcW w:w="2000" w:type="dxa"/>
-            <w:tcBorders>
-              <w:top w:val="single" w:sz="1" w:space="0" w:color="AAAAAA"/>
-              <w:left w:val="single" w:sz="1" w:space="0" w:color="AAAAAA"/>
-              <w:bottom w:val="single" w:sz="1" w:space="0" w:color="AAAAAA"/>
-              <w:right w:val="single" w:sz="1" w:space="0" w:color="AAAAAA"/>
-            </w:tcBorders>
-            <w:shd w:val="clear" w:color="auto" w:fill="D5E8F0"/>
-            <w:tcMar>
-              <w:top w:w="80" w:type="dxa"/>
-              <w:left w:w="120" w:type="dxa"/>
-              <w:bottom w:w="80" w:type="dxa"/>
-              <w:right w:w="120" w:type="dxa"/>
-            </w:tcMar>
-          </w:tcPr>
-          <w:p>
-            <w:pPr>
-              <w:jc w:val="center"/>
-            </w:pPr>
-            <w:r>
-              <w:rPr>
-                <w:b/>
-                <w:bCs/>
-                <w:color w:val="1F3864"/>
-                <w:sz w:val="21"/>
-                <w:szCs w:val="21"/>
-              </w:rPr>
-              <w:t>10 Marks</w:t>
-            </w:r>
-          </w:p>
-        </w:tc>
-      </w:tr>
-      <w:tr>
-        <w:tc>
-          <w:tcPr>
-            <w:tcW w:w="500" w:type="dxa"/>
-            <w:tcBorders>
-              <w:top w:val="single" w:sz="1" w:space="0" w:color="AAAAAA"/>
-              <w:left w:val="single" w:sz="1" w:space="0" w:color="AAAAAA"/>
-              <w:bottom w:val="single" w:sz="1" w:space="0" w:color="AAAAAA"/>
-              <w:right w:val="single" w:sz="1" w:space="0" w:color="AAAAAA"/>
-            </w:tcBorders>
-            <w:shd w:val="clear" w:color="auto" w:fill="EBF3FA"/>
-            <w:tcMar>
-              <w:top w:w="80" w:type="dxa"/>
-              <w:left w:w="120" w:type="dxa"/>
-              <w:bottom w:w="80" w:type="dxa"/>
-              <w:right w:w="120" w:type="dxa"/>
-            </w:tcMar>
-            <w:vAlign w:val="center"/>
-          </w:tcPr>
-          <w:p>
-            <w:pPr>
-              <w:jc w:val="center"/>
-            </w:pPr>
-            <w:r>
-              <w:rPr>
-                <w:b/>
-                <w:bCs/>
-                <w:color w:val="000000"/>
-                <w:sz w:val="20"/>
-                <w:szCs w:val="20"/>
-              </w:rPr>
-              <w:t>16</w:t>
-            </w:r>
-          </w:p>
-        </w:tc>
-        <w:tc>
-          <w:tcPr>
-            <w:tcW w:w="6860" w:type="dxa"/>
-            <w:tcBorders>
-              <w:top w:val="single" w:sz="1" w:space="0" w:color="AAAAAA"/>
-              <w:left w:val="single" w:sz="1" w:space="0" w:color="AAAAAA"/>
-              <w:bottom w:val="single" w:sz="1" w:space="0" w:color="AAAAAA"/>
-              <w:right w:val="single" w:sz="1" w:space="0" w:color="AAAAAA"/>
-            </w:tcBorders>
-            <w:shd w:val="clear" w:color="auto" w:fill="EBF3FA"/>
-            <w:tcMar>
-              <w:top w:w="80" w:type="dxa"/>
-              <w:left w:w="120" w:type="dxa"/>
-              <w:bottom w:w="80" w:type="dxa"/>
-              <w:right w:w="120" w:type="dxa"/>
-            </w:tcMar>
-            <w:vAlign w:val="center"/>
-          </w:tcPr>
-          <w:p>
-            <w:r>
-              <w:rPr>
-                <w:color w:val="000000"/>
-                <w:sz w:val="20"/>
-                <w:szCs w:val="20"/>
-              </w:rPr>
-              <w:t>Screenshots: all six workflow runs (CI + CD per environment), Docker Hub image tags, three live Render service URLs with all pages accessible.</w:t>
-            </w:r>
-          </w:p>
-        </w:tc>
-        <w:tc>
-          <w:tcPr>
-            <w:tcW w:w="2000" w:type="dxa"/>
-            <w:tcBorders>
-              <w:top w:val="single" w:sz="1" w:space="0" w:color="AAAAAA"/>
-              <w:left w:val="single" w:sz="1" w:space="0" w:color="AAAAAA"/>
-              <w:bottom w:val="single" w:sz="1" w:space="0" w:color="AAAAAA"/>
-              <w:right w:val="single" w:sz="1" w:space="0" w:color="AAAAAA"/>
-            </w:tcBorders>
-            <w:shd w:val="clear" w:color="auto" w:fill="EBF3FA"/>
-            <w:tcMar>
-              <w:top w:w="80" w:type="dxa"/>
-              <w:left w:w="120" w:type="dxa"/>
-              <w:bottom w:w="80" w:type="dxa"/>
-              <w:right w:w="120" w:type="dxa"/>
-            </w:tcMar>
-            <w:vAlign w:val="center"/>
-          </w:tcPr>
-          <w:p>
-            <w:pPr>
-              <w:jc w:val="center"/>
-            </w:pPr>
-            <w:r>
-              <w:rPr>
-                <w:color w:val="000000"/>
-                <w:sz w:val="20"/>
-                <w:szCs w:val="20"/>
-              </w:rPr>
-              <w:t>5</w:t>
-            </w:r>
-          </w:p>
-        </w:tc>
-      </w:tr>
-      <w:tr>
-        <w:tc>
-          <w:tcPr>
-            <w:tcW w:w="500" w:type="dxa"/>
-            <w:tcBorders>
-              <w:top w:val="single" w:sz="1" w:space="0" w:color="AAAAAA"/>
-              <w:left w:val="single" w:sz="1" w:space="0" w:color="AAAAAA"/>
-              <w:bottom w:val="single" w:sz="1" w:space="0" w:color="AAAAAA"/>
-              <w:right w:val="single" w:sz="1" w:space="0" w:color="AAAAAA"/>
-            </w:tcBorders>
-            <w:shd w:val="clear" w:color="auto" w:fill="FFFFFF"/>
-            <w:tcMar>
-              <w:top w:w="80" w:type="dxa"/>
-              <w:left w:w="120" w:type="dxa"/>
-              <w:bottom w:w="80" w:type="dxa"/>
-              <w:right w:w="120" w:type="dxa"/>
-            </w:tcMar>
-            <w:vAlign w:val="center"/>
-          </w:tcPr>
-          <w:p>
-            <w:pPr>
-              <w:jc w:val="center"/>
-            </w:pPr>
-            <w:r>
-              <w:rPr>
-                <w:b/>
-                <w:bCs/>
-                <w:color w:val="000000"/>
-                <w:sz w:val="20"/>
-                <w:szCs w:val="20"/>
-              </w:rPr>
-              <w:t>17</w:t>
-            </w:r>
-          </w:p>
-        </w:tc>
-        <w:tc>
-          <w:tcPr>
-            <w:tcW w:w="6860" w:type="dxa"/>
-            <w:tcBorders>
-              <w:top w:val="single" w:sz="1" w:space="0" w:color="AAAAAA"/>
-              <w:left w:val="single" w:sz="1" w:space="0" w:color="AAAAAA"/>
-              <w:bottom w:val="single" w:sz="1" w:space="0" w:color="AAAAAA"/>
-              <w:right w:val="single" w:sz="1" w:space="0" w:color="AAAAAA"/>
-            </w:tcBorders>
-            <w:shd w:val="clear" w:color="auto" w:fill="FFFFFF"/>
-            <w:tcMar>
-              <w:top w:w="80" w:type="dxa"/>
-              <w:left w:w="120" w:type="dxa"/>
-              <w:bottom w:w="80" w:type="dxa"/>
-              <w:right w:w="120" w:type="dxa"/>
-            </w:tcMar>
-            <w:vAlign w:val="center"/>
-          </w:tcPr>
-          <w:p>
-            <w:r>
-              <w:rPr>
-                <w:color w:val="000000"/>
-                <w:sz w:val="20"/>
-                <w:szCs w:val="20"/>
-              </w:rPr>
-              <w:t xml:space="preserve">Individual reflection (4–5 lines per </w:t>
-            </w:r>
-            <w:r>
-              <w:rPr>
-                <w:color w:val="000000"/>
-                <w:sz w:val="20"/>
-                <w:szCs w:val="20"/>
-              </w:rPr>
-              <w:t>member) on multi-environment CI/CD and their experience authoring a workflow file and an HTML page.</w:t>
+              <w:t>Individual reflection (4–5 lines per member) on multi-environment CI/CD and their experience authoring a workflow file and an HTML page.</w:t>
             </w:r>
           </w:p>
         </w:tc>
@@ -13303,13 +12686,7 @@
         <w:rPr>
           <w:color w:val="000000"/>
         </w:rPr>
-        <w:t xml:space="preserve">Completed Term Project document with all group details </w:t>
-      </w:r>
-      <w:r>
-        <w:rPr>
-          <w:color w:val="000000"/>
-        </w:rPr>
-        <w:t>filled in (Table 1), including each member's Assigned Workflow File and Assigned Page.</w:t>
+        <w:t>Completed Term Project document with all group details filled in (Table 1), including each member's Assigned Workflow File and Assigned Page.</w:t>
       </w:r>
     </w:p>
     <w:p>
@@ -13357,13 +12734,7 @@
         <w:rPr>
           <w:color w:val="000000"/>
         </w:rPr>
-        <w:t xml:space="preserve">Screenshot 1: GitHub </w:t>
-      </w:r>
-      <w:r>
-        <w:rPr>
-          <w:color w:val="000000"/>
-        </w:rPr>
-        <w:t>repository showing all three GitHub Environments (development, staging, production) with their respective secrets configured.</w:t>
+        <w:t>Screenshot 1: GitHub repository showing all three GitHub Environments (development, staging, production) with their respective secrets configured.</w:t>
       </w:r>
     </w:p>
     <w:p>
@@ -13379,13 +12750,7 @@
         <w:rPr>
           <w:color w:val="000000"/>
         </w:rPr>
-        <w:t>Screenshot 2: Each member's CI workflow run (ci-dev.yml) triggered by their individual PR – all steps green. One screenshot per me</w:t>
-      </w:r>
-      <w:r>
-        <w:rPr>
-          <w:color w:val="000000"/>
-        </w:rPr>
-        <w:t>mber or a combined view showing all members' runs.</w:t>
+        <w:t>Screenshot 2: Each member's CI workflow run (ci-dev.yml) triggered by their individual PR – all steps green. One screenshot per member or a combined view showing all members' runs.</w:t>
       </w:r>
     </w:p>
     <w:p>
@@ -13417,13 +12782,7 @@
         <w:rPr>
           <w:color w:val="000000"/>
         </w:rPr>
-        <w:t xml:space="preserve">Screenshot 4: All three </w:t>
-      </w:r>
-      <w:r>
-        <w:rPr>
-          <w:color w:val="000000"/>
-        </w:rPr>
-        <w:t>CD workflow runs (cd-dev.yml, cd-staging.yml, cd-prod.yml) – deploy step completed and confirmation echo visible.</w:t>
+        <w:t>Screenshot 4: All three CD workflow runs (cd-dev.yml, cd-staging.yml, cd-prod.yml) – deploy step completed and confirmation echo visible.</w:t>
       </w:r>
     </w:p>
     <w:p>
@@ -13439,13 +12798,7 @@
         <w:rPr>
           <w:color w:val="000000"/>
         </w:rPr>
-        <w:t xml:space="preserve">Screenshot 5: Live PakVista site on each of the three Render services showing all five pages are accessible (three screenshots total, one per </w:t>
-      </w:r>
-      <w:r>
-        <w:rPr>
-          <w:color w:val="000000"/>
-        </w:rPr>
-        <w:t>environment).</w:t>
+        <w:t>Screenshot 5: Live PakVista site on each of the three Render services showing all five pages are accessible (three screenshots total, one per environment).</w:t>
       </w:r>
     </w:p>
     <w:p>
@@ -13477,13 +12830,7 @@
         <w:rPr>
           <w:color w:val="000000"/>
         </w:rPr>
-        <w:t xml:space="preserve">Individual Reflection: Each team member must write 4–5 lines on what they learnt and any challenges they faced, especially regarding authoring a GitHub </w:t>
-      </w:r>
-      <w:r>
-        <w:rPr>
-          <w:color w:val="000000"/>
-        </w:rPr>
-        <w:t>Actions workflow file and building their HTML page.</w:t>
+        <w:t>Individual Reflection: Each team member must write 4–5 lines on what they learnt and any challenges they faced, especially regarding authoring a GitHub Actions workflow file and building their HTML page.</w:t>
       </w:r>
     </w:p>
     <w:p/>
@@ -13626,17 +12973,7 @@
                 <w:sz w:val="20"/>
                 <w:szCs w:val="20"/>
               </w:rPr>
-              <w:t xml:space="preserve">GitHub Environments (development, staging, production) </w:t>
-            </w:r>
-            <w:r>
-              <w:rPr>
-                <w:b/>
-                <w:bCs/>
-                <w:color w:val="000000"/>
-                <w:sz w:val="20"/>
-                <w:szCs w:val="20"/>
-              </w:rPr>
-              <w:t>&amp; All Secrets</w:t>
+              <w:t>GitHub Environments (development, staging, production) &amp; All Secrets</w:t>
             </w:r>
           </w:p>
         </w:tc>
@@ -13825,17 +13162,7 @@
                 <w:sz w:val="20"/>
                 <w:szCs w:val="20"/>
               </w:rPr>
-              <w:t xml:space="preserve">CD Workflow </w:t>
-            </w:r>
-            <w:r>
-              <w:rPr>
-                <w:b/>
-                <w:bCs/>
-                <w:color w:val="000000"/>
-                <w:sz w:val="20"/>
-                <w:szCs w:val="20"/>
-              </w:rPr>
-              <w:t>Runs – All three environments triggered by push events</w:t>
+              <w:t>CD Workflow Runs – All three environments triggered by push events</w:t>
             </w:r>
           </w:p>
         </w:tc>
@@ -13991,8 +13318,62 @@
                 <w:sz w:val="20"/>
                 <w:szCs w:val="20"/>
               </w:rPr>
-              <w:t xml:space="preserve">[Paste screenshot </w:t>
-            </w:r>
+              <w:t>[Paste screenshot here]</w:t>
+            </w:r>
+          </w:p>
+        </w:tc>
+      </w:tr>
+      <w:tr>
+        <w:tc>
+          <w:tcPr>
+            <w:tcW w:w="3200" w:type="dxa"/>
+            <w:tcBorders>
+              <w:top w:val="single" w:sz="1" w:space="0" w:color="AAAAAA"/>
+              <w:left w:val="single" w:sz="1" w:space="0" w:color="AAAAAA"/>
+              <w:bottom w:val="single" w:sz="1" w:space="0" w:color="AAAAAA"/>
+              <w:right w:val="single" w:sz="1" w:space="0" w:color="AAAAAA"/>
+            </w:tcBorders>
+            <w:shd w:val="clear" w:color="auto" w:fill="EBF3FA"/>
+            <w:tcMar>
+              <w:top w:w="80" w:type="dxa"/>
+              <w:left w:w="120" w:type="dxa"/>
+              <w:bottom w:w="80" w:type="dxa"/>
+              <w:right w:w="120" w:type="dxa"/>
+            </w:tcMar>
+            <w:vAlign w:val="center"/>
+          </w:tcPr>
+          <w:p>
+            <w:r>
+              <w:rPr>
+                <w:b/>
+                <w:bCs/>
+                <w:color w:val="000000"/>
+                <w:sz w:val="20"/>
+                <w:szCs w:val="20"/>
+              </w:rPr>
+              <w:lastRenderedPageBreak/>
+              <w:t>Live PakVista – Production Render Service (all 5 pages accessible)</w:t>
+            </w:r>
+          </w:p>
+        </w:tc>
+        <w:tc>
+          <w:tcPr>
+            <w:tcW w:w="6160" w:type="dxa"/>
+            <w:tcBorders>
+              <w:top w:val="single" w:sz="1" w:space="0" w:color="AAAAAA"/>
+              <w:left w:val="single" w:sz="1" w:space="0" w:color="AAAAAA"/>
+              <w:bottom w:val="single" w:sz="1" w:space="0" w:color="AAAAAA"/>
+              <w:right w:val="single" w:sz="1" w:space="0" w:color="AAAAAA"/>
+            </w:tcBorders>
+            <w:shd w:val="clear" w:color="auto" w:fill="EBF3FA"/>
+            <w:tcMar>
+              <w:top w:w="80" w:type="dxa"/>
+              <w:left w:w="120" w:type="dxa"/>
+              <w:bottom w:w="80" w:type="dxa"/>
+              <w:right w:w="120" w:type="dxa"/>
+            </w:tcMar>
+          </w:tcPr>
+          <w:p>
             <w:r>
               <w:rPr>
                 <w:i/>
@@ -14001,7 +13382,7 @@
                 <w:sz w:val="20"/>
                 <w:szCs w:val="20"/>
               </w:rPr>
-              <w:t>here]</w:t>
+              <w:t>[Paste screenshot here]</w:t>
             </w:r>
           </w:p>
         </w:tc>
@@ -14016,26 +13397,25 @@
               <w:bottom w:val="single" w:sz="1" w:space="0" w:color="AAAAAA"/>
               <w:right w:val="single" w:sz="1" w:space="0" w:color="AAAAAA"/>
             </w:tcBorders>
-            <w:shd w:val="clear" w:color="auto" w:fill="EBF3FA"/>
-            <w:tcMar>
-              <w:top w:w="80" w:type="dxa"/>
-              <w:left w:w="120" w:type="dxa"/>
-              <w:bottom w:w="80" w:type="dxa"/>
-              <w:right w:w="120" w:type="dxa"/>
-            </w:tcMar>
-            <w:vAlign w:val="center"/>
-          </w:tcPr>
-          <w:p>
-            <w:r>
-              <w:rPr>
-                <w:b/>
-                <w:bCs/>
-                <w:color w:val="000000"/>
-                <w:sz w:val="20"/>
-                <w:szCs w:val="20"/>
-              </w:rPr>
-              <w:lastRenderedPageBreak/>
-              <w:t>Live PakVista – Production Render Service (all 5 pages accessible)</w:t>
+            <w:shd w:val="clear" w:color="auto" w:fill="FFFFFF"/>
+            <w:tcMar>
+              <w:top w:w="80" w:type="dxa"/>
+              <w:left w:w="120" w:type="dxa"/>
+              <w:bottom w:w="80" w:type="dxa"/>
+              <w:right w:w="120" w:type="dxa"/>
+            </w:tcMar>
+            <w:vAlign w:val="center"/>
+          </w:tcPr>
+          <w:p>
+            <w:r>
+              <w:rPr>
+                <w:b/>
+                <w:bCs/>
+                <w:color w:val="000000"/>
+                <w:sz w:val="20"/>
+                <w:szCs w:val="20"/>
+              </w:rPr>
+              <w:t>Term Project .docx visible in GitHub Repository file listing</w:t>
             </w:r>
           </w:p>
         </w:tc>
@@ -14048,7 +13428,7 @@
               <w:bottom w:val="single" w:sz="1" w:space="0" w:color="AAAAAA"/>
               <w:right w:val="single" w:sz="1" w:space="0" w:color="AAAAAA"/>
             </w:tcBorders>
-            <w:shd w:val="clear" w:color="auto" w:fill="EBF3FA"/>
+            <w:shd w:val="clear" w:color="auto" w:fill="FFFFFF"/>
             <w:tcMar>
               <w:top w:w="80" w:type="dxa"/>
               <w:left w:w="120" w:type="dxa"/>
@@ -14070,69 +13450,6 @@
           </w:p>
         </w:tc>
       </w:tr>
-      <w:tr>
-        <w:tc>
-          <w:tcPr>
-            <w:tcW w:w="3200" w:type="dxa"/>
-            <w:tcBorders>
-              <w:top w:val="single" w:sz="1" w:space="0" w:color="AAAAAA"/>
-              <w:left w:val="single" w:sz="1" w:space="0" w:color="AAAAAA"/>
-              <w:bottom w:val="single" w:sz="1" w:space="0" w:color="AAAAAA"/>
-              <w:right w:val="single" w:sz="1" w:space="0" w:color="AAAAAA"/>
-            </w:tcBorders>
-            <w:shd w:val="clear" w:color="auto" w:fill="FFFFFF"/>
-            <w:tcMar>
-              <w:top w:w="80" w:type="dxa"/>
-              <w:left w:w="120" w:type="dxa"/>
-              <w:bottom w:w="80" w:type="dxa"/>
-              <w:right w:w="120" w:type="dxa"/>
-            </w:tcMar>
-            <w:vAlign w:val="center"/>
-          </w:tcPr>
-          <w:p>
-            <w:r>
-              <w:rPr>
-                <w:b/>
-                <w:bCs/>
-                <w:color w:val="000000"/>
-                <w:sz w:val="20"/>
-                <w:szCs w:val="20"/>
-              </w:rPr>
-              <w:t>Term Project .docx visible in GitHub Repository file listing</w:t>
-            </w:r>
-          </w:p>
-        </w:tc>
-        <w:tc>
-          <w:tcPr>
-            <w:tcW w:w="6160" w:type="dxa"/>
-            <w:tcBorders>
-              <w:top w:val="single" w:sz="1" w:space="0" w:color="AAAAAA"/>
-              <w:left w:val="single" w:sz="1" w:space="0" w:color="AAAAAA"/>
-              <w:bottom w:val="single" w:sz="1" w:space="0" w:color="AAAAAA"/>
-              <w:right w:val="single" w:sz="1" w:space="0" w:color="AAAAAA"/>
-            </w:tcBorders>
-            <w:shd w:val="clear" w:color="auto" w:fill="FFFFFF"/>
-            <w:tcMar>
-              <w:top w:w="80" w:type="dxa"/>
-              <w:left w:w="120" w:type="dxa"/>
-              <w:bottom w:w="80" w:type="dxa"/>
-              <w:right w:w="120" w:type="dxa"/>
-            </w:tcMar>
-          </w:tcPr>
-          <w:p>
-            <w:r>
-              <w:rPr>
-                <w:i/>
-                <w:iCs/>
-                <w:color w:val="595959"/>
-                <w:sz w:val="20"/>
-                <w:szCs w:val="20"/>
-              </w:rPr>
-              <w:t>[Paste screenshot here]</w:t>
-            </w:r>
-          </w:p>
-        </w:tc>
-      </w:tr>
     </w:tbl>
     <w:p/>
     <w:p>
@@ -14151,13 +13468,7 @@
         <w:rPr>
           <w:color w:val="000000"/>
         </w:rPr>
-        <w:t xml:space="preserve">Each team member must write 4–5 lines below </w:t>
-      </w:r>
-      <w:r>
-        <w:rPr>
-          <w:color w:val="000000"/>
-        </w:rPr>
-        <w:t>describing what they learnt during this Term Project, any challenges they encountered while authoring their workflow file and building their HTML page, and how they resolved those challenges.</w:t>
+        <w:t>Each team member must write 4–5 lines below describing what they learnt during this Term Project, any challenges they encountered while authoring their workflow file and building their HTML page, and how they resolved those challenges.</w:t>
       </w:r>
     </w:p>
     <w:p/>
@@ -14187,15 +13498,7 @@
           <w:iCs/>
           <w:color w:val="595959"/>
         </w:rPr>
-        <w:t>[Write your 4–5 line refl</w:t>
-      </w:r>
-      <w:r>
-        <w:rPr>
-          <w:i/>
-          <w:iCs/>
-          <w:color w:val="595959"/>
-        </w:rPr>
-        <w:t>ection here]</w:t>
+        <w:t>[Write your 4–5 line reflection here]</w:t>
       </w:r>
     </w:p>
     <w:p/>
@@ -14299,15 +13602,7 @@
           <w:bCs/>
           <w:color w:val="2E75B6"/>
         </w:rPr>
-        <w:t xml:space="preserve">Member 5: </w:t>
-      </w:r>
-      <w:r>
-        <w:rPr>
-          <w:b/>
-          <w:bCs/>
-          <w:color w:val="2E75B6"/>
-        </w:rPr>
-        <w:t>[Student Name] – Reflection</w:t>
+        <w:t>Member 5: [Student Name] – Reflection</w:t>
       </w:r>
     </w:p>
     <w:p>
@@ -14349,13 +13644,7 @@
         <w:rPr>
           <w:color w:val="000000"/>
         </w:rPr>
-        <w:t>All technical work must align with the official documentation listed below. Students are expected to consult these resources while building their workflow</w:t>
-      </w:r>
-      <w:r>
-        <w:rPr>
-          <w:color w:val="000000"/>
-        </w:rPr>
-        <w:t xml:space="preserve"> files, Dockerfile, and HTML pages.</w:t>
+        <w:t>All technical work must align with the official documentation listed below. Students are expected to consult these resources while building their workflow files, Dockerfile, and HTML pages.</w:t>
       </w:r>
     </w:p>
     <w:p/>
@@ -14631,8 +13920,61 @@
                 <w:sz w:val="18"/>
                 <w:szCs w:val="18"/>
               </w:rPr>
-              <w:t>https://docs.github.com/en/actions/writing-workflows/choosing-what-your-workflow-does</w:t>
-            </w:r>
+              <w:t>https://docs.github.com/en/actions/writing-workflows/choosing-what-your-workflow-does/accessing-contextual-information-about-workflow-runs</w:t>
+            </w:r>
+          </w:p>
+        </w:tc>
+      </w:tr>
+      <w:tr>
+        <w:tc>
+          <w:tcPr>
+            <w:tcW w:w="3400" w:type="dxa"/>
+            <w:tcBorders>
+              <w:top w:val="single" w:sz="1" w:space="0" w:color="AAAAAA"/>
+              <w:left w:val="single" w:sz="1" w:space="0" w:color="AAAAAA"/>
+              <w:bottom w:val="single" w:sz="1" w:space="0" w:color="AAAAAA"/>
+              <w:right w:val="single" w:sz="1" w:space="0" w:color="AAAAAA"/>
+            </w:tcBorders>
+            <w:shd w:val="clear" w:color="auto" w:fill="FFFFFF"/>
+            <w:tcMar>
+              <w:top w:w="80" w:type="dxa"/>
+              <w:left w:w="120" w:type="dxa"/>
+              <w:bottom w:w="80" w:type="dxa"/>
+              <w:right w:w="120" w:type="dxa"/>
+            </w:tcMar>
+            <w:vAlign w:val="center"/>
+          </w:tcPr>
+          <w:p>
+            <w:r>
+              <w:rPr>
+                <w:b/>
+                <w:bCs/>
+                <w:color w:val="000000"/>
+                <w:sz w:val="20"/>
+                <w:szCs w:val="20"/>
+              </w:rPr>
+              <w:t>GitHub Actions – Encrypted Secrets</w:t>
+            </w:r>
+          </w:p>
+        </w:tc>
+        <w:tc>
+          <w:tcPr>
+            <w:tcW w:w="5960" w:type="dxa"/>
+            <w:tcBorders>
+              <w:top w:val="single" w:sz="1" w:space="0" w:color="AAAAAA"/>
+              <w:left w:val="single" w:sz="1" w:space="0" w:color="AAAAAA"/>
+              <w:bottom w:val="single" w:sz="1" w:space="0" w:color="AAAAAA"/>
+              <w:right w:val="single" w:sz="1" w:space="0" w:color="AAAAAA"/>
+            </w:tcBorders>
+            <w:shd w:val="clear" w:color="auto" w:fill="FFFFFF"/>
+            <w:tcMar>
+              <w:top w:w="80" w:type="dxa"/>
+              <w:left w:w="120" w:type="dxa"/>
+              <w:bottom w:w="80" w:type="dxa"/>
+              <w:right w:w="120" w:type="dxa"/>
+            </w:tcMar>
+          </w:tcPr>
+          <w:p>
             <w:r>
               <w:rPr>
                 <w:rFonts w:ascii="Courier New" w:eastAsia="Courier New" w:hAnsi="Courier New" w:cs="Courier New"/>
@@ -14640,7 +13982,7 @@
                 <w:sz w:val="18"/>
                 <w:szCs w:val="18"/>
               </w:rPr>
-              <w:t>/accessing-contextual-information-about-workflow-runs</w:t>
+              <w:t>https://docs.github.com/en/actions/security-guides/encrypted-secrets</w:t>
             </w:r>
           </w:p>
         </w:tc>
@@ -14655,25 +13997,25 @@
               <w:bottom w:val="single" w:sz="1" w:space="0" w:color="AAAAAA"/>
               <w:right w:val="single" w:sz="1" w:space="0" w:color="AAAAAA"/>
             </w:tcBorders>
-            <w:shd w:val="clear" w:color="auto" w:fill="FFFFFF"/>
-            <w:tcMar>
-              <w:top w:w="80" w:type="dxa"/>
-              <w:left w:w="120" w:type="dxa"/>
-              <w:bottom w:w="80" w:type="dxa"/>
-              <w:right w:w="120" w:type="dxa"/>
-            </w:tcMar>
-            <w:vAlign w:val="center"/>
-          </w:tcPr>
-          <w:p>
-            <w:r>
-              <w:rPr>
-                <w:b/>
-                <w:bCs/>
-                <w:color w:val="000000"/>
-                <w:sz w:val="20"/>
-                <w:szCs w:val="20"/>
-              </w:rPr>
-              <w:t>GitHub Actions – Encrypted Secrets</w:t>
+            <w:shd w:val="clear" w:color="auto" w:fill="EBF3FA"/>
+            <w:tcMar>
+              <w:top w:w="80" w:type="dxa"/>
+              <w:left w:w="120" w:type="dxa"/>
+              <w:bottom w:w="80" w:type="dxa"/>
+              <w:right w:w="120" w:type="dxa"/>
+            </w:tcMar>
+            <w:vAlign w:val="center"/>
+          </w:tcPr>
+          <w:p>
+            <w:r>
+              <w:rPr>
+                <w:b/>
+                <w:bCs/>
+                <w:color w:val="000000"/>
+                <w:sz w:val="20"/>
+                <w:szCs w:val="20"/>
+              </w:rPr>
+              <w:t>GitHub Actions – Environments for Deployment</w:t>
             </w:r>
           </w:p>
         </w:tc>
@@ -14686,7 +14028,7 @@
               <w:bottom w:val="single" w:sz="1" w:space="0" w:color="AAAAAA"/>
               <w:right w:val="single" w:sz="1" w:space="0" w:color="AAAAAA"/>
             </w:tcBorders>
-            <w:shd w:val="clear" w:color="auto" w:fill="FFFFFF"/>
+            <w:shd w:val="clear" w:color="auto" w:fill="EBF3FA"/>
             <w:tcMar>
               <w:top w:w="80" w:type="dxa"/>
               <w:left w:w="120" w:type="dxa"/>
@@ -14702,7 +14044,7 @@
                 <w:sz w:val="18"/>
                 <w:szCs w:val="18"/>
               </w:rPr>
-              <w:t>https://docs.github.com/en/actions/security-guides/encrypted-secrets</w:t>
+              <w:t>https://docs.github.com/en/actions/deployment/targeting-different-environments/using-environments-for-deployment</w:t>
             </w:r>
           </w:p>
         </w:tc>
@@ -14717,25 +14059,25 @@
               <w:bottom w:val="single" w:sz="1" w:space="0" w:color="AAAAAA"/>
               <w:right w:val="single" w:sz="1" w:space="0" w:color="AAAAAA"/>
             </w:tcBorders>
-            <w:shd w:val="clear" w:color="auto" w:fill="EBF3FA"/>
-            <w:tcMar>
-              <w:top w:w="80" w:type="dxa"/>
-              <w:left w:w="120" w:type="dxa"/>
-              <w:bottom w:w="80" w:type="dxa"/>
-              <w:right w:w="120" w:type="dxa"/>
-            </w:tcMar>
-            <w:vAlign w:val="center"/>
-          </w:tcPr>
-          <w:p>
-            <w:r>
-              <w:rPr>
-                <w:b/>
-                <w:bCs/>
-                <w:color w:val="000000"/>
-                <w:sz w:val="20"/>
-                <w:szCs w:val="20"/>
-              </w:rPr>
-              <w:t>GitHub Actions – Environments for Deployment</w:t>
+            <w:shd w:val="clear" w:color="auto" w:fill="FFFFFF"/>
+            <w:tcMar>
+              <w:top w:w="80" w:type="dxa"/>
+              <w:left w:w="120" w:type="dxa"/>
+              <w:bottom w:w="80" w:type="dxa"/>
+              <w:right w:w="120" w:type="dxa"/>
+            </w:tcMar>
+            <w:vAlign w:val="center"/>
+          </w:tcPr>
+          <w:p>
+            <w:r>
+              <w:rPr>
+                <w:b/>
+                <w:bCs/>
+                <w:color w:val="000000"/>
+                <w:sz w:val="20"/>
+                <w:szCs w:val="20"/>
+              </w:rPr>
+              <w:t>GitHub Actions – Branch Protection Rules</w:t>
             </w:r>
           </w:p>
         </w:tc>
@@ -14748,7 +14090,7 @@
               <w:bottom w:val="single" w:sz="1" w:space="0" w:color="AAAAAA"/>
               <w:right w:val="single" w:sz="1" w:space="0" w:color="AAAAAA"/>
             </w:tcBorders>
-            <w:shd w:val="clear" w:color="auto" w:fill="EBF3FA"/>
+            <w:shd w:val="clear" w:color="auto" w:fill="FFFFFF"/>
             <w:tcMar>
               <w:top w:w="80" w:type="dxa"/>
               <w:left w:w="120" w:type="dxa"/>
@@ -14764,7 +14106,7 @@
                 <w:sz w:val="18"/>
                 <w:szCs w:val="18"/>
               </w:rPr>
-              <w:t>https://docs.github.com/en/actions/deployment/targeting-different-environments/using-environments-for-deployment</w:t>
+              <w:t>https://docs.github.com/en/repositories/configuring-branches-and-merges-in-your-repository/managing-protected-branches/about-protected-branches</w:t>
             </w:r>
           </w:p>
         </w:tc>
@@ -14779,25 +14121,25 @@
               <w:bottom w:val="single" w:sz="1" w:space="0" w:color="AAAAAA"/>
               <w:right w:val="single" w:sz="1" w:space="0" w:color="AAAAAA"/>
             </w:tcBorders>
-            <w:shd w:val="clear" w:color="auto" w:fill="FFFFFF"/>
-            <w:tcMar>
-              <w:top w:w="80" w:type="dxa"/>
-              <w:left w:w="120" w:type="dxa"/>
-              <w:bottom w:w="80" w:type="dxa"/>
-              <w:right w:w="120" w:type="dxa"/>
-            </w:tcMar>
-            <w:vAlign w:val="center"/>
-          </w:tcPr>
-          <w:p>
-            <w:r>
-              <w:rPr>
-                <w:b/>
-                <w:bCs/>
-                <w:color w:val="000000"/>
-                <w:sz w:val="20"/>
-                <w:szCs w:val="20"/>
-              </w:rPr>
-              <w:t>GitHub Actions – Branch Protection Rules</w:t>
+            <w:shd w:val="clear" w:color="auto" w:fill="EBF3FA"/>
+            <w:tcMar>
+              <w:top w:w="80" w:type="dxa"/>
+              <w:left w:w="120" w:type="dxa"/>
+              <w:bottom w:w="80" w:type="dxa"/>
+              <w:right w:w="120" w:type="dxa"/>
+            </w:tcMar>
+            <w:vAlign w:val="center"/>
+          </w:tcPr>
+          <w:p>
+            <w:r>
+              <w:rPr>
+                <w:b/>
+                <w:bCs/>
+                <w:color w:val="000000"/>
+                <w:sz w:val="20"/>
+                <w:szCs w:val="20"/>
+              </w:rPr>
+              <w:t>actions/checkout@v4 (Official Action)</w:t>
             </w:r>
           </w:p>
         </w:tc>
@@ -14810,7 +14152,7 @@
               <w:bottom w:val="single" w:sz="1" w:space="0" w:color="AAAAAA"/>
               <w:right w:val="single" w:sz="1" w:space="0" w:color="AAAAAA"/>
             </w:tcBorders>
-            <w:shd w:val="clear" w:color="auto" w:fill="FFFFFF"/>
+            <w:shd w:val="clear" w:color="auto" w:fill="EBF3FA"/>
             <w:tcMar>
               <w:top w:w="80" w:type="dxa"/>
               <w:left w:w="120" w:type="dxa"/>
@@ -14826,7 +14168,7 @@
                 <w:sz w:val="18"/>
                 <w:szCs w:val="18"/>
               </w:rPr>
-              <w:t>https://docs.github.com/en/repositories/configuring-branches-and-merges-in-your-repository/managing-protected-branches/about-protected-branches</w:t>
+              <w:t>https://github.com/actions/checkout</w:t>
             </w:r>
           </w:p>
         </w:tc>
@@ -14841,25 +14183,25 @@
               <w:bottom w:val="single" w:sz="1" w:space="0" w:color="AAAAAA"/>
               <w:right w:val="single" w:sz="1" w:space="0" w:color="AAAAAA"/>
             </w:tcBorders>
-            <w:shd w:val="clear" w:color="auto" w:fill="EBF3FA"/>
-            <w:tcMar>
-              <w:top w:w="80" w:type="dxa"/>
-              <w:left w:w="120" w:type="dxa"/>
-              <w:bottom w:w="80" w:type="dxa"/>
-              <w:right w:w="120" w:type="dxa"/>
-            </w:tcMar>
-            <w:vAlign w:val="center"/>
-          </w:tcPr>
-          <w:p>
-            <w:r>
-              <w:rPr>
-                <w:b/>
-                <w:bCs/>
-                <w:color w:val="000000"/>
-                <w:sz w:val="20"/>
-                <w:szCs w:val="20"/>
-              </w:rPr>
-              <w:t>actions/checkout@v4 (Official Action)</w:t>
+            <w:shd w:val="clear" w:color="auto" w:fill="FFFFFF"/>
+            <w:tcMar>
+              <w:top w:w="80" w:type="dxa"/>
+              <w:left w:w="120" w:type="dxa"/>
+              <w:bottom w:w="80" w:type="dxa"/>
+              <w:right w:w="120" w:type="dxa"/>
+            </w:tcMar>
+            <w:vAlign w:val="center"/>
+          </w:tcPr>
+          <w:p>
+            <w:r>
+              <w:rPr>
+                <w:b/>
+                <w:bCs/>
+                <w:color w:val="000000"/>
+                <w:sz w:val="20"/>
+                <w:szCs w:val="20"/>
+              </w:rPr>
+              <w:t>docker/login-action@v3 (Official Docker Action)</w:t>
             </w:r>
           </w:p>
         </w:tc>
@@ -14872,7 +14214,7 @@
               <w:bottom w:val="single" w:sz="1" w:space="0" w:color="AAAAAA"/>
               <w:right w:val="single" w:sz="1" w:space="0" w:color="AAAAAA"/>
             </w:tcBorders>
-            <w:shd w:val="clear" w:color="auto" w:fill="EBF3FA"/>
+            <w:shd w:val="clear" w:color="auto" w:fill="FFFFFF"/>
             <w:tcMar>
               <w:top w:w="80" w:type="dxa"/>
               <w:left w:w="120" w:type="dxa"/>
@@ -14888,7 +14230,7 @@
                 <w:sz w:val="18"/>
                 <w:szCs w:val="18"/>
               </w:rPr>
-              <w:t>https://github.com/actions/checkout</w:t>
+              <w:t>https://github.com/docker/login-action</w:t>
             </w:r>
           </w:p>
         </w:tc>
@@ -14903,35 +14245,25 @@
               <w:bottom w:val="single" w:sz="1" w:space="0" w:color="AAAAAA"/>
               <w:right w:val="single" w:sz="1" w:space="0" w:color="AAAAAA"/>
             </w:tcBorders>
-            <w:shd w:val="clear" w:color="auto" w:fill="FFFFFF"/>
-            <w:tcMar>
-              <w:top w:w="80" w:type="dxa"/>
-              <w:left w:w="120" w:type="dxa"/>
-              <w:bottom w:w="80" w:type="dxa"/>
-              <w:right w:w="120" w:type="dxa"/>
-            </w:tcMar>
-            <w:vAlign w:val="center"/>
-          </w:tcPr>
-          <w:p>
-            <w:r>
-              <w:rPr>
-                <w:b/>
-                <w:bCs/>
-                <w:color w:val="000000"/>
-                <w:sz w:val="20"/>
-                <w:szCs w:val="20"/>
-              </w:rPr>
-              <w:t xml:space="preserve">docker/login-action@v3 (Official </w:t>
-            </w:r>
-            <w:r>
-              <w:rPr>
-                <w:b/>
-                <w:bCs/>
-                <w:color w:val="000000"/>
-                <w:sz w:val="20"/>
-                <w:szCs w:val="20"/>
-              </w:rPr>
-              <w:t>Docker Action)</w:t>
+            <w:shd w:val="clear" w:color="auto" w:fill="EBF3FA"/>
+            <w:tcMar>
+              <w:top w:w="80" w:type="dxa"/>
+              <w:left w:w="120" w:type="dxa"/>
+              <w:bottom w:w="80" w:type="dxa"/>
+              <w:right w:w="120" w:type="dxa"/>
+            </w:tcMar>
+            <w:vAlign w:val="center"/>
+          </w:tcPr>
+          <w:p>
+            <w:r>
+              <w:rPr>
+                <w:b/>
+                <w:bCs/>
+                <w:color w:val="000000"/>
+                <w:sz w:val="20"/>
+                <w:szCs w:val="20"/>
+              </w:rPr>
+              <w:t>docker/build-push-action@v5 (Official Docker Action)</w:t>
             </w:r>
           </w:p>
         </w:tc>
@@ -14944,7 +14276,7 @@
               <w:bottom w:val="single" w:sz="1" w:space="0" w:color="AAAAAA"/>
               <w:right w:val="single" w:sz="1" w:space="0" w:color="AAAAAA"/>
             </w:tcBorders>
-            <w:shd w:val="clear" w:color="auto" w:fill="FFFFFF"/>
+            <w:shd w:val="clear" w:color="auto" w:fill="EBF3FA"/>
             <w:tcMar>
               <w:top w:w="80" w:type="dxa"/>
               <w:left w:w="120" w:type="dxa"/>
@@ -14960,7 +14292,7 @@
                 <w:sz w:val="18"/>
                 <w:szCs w:val="18"/>
               </w:rPr>
-              <w:t>https://github.com/docker/login-action</w:t>
+              <w:t>https://github.com/docker/build-push-action</w:t>
             </w:r>
           </w:p>
         </w:tc>
@@ -14975,25 +14307,25 @@
               <w:bottom w:val="single" w:sz="1" w:space="0" w:color="AAAAAA"/>
               <w:right w:val="single" w:sz="1" w:space="0" w:color="AAAAAA"/>
             </w:tcBorders>
-            <w:shd w:val="clear" w:color="auto" w:fill="EBF3FA"/>
-            <w:tcMar>
-              <w:top w:w="80" w:type="dxa"/>
-              <w:left w:w="120" w:type="dxa"/>
-              <w:bottom w:w="80" w:type="dxa"/>
-              <w:right w:w="120" w:type="dxa"/>
-            </w:tcMar>
-            <w:vAlign w:val="center"/>
-          </w:tcPr>
-          <w:p>
-            <w:r>
-              <w:rPr>
-                <w:b/>
-                <w:bCs/>
-                <w:color w:val="000000"/>
-                <w:sz w:val="20"/>
-                <w:szCs w:val="20"/>
-              </w:rPr>
-              <w:t>docker/build-push-action@v5 (Official Docker Action)</w:t>
+            <w:shd w:val="clear" w:color="auto" w:fill="FFFFFF"/>
+            <w:tcMar>
+              <w:top w:w="80" w:type="dxa"/>
+              <w:left w:w="120" w:type="dxa"/>
+              <w:bottom w:w="80" w:type="dxa"/>
+              <w:right w:w="120" w:type="dxa"/>
+            </w:tcMar>
+            <w:vAlign w:val="center"/>
+          </w:tcPr>
+          <w:p>
+            <w:r>
+              <w:rPr>
+                <w:b/>
+                <w:bCs/>
+                <w:color w:val="000000"/>
+                <w:sz w:val="20"/>
+                <w:szCs w:val="20"/>
+              </w:rPr>
+              <w:t>docker/metadata-action@v5 (Official Docker Action)</w:t>
             </w:r>
           </w:p>
         </w:tc>
@@ -15006,7 +14338,7 @@
               <w:bottom w:val="single" w:sz="1" w:space="0" w:color="AAAAAA"/>
               <w:right w:val="single" w:sz="1" w:space="0" w:color="AAAAAA"/>
             </w:tcBorders>
-            <w:shd w:val="clear" w:color="auto" w:fill="EBF3FA"/>
+            <w:shd w:val="clear" w:color="auto" w:fill="FFFFFF"/>
             <w:tcMar>
               <w:top w:w="80" w:type="dxa"/>
               <w:left w:w="120" w:type="dxa"/>
@@ -15022,7 +14354,7 @@
                 <w:sz w:val="18"/>
                 <w:szCs w:val="18"/>
               </w:rPr>
-              <w:t>https://github.com/docker/build-push-action</w:t>
+              <w:t>https://github.com/docker/metadata-action</w:t>
             </w:r>
           </w:p>
         </w:tc>
@@ -15037,25 +14369,25 @@
               <w:bottom w:val="single" w:sz="1" w:space="0" w:color="AAAAAA"/>
               <w:right w:val="single" w:sz="1" w:space="0" w:color="AAAAAA"/>
             </w:tcBorders>
-            <w:shd w:val="clear" w:color="auto" w:fill="FFFFFF"/>
-            <w:tcMar>
-              <w:top w:w="80" w:type="dxa"/>
-              <w:left w:w="120" w:type="dxa"/>
-              <w:bottom w:w="80" w:type="dxa"/>
-              <w:right w:w="120" w:type="dxa"/>
-            </w:tcMar>
-            <w:vAlign w:val="center"/>
-          </w:tcPr>
-          <w:p>
-            <w:r>
-              <w:rPr>
-                <w:b/>
-                <w:bCs/>
-                <w:color w:val="000000"/>
-                <w:sz w:val="20"/>
-                <w:szCs w:val="20"/>
-              </w:rPr>
-              <w:t>docker/metadata-action@v5 (Official Docker Action)</w:t>
+            <w:shd w:val="clear" w:color="auto" w:fill="EBF3FA"/>
+            <w:tcMar>
+              <w:top w:w="80" w:type="dxa"/>
+              <w:left w:w="120" w:type="dxa"/>
+              <w:bottom w:w="80" w:type="dxa"/>
+              <w:right w:w="120" w:type="dxa"/>
+            </w:tcMar>
+            <w:vAlign w:val="center"/>
+          </w:tcPr>
+          <w:p>
+            <w:r>
+              <w:rPr>
+                <w:b/>
+                <w:bCs/>
+                <w:color w:val="000000"/>
+                <w:sz w:val="20"/>
+                <w:szCs w:val="20"/>
+              </w:rPr>
+              <w:t>Docker Hub – Repositories &amp; Access Tokens</w:t>
             </w:r>
           </w:p>
         </w:tc>
@@ -15068,7 +14400,7 @@
               <w:bottom w:val="single" w:sz="1" w:space="0" w:color="AAAAAA"/>
               <w:right w:val="single" w:sz="1" w:space="0" w:color="AAAAAA"/>
             </w:tcBorders>
-            <w:shd w:val="clear" w:color="auto" w:fill="FFFFFF"/>
+            <w:shd w:val="clear" w:color="auto" w:fill="EBF3FA"/>
             <w:tcMar>
               <w:top w:w="80" w:type="dxa"/>
               <w:left w:w="120" w:type="dxa"/>
@@ -15084,7 +14416,7 @@
                 <w:sz w:val="18"/>
                 <w:szCs w:val="18"/>
               </w:rPr>
-              <w:t>https://github.com/docker/metadata-action</w:t>
+              <w:t>https://docs.docker.com/docker-hub/ | https://docs.docker.com/security/for-developers/access-tokens/</w:t>
             </w:r>
           </w:p>
         </w:tc>
@@ -15099,35 +14431,25 @@
               <w:bottom w:val="single" w:sz="1" w:space="0" w:color="AAAAAA"/>
               <w:right w:val="single" w:sz="1" w:space="0" w:color="AAAAAA"/>
             </w:tcBorders>
-            <w:shd w:val="clear" w:color="auto" w:fill="EBF3FA"/>
-            <w:tcMar>
-              <w:top w:w="80" w:type="dxa"/>
-              <w:left w:w="120" w:type="dxa"/>
-              <w:bottom w:w="80" w:type="dxa"/>
-              <w:right w:w="120" w:type="dxa"/>
-            </w:tcMar>
-            <w:vAlign w:val="center"/>
-          </w:tcPr>
-          <w:p>
-            <w:r>
-              <w:rPr>
-                <w:b/>
-                <w:bCs/>
-                <w:color w:val="000000"/>
-                <w:sz w:val="20"/>
-                <w:szCs w:val="20"/>
-              </w:rPr>
-              <w:t xml:space="preserve">Docker </w:t>
-            </w:r>
-            <w:r>
-              <w:rPr>
-                <w:b/>
-                <w:bCs/>
-                <w:color w:val="000000"/>
-                <w:sz w:val="20"/>
-                <w:szCs w:val="20"/>
-              </w:rPr>
-              <w:t>Hub – Repositories &amp; Access Tokens</w:t>
+            <w:shd w:val="clear" w:color="auto" w:fill="FFFFFF"/>
+            <w:tcMar>
+              <w:top w:w="80" w:type="dxa"/>
+              <w:left w:w="120" w:type="dxa"/>
+              <w:bottom w:w="80" w:type="dxa"/>
+              <w:right w:w="120" w:type="dxa"/>
+            </w:tcMar>
+            <w:vAlign w:val="center"/>
+          </w:tcPr>
+          <w:p>
+            <w:r>
+              <w:rPr>
+                <w:b/>
+                <w:bCs/>
+                <w:color w:val="000000"/>
+                <w:sz w:val="20"/>
+                <w:szCs w:val="20"/>
+              </w:rPr>
+              <w:t>Docker Official nginx Image</w:t>
             </w:r>
           </w:p>
         </w:tc>
@@ -15140,7 +14462,7 @@
               <w:bottom w:val="single" w:sz="1" w:space="0" w:color="AAAAAA"/>
               <w:right w:val="single" w:sz="1" w:space="0" w:color="AAAAAA"/>
             </w:tcBorders>
-            <w:shd w:val="clear" w:color="auto" w:fill="EBF3FA"/>
+            <w:shd w:val="clear" w:color="auto" w:fill="FFFFFF"/>
             <w:tcMar>
               <w:top w:w="80" w:type="dxa"/>
               <w:left w:w="120" w:type="dxa"/>
@@ -15156,7 +14478,7 @@
                 <w:sz w:val="18"/>
                 <w:szCs w:val="18"/>
               </w:rPr>
-              <w:t>https://docs.docker.com/docker-hub/ | https://docs.docker.com/security/for-developers/access-tokens/</w:t>
+              <w:t>https://hub.docker.com/_/nginx</w:t>
             </w:r>
           </w:p>
         </w:tc>
@@ -15171,25 +14493,25 @@
               <w:bottom w:val="single" w:sz="1" w:space="0" w:color="AAAAAA"/>
               <w:right w:val="single" w:sz="1" w:space="0" w:color="AAAAAA"/>
             </w:tcBorders>
-            <w:shd w:val="clear" w:color="auto" w:fill="FFFFFF"/>
-            <w:tcMar>
-              <w:top w:w="80" w:type="dxa"/>
-              <w:left w:w="120" w:type="dxa"/>
-              <w:bottom w:w="80" w:type="dxa"/>
-              <w:right w:w="120" w:type="dxa"/>
-            </w:tcMar>
-            <w:vAlign w:val="center"/>
-          </w:tcPr>
-          <w:p>
-            <w:r>
-              <w:rPr>
-                <w:b/>
-                <w:bCs/>
-                <w:color w:val="000000"/>
-                <w:sz w:val="20"/>
-                <w:szCs w:val="20"/>
-              </w:rPr>
-              <w:t>Docker Official nginx Image</w:t>
+            <w:shd w:val="clear" w:color="auto" w:fill="EBF3FA"/>
+            <w:tcMar>
+              <w:top w:w="80" w:type="dxa"/>
+              <w:left w:w="120" w:type="dxa"/>
+              <w:bottom w:w="80" w:type="dxa"/>
+              <w:right w:w="120" w:type="dxa"/>
+            </w:tcMar>
+            <w:vAlign w:val="center"/>
+          </w:tcPr>
+          <w:p>
+            <w:r>
+              <w:rPr>
+                <w:b/>
+                <w:bCs/>
+                <w:color w:val="000000"/>
+                <w:sz w:val="20"/>
+                <w:szCs w:val="20"/>
+              </w:rPr>
+              <w:t>Dockerfile Reference</w:t>
             </w:r>
           </w:p>
         </w:tc>
@@ -15202,7 +14524,7 @@
               <w:bottom w:val="single" w:sz="1" w:space="0" w:color="AAAAAA"/>
               <w:right w:val="single" w:sz="1" w:space="0" w:color="AAAAAA"/>
             </w:tcBorders>
-            <w:shd w:val="clear" w:color="auto" w:fill="FFFFFF"/>
+            <w:shd w:val="clear" w:color="auto" w:fill="EBF3FA"/>
             <w:tcMar>
               <w:top w:w="80" w:type="dxa"/>
               <w:left w:w="120" w:type="dxa"/>
@@ -15218,7 +14540,7 @@
                 <w:sz w:val="18"/>
                 <w:szCs w:val="18"/>
               </w:rPr>
-              <w:t>https://hub.docker.com/_/nginx</w:t>
+              <w:t>https://docs.docker.com/reference/dockerfile/</w:t>
             </w:r>
           </w:p>
         </w:tc>
@@ -15233,25 +14555,25 @@
               <w:bottom w:val="single" w:sz="1" w:space="0" w:color="AAAAAA"/>
               <w:right w:val="single" w:sz="1" w:space="0" w:color="AAAAAA"/>
             </w:tcBorders>
-            <w:shd w:val="clear" w:color="auto" w:fill="EBF3FA"/>
-            <w:tcMar>
-              <w:top w:w="80" w:type="dxa"/>
-              <w:left w:w="120" w:type="dxa"/>
-              <w:bottom w:w="80" w:type="dxa"/>
-              <w:right w:w="120" w:type="dxa"/>
-            </w:tcMar>
-            <w:vAlign w:val="center"/>
-          </w:tcPr>
-          <w:p>
-            <w:r>
-              <w:rPr>
-                <w:b/>
-                <w:bCs/>
-                <w:color w:val="000000"/>
-                <w:sz w:val="20"/>
-                <w:szCs w:val="20"/>
-              </w:rPr>
-              <w:t>Dockerfile Reference</w:t>
+            <w:shd w:val="clear" w:color="auto" w:fill="FFFFFF"/>
+            <w:tcMar>
+              <w:top w:w="80" w:type="dxa"/>
+              <w:left w:w="120" w:type="dxa"/>
+              <w:bottom w:w="80" w:type="dxa"/>
+              <w:right w:w="120" w:type="dxa"/>
+            </w:tcMar>
+            <w:vAlign w:val="center"/>
+          </w:tcPr>
+          <w:p>
+            <w:r>
+              <w:rPr>
+                <w:b/>
+                <w:bCs/>
+                <w:color w:val="000000"/>
+                <w:sz w:val="20"/>
+                <w:szCs w:val="20"/>
+              </w:rPr>
+              <w:t>Render.com – Deploy Hooks</w:t>
             </w:r>
           </w:p>
         </w:tc>
@@ -15264,7 +14586,7 @@
               <w:bottom w:val="single" w:sz="1" w:space="0" w:color="AAAAAA"/>
               <w:right w:val="single" w:sz="1" w:space="0" w:color="AAAAAA"/>
             </w:tcBorders>
-            <w:shd w:val="clear" w:color="auto" w:fill="EBF3FA"/>
+            <w:shd w:val="clear" w:color="auto" w:fill="FFFFFF"/>
             <w:tcMar>
               <w:top w:w="80" w:type="dxa"/>
               <w:left w:w="120" w:type="dxa"/>
@@ -15280,7 +14602,7 @@
                 <w:sz w:val="18"/>
                 <w:szCs w:val="18"/>
               </w:rPr>
-              <w:t>https://docs.docker.com/reference/dockerfile/</w:t>
+              <w:t>https://docs.render.com/deploy-hooks</w:t>
             </w:r>
           </w:p>
         </w:tc>
@@ -15295,25 +14617,25 @@
               <w:bottom w:val="single" w:sz="1" w:space="0" w:color="AAAAAA"/>
               <w:right w:val="single" w:sz="1" w:space="0" w:color="AAAAAA"/>
             </w:tcBorders>
-            <w:shd w:val="clear" w:color="auto" w:fill="FFFFFF"/>
-            <w:tcMar>
-              <w:top w:w="80" w:type="dxa"/>
-              <w:left w:w="120" w:type="dxa"/>
-              <w:bottom w:w="80" w:type="dxa"/>
-              <w:right w:w="120" w:type="dxa"/>
-            </w:tcMar>
-            <w:vAlign w:val="center"/>
-          </w:tcPr>
-          <w:p>
-            <w:r>
-              <w:rPr>
-                <w:b/>
-                <w:bCs/>
-                <w:color w:val="000000"/>
-                <w:sz w:val="20"/>
-                <w:szCs w:val="20"/>
-              </w:rPr>
-              <w:t>Render.com – Deploy Hooks</w:t>
+            <w:shd w:val="clear" w:color="auto" w:fill="EBF3FA"/>
+            <w:tcMar>
+              <w:top w:w="80" w:type="dxa"/>
+              <w:left w:w="120" w:type="dxa"/>
+              <w:bottom w:w="80" w:type="dxa"/>
+              <w:right w:w="120" w:type="dxa"/>
+            </w:tcMar>
+            <w:vAlign w:val="center"/>
+          </w:tcPr>
+          <w:p>
+            <w:r>
+              <w:rPr>
+                <w:b/>
+                <w:bCs/>
+                <w:color w:val="000000"/>
+                <w:sz w:val="20"/>
+                <w:szCs w:val="20"/>
+              </w:rPr>
+              <w:t>Render.com – Docker Deploys</w:t>
             </w:r>
           </w:p>
         </w:tc>
@@ -15326,7 +14648,7 @@
               <w:bottom w:val="single" w:sz="1" w:space="0" w:color="AAAAAA"/>
               <w:right w:val="single" w:sz="1" w:space="0" w:color="AAAAAA"/>
             </w:tcBorders>
-            <w:shd w:val="clear" w:color="auto" w:fill="FFFFFF"/>
+            <w:shd w:val="clear" w:color="auto" w:fill="EBF3FA"/>
             <w:tcMar>
               <w:top w:w="80" w:type="dxa"/>
               <w:left w:w="120" w:type="dxa"/>
@@ -15342,7 +14664,7 @@
                 <w:sz w:val="18"/>
                 <w:szCs w:val="18"/>
               </w:rPr>
-              <w:t>https://docs.render.com/deploy-hooks</w:t>
+              <w:t>https://docs.render.com/docker</w:t>
             </w:r>
           </w:p>
         </w:tc>
@@ -15357,25 +14679,25 @@
               <w:bottom w:val="single" w:sz="1" w:space="0" w:color="AAAAAA"/>
               <w:right w:val="single" w:sz="1" w:space="0" w:color="AAAAAA"/>
             </w:tcBorders>
-            <w:shd w:val="clear" w:color="auto" w:fill="EBF3FA"/>
-            <w:tcMar>
-              <w:top w:w="80" w:type="dxa"/>
-              <w:left w:w="120" w:type="dxa"/>
-              <w:bottom w:w="80" w:type="dxa"/>
-              <w:right w:w="120" w:type="dxa"/>
-            </w:tcMar>
-            <w:vAlign w:val="center"/>
-          </w:tcPr>
-          <w:p>
-            <w:r>
-              <w:rPr>
-                <w:b/>
-                <w:bCs/>
-                <w:color w:val="000000"/>
-                <w:sz w:val="20"/>
-                <w:szCs w:val="20"/>
-              </w:rPr>
-              <w:t>Render.com – Docker Deploys</w:t>
+            <w:shd w:val="clear" w:color="auto" w:fill="FFFFFF"/>
+            <w:tcMar>
+              <w:top w:w="80" w:type="dxa"/>
+              <w:left w:w="120" w:type="dxa"/>
+              <w:bottom w:w="80" w:type="dxa"/>
+              <w:right w:w="120" w:type="dxa"/>
+            </w:tcMar>
+            <w:vAlign w:val="center"/>
+          </w:tcPr>
+          <w:p>
+            <w:r>
+              <w:rPr>
+                <w:b/>
+                <w:bCs/>
+                <w:color w:val="000000"/>
+                <w:sz w:val="20"/>
+                <w:szCs w:val="20"/>
+              </w:rPr>
+              <w:t>HTML5 Specification (WHATWG)</w:t>
             </w:r>
           </w:p>
         </w:tc>
@@ -15388,7 +14710,7 @@
               <w:bottom w:val="single" w:sz="1" w:space="0" w:color="AAAAAA"/>
               <w:right w:val="single" w:sz="1" w:space="0" w:color="AAAAAA"/>
             </w:tcBorders>
-            <w:shd w:val="clear" w:color="auto" w:fill="EBF3FA"/>
+            <w:shd w:val="clear" w:color="auto" w:fill="FFFFFF"/>
             <w:tcMar>
               <w:top w:w="80" w:type="dxa"/>
               <w:left w:w="120" w:type="dxa"/>
@@ -15404,7 +14726,7 @@
                 <w:sz w:val="18"/>
                 <w:szCs w:val="18"/>
               </w:rPr>
-              <w:t>https://docs.render.com/docker</w:t>
+              <w:t>https://html.spec.whatwg.org/</w:t>
             </w:r>
           </w:p>
         </w:tc>
@@ -15419,97 +14741,25 @@
               <w:bottom w:val="single" w:sz="1" w:space="0" w:color="AAAAAA"/>
               <w:right w:val="single" w:sz="1" w:space="0" w:color="AAAAAA"/>
             </w:tcBorders>
-            <w:shd w:val="clear" w:color="auto" w:fill="FFFFFF"/>
-            <w:tcMar>
-              <w:top w:w="80" w:type="dxa"/>
-              <w:left w:w="120" w:type="dxa"/>
-              <w:bottom w:w="80" w:type="dxa"/>
-              <w:right w:w="120" w:type="dxa"/>
-            </w:tcMar>
-            <w:vAlign w:val="center"/>
-          </w:tcPr>
-          <w:p>
-            <w:r>
-              <w:rPr>
-                <w:b/>
-                <w:bCs/>
-                <w:color w:val="000000"/>
-                <w:sz w:val="20"/>
-                <w:szCs w:val="20"/>
-              </w:rPr>
-              <w:t>HTML5 Specification (WHATWG)</w:t>
-            </w:r>
-          </w:p>
-        </w:tc>
-        <w:tc>
-          <w:tcPr>
-            <w:tcW w:w="5960" w:type="dxa"/>
-            <w:tcBorders>
-              <w:top w:val="single" w:sz="1" w:space="0" w:color="AAAAAA"/>
-              <w:left w:val="single" w:sz="1" w:space="0" w:color="AAAAAA"/>
-              <w:bottom w:val="single" w:sz="1" w:space="0" w:color="AAAAAA"/>
-              <w:right w:val="single" w:sz="1" w:space="0" w:color="AAAAAA"/>
-            </w:tcBorders>
-            <w:shd w:val="clear" w:color="auto" w:fill="FFFFFF"/>
-            <w:tcMar>
-              <w:top w:w="80" w:type="dxa"/>
-              <w:left w:w="120" w:type="dxa"/>
-              <w:bottom w:w="80" w:type="dxa"/>
-              <w:right w:w="120" w:type="dxa"/>
-            </w:tcMar>
-          </w:tcPr>
-          <w:p>
-            <w:r>
-              <w:rPr>
-                <w:rFonts w:ascii="Courier New" w:eastAsia="Courier New" w:hAnsi="Courier New" w:cs="Courier New"/>
-                <w:color w:val="2E75B6"/>
-                <w:sz w:val="18"/>
-                <w:szCs w:val="18"/>
-              </w:rPr>
-              <w:t>https://html.spec.whatwg.org/</w:t>
-            </w:r>
-          </w:p>
-        </w:tc>
-      </w:tr>
-      <w:tr>
-        <w:tc>
-          <w:tcPr>
-            <w:tcW w:w="3400" w:type="dxa"/>
-            <w:tcBorders>
-              <w:top w:val="single" w:sz="1" w:space="0" w:color="AAAAAA"/>
-              <w:left w:val="single" w:sz="1" w:space="0" w:color="AAAAAA"/>
-              <w:bottom w:val="single" w:sz="1" w:space="0" w:color="AAAAAA"/>
-              <w:right w:val="single" w:sz="1" w:space="0" w:color="AAAAAA"/>
-            </w:tcBorders>
-            <w:shd w:val="clear" w:color="auto" w:fill="EBF3FA"/>
-            <w:tcMar>
-              <w:top w:w="80" w:type="dxa"/>
-              <w:left w:w="120" w:type="dxa"/>
-              <w:bottom w:w="80" w:type="dxa"/>
-              <w:right w:w="120" w:type="dxa"/>
-            </w:tcMar>
-            <w:vAlign w:val="center"/>
-          </w:tcPr>
-          <w:p>
-            <w:r>
-              <w:rPr>
-                <w:b/>
-                <w:bCs/>
-                <w:color w:val="000000"/>
-                <w:sz w:val="20"/>
-                <w:szCs w:val="20"/>
-              </w:rPr>
-              <w:t xml:space="preserve">MDN Web Docs – HTML </w:t>
-            </w:r>
-            <w:r>
-              <w:rPr>
-                <w:b/>
-                <w:bCs/>
-                <w:color w:val="000000"/>
-                <w:sz w:val="20"/>
-                <w:szCs w:val="20"/>
-              </w:rPr>
-              <w:t>Reference</w:t>
+            <w:shd w:val="clear" w:color="auto" w:fill="EBF3FA"/>
+            <w:tcMar>
+              <w:top w:w="80" w:type="dxa"/>
+              <w:left w:w="120" w:type="dxa"/>
+              <w:bottom w:w="80" w:type="dxa"/>
+              <w:right w:w="120" w:type="dxa"/>
+            </w:tcMar>
+            <w:vAlign w:val="center"/>
+          </w:tcPr>
+          <w:p>
+            <w:r>
+              <w:rPr>
+                <w:b/>
+                <w:bCs/>
+                <w:color w:val="000000"/>
+                <w:sz w:val="20"/>
+                <w:szCs w:val="20"/>
+              </w:rPr>
+              <w:t>MDN Web Docs – HTML Reference</w:t>
             </w:r>
           </w:p>
         </w:tc>
@@ -15683,7 +14933,7 @@
 </file>
 
 <file path=word/endnotes.xml><?xml version="1.0" encoding="utf-8"?>
-<w:endnotes xmlns:wpc="http://schemas.microsoft.com/office/word/2010/wordprocessingCanvas" xmlns:cx="http://schemas.microsoft.com/office/drawing/2014/chartex" xmlns:mc="http://schemas.openxmlformats.org/markup-compatibility/2006" xmlns:o="urn:schemas-microsoft-com:office:office" xmlns:r="http://schemas.openxmlformats.org/officeDocument/2006/relationships" xmlns:m="http://schemas.openxmlformats.org/officeDocument/2006/math" xmlns:v="urn:schemas-microsoft-com:vml" xmlns:wp14="http://schemas.microsoft.com/office/word/2010/wordprocessingDrawing" xmlns:wp="http://schemas.openxmlformats.org/drawingml/2006/wordprocessingDrawing" xmlns:w10="urn:schemas-microsoft-com:office:word" xmlns:w="http://schemas.openxmlformats.org/wordprocessingml/2006/main" xmlns:w14="http://schemas.microsoft.com/office/word/2010/wordml" xmlns:w15="http://schemas.microsoft.com/office/word/2012/wordml" xmlns:w16se="http://schemas.microsoft.com/office/word/2015/wordml/symex" xmlns:wpg="http://schemas.microsoft.com/office/word/2010/wordprocessingGroup" xmlns:wpi="http://schemas.microsoft.com/office/word/2010/wordprocessingInk" xmlns:wne="http://schemas.microsoft.com/office/word/2006/wordml" xmlns:wps="http://schemas.microsoft.com/office/word/2010/wordprocessingShape" mc:Ignorable="w14 w15 w16se wp14">
+<w:endnotes xmlns:wpc="http://schemas.microsoft.com/office/word/2010/wordprocessingCanvas" xmlns:cx="http://schemas.microsoft.com/office/drawing/2014/chartex" xmlns:cx1="http://schemas.microsoft.com/office/drawing/2015/9/8/chartex" xmlns:cx2="http://schemas.microsoft.com/office/drawing/2015/10/21/chartex" xmlns:cx3="http://schemas.microsoft.com/office/drawing/2016/5/9/chartex" xmlns:cx4="http://schemas.microsoft.com/office/drawing/2016/5/10/chartex" xmlns:cx5="http://schemas.microsoft.com/office/drawing/2016/5/11/chartex" xmlns:cx6="http://schemas.microsoft.com/office/drawing/2016/5/12/chartex" xmlns:cx7="http://schemas.microsoft.com/office/drawing/2016/5/13/chartex" xmlns:cx8="http://schemas.microsoft.com/office/drawing/2016/5/14/chartex" xmlns:mc="http://schemas.openxmlformats.org/markup-compatibility/2006" xmlns:aink="http://schemas.microsoft.com/office/drawing/2016/ink" xmlns:am3d="http://schemas.microsoft.com/office/drawing/2017/model3d" xmlns:o="urn:schemas-microsoft-com:office:office" xmlns:oel="http://schemas.microsoft.com/office/2019/extlst" xmlns:r="http://schemas.openxmlformats.org/officeDocument/2006/relationships" xmlns:m="http://schemas.openxmlformats.org/officeDocument/2006/math" xmlns:v="urn:schemas-microsoft-com:vml" xmlns:wp14="http://schemas.microsoft.com/office/word/2010/wordprocessingDrawing" xmlns:wp="http://schemas.openxmlformats.org/drawingml/2006/wordprocessingDrawing" xmlns:w10="urn:schemas-microsoft-com:office:word" xmlns:w="http://schemas.openxmlformats.org/wordprocessingml/2006/main" xmlns:w14="http://schemas.microsoft.com/office/word/2010/wordml" xmlns:w15="http://schemas.microsoft.com/office/word/2012/wordml" xmlns:w16cex="http://schemas.microsoft.com/office/word/2018/wordml/cex" xmlns:w16cid="http://schemas.microsoft.com/office/word/2016/wordml/cid" xmlns:w16="http://schemas.microsoft.com/office/word/2018/wordml" xmlns:w16du="http://schemas.microsoft.com/office/word/2023/wordml/word16du" xmlns:w16sdtdh="http://schemas.microsoft.com/office/word/2020/wordml/sdtdatahash" xmlns:w16sdtfl="http://schemas.microsoft.com/office/word/2024/wordml/sdtformatlock" xmlns:w16se="http://schemas.microsoft.com/office/word/2015/wordml/symex" xmlns:wpg="http://schemas.microsoft.com/office/word/2010/wordprocessingGroup" xmlns:wpi="http://schemas.microsoft.com/office/word/2010/wordprocessingInk" xmlns:wne="http://schemas.microsoft.com/office/word/2006/wordml" xmlns:wps="http://schemas.microsoft.com/office/word/2010/wordprocessingShape" mc:Ignorable="w14 w15 w16se w16cid w16 w16cex w16sdtdh w16sdtfl w16du wp14">
   <w:endnote w:type="separator" w:id="-1">
     <w:p>
       <w:r>
@@ -15702,7 +14952,7 @@
 </file>
 
 <file path=word/footer1.xml><?xml version="1.0" encoding="utf-8"?>
-<w:ftr xmlns:wpc="http://schemas.microsoft.com/office/word/2010/wordprocessingCanvas" xmlns:cx="http://schemas.microsoft.com/office/drawing/2014/chartex" xmlns:mc="http://schemas.openxmlformats.org/markup-compatibility/2006" xmlns:o="urn:schemas-microsoft-com:office:office" xmlns:r="http://schemas.openxmlformats.org/officeDocument/2006/relationships" xmlns:m="http://schemas.openxmlformats.org/officeDocument/2006/math" xmlns:v="urn:schemas-microsoft-com:vml" xmlns:wp14="http://schemas.microsoft.com/office/word/2010/wordprocessingDrawing" xmlns:wp="http://schemas.openxmlformats.org/drawingml/2006/wordprocessingDrawing" xmlns:w10="urn:schemas-microsoft-com:office:word" xmlns:w="http://schemas.openxmlformats.org/wordprocessingml/2006/main" xmlns:w14="http://schemas.microsoft.com/office/word/2010/wordml" xmlns:w15="http://schemas.microsoft.com/office/word/2012/wordml" xmlns:w16se="http://schemas.microsoft.com/office/word/2015/wordml/symex" xmlns:wpg="http://schemas.microsoft.com/office/word/2010/wordprocessingGroup" xmlns:wpi="http://schemas.microsoft.com/office/word/2010/wordprocessingInk" xmlns:wne="http://schemas.microsoft.com/office/word/2006/wordml" xmlns:wps="http://schemas.microsoft.com/office/word/2010/wordprocessingShape" mc:Ignorable="w14 w15 w16se wp14">
+<w:ftr xmlns:wpc="http://schemas.microsoft.com/office/word/2010/wordprocessingCanvas" xmlns:cx="http://schemas.microsoft.com/office/drawing/2014/chartex" xmlns:cx1="http://schemas.microsoft.com/office/drawing/2015/9/8/chartex" xmlns:cx2="http://schemas.microsoft.com/office/drawing/2015/10/21/chartex" xmlns:cx3="http://schemas.microsoft.com/office/drawing/2016/5/9/chartex" xmlns:cx4="http://schemas.microsoft.com/office/drawing/2016/5/10/chartex" xmlns:cx5="http://schemas.microsoft.com/office/drawing/2016/5/11/chartex" xmlns:cx6="http://schemas.microsoft.com/office/drawing/2016/5/12/chartex" xmlns:cx7="http://schemas.microsoft.com/office/drawing/2016/5/13/chartex" xmlns:cx8="http://schemas.microsoft.com/office/drawing/2016/5/14/chartex" xmlns:mc="http://schemas.openxmlformats.org/markup-compatibility/2006" xmlns:aink="http://schemas.microsoft.com/office/drawing/2016/ink" xmlns:am3d="http://schemas.microsoft.com/office/drawing/2017/model3d" xmlns:o="urn:schemas-microsoft-com:office:office" xmlns:oel="http://schemas.microsoft.com/office/2019/extlst" xmlns:r="http://schemas.openxmlformats.org/officeDocument/2006/relationships" xmlns:m="http://schemas.openxmlformats.org/officeDocument/2006/math" xmlns:v="urn:schemas-microsoft-com:vml" xmlns:wp14="http://schemas.microsoft.com/office/word/2010/wordprocessingDrawing" xmlns:wp="http://schemas.openxmlformats.org/drawingml/2006/wordprocessingDrawing" xmlns:w10="urn:schemas-microsoft-com:office:word" xmlns:w="http://schemas.openxmlformats.org/wordprocessingml/2006/main" xmlns:w14="http://schemas.microsoft.com/office/word/2010/wordml" xmlns:w15="http://schemas.microsoft.com/office/word/2012/wordml" xmlns:w16cex="http://schemas.microsoft.com/office/word/2018/wordml/cex" xmlns:w16cid="http://schemas.microsoft.com/office/word/2016/wordml/cid" xmlns:w16="http://schemas.microsoft.com/office/word/2018/wordml" xmlns:w16du="http://schemas.microsoft.com/office/word/2023/wordml/word16du" xmlns:w16sdtdh="http://schemas.microsoft.com/office/word/2020/wordml/sdtdatahash" xmlns:w16sdtfl="http://schemas.microsoft.com/office/word/2024/wordml/sdtformatlock" xmlns:w16se="http://schemas.microsoft.com/office/word/2015/wordml/symex" xmlns:wpg="http://schemas.microsoft.com/office/word/2010/wordprocessingGroup" xmlns:wpi="http://schemas.microsoft.com/office/word/2010/wordprocessingInk" xmlns:wne="http://schemas.microsoft.com/office/word/2006/wordml" xmlns:wps="http://schemas.microsoft.com/office/word/2010/wordprocessingShape" mc:Ignorable="w14 w15 w16se w16cid w16 w16cex w16sdtdh w16sdtfl w16du wp14">
   <w:p>
     <w:pPr>
       <w:pBdr>
@@ -15824,7 +15074,7 @@
 </file>
 
 <file path=word/footnotes.xml><?xml version="1.0" encoding="utf-8"?>
-<w:footnotes xmlns:wpc="http://schemas.microsoft.com/office/word/2010/wordprocessingCanvas" xmlns:cx="http://schemas.microsoft.com/office/drawing/2014/chartex" xmlns:mc="http://schemas.openxmlformats.org/markup-compatibility/2006" xmlns:o="urn:schemas-microsoft-com:office:office" xmlns:r="http://schemas.openxmlformats.org/officeDocument/2006/relationships" xmlns:m="http://schemas.openxmlformats.org/officeDocument/2006/math" xmlns:v="urn:schemas-microsoft-com:vml" xmlns:wp14="http://schemas.microsoft.com/office/word/2010/wordprocessingDrawing" xmlns:wp="http://schemas.openxmlformats.org/drawingml/2006/wordprocessingDrawing" xmlns:w10="urn:schemas-microsoft-com:office:word" xmlns:w="http://schemas.openxmlformats.org/wordprocessingml/2006/main" xmlns:w14="http://schemas.microsoft.com/office/word/2010/wordml" xmlns:w15="http://schemas.microsoft.com/office/word/2012/wordml" xmlns:w16se="http://schemas.microsoft.com/office/word/2015/wordml/symex" xmlns:wpg="http://schemas.microsoft.com/office/word/2010/wordprocessingGroup" xmlns:wpi="http://schemas.microsoft.com/office/word/2010/wordprocessingInk" xmlns:wne="http://schemas.microsoft.com/office/word/2006/wordml" xmlns:wps="http://schemas.microsoft.com/office/word/2010/wordprocessingShape" mc:Ignorable="w14 w15 w16se wp14">
+<w:footnotes xmlns:wpc="http://schemas.microsoft.com/office/word/2010/wordprocessingCanvas" xmlns:cx="http://schemas.microsoft.com/office/drawing/2014/chartex" xmlns:cx1="http://schemas.microsoft.com/office/drawing/2015/9/8/chartex" xmlns:cx2="http://schemas.microsoft.com/office/drawing/2015/10/21/chartex" xmlns:cx3="http://schemas.microsoft.com/office/drawing/2016/5/9/chartex" xmlns:cx4="http://schemas.microsoft.com/office/drawing/2016/5/10/chartex" xmlns:cx5="http://schemas.microsoft.com/office/drawing/2016/5/11/chartex" xmlns:cx6="http://schemas.microsoft.com/office/drawing/2016/5/12/chartex" xmlns:cx7="http://schemas.microsoft.com/office/drawing/2016/5/13/chartex" xmlns:cx8="http://schemas.microsoft.com/office/drawing/2016/5/14/chartex" xmlns:mc="http://schemas.openxmlformats.org/markup-compatibility/2006" xmlns:aink="http://schemas.microsoft.com/office/drawing/2016/ink" xmlns:am3d="http://schemas.microsoft.com/office/drawing/2017/model3d" xmlns:o="urn:schemas-microsoft-com:office:office" xmlns:oel="http://schemas.microsoft.com/office/2019/extlst" xmlns:r="http://schemas.openxmlformats.org/officeDocument/2006/relationships" xmlns:m="http://schemas.openxmlformats.org/officeDocument/2006/math" xmlns:v="urn:schemas-microsoft-com:vml" xmlns:wp14="http://schemas.microsoft.com/office/word/2010/wordprocessingDrawing" xmlns:wp="http://schemas.openxmlformats.org/drawingml/2006/wordprocessingDrawing" xmlns:w10="urn:schemas-microsoft-com:office:word" xmlns:w="http://schemas.openxmlformats.org/wordprocessingml/2006/main" xmlns:w14="http://schemas.microsoft.com/office/word/2010/wordml" xmlns:w15="http://schemas.microsoft.com/office/word/2012/wordml" xmlns:w16cex="http://schemas.microsoft.com/office/word/2018/wordml/cex" xmlns:w16cid="http://schemas.microsoft.com/office/word/2016/wordml/cid" xmlns:w16="http://schemas.microsoft.com/office/word/2018/wordml" xmlns:w16du="http://schemas.microsoft.com/office/word/2023/wordml/word16du" xmlns:w16sdtdh="http://schemas.microsoft.com/office/word/2020/wordml/sdtdatahash" xmlns:w16sdtfl="http://schemas.microsoft.com/office/word/2024/wordml/sdtformatlock" xmlns:w16se="http://schemas.microsoft.com/office/word/2015/wordml/symex" xmlns:wpg="http://schemas.microsoft.com/office/word/2010/wordprocessingGroup" xmlns:wpi="http://schemas.microsoft.com/office/word/2010/wordprocessingInk" xmlns:wne="http://schemas.microsoft.com/office/word/2006/wordml" xmlns:wps="http://schemas.microsoft.com/office/word/2010/wordprocessingShape" mc:Ignorable="w14 w15 w16se w16cid w16 w16cex w16sdtdh w16sdtfl w16du wp14">
   <w:footnote w:type="separator" w:id="-1">
     <w:p>
       <w:r>
@@ -15843,7 +15093,7 @@
 </file>
 
 <file path=word/header1.xml><?xml version="1.0" encoding="utf-8"?>
-<w:hdr xmlns:wpc="http://schemas.microsoft.com/office/word/2010/wordprocessingCanvas" xmlns:cx="http://schemas.microsoft.com/office/drawing/2014/chartex" xmlns:mc="http://schemas.openxmlformats.org/markup-compatibility/2006" xmlns:o="urn:schemas-microsoft-com:office:office" xmlns:r="http://schemas.openxmlformats.org/officeDocument/2006/relationships" xmlns:m="http://schemas.openxmlformats.org/officeDocument/2006/math" xmlns:v="urn:schemas-microsoft-com:vml" xmlns:wp14="http://schemas.microsoft.com/office/word/2010/wordprocessingDrawing" xmlns:wp="http://schemas.openxmlformats.org/drawingml/2006/wordprocessingDrawing" xmlns:w10="urn:schemas-microsoft-com:office:word" xmlns:w="http://schemas.openxmlformats.org/wordprocessingml/2006/main" xmlns:w14="http://schemas.microsoft.com/office/word/2010/wordml" xmlns:w15="http://schemas.microsoft.com/office/word/2012/wordml" xmlns:w16se="http://schemas.microsoft.com/office/word/2015/wordml/symex" xmlns:wpg="http://schemas.microsoft.com/office/word/2010/wordprocessingGroup" xmlns:wpi="http://schemas.microsoft.com/office/word/2010/wordprocessingInk" xmlns:wne="http://schemas.microsoft.com/office/word/2006/wordml" xmlns:wps="http://schemas.microsoft.com/office/word/2010/wordprocessingShape" mc:Ignorable="w14 w15 w16se wp14">
+<w:hdr xmlns:wpc="http://schemas.microsoft.com/office/word/2010/wordprocessingCanvas" xmlns:cx="http://schemas.microsoft.com/office/drawing/2014/chartex" xmlns:cx1="http://schemas.microsoft.com/office/drawing/2015/9/8/chartex" xmlns:cx2="http://schemas.microsoft.com/office/drawing/2015/10/21/chartex" xmlns:cx3="http://schemas.microsoft.com/office/drawing/2016/5/9/chartex" xmlns:cx4="http://schemas.microsoft.com/office/drawing/2016/5/10/chartex" xmlns:cx5="http://schemas.microsoft.com/office/drawing/2016/5/11/chartex" xmlns:cx6="http://schemas.microsoft.com/office/drawing/2016/5/12/chartex" xmlns:cx7="http://schemas.microsoft.com/office/drawing/2016/5/13/chartex" xmlns:cx8="http://schemas.microsoft.com/office/drawing/2016/5/14/chartex" xmlns:mc="http://schemas.openxmlformats.org/markup-compatibility/2006" xmlns:aink="http://schemas.microsoft.com/office/drawing/2016/ink" xmlns:am3d="http://schemas.microsoft.com/office/drawing/2017/model3d" xmlns:o="urn:schemas-microsoft-com:office:office" xmlns:oel="http://schemas.microsoft.com/office/2019/extlst" xmlns:r="http://schemas.openxmlformats.org/officeDocument/2006/relationships" xmlns:m="http://schemas.openxmlformats.org/officeDocument/2006/math" xmlns:v="urn:schemas-microsoft-com:vml" xmlns:wp14="http://schemas.microsoft.com/office/word/2010/wordprocessingDrawing" xmlns:wp="http://schemas.openxmlformats.org/drawingml/2006/wordprocessingDrawing" xmlns:w10="urn:schemas-microsoft-com:office:word" xmlns:w="http://schemas.openxmlformats.org/wordprocessingml/2006/main" xmlns:w14="http://schemas.microsoft.com/office/word/2010/wordml" xmlns:w15="http://schemas.microsoft.com/office/word/2012/wordml" xmlns:w16cex="http://schemas.microsoft.com/office/word/2018/wordml/cex" xmlns:w16cid="http://schemas.microsoft.com/office/word/2016/wordml/cid" xmlns:w16="http://schemas.microsoft.com/office/word/2018/wordml" xmlns:w16du="http://schemas.microsoft.com/office/word/2023/wordml/word16du" xmlns:w16sdtdh="http://schemas.microsoft.com/office/word/2020/wordml/sdtdatahash" xmlns:w16sdtfl="http://schemas.microsoft.com/office/word/2024/wordml/sdtformatlock" xmlns:w16se="http://schemas.microsoft.com/office/word/2015/wordml/symex" xmlns:wpg="http://schemas.microsoft.com/office/word/2010/wordprocessingGroup" xmlns:wpi="http://schemas.microsoft.com/office/word/2010/wordprocessingInk" xmlns:wne="http://schemas.microsoft.com/office/word/2006/wordml" xmlns:wps="http://schemas.microsoft.com/office/word/2010/wordprocessingShape" mc:Ignorable="w14 w15 w16se w16cid w16 w16cex w16sdtdh w16sdtfl w16du wp14">
   <w:p>
     <w:pPr>
       <w:pBdr>
@@ -15877,7 +15127,7 @@
 </file>
 
 <file path=word/numbering.xml><?xml version="1.0" encoding="utf-8"?>
-<w:numbering xmlns:wpc="http://schemas.microsoft.com/office/word/2010/wordprocessingCanvas" xmlns:cx="http://schemas.microsoft.com/office/drawing/2014/chartex" xmlns:mc="http://schemas.openxmlformats.org/markup-compatibility/2006" xmlns:o="urn:schemas-microsoft-com:office:office" xmlns:r="http://schemas.openxmlformats.org/officeDocument/2006/relationships" xmlns:m="http://schemas.openxmlformats.org/officeDocument/2006/math" xmlns:v="urn:schemas-microsoft-com:vml" xmlns:wp14="http://schemas.microsoft.com/office/word/2010/wordprocessingDrawing" xmlns:wp="http://schemas.openxmlformats.org/drawingml/2006/wordprocessingDrawing" xmlns:w10="urn:schemas-microsoft-com:office:word" xmlns:w="http://schemas.openxmlformats.org/wordprocessingml/2006/main" xmlns:w14="http://schemas.microsoft.com/office/word/2010/wordml" xmlns:w15="http://schemas.microsoft.com/office/word/2012/wordml" xmlns:w16se="http://schemas.microsoft.com/office/word/2015/wordml/symex" xmlns:wpg="http://schemas.microsoft.com/office/word/2010/wordprocessingGroup" xmlns:wpi="http://schemas.microsoft.com/office/word/2010/wordprocessingInk" xmlns:wne="http://schemas.microsoft.com/office/word/2006/wordml" xmlns:wps="http://schemas.microsoft.com/office/word/2010/wordprocessingShape" mc:Ignorable="w14 w15 w16se wp14">
+<w:numbering xmlns:wpc="http://schemas.microsoft.com/office/word/2010/wordprocessingCanvas" xmlns:cx="http://schemas.microsoft.com/office/drawing/2014/chartex" xmlns:cx1="http://schemas.microsoft.com/office/drawing/2015/9/8/chartex" xmlns:cx2="http://schemas.microsoft.com/office/drawing/2015/10/21/chartex" xmlns:cx3="http://schemas.microsoft.com/office/drawing/2016/5/9/chartex" xmlns:cx4="http://schemas.microsoft.com/office/drawing/2016/5/10/chartex" xmlns:cx5="http://schemas.microsoft.com/office/drawing/2016/5/11/chartex" xmlns:cx6="http://schemas.microsoft.com/office/drawing/2016/5/12/chartex" xmlns:cx7="http://schemas.microsoft.com/office/drawing/2016/5/13/chartex" xmlns:cx8="http://schemas.microsoft.com/office/drawing/2016/5/14/chartex" xmlns:mc="http://schemas.openxmlformats.org/markup-compatibility/2006" xmlns:aink="http://schemas.microsoft.com/office/drawing/2016/ink" xmlns:am3d="http://schemas.microsoft.com/office/drawing/2017/model3d" xmlns:o="urn:schemas-microsoft-com:office:office" xmlns:oel="http://schemas.microsoft.com/office/2019/extlst" xmlns:r="http://schemas.openxmlformats.org/officeDocument/2006/relationships" xmlns:m="http://schemas.openxmlformats.org/officeDocument/2006/math" xmlns:v="urn:schemas-microsoft-com:vml" xmlns:wp14="http://schemas.microsoft.com/office/word/2010/wordprocessingDrawing" xmlns:wp="http://schemas.openxmlformats.org/drawingml/2006/wordprocessingDrawing" xmlns:w10="urn:schemas-microsoft-com:office:word" xmlns:w="http://schemas.openxmlformats.org/wordprocessingml/2006/main" xmlns:w14="http://schemas.microsoft.com/office/word/2010/wordml" xmlns:w15="http://schemas.microsoft.com/office/word/2012/wordml" xmlns:w16cex="http://schemas.microsoft.com/office/word/2018/wordml/cex" xmlns:w16cid="http://schemas.microsoft.com/office/word/2016/wordml/cid" xmlns:w16="http://schemas.microsoft.com/office/word/2018/wordml" xmlns:w16du="http://schemas.microsoft.com/office/word/2023/wordml/word16du" xmlns:w16sdtdh="http://schemas.microsoft.com/office/word/2020/wordml/sdtdatahash" xmlns:w16sdtfl="http://schemas.microsoft.com/office/word/2024/wordml/sdtformatlock" xmlns:w16se="http://schemas.microsoft.com/office/word/2015/wordml/symex" xmlns:wpg="http://schemas.microsoft.com/office/word/2010/wordprocessingGroup" xmlns:wpi="http://schemas.microsoft.com/office/word/2010/wordprocessingInk" xmlns:wne="http://schemas.microsoft.com/office/word/2006/wordml" xmlns:wps="http://schemas.microsoft.com/office/word/2010/wordprocessingShape" mc:Ignorable="w14 w15 w16se w16cid w16 w16cex w16sdtdh w16sdtfl w16du wp14">
   <w:abstractNum w:abstractNumId="0" w15:restartNumberingAfterBreak="0">
     <w:nsid w:val="0C5F5D60"/>
     <w:multiLevelType w:val="hybridMultilevel"/>
@@ -16308,44 +15558,44 @@
       <w:lvlJc w:val="left"/>
     </w:lvl>
   </w:abstractNum>
-  <w:num w:numId="1">
+  <w:num w:numId="1" w16cid:durableId="1627079862">
     <w:abstractNumId w:val="4"/>
     <w:lvlOverride w:ilvl="0">
       <w:startOverride w:val="1"/>
     </w:lvlOverride>
   </w:num>
-  <w:num w:numId="2">
+  <w:num w:numId="2" w16cid:durableId="1203130621">
     <w:abstractNumId w:val="0"/>
     <w:lvlOverride w:ilvl="0">
       <w:startOverride w:val="1"/>
     </w:lvlOverride>
   </w:num>
-  <w:num w:numId="3">
+  <w:num w:numId="3" w16cid:durableId="906839492">
     <w:abstractNumId w:val="2"/>
     <w:lvlOverride w:ilvl="0">
       <w:startOverride w:val="1"/>
     </w:lvlOverride>
   </w:num>
-  <w:num w:numId="4">
+  <w:num w:numId="4" w16cid:durableId="1429227494">
     <w:abstractNumId w:val="0"/>
   </w:num>
-  <w:num w:numId="5">
+  <w:num w:numId="5" w16cid:durableId="194122701">
     <w:abstractNumId w:val="6"/>
   </w:num>
-  <w:num w:numId="6">
+  <w:num w:numId="6" w16cid:durableId="288123099">
     <w:abstractNumId w:val="1"/>
   </w:num>
-  <w:num w:numId="7">
+  <w:num w:numId="7" w16cid:durableId="2111466143">
     <w:abstractNumId w:val="5"/>
   </w:num>
-  <w:num w:numId="8">
+  <w:num w:numId="8" w16cid:durableId="334961252">
     <w:abstractNumId w:val="3"/>
   </w:num>
 </w:numbering>
 </file>
 
 <file path=word/styles.xml><?xml version="1.0" encoding="utf-8"?>
-<w:styles xmlns:mc="http://schemas.openxmlformats.org/markup-compatibility/2006" xmlns:r="http://schemas.openxmlformats.org/officeDocument/2006/relationships" xmlns:w="http://schemas.openxmlformats.org/wordprocessingml/2006/main" xmlns:w14="http://schemas.microsoft.com/office/word/2010/wordml" xmlns:w15="http://schemas.microsoft.com/office/word/2012/wordml" xmlns:w16se="http://schemas.microsoft.com/office/word/2015/wordml/symex" mc:Ignorable="w14 w15 w16se">
+<w:styles xmlns:mc="http://schemas.openxmlformats.org/markup-compatibility/2006" xmlns:r="http://schemas.openxmlformats.org/officeDocument/2006/relationships" xmlns:w="http://schemas.openxmlformats.org/wordprocessingml/2006/main" xmlns:w14="http://schemas.microsoft.com/office/word/2010/wordml" xmlns:w15="http://schemas.microsoft.com/office/word/2012/wordml" xmlns:w16cex="http://schemas.microsoft.com/office/word/2018/wordml/cex" xmlns:w16cid="http://schemas.microsoft.com/office/word/2016/wordml/cid" xmlns:w16="http://schemas.microsoft.com/office/word/2018/wordml" xmlns:w16du="http://schemas.microsoft.com/office/word/2023/wordml/word16du" xmlns:w16sdtdh="http://schemas.microsoft.com/office/word/2020/wordml/sdtdatahash" xmlns:w16sdtfl="http://schemas.microsoft.com/office/word/2024/wordml/sdtformatlock" xmlns:w16se="http://schemas.microsoft.com/office/word/2015/wordml/symex" mc:Ignorable="w14 w15 w16se w16cid w16 w16cex w16sdtdh w16sdtfl w16du">
   <w:docDefaults>
     <w:rPrDefault>
       <w:rPr>
@@ -16357,7 +15607,7 @@
     </w:rPrDefault>
     <w:pPrDefault/>
   </w:docDefaults>
-  <w:latentStyles w:defLockedState="0" w:defUIPriority="99" w:defSemiHidden="0" w:defUnhideWhenUsed="0" w:defQFormat="0" w:count="371">
+  <w:latentStyles w:defLockedState="0" w:defUIPriority="99" w:defSemiHidden="0" w:defUnhideWhenUsed="0" w:defQFormat="0" w:count="376">
     <w:lsdException w:name="Normal" w:uiPriority="0" w:qFormat="1"/>
     <w:lsdException w:name="heading 1" w:uiPriority="9" w:qFormat="1"/>
     <w:lsdException w:name="heading 2" w:semiHidden="1" w:uiPriority="9" w:unhideWhenUsed="1" w:qFormat="1"/>
@@ -16729,6 +15979,11 @@
     <w:lsdException w:name="List Table 5 Dark Accent 6" w:uiPriority="50"/>
     <w:lsdException w:name="List Table 6 Colorful Accent 6" w:uiPriority="51"/>
     <w:lsdException w:name="List Table 7 Colorful Accent 6" w:uiPriority="52"/>
+    <w:lsdException w:name="Mention" w:semiHidden="1" w:unhideWhenUsed="1"/>
+    <w:lsdException w:name="Smart Hyperlink" w:semiHidden="1" w:unhideWhenUsed="1"/>
+    <w:lsdException w:name="Hashtag" w:semiHidden="1" w:unhideWhenUsed="1"/>
+    <w:lsdException w:name="Unresolved Mention" w:semiHidden="1" w:unhideWhenUsed="1"/>
+    <w:lsdException w:name="Smart Link" w:semiHidden="1" w:unhideWhenUsed="1"/>
   </w:latentStyles>
   <w:style w:type="paragraph" w:default="1" w:styleId="Normal">
     <w:name w:val="Normal"/>

</xml_diff>

<commit_message>
shehroz work is done
</commit_message>
<xml_diff>
--- a/DF_TermProject_Spring2026.docx
+++ b/DF_TermProject_Spring2026.docx
@@ -1,12 +1,14 @@
 
 <file path=word/document.xml><?xml version="1.0" encoding="utf-8"?>
-<w:document xmlns:wpc="http://schemas.microsoft.com/office/word/2010/wordprocessingCanvas" xmlns:cx="http://schemas.microsoft.com/office/drawing/2014/chartex" xmlns:mc="http://schemas.openxmlformats.org/markup-compatibility/2006" xmlns:o="urn:schemas-microsoft-com:office:office" xmlns:r="http://schemas.openxmlformats.org/officeDocument/2006/relationships" xmlns:m="http://schemas.openxmlformats.org/officeDocument/2006/math" xmlns:v="urn:schemas-microsoft-com:vml" xmlns:wp14="http://schemas.microsoft.com/office/word/2010/wordprocessingDrawing" xmlns:wp="http://schemas.openxmlformats.org/drawingml/2006/wordprocessingDrawing" xmlns:w10="urn:schemas-microsoft-com:office:word" xmlns:w="http://schemas.openxmlformats.org/wordprocessingml/2006/main" xmlns:w14="http://schemas.microsoft.com/office/word/2010/wordml" xmlns:w15="http://schemas.microsoft.com/office/word/2012/wordml" xmlns:w16se="http://schemas.microsoft.com/office/word/2015/wordml/symex" xmlns:wpg="http://schemas.microsoft.com/office/word/2010/wordprocessingGroup" xmlns:wpi="http://schemas.microsoft.com/office/word/2010/wordprocessingInk" xmlns:wne="http://schemas.microsoft.com/office/word/2006/wordml" xmlns:wps="http://schemas.microsoft.com/office/word/2010/wordprocessingShape" mc:Ignorable="w14 w15 w16se wp14">
+<w:document xmlns:wpc="http://schemas.microsoft.com/office/word/2010/wordprocessingCanvas" xmlns:cx="http://schemas.microsoft.com/office/drawing/2014/chartex" xmlns:cx1="http://schemas.microsoft.com/office/drawing/2015/9/8/chartex" xmlns:mc="http://schemas.openxmlformats.org/markup-compatibility/2006" xmlns:o="urn:schemas-microsoft-com:office:office" xmlns:r="http://schemas.openxmlformats.org/officeDocument/2006/relationships" xmlns:m="http://schemas.openxmlformats.org/officeDocument/2006/math" xmlns:v="urn:schemas-microsoft-com:vml" xmlns:wp14="http://schemas.microsoft.com/office/word/2010/wordprocessingDrawing" xmlns:wp="http://schemas.openxmlformats.org/drawingml/2006/wordprocessingDrawing" xmlns:w10="urn:schemas-microsoft-com:office:word" xmlns:w="http://schemas.openxmlformats.org/wordprocessingml/2006/main" xmlns:w14="http://schemas.microsoft.com/office/word/2010/wordml" xmlns:w15="http://schemas.microsoft.com/office/word/2012/wordml" xmlns:w16se="http://schemas.microsoft.com/office/word/2015/wordml/symex" xmlns:wpg="http://schemas.microsoft.com/office/word/2010/wordprocessingGroup" xmlns:wpi="http://schemas.microsoft.com/office/word/2010/wordprocessingInk" xmlns:wne="http://schemas.microsoft.com/office/word/2006/wordml" xmlns:wps="http://schemas.microsoft.com/office/word/2010/wordprocessingShape" mc:Ignorable="w14 w15 w16se wp14">
   <w:body>
     <w:p>
       <w:pPr>
         <w:spacing w:after="80"/>
         <w:jc w:val="center"/>
       </w:pPr>
+      <w:bookmarkStart w:id="0" w:name="_GoBack"/>
+      <w:bookmarkEnd w:id="0"/>
       <w:r>
         <w:rPr>
           <w:b/>
@@ -61,15 +63,7 @@
           <w:bCs/>
           <w:color w:val="1F3864"/>
         </w:rPr>
-        <w:t xml:space="preserve">Total Marks: 100   |   Weeks Covered: 1 </w:t>
-      </w:r>
-      <w:r>
-        <w:rPr>
-          <w:b/>
-          <w:bCs/>
-          <w:color w:val="1F3864"/>
-        </w:rPr>
-        <w:t>– 16   |   CLO: CLO1, CLO2, CLO3</w:t>
+        <w:t>Total Marks: 100   |   Weeks Covered: 1 – 16   |   CLO: CLO1, CLO2, CLO3</w:t>
       </w:r>
     </w:p>
     <w:p>
@@ -108,19 +102,7 @@
         <w:rPr>
           <w:color w:val="000000"/>
         </w:rPr>
-        <w:t xml:space="preserve"> static web application across three isolated software environments: Development, Staging, and Production. Each env</w:t>
-      </w:r>
-      <w:r>
-        <w:rPr>
-          <w:color w:val="000000"/>
-        </w:rPr>
-        <w:t>ironment has its own dedicated CI workflow (triggered on a Pull Request) and its own dedicated CD workflow (triggered on a merge/push), giving six GitHub Actions workflow files in total. Each team member authors exactly one workflow file and exactly one we</w:t>
-      </w:r>
-      <w:r>
-        <w:rPr>
-          <w:color w:val="000000"/>
-        </w:rPr>
-        <w:t>b page.</w:t>
+        <w:t xml:space="preserve"> static web application across three isolated software environments: Development, Staging, and Production. Each environment has its own dedicated CI workflow (triggered on a Pull Request) and its own dedicated CD workflow (triggered on a merge/push), giving six GitHub Actions workflow files in total. Each team member authors exactly one workflow file and exactly one web page.</w:t>
       </w:r>
     </w:p>
     <w:p/>
@@ -166,13 +148,8 @@
         <w:rPr>
           <w:color w:val="000000"/>
         </w:rPr>
-        <w:t>Design and implement six GitHub Actions workflow files: ci-dev.y</w:t>
-      </w:r>
-      <w:r>
-        <w:rPr>
-          <w:color w:val="000000"/>
-        </w:rPr>
-        <w:t>ml, cd-dev.yml, ci-staging.yml, cd-staging.yml, ci-prod.yml, and cd-prod.yml.</w:t>
+        <w:lastRenderedPageBreak/>
+        <w:t>Design and implement six GitHub Actions workflow files: ci-dev.yml, cd-dev.yml, ci-staging.yml, cd-staging.yml, ci-prod.yml, and cd-prod.yml.</w:t>
       </w:r>
     </w:p>
     <w:p>
@@ -204,13 +181,7 @@
         <w:rPr>
           <w:color w:val="000000"/>
         </w:rPr>
-        <w:t xml:space="preserve">Build and push environment-tagged Docker images to Docker Hub </w:t>
-      </w:r>
-      <w:r>
-        <w:rPr>
-          <w:color w:val="000000"/>
-        </w:rPr>
-        <w:t>from each CI pipeline.</w:t>
+        <w:t>Build and push environment-tagged Docker images to Docker Hub from each CI pipeline.</w:t>
       </w:r>
     </w:p>
     <w:p>
@@ -258,13 +229,7 @@
         <w:rPr>
           <w:color w:val="000000"/>
         </w:rPr>
-        <w:t>Demonstrate end-to-end automa</w:t>
-      </w:r>
-      <w:r>
-        <w:rPr>
-          <w:color w:val="000000"/>
-        </w:rPr>
-        <w:t>ted delivery from a code push on a feature branch to a live deployment on the appropriate Render service.</w:t>
+        <w:t>Demonstrate end-to-end automated delivery from a code push on a feature branch to a live deployment on the appropriate Render service.</w:t>
       </w:r>
     </w:p>
     <w:p/>
@@ -289,13 +254,7 @@
         <w:rPr>
           <w:color w:val="000000"/>
         </w:rPr>
-        <w:t>Group Size: Five (5) students per group. A group of six is permitted; in that case the Team Lead must add an extra row to Tabl</w:t>
-      </w:r>
-      <w:r>
-        <w:rPr>
-          <w:color w:val="000000"/>
-        </w:rPr>
-        <w:t>e 1 and assign one additional page (contact.html).</w:t>
+        <w:t>Group Size: Five (5) students per group. A group of six is permitted; in that case the Team Lead must add an extra row to Table 1 and assign one additional page (contact.html).</w:t>
       </w:r>
     </w:p>
     <w:p>
@@ -327,13 +286,7 @@
         <w:rPr>
           <w:color w:val="000000"/>
         </w:rPr>
-        <w:t>New Repository: Students MUST create a brand-new GitHub repository for this Term Project. Do NOT reuse or fork any repository</w:t>
-      </w:r>
-      <w:r>
-        <w:rPr>
-          <w:color w:val="000000"/>
-        </w:rPr>
-        <w:t xml:space="preserve"> from any previous assignment.</w:t>
+        <w:t>New Repository: Students MUST create a brand-new GitHub repository for this Term Project. Do NOT reuse or fork any repository from any previous assignment.</w:t>
       </w:r>
     </w:p>
     <w:p>
@@ -365,13 +318,8 @@
         <w:rPr>
           <w:color w:val="000000"/>
         </w:rPr>
-        <w:t>Secre</w:t>
-      </w:r>
-      <w:r>
-        <w:rPr>
-          <w:color w:val="000000"/>
-        </w:rPr>
-        <w:t>ts Ownership: All GitHub secrets and environment configurations must be created by the Team Lead using the TL's own Docker Hub and Render credentials. No team member other than the TL should create or modify secrets.</w:t>
+        <w:lastRenderedPageBreak/>
+        <w:t>Secrets Ownership: All GitHub secrets and environment configurations must be created by the Team Lead using the TL's own Docker Hub and Render credentials. No team member other than the TL should create or modify secrets.</w:t>
       </w:r>
     </w:p>
     <w:p>
@@ -387,13 +335,7 @@
         <w:rPr>
           <w:color w:val="000000"/>
         </w:rPr>
-        <w:t>All deployments MUST be triggered via t</w:t>
-      </w:r>
-      <w:r>
-        <w:rPr>
-          <w:color w:val="000000"/>
-        </w:rPr>
-        <w:t>he GitHub Actions CD pipelines. Manual deployment on Render is NOT permitted after the initial service setup.</w:t>
+        <w:t>All deployments MUST be triggered via the GitHub Actions CD pipelines. Manual deployment on Render is NOT permitted after the initial service setup.</w:t>
       </w:r>
     </w:p>
     <w:p>
@@ -409,7 +351,6 @@
         <w:rPr>
           <w:color w:val="000000"/>
         </w:rPr>
-        <w:lastRenderedPageBreak/>
         <w:t>Only the Team Lead submits the final document to the LMS.</w:t>
       </w:r>
     </w:p>
@@ -442,13 +383,7 @@
         <w:rPr>
           <w:color w:val="000000"/>
         </w:rPr>
-        <w:t>Each team member must wor</w:t>
-      </w:r>
-      <w:r>
-        <w:rPr>
-          <w:color w:val="000000"/>
-        </w:rPr>
-        <w:t>k on their own feature branch and open a Pull Request (PR) targeting the develop branch.</w:t>
+        <w:t>Each team member must work on their own feature branch and open a Pull Request (PR) targeting the develop branch.</w:t>
       </w:r>
     </w:p>
     <w:p>
@@ -464,13 +399,7 @@
         <w:rPr>
           <w:color w:val="000000"/>
         </w:rPr>
-        <w:t>No JavaScript of any kind is permitted. All pages must be built exclusively using HTML5 and CSS3. Forms must use HTML-only attributes (no JS event listeners, no fetch,</w:t>
-      </w:r>
-      <w:r>
-        <w:rPr>
-          <w:color w:val="000000"/>
-        </w:rPr>
-        <w:t xml:space="preserve"> no XMLHttpRequest).</w:t>
+        <w:t>No JavaScript of any kind is permitted. All pages must be built exclusively using HTML5 and CSS3. Forms must use HTML-only attributes (no JS event listeners, no fetch, no XMLHttpRequest).</w:t>
       </w:r>
     </w:p>
     <w:p>
@@ -694,17 +623,7 @@
                 <w:sz w:val="20"/>
                 <w:szCs w:val="20"/>
               </w:rPr>
-              <w:t>Assig</w:t>
-            </w:r>
-            <w:r>
-              <w:rPr>
-                <w:b/>
-                <w:bCs/>
-                <w:color w:val="FFFFFF"/>
-                <w:sz w:val="20"/>
-                <w:szCs w:val="20"/>
-              </w:rPr>
-              <w:t>ned Workflow File</w:t>
+              <w:t>Assigned Workflow File</w:t>
             </w:r>
           </w:p>
         </w:tc>
@@ -1033,8 +952,6 @@
             <w:r>
               <w:t>2</w:t>
             </w:r>
-            <w:bookmarkStart w:id="0" w:name="_GoBack"/>
-            <w:bookmarkEnd w:id="0"/>
           </w:p>
         </w:tc>
         <w:tc>
@@ -1718,15 +1635,7 @@
           <w:iCs/>
           <w:color w:val="595959"/>
         </w:rPr>
-        <w:t xml:space="preserve">[Paste Render Development </w:t>
-      </w:r>
-      <w:r>
-        <w:rPr>
-          <w:i/>
-          <w:iCs/>
-          <w:color w:val="595959"/>
-        </w:rPr>
-        <w:t>Service URL Here]</w:t>
+        <w:t>[Paste Render Development Service URL Here]</w:t>
       </w:r>
     </w:p>
     <w:p>
@@ -2036,15 +1945,7 @@
                 <w:sz w:val="20"/>
                 <w:szCs w:val="20"/>
               </w:rPr>
-              <w:t>Active development; CI tri</w:t>
-            </w:r>
-            <w:r>
-              <w:rPr>
-                <w:color w:val="000000"/>
-                <w:sz w:val="20"/>
-                <w:szCs w:val="20"/>
-              </w:rPr>
-              <w:t>ggered on every PR to develop</w:t>
+              <w:t>Active development; CI triggered on every PR to develop</w:t>
             </w:r>
           </w:p>
         </w:tc>
@@ -2284,15 +2185,7 @@
                 <w:sz w:val="20"/>
                 <w:szCs w:val="20"/>
               </w:rPr>
-              <w:t>Live public site; CI triggered on</w:t>
-            </w:r>
-            <w:r>
-              <w:rPr>
-                <w:color w:val="000000"/>
-                <w:sz w:val="20"/>
-                <w:szCs w:val="20"/>
-              </w:rPr>
-              <w:t xml:space="preserve"> every PR to main</w:t>
+              <w:t>Live public site; CI triggered on every PR to main</w:t>
             </w:r>
           </w:p>
         </w:tc>
@@ -2365,13 +2258,7 @@
         <w:rPr>
           <w:color w:val="000000"/>
         </w:rPr>
-        <w:t xml:space="preserve">The Team Lead sets up the repository, Dockerfile, shared stylesheet (style.css), and all six CI/CD workflow files. Each team member is individually responsible for building one </w:t>
-      </w:r>
-      <w:r>
-        <w:rPr>
-          <w:color w:val="000000"/>
-        </w:rPr>
-        <w:t>destination page (HTML + CSS) and authoring one workflow file – either a CI or a CD workflow for any one environment.</w:t>
+        <w:t>The Team Lead sets up the repository, Dockerfile, shared stylesheet (style.css), and all six CI/CD workflow files. Each team member is individually responsible for building one destination page (HTML + CSS) and authoring one workflow file – either a CI or a CD workflow for any one environment.</w:t>
       </w:r>
     </w:p>
     <w:p/>
@@ -2664,15 +2551,7 @@
                 <w:sz w:val="20"/>
                 <w:szCs w:val="20"/>
               </w:rPr>
-              <w:t xml:space="preserve">A welcoming landing page </w:t>
-            </w:r>
-            <w:r>
-              <w:rPr>
-                <w:color w:val="000000"/>
-                <w:sz w:val="20"/>
-                <w:szCs w:val="20"/>
-              </w:rPr>
-              <w:t>introducing PakVista, with a hero section, a brief paragraph about Pakistan's tourism, and navigation links to all five destination pages.</w:t>
+              <w:t>A welcoming landing page introducing PakVista, with a hero section, a brief paragraph about Pakistan's tourism, and navigation links to all five destination pages.</w:t>
             </w:r>
           </w:p>
         </w:tc>
@@ -2797,15 +2676,7 @@
                 <w:sz w:val="20"/>
                 <w:szCs w:val="20"/>
               </w:rPr>
-              <w:t xml:space="preserve">Dedicated page for Lahore covering the Badshahi Mosque, Lahore Fort, and </w:t>
-            </w:r>
-            <w:r>
-              <w:rPr>
-                <w:color w:val="000000"/>
-                <w:sz w:val="20"/>
-                <w:szCs w:val="20"/>
-              </w:rPr>
-              <w:t>Shalimar Gardens, with descriptive paragraphs and an HTML-only image placeholder section.</w:t>
+              <w:t>Dedicated page for Lahore covering the Badshahi Mosque, Lahore Fort, and Shalimar Gardens, with descriptive paragraphs and an HTML-only image placeholder section.</w:t>
             </w:r>
           </w:p>
         </w:tc>
@@ -2930,15 +2801,7 @@
                 <w:sz w:val="20"/>
                 <w:szCs w:val="20"/>
               </w:rPr>
-              <w:t xml:space="preserve">Dedicated page for Hunza Valley covering Rakaposhi viewpoint, Attabad Lake, and Baltit Fort, with descriptive paragraphs and an HTML-only </w:t>
-            </w:r>
-            <w:r>
-              <w:rPr>
-                <w:color w:val="000000"/>
-                <w:sz w:val="20"/>
-                <w:szCs w:val="20"/>
-              </w:rPr>
-              <w:t>image placeholder section.</w:t>
+              <w:t>Dedicated page for Hunza Valley covering Rakaposhi viewpoint, Attabad Lake, and Baltit Fort, with descriptive paragraphs and an HTML-only image placeholder section.</w:t>
             </w:r>
           </w:p>
         </w:tc>
@@ -3211,13 +3074,8 @@
         <w:rPr>
           <w:color w:val="000000"/>
         </w:rPr>
-        <w:t xml:space="preserve">Each team member must </w:t>
-      </w:r>
-      <w:r>
-        <w:rPr>
-          <w:color w:val="000000"/>
-        </w:rPr>
-        <w:t>author exactly one workflow file. The Team Lead authors the remaining workflow files as part of the repository setup.</w:t>
+        <w:lastRenderedPageBreak/>
+        <w:t>Each team member must author exactly one workflow file. The Team Lead authors the remaining workflow files as part of the repository setup.</w:t>
       </w:r>
     </w:p>
     <w:p/>
@@ -3566,32 +3424,15 @@
                 <w:sz w:val="20"/>
                 <w:szCs w:val="20"/>
               </w:rPr>
-              <w:t xml:space="preserve">Assigned to </w:t>
-            </w:r>
-            <w:r>
-              <w:rPr>
-                <w:color w:val="000000"/>
-                <w:sz w:val="20"/>
-                <w:szCs w:val="20"/>
-              </w:rPr>
-              <w:t>Member 1 (Team Lead): Checkout,</w:t>
-            </w:r>
-            <w:r>
-              <w:rPr>
-                <w:color w:val="000000"/>
-                <w:sz w:val="20"/>
-                <w:szCs w:val="20"/>
-              </w:rPr>
-              <w:t xml:space="preserve"> HTML &amp; CSS Linting, Building with </w:t>
-            </w:r>
-            <w:r>
-              <w:rPr>
-                <w:color w:val="000000"/>
-                <w:sz w:val="20"/>
-                <w:szCs w:val="20"/>
-              </w:rPr>
-              <w:lastRenderedPageBreak/>
-              <w:t>Parcel,</w:t>
+              <w:t>Assigned to Member 1 (Team Lead): Checkout,</w:t>
+            </w:r>
+            <w:r>
+              <w:rPr>
+                <w:color w:val="000000"/>
+                <w:sz w:val="20"/>
+                <w:szCs w:val="20"/>
+              </w:rPr>
+              <w:t xml:space="preserve"> HTML &amp; CSS Linting, Building with Parcel,</w:t>
             </w:r>
             <w:r>
               <w:rPr>
@@ -3635,7 +3476,6 @@
                 <w:sz w:val="20"/>
                 <w:szCs w:val="20"/>
               </w:rPr>
-              <w:lastRenderedPageBreak/>
               <w:t>2</w:t>
             </w:r>
           </w:p>
@@ -3754,15 +3594,7 @@
                 <w:sz w:val="20"/>
                 <w:szCs w:val="20"/>
               </w:rPr>
-              <w:t xml:space="preserve">Assigned to Member 2: Checkout, declare </w:t>
-            </w:r>
-            <w:r>
-              <w:rPr>
-                <w:color w:val="000000"/>
-                <w:sz w:val="20"/>
-                <w:szCs w:val="20"/>
-              </w:rPr>
-              <w:t>environment: development, curl POST to RENDER_DEPLOY_HOOK_DEV_URL, output confirmation.</w:t>
+              <w:t>Assigned to Member 2: Checkout, declare environment: development, curl POST to RENDER_DEPLOY_HOOK_DEV_URL, output confirmation.</w:t>
             </w:r>
           </w:p>
         </w:tc>
@@ -3932,15 +3764,7 @@
                 <w:sz w:val="20"/>
                 <w:szCs w:val="20"/>
               </w:rPr>
-              <w:t xml:space="preserve">Docker Login, Build, Tag </w:t>
-            </w:r>
-            <w:r>
-              <w:rPr>
-                <w:color w:val="000000"/>
-                <w:sz w:val="20"/>
-                <w:szCs w:val="20"/>
-              </w:rPr>
-              <w:t>(:staging-latest, :staging-&lt;sha&gt;), Push to Docker Hub.</w:t>
+              <w:t>Docker Login, Build, Tag (:staging-latest, :staging-&lt;sha&gt;), Push to Docker Hub.</w:t>
             </w:r>
           </w:p>
         </w:tc>
@@ -4441,13 +4265,7 @@
         <w:rPr>
           <w:color w:val="000000"/>
         </w:rPr>
-        <w:t>Each team member independently follows the complete GitFlow for their</w:t>
-      </w:r>
-      <w:r>
-        <w:rPr>
-          <w:color w:val="000000"/>
-        </w:rPr>
-        <w:t xml:space="preserve"> assigned page and workflow file:</w:t>
+        <w:t>Each team member independently follows the complete GitFlow for their assigned page and workflow file:</w:t>
       </w:r>
     </w:p>
     <w:p>
@@ -4496,13 +4314,8 @@
         <w:rPr>
           <w:color w:val="000000"/>
         </w:rPr>
-        <w:t>Build the assigned HTML page with appropriate content. Link the page to t</w:t>
-      </w:r>
-      <w:r>
-        <w:rPr>
-          <w:color w:val="000000"/>
-        </w:rPr>
-        <w:t>he shared style.css. No JavaScript permitted.</w:t>
+        <w:lastRenderedPageBreak/>
+        <w:t>Build the assigned HTML page with appropriate content. Link the page to the shared style.css. No JavaScript permitted.</w:t>
       </w:r>
     </w:p>
     <w:p>
@@ -4550,13 +4363,7 @@
         <w:rPr>
           <w:color w:val="000000"/>
         </w:rPr>
-        <w:t>Op</w:t>
-      </w:r>
-      <w:r>
-        <w:rPr>
-          <w:color w:val="000000"/>
-        </w:rPr>
-        <w:t>en a Pull Request (PR) targeting the develop branch. The CI workflow for the development environment (ci-dev.yml) fires automatically. Verify all steps pass.</w:t>
+        <w:t>Open a Pull Request (PR) targeting the develop branch. The CI workflow for the development environment (ci-dev.yml) fires automatically. Verify all steps pass.</w:t>
       </w:r>
     </w:p>
     <w:p>
@@ -4572,13 +4379,7 @@
         <w:rPr>
           <w:color w:val="000000"/>
         </w:rPr>
-        <w:t xml:space="preserve">Request a review from the Team Lead. Once CI passes and the PR is approved, the Team Lead merges </w:t>
-      </w:r>
-      <w:r>
-        <w:rPr>
-          <w:color w:val="000000"/>
-        </w:rPr>
-        <w:t>it. The merge triggers the CD pipeline (cd-dev.yml) and deploys the updated site to the Render development service.</w:t>
+        <w:t>Request a review from the Team Lead. Once CI passes and the PR is approved, the Team Lead merges it. The merge triggers the CD pipeline (cd-dev.yml) and deploys the updated site to the Render development service.</w:t>
       </w:r>
     </w:p>
     <w:p/>
@@ -4604,16 +4405,7 @@
           <w:sz w:val="19"/>
           <w:szCs w:val="19"/>
         </w:rPr>
-        <w:t>Feature Branch → PR to develop → ci-dev.yml builds &amp; pushes :dev-latest → PR merged → push on develop → cd-dev.yml</w:t>
-      </w:r>
-      <w:r>
-        <w:rPr>
-          <w:rFonts w:ascii="Courier New" w:eastAsia="Courier New" w:hAnsi="Courier New" w:cs="Courier New"/>
-          <w:color w:val="1F3864"/>
-          <w:sz w:val="19"/>
-          <w:szCs w:val="19"/>
-        </w:rPr>
-        <w:t xml:space="preserve"> deploys to pakvista-dev on Render → Live PakVista Development updated.</w:t>
+        <w:t>Feature Branch → PR to develop → ci-dev.yml builds &amp; pushes :dev-latest → PR merged → push on develop → cd-dev.yml deploys to pakvista-dev on Render → Live PakVista Development updated.</w:t>
       </w:r>
     </w:p>
     <w:p/>
@@ -4664,13 +4456,7 @@
         <w:rPr>
           <w:color w:val="000000"/>
         </w:rPr>
-        <w:t>Creat</w:t>
-      </w:r>
-      <w:r>
-        <w:rPr>
-          <w:color w:val="000000"/>
-        </w:rPr>
-        <w:t>e a new public GitHub repository named pakvista-cicd (or a name agreed by the team). Do NOT clone or fork any existing repository.</w:t>
+        <w:t>Create a new public GitHub repository named pakvista-cicd (or a name agreed by the team). Do NOT clone or fork any existing repository.</w:t>
       </w:r>
     </w:p>
     <w:p>
@@ -4686,13 +4472,7 @@
         <w:rPr>
           <w:color w:val="000000"/>
         </w:rPr>
-        <w:t xml:space="preserve">Create the develop, staging, and main branches. Set develop as the default working branch. The promotion flow is: develop → </w:t>
-      </w:r>
-      <w:r>
-        <w:rPr>
-          <w:color w:val="000000"/>
-        </w:rPr>
-        <w:t>staging → main.</w:t>
+        <w:t>Create the develop, staging, and main branches. Set develop as the default working branch. The promotion flow is: develop → staging → main.</w:t>
       </w:r>
     </w:p>
     <w:p>
@@ -4786,15 +4566,7 @@
           <w:bCs/>
           <w:color w:val="000000"/>
         </w:rPr>
-        <w:t>Require the corresponding CI status check to pass before merging (ci-dev for develop; ci-staging for staging; ci-prod for m</w:t>
-      </w:r>
-      <w:r>
-        <w:rPr>
-          <w:b/>
-          <w:bCs/>
-          <w:color w:val="000000"/>
-        </w:rPr>
-        <w:t>ain).</w:t>
+        <w:t>Require the corresponding CI status check to pass before merging (ci-dev for develop; ci-staging for staging; ci-prod for main).</w:t>
       </w:r>
     </w:p>
     <w:p>
@@ -4830,13 +4602,7 @@
         <w:rPr>
           <w:color w:val="000000"/>
         </w:rPr>
-        <w:t>The Team Lead must sign up on Render (render.com) and create three separate Web Services, one per environment, each connected to the Team Lead's Dock</w:t>
-      </w:r>
-      <w:r>
-        <w:rPr>
-          <w:color w:val="000000"/>
-        </w:rPr>
-        <w:t>er Hub image repository. The deploy hook URL for each service is obtained from: Render Dashboard → Service → Settings → Deploy Hook.</w:t>
+        <w:t>The Team Lead must sign up on Render (render.com) and create three separate Web Services, one per environment, each connected to the Team Lead's Docker Hub image repository. The deploy hook URL for each service is obtained from: Render Dashboard → Service → Settings → Deploy Hook.</w:t>
       </w:r>
     </w:p>
     <w:p/>
@@ -5356,15 +5122,7 @@
                 <w:sz w:val="20"/>
                 <w:szCs w:val="20"/>
               </w:rPr>
-              <w:t>Store in GitHub 'production'</w:t>
-            </w:r>
-            <w:r>
-              <w:rPr>
-                <w:color w:val="000000"/>
-                <w:sz w:val="20"/>
-                <w:szCs w:val="20"/>
-              </w:rPr>
-              <w:t xml:space="preserve"> environment</w:t>
+              <w:t>Store in GitHub 'production' environment</w:t>
             </w:r>
           </w:p>
         </w:tc>
@@ -5758,7 +5516,6 @@
                 <w:sz w:val="20"/>
                 <w:szCs w:val="20"/>
               </w:rPr>
-              <w:lastRenderedPageBreak/>
               <w:t>swat.html</w:t>
             </w:r>
           </w:p>
@@ -5850,15 +5607,7 @@
                 <w:sz w:val="20"/>
                 <w:szCs w:val="20"/>
               </w:rPr>
-              <w:t xml:space="preserve">Shared stylesheet enforcing consistent visual identity across all </w:t>
-            </w:r>
-            <w:r>
-              <w:rPr>
-                <w:color w:val="000000"/>
-                <w:sz w:val="20"/>
-                <w:szCs w:val="20"/>
-              </w:rPr>
-              <w:t>pages</w:t>
+              <w:t>Shared stylesheet enforcing consistent visual identity across all pages</w:t>
             </w:r>
           </w:p>
         </w:tc>
@@ -6044,15 +5793,7 @@
                 <w:sz w:val="20"/>
                 <w:szCs w:val="20"/>
               </w:rPr>
-              <w:t xml:space="preserve">CD workflow for Development </w:t>
-            </w:r>
-            <w:r>
-              <w:rPr>
-                <w:color w:val="000000"/>
-                <w:sz w:val="20"/>
-                <w:szCs w:val="20"/>
-              </w:rPr>
-              <w:t>– triggered on push to develop</w:t>
+              <w:t>CD workflow for Development – triggered on push to develop</w:t>
             </w:r>
           </w:p>
         </w:tc>
@@ -6380,10 +6121,7 @@
       </w:pPr>
       <w:r>
         <w:lastRenderedPageBreak/>
-        <w:t xml:space="preserve">GITHUB </w:t>
-      </w:r>
-      <w:r>
-        <w:t>ENVIRONMENTS &amp; SECRETS (MANDATORY)</w:t>
+        <w:t>GITHUB ENVIRONMENTS &amp; SECRETS (MANDATORY)</w:t>
       </w:r>
     </w:p>
     <w:p>
@@ -6394,13 +6132,7 @@
         <w:rPr>
           <w:color w:val="000000"/>
         </w:rPr>
-        <w:t>The Team Lead is responsible for creating all three GitHub Environments and all secrets listed below. The TL is the repository admin and the credentials belong exclusively to the TL's Docker Hub and Render accounts. No ot</w:t>
-      </w:r>
-      <w:r>
-        <w:rPr>
-          <w:color w:val="000000"/>
-        </w:rPr>
-        <w:t>her team member should create or modify secrets.</w:t>
+        <w:t>The Team Lead is responsible for creating all three GitHub Environments and all secrets listed below. The TL is the repository admin and the credentials belong exclusively to the TL's Docker Hub and Render accounts. No other team member should create or modify secrets.</w:t>
       </w:r>
     </w:p>
     <w:p/>
@@ -6495,13 +6227,7 @@
         <w:rPr>
           <w:color w:val="000000"/>
         </w:rPr>
-        <w:t xml:space="preserve">Table 5: </w:t>
-      </w:r>
-      <w:r>
-        <w:rPr>
-          <w:color w:val="000000"/>
-        </w:rPr>
-        <w:t>Secrets Configuration Reference</w:t>
+        <w:t>Table 5: Secrets Configuration Reference</w:t>
       </w:r>
     </w:p>
     <w:p/>
@@ -6812,15 +6538,16 @@
                 <w:sz w:val="20"/>
                 <w:szCs w:val="20"/>
               </w:rPr>
-              <w:t xml:space="preserve">Team </w:t>
-            </w:r>
-            <w:r>
-              <w:rPr>
-                <w:color w:val="000000"/>
-                <w:sz w:val="20"/>
-                <w:szCs w:val="20"/>
-              </w:rPr>
-              <w:t>Lead's Docker Hub Personal Access Token (PAT) generated from Docker Hub → Account Settings → Security. Reference: https://docs.docker.com/security/for-developers/access-tokens/</w:t>
+              <w:t xml:space="preserve">Team Lead's Docker Hub Personal Access Token (PAT) generated from Docker Hub → Account Settings → Security. Reference: </w:t>
+            </w:r>
+            <w:r>
+              <w:rPr>
+                <w:color w:val="000000"/>
+                <w:sz w:val="20"/>
+                <w:szCs w:val="20"/>
+              </w:rPr>
+              <w:lastRenderedPageBreak/>
+              <w:t>https://docs.docker.com/security/for-developers/access-tokens/</w:t>
             </w:r>
           </w:p>
         </w:tc>
@@ -6853,6 +6580,7 @@
                 <w:sz w:val="20"/>
                 <w:szCs w:val="20"/>
               </w:rPr>
+              <w:lastRenderedPageBreak/>
               <w:t>Environment: development</w:t>
             </w:r>
           </w:p>
@@ -6913,15 +6641,7 @@
                 <w:sz w:val="20"/>
                 <w:szCs w:val="20"/>
               </w:rPr>
-              <w:t xml:space="preserve">Deploy-hook webhook URL </w:t>
-            </w:r>
-            <w:r>
-              <w:rPr>
-                <w:color w:val="000000"/>
-                <w:sz w:val="20"/>
-                <w:szCs w:val="20"/>
-              </w:rPr>
-              <w:t>from the pakvista-dev Render service. Added inside the 'development' environment secrets.</w:t>
+              <w:t>Deploy-hook webhook URL from the pakvista-dev Render service. Added inside the 'development' environment secrets.</w:t>
             </w:r>
           </w:p>
         </w:tc>
@@ -7126,17 +6846,7 @@
           <w:sz w:val="20"/>
           <w:szCs w:val="20"/>
         </w:rPr>
-        <w:t xml:space="preserve">Reference: GitHub Encrypted Secrets – </w:t>
-      </w:r>
-      <w:r>
-        <w:rPr>
-          <w:i/>
-          <w:iCs/>
-          <w:color w:val="595959"/>
-          <w:sz w:val="20"/>
-          <w:szCs w:val="20"/>
-        </w:rPr>
-        <w:t>https://docs.github.com/en/actions/security-guides/encrypted-secrets | GitHub Environments – https://docs.github.com/en/actions/deployment/targeting-different-environments/using-environments-for-deployment</w:t>
+        <w:t>Reference: GitHub Encrypted Secrets – https://docs.github.com/en/actions/security-guides/encrypted-secrets | GitHub Environments – https://docs.github.com/en/actions/deployment/targeting-different-environments/using-environments-for-deployment</w:t>
       </w:r>
     </w:p>
     <w:p/>
@@ -7145,7 +6855,6 @@
         <w:pStyle w:val="Heading1"/>
       </w:pPr>
       <w:r>
-        <w:lastRenderedPageBreak/>
         <w:t>CI PIPELINE REQUIREMENTS</w:t>
       </w:r>
     </w:p>
@@ -7157,13 +6866,7 @@
         <w:rPr>
           <w:color w:val="000000"/>
         </w:rPr>
-        <w:t>There are three CI workf</w:t>
-      </w:r>
-      <w:r>
-        <w:rPr>
-          <w:color w:val="000000"/>
-        </w:rPr>
-        <w:t>low files, one per environment. All three follow the same structure; the only differences are the trigger branch, the image tags, and the file name.</w:t>
+        <w:t>There are three CI workflow files, one per environment. All three follow the same structure; the only differences are the trigger branch, the image tags, and the file name.</w:t>
       </w:r>
     </w:p>
     <w:p/>
@@ -7703,6 +7406,7 @@
         <w:pStyle w:val="Heading2"/>
       </w:pPr>
       <w:r>
+        <w:lastRenderedPageBreak/>
         <w:t>7.2  Mandatory Steps (all CI workflows)</w:t>
       </w:r>
     </w:p>
@@ -7714,13 +7418,7 @@
         <w:rPr>
           <w:color w:val="000000"/>
         </w:rPr>
-        <w:t xml:space="preserve">Each CI workflow must </w:t>
-      </w:r>
-      <w:r>
-        <w:rPr>
-          <w:color w:val="000000"/>
-        </w:rPr>
-        <w:t>include the following steps in the stated order:</w:t>
+        <w:t>Each CI workflow must include the following steps in the stated order:</w:t>
       </w:r>
     </w:p>
     <w:p/>
@@ -7851,8 +7549,54 @@
           <w:sz w:val="20"/>
           <w:szCs w:val="20"/>
         </w:rPr>
-        <w:t xml:space="preserve">Reference: https://github.com/docker/login-action | </w:t>
-      </w:r>
+        <w:t>Reference: https://github.com/docker/login-action | https://docs.docker.com/security/for-developers/access-tokens/</w:t>
+      </w:r>
+    </w:p>
+    <w:p/>
+    <w:p>
+      <w:pPr>
+        <w:spacing w:before="80" w:after="20"/>
+      </w:pPr>
+      <w:r>
+        <w:rPr>
+          <w:b/>
+          <w:bCs/>
+          <w:color w:val="1F3864"/>
+        </w:rPr>
+        <w:t xml:space="preserve">Step </w:t>
+      </w:r>
+      <w:r>
+        <w:rPr>
+          <w:b/>
+          <w:bCs/>
+          <w:color w:val="1F3864"/>
+        </w:rPr>
+        <w:t>4</w:t>
+      </w:r>
+      <w:r>
+        <w:rPr>
+          <w:b/>
+          <w:bCs/>
+          <w:color w:val="1F3864"/>
+        </w:rPr>
+        <w:t xml:space="preserve"> – Build Image</w:t>
+      </w:r>
+    </w:p>
+    <w:p>
+      <w:pPr>
+        <w:spacing w:before="60" w:after="60" w:line="276" w:lineRule="auto"/>
+      </w:pPr>
+      <w:r>
+        <w:rPr>
+          <w:color w:val="000000"/>
+        </w:rPr>
+        <w:t>Build the Docker image from the Dockerfile in the project root using docker/build-push-action@v5 with push: false.</w:t>
+      </w:r>
+    </w:p>
+    <w:p>
+      <w:pPr>
+        <w:spacing w:before="60" w:after="60"/>
+      </w:pPr>
       <w:r>
         <w:rPr>
           <w:i/>
@@ -7861,7 +7605,7 @@
           <w:sz w:val="20"/>
           <w:szCs w:val="20"/>
         </w:rPr>
-        <w:t>https://docs.docker.com/security/for-developers/access-tokens/</w:t>
+        <w:t>Reference: https://github.com/docker/build-push-action</w:t>
       </w:r>
     </w:p>
     <w:p/>
@@ -7883,7 +7627,7 @@
           <w:bCs/>
           <w:color w:val="1F3864"/>
         </w:rPr>
-        <w:t>4</w:t>
+        <w:t>5</w:t>
       </w:r>
       <w:r>
         <w:rPr>
@@ -7891,7 +7635,7 @@
           <w:bCs/>
           <w:color w:val="1F3864"/>
         </w:rPr>
-        <w:t xml:space="preserve"> – Build Image</w:t>
+        <w:t xml:space="preserve"> – Tag Image</w:t>
       </w:r>
     </w:p>
     <w:p>
@@ -7902,7 +7646,49 @@
         <w:rPr>
           <w:color w:val="000000"/>
         </w:rPr>
-        <w:t>Build the Docker image from the Dockerfile in the project root using docker/build-push-action@v5 with push: false.</w:t>
+        <w:t>Apply environment-specific tags</w:t>
+      </w:r>
+    </w:p>
+    <w:p/>
+    <w:p>
+      <w:pPr>
+        <w:spacing w:before="80" w:after="20"/>
+      </w:pPr>
+      <w:r>
+        <w:rPr>
+          <w:b/>
+          <w:bCs/>
+          <w:color w:val="1F3864"/>
+        </w:rPr>
+        <w:lastRenderedPageBreak/>
+        <w:t xml:space="preserve">Step </w:t>
+      </w:r>
+      <w:r>
+        <w:rPr>
+          <w:b/>
+          <w:bCs/>
+          <w:color w:val="1F3864"/>
+        </w:rPr>
+        <w:t>6</w:t>
+      </w:r>
+      <w:r>
+        <w:rPr>
+          <w:b/>
+          <w:bCs/>
+          <w:color w:val="1F3864"/>
+        </w:rPr>
+        <w:t xml:space="preserve"> – Push Image</w:t>
+      </w:r>
+    </w:p>
+    <w:p>
+      <w:pPr>
+        <w:spacing w:before="60" w:after="60" w:line="276" w:lineRule="auto"/>
+      </w:pPr>
+      <w:r>
+        <w:rPr>
+          <w:color w:val="000000"/>
+        </w:rPr>
+        <w:t>Re-run docker/build-push-action@v5 with push: true to push the tagged image to Docker Hub.</w:t>
       </w:r>
     </w:p>
     <w:p>
@@ -7917,113 +7703,15 @@
           <w:sz w:val="20"/>
           <w:szCs w:val="20"/>
         </w:rPr>
-        <w:t>Reference: https://github.com/docker/build-push-action</w:t>
+        <w:t>Reference: https://docs.docker.com/docker-hub/ | https://github.com/docker/build-push-action</w:t>
       </w:r>
     </w:p>
     <w:p/>
     <w:p>
       <w:pPr>
-        <w:spacing w:before="80" w:after="20"/>
-      </w:pPr>
-      <w:r>
-        <w:rPr>
-          <w:b/>
-          <w:bCs/>
-          <w:color w:val="1F3864"/>
-        </w:rPr>
-        <w:t xml:space="preserve">Step </w:t>
-      </w:r>
-      <w:r>
-        <w:rPr>
-          <w:b/>
-          <w:bCs/>
-          <w:color w:val="1F3864"/>
-        </w:rPr>
-        <w:t>5</w:t>
-      </w:r>
-      <w:r>
-        <w:rPr>
-          <w:b/>
-          <w:bCs/>
-          <w:color w:val="1F3864"/>
-        </w:rPr>
-        <w:t xml:space="preserve"> – Tag Image</w:t>
-      </w:r>
-    </w:p>
-    <w:p>
-      <w:pPr>
-        <w:spacing w:before="60" w:after="60" w:line="276" w:lineRule="auto"/>
-      </w:pPr>
-      <w:r>
-        <w:rPr>
-          <w:color w:val="000000"/>
-        </w:rPr>
-        <w:t>Apply environment-specific tags</w:t>
-      </w:r>
-    </w:p>
-    <w:p/>
-    <w:p>
-      <w:pPr>
-        <w:spacing w:before="80" w:after="20"/>
-      </w:pPr>
-      <w:r>
-        <w:rPr>
-          <w:b/>
-          <w:bCs/>
-          <w:color w:val="1F3864"/>
-        </w:rPr>
-        <w:t xml:space="preserve">Step </w:t>
-      </w:r>
-      <w:r>
-        <w:rPr>
-          <w:b/>
-          <w:bCs/>
-          <w:color w:val="1F3864"/>
-        </w:rPr>
-        <w:t>6</w:t>
-      </w:r>
-      <w:r>
-        <w:rPr>
-          <w:b/>
-          <w:bCs/>
-          <w:color w:val="1F3864"/>
-        </w:rPr>
-        <w:t xml:space="preserve"> – Push Image</w:t>
-      </w:r>
-    </w:p>
-    <w:p>
-      <w:pPr>
-        <w:spacing w:before="60" w:after="60" w:line="276" w:lineRule="auto"/>
-      </w:pPr>
-      <w:r>
-        <w:rPr>
-          <w:color w:val="000000"/>
-        </w:rPr>
-        <w:t>Re-run docker/build-push-action@v5 with push: true to push the tagged image to Docker Hub.</w:t>
-      </w:r>
-    </w:p>
-    <w:p>
-      <w:pPr>
-        <w:spacing w:before="60" w:after="60"/>
-      </w:pPr>
-      <w:r>
-        <w:rPr>
-          <w:i/>
-          <w:iCs/>
-          <w:color w:val="595959"/>
-          <w:sz w:val="20"/>
-          <w:szCs w:val="20"/>
-        </w:rPr>
-        <w:t>Reference: https://docs.docker.com/docker-hub/ | https://github.com/docker/build-push-action</w:t>
-      </w:r>
-    </w:p>
-    <w:p/>
-    <w:p>
-      <w:pPr>
         <w:pStyle w:val="Heading2"/>
       </w:pPr>
       <w:r>
-        <w:lastRenderedPageBreak/>
         <w:t>7.3  Additional CI Requirements</w:t>
       </w:r>
     </w:p>
@@ -8058,15 +7746,7 @@
           <w:bCs/>
           <w:color w:val="000000"/>
         </w:rPr>
-        <w:t>The CI status check must be register</w:t>
-      </w:r>
-      <w:r>
-        <w:rPr>
-          <w:b/>
-          <w:bCs/>
-          <w:color w:val="000000"/>
-        </w:rPr>
-        <w:t>ed as a required check in the Branch Protection Rules on the target branch</w:t>
+        <w:t>The CI status check must be registered as a required check in the Branch Protection Rules on the target branch</w:t>
       </w:r>
       <w:r>
         <w:rPr>
@@ -8108,13 +7788,7 @@
         <w:rPr>
           <w:color w:val="000000"/>
         </w:rPr>
-        <w:t>There are three CD workflow files, one per environment. All three follow the same structure; the on</w:t>
-      </w:r>
-      <w:r>
-        <w:rPr>
-          <w:color w:val="000000"/>
-        </w:rPr>
-        <w:t>ly differences are the trigger branch, the GitHub Environment declared, and the deploy hook secret name.</w:t>
+        <w:t>There are three CD workflow files, one per environment. All three follow the same structure; the only differences are the trigger branch, the GitHub Environment declared, and the deploy hook secret name.</w:t>
       </w:r>
     </w:p>
     <w:p/>
@@ -8402,15 +8076,7 @@
                 <w:sz w:val="20"/>
                 <w:szCs w:val="20"/>
               </w:rPr>
-              <w:t xml:space="preserve">RENDER_DEPLOY_HOOK_DEV_URL (in </w:t>
-            </w:r>
-            <w:r>
-              <w:rPr>
-                <w:color w:val="000000"/>
-                <w:sz w:val="20"/>
-                <w:szCs w:val="20"/>
-              </w:rPr>
-              <w:t>'development' env)</w:t>
+              <w:t>RENDER_DEPLOY_HOOK_DEV_URL (in 'development' env)</w:t>
             </w:r>
           </w:p>
         </w:tc>
@@ -8443,6 +8109,7 @@
                 <w:sz w:val="20"/>
                 <w:szCs w:val="20"/>
               </w:rPr>
+              <w:lastRenderedPageBreak/>
               <w:t>cd-staging.yml</w:t>
             </w:r>
           </w:p>
@@ -8673,13 +8340,7 @@
         <w:rPr>
           <w:color w:val="000000"/>
         </w:rPr>
-        <w:t>Each CD workflow must include the following</w:t>
-      </w:r>
-      <w:r>
-        <w:rPr>
-          <w:color w:val="000000"/>
-        </w:rPr>
-        <w:t xml:space="preserve"> steps in the stated order:</w:t>
+        <w:t>Each CD workflow must include the following steps in the stated order:</w:t>
       </w:r>
     </w:p>
     <w:p/>
@@ -8744,13 +8405,7 @@
         <w:rPr>
           <w:color w:val="000000"/>
         </w:rPr>
-        <w:t>The job must declare the appropriate GitHub Environment (environment: devel</w:t>
-      </w:r>
-      <w:r>
-        <w:rPr>
-          <w:color w:val="000000"/>
-        </w:rPr>
-        <w:t>opment | staging | production) so that the environment-level deploy hook secret is injected into the job.</w:t>
+        <w:t>The job must declare the appropriate GitHub Environment (environment: development | staging | production) so that the environment-level deploy hook secret is injected into the job.</w:t>
       </w:r>
     </w:p>
     <w:p>
@@ -8790,13 +8445,7 @@
         <w:rPr>
           <w:color w:val="000000"/>
         </w:rPr>
-        <w:t xml:space="preserve">Send an </w:t>
-      </w:r>
-      <w:r>
-        <w:rPr>
-          <w:color w:val="000000"/>
-        </w:rPr>
-        <w:t>HTTP POST request to the Render deploy hook URL using curl:</w:t>
+        <w:t>Send an HTTP POST request to the Render deploy hook URL using curl:</w:t>
       </w:r>
     </w:p>
     <w:p>
@@ -8841,16 +8490,8 @@
           <w:sz w:val="20"/>
           <w:szCs w:val="20"/>
         </w:rPr>
-        <w:t>curl -X POST ${{ secrets.RENDER_DEPLOY_HOOK_PROD_</w:t>
-      </w:r>
-      <w:r>
-        <w:rPr>
-          <w:rFonts w:ascii="Courier New" w:eastAsia="Courier New" w:hAnsi="Courier New" w:cs="Courier New"/>
-          <w:color w:val="C7254E"/>
-          <w:sz w:val="20"/>
-          <w:szCs w:val="20"/>
-        </w:rPr>
-        <w:t>URL }}    # cd-prod.yml</w:t>
+        <w:lastRenderedPageBreak/>
+        <w:t>curl -X POST ${{ secrets.RENDER_DEPLOY_HOOK_PROD_URL }}    # cd-prod.yml</w:t>
       </w:r>
     </w:p>
     <w:p>
@@ -8879,7 +8520,6 @@
           <w:bCs/>
           <w:color w:val="1F3864"/>
         </w:rPr>
-        <w:lastRenderedPageBreak/>
         <w:t>Step 4 – Confirm</w:t>
       </w:r>
     </w:p>
@@ -8891,13 +8531,7 @@
         <w:rPr>
           <w:color w:val="000000"/>
         </w:rPr>
-        <w:t>Output a timestamped deployment confirmat</w:t>
-      </w:r>
-      <w:r>
-        <w:rPr>
-          <w:color w:val="000000"/>
-        </w:rPr>
-        <w:t>ion message as the final step using echo, e.g.: echo "Deployment to &lt;environment&gt; triggered at $(date)"</w:t>
+        <w:t>Output a timestamped deployment confirmation message as the final step using echo, e.g.: echo "Deployment to &lt;environment&gt; triggered at $(date)"</w:t>
       </w:r>
     </w:p>
     <w:p>
@@ -8953,13 +8587,7 @@
         <w:rPr>
           <w:color w:val="000000"/>
         </w:rPr>
-        <w:t xml:space="preserve">The job must </w:t>
-      </w:r>
-      <w:r>
-        <w:rPr>
-          <w:color w:val="000000"/>
-        </w:rPr>
-        <w:t>NOT contain any Docker build or push steps – those responsibilities belong exclusively to the CI workflows.</w:t>
+        <w:t>The job must NOT contain any Docker build or push steps – those responsibilities belong exclusively to the CI workflows.</w:t>
       </w:r>
     </w:p>
     <w:p>
@@ -8975,13 +8603,7 @@
         <w:rPr>
           <w:color w:val="000000"/>
         </w:rPr>
-        <w:t xml:space="preserve">The workflow must be triggered only on push events to the specified branch (no workflow_dispatch or schedule triggers are required, though they may </w:t>
-      </w:r>
-      <w:r>
-        <w:rPr>
-          <w:color w:val="000000"/>
-        </w:rPr>
-        <w:t>be added as extras).</w:t>
+        <w:t>The workflow must be triggered only on push events to the specified branch (no workflow_dispatch or schedule triggers are required, though they may be added as extras).</w:t>
       </w:r>
     </w:p>
     <w:p/>
@@ -9024,13 +8646,7 @@
         <w:rPr>
           <w:color w:val="000000"/>
         </w:rPr>
-        <w:t>Base image: nginx:alpine (official Nginx image on Alpine Linux). Reference: https://hub.docker.com/_/n</w:t>
-      </w:r>
-      <w:r>
-        <w:rPr>
-          <w:color w:val="000000"/>
-        </w:rPr>
-        <w:t>ginx</w:t>
+        <w:t>Base image: nginx:alpine (official Nginx image on Alpine Linux). Reference: https://hub.docker.com/_/nginx</w:t>
       </w:r>
     </w:p>
     <w:p>
@@ -9094,13 +8710,7 @@
         <w:rPr>
           <w:color w:val="000000"/>
         </w:rPr>
-        <w:t xml:space="preserve">The </w:t>
-      </w:r>
-      <w:r>
-        <w:rPr>
-          <w:color w:val="000000"/>
-        </w:rPr>
-        <w:t>Dockerfile must be placed in the repository root (not in a subdirectory).</w:t>
+        <w:t>The Dockerfile must be placed in the repository root (not in a subdirectory).</w:t>
       </w:r>
     </w:p>
     <w:p/>
@@ -9188,17 +8798,7 @@
           <w:sz w:val="20"/>
           <w:szCs w:val="20"/>
         </w:rPr>
-        <w:t>Reference – Docker Official nginx Image: https://hu</w:t>
-      </w:r>
-      <w:r>
-        <w:rPr>
-          <w:i/>
-          <w:iCs/>
-          <w:color w:val="595959"/>
-          <w:sz w:val="20"/>
-          <w:szCs w:val="20"/>
-        </w:rPr>
-        <w:t>b.docker.com/_/nginx | Dockerfile Reference: https://docs.docker.com/reference/dockerfile/</w:t>
+        <w:t>Reference – Docker Official nginx Image: https://hub.docker.com/_/nginx | Dockerfile Reference: https://docs.docker.com/reference/dockerfile/</w:t>
       </w:r>
     </w:p>
     <w:p/>
@@ -9218,13 +8818,8 @@
         <w:rPr>
           <w:color w:val="000000"/>
         </w:rPr>
-        <w:t>All pages must comply with the following standards. Pages not meeting these requirements will not receive full marks for the page development</w:t>
-      </w:r>
-      <w:r>
-        <w:rPr>
-          <w:color w:val="000000"/>
-        </w:rPr>
-        <w:t xml:space="preserve"> task.</w:t>
+        <w:lastRenderedPageBreak/>
+        <w:t>All pages must comply with the following standards. Pages not meeting these requirements will not receive full marks for the page development task.</w:t>
       </w:r>
     </w:p>
     <w:p/>
@@ -9289,13 +8884,7 @@
         <w:rPr>
           <w:color w:val="000000"/>
         </w:rPr>
-        <w:t>Every</w:t>
-      </w:r>
-      <w:r>
-        <w:rPr>
-          <w:color w:val="000000"/>
-        </w:rPr>
-        <w:t xml:space="preserve"> page must contain a consistent navigation bar (&lt;nav&gt;) with anchor links to all five destination pages and the home page.</w:t>
+        <w:t>Every page must contain a consistent navigation bar (&lt;nav&gt;) with anchor links to all five destination pages and the home page.</w:t>
       </w:r>
     </w:p>
     <w:p>
@@ -9327,13 +8916,7 @@
         <w:rPr>
           <w:color w:val="000000"/>
         </w:rPr>
-        <w:t>No JavaScript: &lt;script&gt; tags, inline</w:t>
-      </w:r>
-      <w:r>
-        <w:rPr>
-          <w:color w:val="000000"/>
-        </w:rPr>
-        <w:t xml:space="preserve"> event handlers (onclick, onsubmit, etc.), and external .js file links are strictly prohibited.</w:t>
+        <w:t>No JavaScript: &lt;script&gt; tags, inline event handlers (onclick, onsubmit, etc.), and external .js file links are strictly prohibited.</w:t>
       </w:r>
     </w:p>
     <w:p>
@@ -9349,13 +8932,7 @@
         <w:rPr>
           <w:color w:val="000000"/>
         </w:rPr>
-        <w:t>All images must use HTML &lt;figure&gt; and &lt;figcaption&gt; elements with descriptive alt attributes. Actual image files are optional; a styled empty &lt;div class="img-pla</w:t>
-      </w:r>
-      <w:r>
-        <w:rPr>
-          <w:color w:val="000000"/>
-        </w:rPr>
-        <w:t>ceholder"&gt; with a descriptive label inside is acceptable.</w:t>
+        <w:t>All images must use HTML &lt;figure&gt; and &lt;figcaption&gt; elements with descriptive alt attributes. Actual image files are optional; a styled empty &lt;div class="img-placeholder"&gt; with a descriptive label inside is acceptable.</w:t>
       </w:r>
     </w:p>
     <w:p>
@@ -9387,17 +8964,7 @@
           <w:sz w:val="20"/>
           <w:szCs w:val="20"/>
         </w:rPr>
-        <w:t>Reference – HTML5 Specification: https://html.spec.whatwg.org/ | MDN HTML Reference: http</w:t>
-      </w:r>
-      <w:r>
-        <w:rPr>
-          <w:i/>
-          <w:iCs/>
-          <w:color w:val="595959"/>
-          <w:sz w:val="20"/>
-          <w:szCs w:val="20"/>
-        </w:rPr>
-        <w:t>s://developer.mozilla.org/en-US/docs/Web/HTML</w:t>
+        <w:t>Reference – HTML5 Specification: https://html.spec.whatwg.org/ | MDN HTML Reference: https://developer.mozilla.org/en-US/docs/Web/HTML</w:t>
       </w:r>
     </w:p>
     <w:p/>
@@ -9406,25 +8973,19 @@
         <w:pStyle w:val="Heading1"/>
       </w:pPr>
       <w:r>
+        <w:t>CSS (style.css) REQUIREMENTS</w:t>
+      </w:r>
+    </w:p>
+    <w:p>
+      <w:pPr>
+        <w:spacing w:before="60" w:after="60" w:line="276" w:lineRule="auto"/>
+      </w:pPr>
+      <w:r>
+        <w:rPr>
+          <w:color w:val="000000"/>
+        </w:rPr>
         <w:lastRenderedPageBreak/>
-        <w:t>CSS (style.css) REQUIREMENTS</w:t>
-      </w:r>
-    </w:p>
-    <w:p>
-      <w:pPr>
-        <w:spacing w:before="60" w:after="60" w:line="276" w:lineRule="auto"/>
-      </w:pPr>
-      <w:r>
-        <w:rPr>
-          <w:color w:val="000000"/>
-        </w:rPr>
-        <w:t xml:space="preserve">The Team Lead must create a shared style.css in the repository root. All team members must link their page to this file and must NOT create separate CSS files. Additional inline </w:t>
-      </w:r>
-      <w:r>
-        <w:rPr>
-          <w:color w:val="000000"/>
-        </w:rPr>
-        <w:t>&lt;style&gt; blocks within individual pages are permitted for minor page-specific overrides only.</w:t>
+        <w:t>The Team Lead must create a shared style.css in the repository root. All team members must link their page to this file and must NOT create separate CSS files. Additional inline &lt;style&gt; blocks within individual pages are permitted for minor page-specific overrides only.</w:t>
       </w:r>
     </w:p>
     <w:p/>
@@ -9457,13 +9018,7 @@
         <w:rPr>
           <w:color w:val="000000"/>
         </w:rPr>
-        <w:t xml:space="preserve">Provide base styles for: body, h1–h3, p, a, nav, ul/li, table, th, </w:t>
-      </w:r>
-      <w:r>
-        <w:rPr>
-          <w:color w:val="000000"/>
-        </w:rPr>
-        <w:t>td, footer.</w:t>
+        <w:t>Provide base styles for: body, h1–h3, p, a, nav, ul/li, table, th, td, footer.</w:t>
       </w:r>
     </w:p>
     <w:p>
@@ -9495,13 +9050,7 @@
         <w:rPr>
           <w:color w:val="000000"/>
         </w:rPr>
-        <w:t>Provide a .img-placeholder class that renders an empty box (e.g., 200px × 150px, with a border and background colour) as a stand-in for actual</w:t>
-      </w:r>
-      <w:r>
-        <w:rPr>
-          <w:color w:val="000000"/>
-        </w:rPr>
-        <w:t xml:space="preserve"> images.</w:t>
+        <w:t>Provide a .img-placeholder class that renders an empty box (e.g., 200px × 150px, with a border and background colour) as a stand-in for actual images.</w:t>
       </w:r>
     </w:p>
     <w:p>
@@ -9549,17 +9098,7 @@
           <w:sz w:val="20"/>
           <w:szCs w:val="20"/>
         </w:rPr>
-        <w:t>Reference – CSS Reference: https://developer</w:t>
-      </w:r>
-      <w:r>
-        <w:rPr>
-          <w:i/>
-          <w:iCs/>
-          <w:color w:val="595959"/>
-          <w:sz w:val="20"/>
-          <w:szCs w:val="20"/>
-        </w:rPr>
-        <w:t>.mozilla.org/en-US/docs/Web/CSS | CSS Custom Properties: https://developer.mozilla.org/en-US/docs/Web/CSS/Using_CSS_custom_properties</w:t>
+        <w:t>Reference – CSS Reference: https://developer.mozilla.org/en-US/docs/Web/CSS | CSS Custom Properties: https://developer.mozilla.org/en-US/docs/Web/CSS/Using_CSS_custom_properties</w:t>
       </w:r>
     </w:p>
     <w:p/>
@@ -9745,17 +9284,7 @@
                 <w:sz w:val="20"/>
                 <w:szCs w:val="20"/>
               </w:rPr>
-              <w:t>Key Ste</w:t>
-            </w:r>
-            <w:r>
-              <w:rPr>
-                <w:b/>
-                <w:bCs/>
-                <w:color w:val="FFFFFF"/>
-                <w:sz w:val="20"/>
-                <w:szCs w:val="20"/>
-              </w:rPr>
-              <w:t>ps</w:t>
+              <w:t>Key Steps</w:t>
             </w:r>
           </w:p>
         </w:tc>
@@ -9995,15 +9524,7 @@
                 <w:sz w:val="20"/>
                 <w:szCs w:val="20"/>
               </w:rPr>
-              <w:t>Checkout → env: development → curl POST RENDER_DEPLOY_HOOK_DEV_URL</w:t>
-            </w:r>
-            <w:r>
-              <w:rPr>
-                <w:color w:val="000000"/>
-                <w:sz w:val="20"/>
-                <w:szCs w:val="20"/>
-              </w:rPr>
-              <w:t xml:space="preserve"> → echo confirmation</w:t>
+              <w:t>Checkout → env: development → curl POST RENDER_DEPLOY_HOOK_DEV_URL → echo confirmation</w:t>
             </w:r>
           </w:p>
         </w:tc>
@@ -10243,15 +9764,7 @@
                 <w:sz w:val="20"/>
                 <w:szCs w:val="20"/>
               </w:rPr>
-              <w:t xml:space="preserve">Checkout → env: staging → curl POST </w:t>
-            </w:r>
-            <w:r>
-              <w:rPr>
-                <w:color w:val="000000"/>
-                <w:sz w:val="20"/>
-                <w:szCs w:val="20"/>
-              </w:rPr>
-              <w:t>RENDER_DEPLOY_HOOK_STAGING_URL → echo confirmation</w:t>
+              <w:t>Checkout → env: staging → curl POST RENDER_DEPLOY_HOOK_STAGING_URL → echo confirmation</w:t>
             </w:r>
           </w:p>
         </w:tc>
@@ -10491,15 +10004,7 @@
                 <w:sz w:val="20"/>
                 <w:szCs w:val="20"/>
               </w:rPr>
-              <w:t xml:space="preserve">Checkout → env: </w:t>
-            </w:r>
-            <w:r>
-              <w:rPr>
-                <w:color w:val="000000"/>
-                <w:sz w:val="20"/>
-                <w:szCs w:val="20"/>
-              </w:rPr>
-              <w:t>production → curl POST RENDER_DEPLOY_HOOK_PROD_URL → echo confirmation</w:t>
+              <w:t>Checkout → env: production → curl POST RENDER_DEPLOY_HOOK_PROD_URL → echo confirmation</w:t>
             </w:r>
           </w:p>
         </w:tc>
@@ -10547,13 +10052,7 @@
         <w:rPr>
           <w:color w:val="000000"/>
         </w:rPr>
-        <w:t xml:space="preserve">Create a new GitHub repository from scratch (pakvista-cicd or team-agreed name). Do </w:t>
-      </w:r>
-      <w:r>
-        <w:rPr>
-          <w:color w:val="000000"/>
-        </w:rPr>
-        <w:t>NOT reuse any previous repository.</w:t>
+        <w:t>Create a new GitHub repository from scratch (pakvista-cicd or team-agreed name). Do NOT reuse any previous repository.</w:t>
       </w:r>
     </w:p>
     <w:p>
@@ -10585,13 +10084,8 @@
         <w:rPr>
           <w:color w:val="000000"/>
         </w:rPr>
-        <w:t>Apply Branch Protection Rules on develop, staging, and main – require CI to pass and require at least one review before</w:t>
-      </w:r>
-      <w:r>
-        <w:rPr>
-          <w:color w:val="000000"/>
-        </w:rPr>
-        <w:t xml:space="preserve"> merging.</w:t>
+        <w:lastRenderedPageBreak/>
+        <w:t>Apply Branch Protection Rules on develop, staging, and main – require CI to pass and require at least one review before merging.</w:t>
       </w:r>
     </w:p>
     <w:p>
@@ -10623,13 +10117,7 @@
         <w:rPr>
           <w:color w:val="000000"/>
         </w:rPr>
-        <w:t xml:space="preserve">Create three Render Web Services (pakvista-dev, pakvista-staging, pakvista-prod) each connected to the TL's Docker Hub image. Copy each </w:t>
-      </w:r>
-      <w:r>
-        <w:rPr>
-          <w:color w:val="000000"/>
-        </w:rPr>
-        <w:t>deploy hook URL and store it in the correct GitHub Environment secret.</w:t>
+        <w:t>Create three Render Web Services (pakvista-dev, pakvista-staging, pakvista-prod) each connected to the TL's Docker Hub image. Copy each deploy hook URL and store it in the correct GitHub Environment secret.</w:t>
       </w:r>
     </w:p>
     <w:p>
@@ -10661,13 +10149,7 @@
         <w:rPr>
           <w:color w:val="000000"/>
         </w:rPr>
-        <w:t xml:space="preserve">Set up the initial repository structure: commit style.css, the Dockerfile, and a skeleton index.html (Home / Welcome </w:t>
-      </w:r>
-      <w:r>
-        <w:rPr>
-          <w:color w:val="000000"/>
-        </w:rPr>
-        <w:t>page).</w:t>
+        <w:t>Set up the initial repository structure: commit style.css, the Dockerfile, and a skeleton index.html (Home / Welcome page).</w:t>
       </w:r>
     </w:p>
     <w:p>
@@ -10715,14 +10197,7 @@
         <w:rPr>
           <w:color w:val="000000"/>
         </w:rPr>
-        <w:lastRenderedPageBreak/>
-        <w:t xml:space="preserve">After all five PRs </w:t>
-      </w:r>
-      <w:r>
-        <w:rPr>
-          <w:color w:val="000000"/>
-        </w:rPr>
-        <w:t>are merged into develop, promote the changes: open a PR from develop → staging, merge it; then from staging → main, merge it. Verify the CI and CD pipelines fire correctly for each promotion.</w:t>
+        <w:t>After all five PRs are merged into develop, promote the changes: open a PR from develop → staging, merge it; then from staging → main, merge it. Verify the CI and CD pipelines fire correctly for each promotion.</w:t>
       </w:r>
     </w:p>
     <w:p/>
@@ -10747,13 +10222,7 @@
         <w:rPr>
           <w:color w:val="000000"/>
         </w:rPr>
-        <w:t>Create a personal fea</w:t>
-      </w:r>
-      <w:r>
-        <w:rPr>
-          <w:color w:val="000000"/>
-        </w:rPr>
-        <w:t>ture branch from develop using the convention: feature/&lt;github-username&gt;/&lt;page-name&gt;.</w:t>
+        <w:t>Create a personal feature branch from develop using the convention: feature/&lt;github-username&gt;/&lt;page-name&gt;.</w:t>
       </w:r>
     </w:p>
     <w:p>
@@ -10785,13 +10254,8 @@
         <w:rPr>
           <w:color w:val="000000"/>
         </w:rPr>
-        <w:t>Author the assigned workflow file (Table 3) in .</w:t>
-      </w:r>
-      <w:r>
-        <w:rPr>
-          <w:color w:val="000000"/>
-        </w:rPr>
-        <w:t>github/workflows/. The workflow must be syntactically correct, well-commented YAML.</w:t>
+        <w:lastRenderedPageBreak/>
+        <w:t>Author the assigned workflow file (Table 3) in .github/workflows/. The workflow must be syntactically correct, well-commented YAML.</w:t>
       </w:r>
     </w:p>
     <w:p>
@@ -10823,13 +10287,7 @@
         <w:rPr>
           <w:color w:val="000000"/>
         </w:rPr>
-        <w:t>Open a Pull Request targeting the develop branch with a meaningful PR description.</w:t>
-      </w:r>
-      <w:r>
-        <w:rPr>
-          <w:color w:val="000000"/>
-        </w:rPr>
-        <w:t xml:space="preserve"> Verify the CI workflow (ci-dev.yml) fires and all steps pass.</w:t>
+        <w:t>Open a Pull Request targeting the develop branch with a meaningful PR description. Verify the CI workflow (ci-dev.yml) fires and all steps pass.</w:t>
       </w:r>
     </w:p>
     <w:p>
@@ -10861,13 +10319,7 @@
         <w:rPr>
           <w:color w:val="000000"/>
         </w:rPr>
-        <w:t xml:space="preserve">Verify the live PakVista Development site on Render reflects the </w:t>
-      </w:r>
-      <w:r>
-        <w:rPr>
-          <w:color w:val="000000"/>
-        </w:rPr>
-        <w:t>newly added page.</w:t>
+        <w:t>Verify the live PakVista Development site on Render reflects the newly added page.</w:t>
       </w:r>
     </w:p>
     <w:p>
@@ -11050,17 +10502,7 @@
                 <w:sz w:val="20"/>
                 <w:szCs w:val="20"/>
               </w:rPr>
-              <w:t xml:space="preserve">Max </w:t>
-            </w:r>
-            <w:r>
-              <w:rPr>
-                <w:b/>
-                <w:bCs/>
-                <w:color w:val="FFFFFF"/>
-                <w:sz w:val="20"/>
-                <w:szCs w:val="20"/>
-              </w:rPr>
-              <w:t>Marks</w:t>
+              <w:t>Max Marks</w:t>
             </w:r>
           </w:p>
         </w:tc>
@@ -11288,15 +10730,7 @@
                 <w:sz w:val="20"/>
                 <w:szCs w:val="20"/>
               </w:rPr>
-              <w:t xml:space="preserve">Version the Term Project document </w:t>
-            </w:r>
-            <w:r>
-              <w:rPr>
-                <w:color w:val="000000"/>
-                <w:sz w:val="20"/>
-                <w:szCs w:val="20"/>
-              </w:rPr>
-              <w:t>(TermProject_Spring2026.docx) inside the repo root; each member fills their row in Table 1 including Assigned Workflow File and Assigned Page.</w:t>
+              <w:t>Version the Term Project document (TermProject_Spring2026.docx) inside the repo root; each member fills their row in Table 1 including Assigned Workflow File and Assigned Page.</w:t>
             </w:r>
           </w:p>
         </w:tc>
@@ -11459,15 +10893,7 @@
                 <w:sz w:val="20"/>
                 <w:szCs w:val="20"/>
               </w:rPr>
-              <w:t xml:space="preserve">Create three GitHub </w:t>
-            </w:r>
-            <w:r>
-              <w:rPr>
-                <w:color w:val="000000"/>
-                <w:sz w:val="20"/>
-                <w:szCs w:val="20"/>
-              </w:rPr>
-              <w:t>Environments: development, staging, production.</w:t>
+              <w:t>Create three GitHub Environments: development, staging, production.</w:t>
             </w:r>
           </w:p>
         </w:tc>
@@ -11661,15 +11087,7 @@
                 <w:sz w:val="20"/>
                 <w:szCs w:val="20"/>
               </w:rPr>
-              <w:t xml:space="preserve">Configure three environment-level secrets: RENDER_DEPLOY_HOOK_DEV_URL, </w:t>
-            </w:r>
-            <w:r>
-              <w:rPr>
-                <w:color w:val="000000"/>
-                <w:sz w:val="20"/>
-                <w:szCs w:val="20"/>
-              </w:rPr>
-              <w:t>RENDER_DEPLOY_HOOK_STAGING_URL, RENDER_DEPLOY_HOOK_PROD_URL inside their respective GitHub Environments.</w:t>
+              <w:t>Configure three environment-level secrets: RENDER_DEPLOY_HOOK_DEV_URL, RENDER_DEPLOY_HOOK_STAGING_URL, RENDER_DEPLOY_HOOK_PROD_URL inside their respective GitHub Environments.</w:t>
             </w:r>
           </w:p>
         </w:tc>
@@ -11831,8 +11249,31 @@
                 <w:sz w:val="21"/>
                 <w:szCs w:val="21"/>
               </w:rPr>
-              <w:t xml:space="preserve">HTML Page Development </w:t>
-            </w:r>
+              <w:t>HTML Page Development (Full Git &amp; GitHub Flow)</w:t>
+            </w:r>
+          </w:p>
+        </w:tc>
+        <w:tc>
+          <w:tcPr>
+            <w:tcW w:w="2000" w:type="dxa"/>
+            <w:tcBorders>
+              <w:top w:val="single" w:sz="1" w:space="0" w:color="AAAAAA"/>
+              <w:left w:val="single" w:sz="1" w:space="0" w:color="AAAAAA"/>
+              <w:bottom w:val="single" w:sz="1" w:space="0" w:color="AAAAAA"/>
+              <w:right w:val="single" w:sz="1" w:space="0" w:color="AAAAAA"/>
+            </w:tcBorders>
+            <w:shd w:val="clear" w:color="auto" w:fill="D5E8F0"/>
+            <w:tcMar>
+              <w:top w:w="80" w:type="dxa"/>
+              <w:left w:w="120" w:type="dxa"/>
+              <w:bottom w:w="80" w:type="dxa"/>
+              <w:right w:w="120" w:type="dxa"/>
+            </w:tcMar>
+          </w:tcPr>
+          <w:p>
+            <w:pPr>
+              <w:jc w:val="center"/>
+            </w:pPr>
             <w:r>
               <w:rPr>
                 <w:b/>
@@ -11841,26 +11282,29 @@
                 <w:sz w:val="21"/>
                 <w:szCs w:val="21"/>
               </w:rPr>
-              <w:t>(Full Git &amp; GitHub Flow)</w:t>
-            </w:r>
-          </w:p>
-        </w:tc>
-        <w:tc>
-          <w:tcPr>
-            <w:tcW w:w="2000" w:type="dxa"/>
-            <w:tcBorders>
-              <w:top w:val="single" w:sz="1" w:space="0" w:color="AAAAAA"/>
-              <w:left w:val="single" w:sz="1" w:space="0" w:color="AAAAAA"/>
-              <w:bottom w:val="single" w:sz="1" w:space="0" w:color="AAAAAA"/>
-              <w:right w:val="single" w:sz="1" w:space="0" w:color="AAAAAA"/>
-            </w:tcBorders>
-            <w:shd w:val="clear" w:color="auto" w:fill="D5E8F0"/>
-            <w:tcMar>
-              <w:top w:w="80" w:type="dxa"/>
-              <w:left w:w="120" w:type="dxa"/>
-              <w:bottom w:w="80" w:type="dxa"/>
-              <w:right w:w="120" w:type="dxa"/>
-            </w:tcMar>
+              <w:t>20 Marks</w:t>
+            </w:r>
+          </w:p>
+        </w:tc>
+      </w:tr>
+      <w:tr>
+        <w:tc>
+          <w:tcPr>
+            <w:tcW w:w="500" w:type="dxa"/>
+            <w:tcBorders>
+              <w:top w:val="single" w:sz="1" w:space="0" w:color="AAAAAA"/>
+              <w:left w:val="single" w:sz="1" w:space="0" w:color="AAAAAA"/>
+              <w:bottom w:val="single" w:sz="1" w:space="0" w:color="AAAAAA"/>
+              <w:right w:val="single" w:sz="1" w:space="0" w:color="AAAAAA"/>
+            </w:tcBorders>
+            <w:shd w:val="clear" w:color="auto" w:fill="EBF3FA"/>
+            <w:tcMar>
+              <w:top w:w="80" w:type="dxa"/>
+              <w:left w:w="120" w:type="dxa"/>
+              <w:bottom w:w="80" w:type="dxa"/>
+              <w:right w:w="120" w:type="dxa"/>
+            </w:tcMar>
+            <w:vAlign w:val="center"/>
           </w:tcPr>
           <w:p>
             <w:pPr>
@@ -11870,33 +11314,326 @@
               <w:rPr>
                 <w:b/>
                 <w:bCs/>
+                <w:color w:val="000000"/>
+                <w:sz w:val="20"/>
+                <w:szCs w:val="20"/>
+              </w:rPr>
+              <w:t>7</w:t>
+            </w:r>
+          </w:p>
+        </w:tc>
+        <w:tc>
+          <w:tcPr>
+            <w:tcW w:w="6860" w:type="dxa"/>
+            <w:tcBorders>
+              <w:top w:val="single" w:sz="1" w:space="0" w:color="AAAAAA"/>
+              <w:left w:val="single" w:sz="1" w:space="0" w:color="AAAAAA"/>
+              <w:bottom w:val="single" w:sz="1" w:space="0" w:color="AAAAAA"/>
+              <w:right w:val="single" w:sz="1" w:space="0" w:color="AAAAAA"/>
+            </w:tcBorders>
+            <w:shd w:val="clear" w:color="auto" w:fill="EBF3FA"/>
+            <w:tcMar>
+              <w:top w:w="80" w:type="dxa"/>
+              <w:left w:w="120" w:type="dxa"/>
+              <w:bottom w:w="80" w:type="dxa"/>
+              <w:right w:w="120" w:type="dxa"/>
+            </w:tcMar>
+            <w:vAlign w:val="center"/>
+          </w:tcPr>
+          <w:p>
+            <w:r>
+              <w:rPr>
+                <w:color w:val="000000"/>
+                <w:sz w:val="20"/>
+                <w:szCs w:val="20"/>
+              </w:rPr>
+              <w:t>Each member creates their feature branch using the correct naming convention (feature/&lt;username&gt;/&lt;page-name&gt;).</w:t>
+            </w:r>
+          </w:p>
+        </w:tc>
+        <w:tc>
+          <w:tcPr>
+            <w:tcW w:w="2000" w:type="dxa"/>
+            <w:tcBorders>
+              <w:top w:val="single" w:sz="1" w:space="0" w:color="AAAAAA"/>
+              <w:left w:val="single" w:sz="1" w:space="0" w:color="AAAAAA"/>
+              <w:bottom w:val="single" w:sz="1" w:space="0" w:color="AAAAAA"/>
+              <w:right w:val="single" w:sz="1" w:space="0" w:color="AAAAAA"/>
+            </w:tcBorders>
+            <w:shd w:val="clear" w:color="auto" w:fill="EBF3FA"/>
+            <w:tcMar>
+              <w:top w:w="80" w:type="dxa"/>
+              <w:left w:w="120" w:type="dxa"/>
+              <w:bottom w:w="80" w:type="dxa"/>
+              <w:right w:w="120" w:type="dxa"/>
+            </w:tcMar>
+            <w:vAlign w:val="center"/>
+          </w:tcPr>
+          <w:p>
+            <w:pPr>
+              <w:jc w:val="center"/>
+            </w:pPr>
+            <w:r>
+              <w:rPr>
+                <w:color w:val="000000"/>
+                <w:sz w:val="20"/>
+                <w:szCs w:val="20"/>
+              </w:rPr>
+              <w:t>4</w:t>
+            </w:r>
+          </w:p>
+        </w:tc>
+      </w:tr>
+      <w:tr>
+        <w:tc>
+          <w:tcPr>
+            <w:tcW w:w="500" w:type="dxa"/>
+            <w:tcBorders>
+              <w:top w:val="single" w:sz="1" w:space="0" w:color="AAAAAA"/>
+              <w:left w:val="single" w:sz="1" w:space="0" w:color="AAAAAA"/>
+              <w:bottom w:val="single" w:sz="1" w:space="0" w:color="AAAAAA"/>
+              <w:right w:val="single" w:sz="1" w:space="0" w:color="AAAAAA"/>
+            </w:tcBorders>
+            <w:shd w:val="clear" w:color="auto" w:fill="FFFFFF"/>
+            <w:tcMar>
+              <w:top w:w="80" w:type="dxa"/>
+              <w:left w:w="120" w:type="dxa"/>
+              <w:bottom w:w="80" w:type="dxa"/>
+              <w:right w:w="120" w:type="dxa"/>
+            </w:tcMar>
+            <w:vAlign w:val="center"/>
+          </w:tcPr>
+          <w:p>
+            <w:pPr>
+              <w:jc w:val="center"/>
+            </w:pPr>
+            <w:r>
+              <w:rPr>
+                <w:b/>
+                <w:bCs/>
+                <w:color w:val="000000"/>
+                <w:sz w:val="20"/>
+                <w:szCs w:val="20"/>
+              </w:rPr>
+              <w:t>8</w:t>
+            </w:r>
+          </w:p>
+        </w:tc>
+        <w:tc>
+          <w:tcPr>
+            <w:tcW w:w="6860" w:type="dxa"/>
+            <w:tcBorders>
+              <w:top w:val="single" w:sz="1" w:space="0" w:color="AAAAAA"/>
+              <w:left w:val="single" w:sz="1" w:space="0" w:color="AAAAAA"/>
+              <w:bottom w:val="single" w:sz="1" w:space="0" w:color="AAAAAA"/>
+              <w:right w:val="single" w:sz="1" w:space="0" w:color="AAAAAA"/>
+            </w:tcBorders>
+            <w:shd w:val="clear" w:color="auto" w:fill="FFFFFF"/>
+            <w:tcMar>
+              <w:top w:w="80" w:type="dxa"/>
+              <w:left w:w="120" w:type="dxa"/>
+              <w:bottom w:w="80" w:type="dxa"/>
+              <w:right w:w="120" w:type="dxa"/>
+            </w:tcMar>
+            <w:vAlign w:val="center"/>
+          </w:tcPr>
+          <w:p>
+            <w:r>
+              <w:rPr>
+                <w:color w:val="000000"/>
+                <w:sz w:val="20"/>
+                <w:szCs w:val="20"/>
+              </w:rPr>
+              <w:t>Each member builds their assigned HTML page with complete, relevant content (no Lorem Ipsum), linked to shared style.css, no JavaScript.</w:t>
+            </w:r>
+          </w:p>
+        </w:tc>
+        <w:tc>
+          <w:tcPr>
+            <w:tcW w:w="2000" w:type="dxa"/>
+            <w:tcBorders>
+              <w:top w:val="single" w:sz="1" w:space="0" w:color="AAAAAA"/>
+              <w:left w:val="single" w:sz="1" w:space="0" w:color="AAAAAA"/>
+              <w:bottom w:val="single" w:sz="1" w:space="0" w:color="AAAAAA"/>
+              <w:right w:val="single" w:sz="1" w:space="0" w:color="AAAAAA"/>
+            </w:tcBorders>
+            <w:shd w:val="clear" w:color="auto" w:fill="FFFFFF"/>
+            <w:tcMar>
+              <w:top w:w="80" w:type="dxa"/>
+              <w:left w:w="120" w:type="dxa"/>
+              <w:bottom w:w="80" w:type="dxa"/>
+              <w:right w:w="120" w:type="dxa"/>
+            </w:tcMar>
+            <w:vAlign w:val="center"/>
+          </w:tcPr>
+          <w:p>
+            <w:pPr>
+              <w:jc w:val="center"/>
+            </w:pPr>
+            <w:r>
+              <w:rPr>
+                <w:color w:val="000000"/>
+                <w:sz w:val="20"/>
+                <w:szCs w:val="20"/>
+              </w:rPr>
+              <w:t>10</w:t>
+            </w:r>
+          </w:p>
+        </w:tc>
+      </w:tr>
+      <w:tr>
+        <w:tc>
+          <w:tcPr>
+            <w:tcW w:w="500" w:type="dxa"/>
+            <w:tcBorders>
+              <w:top w:val="single" w:sz="1" w:space="0" w:color="AAAAAA"/>
+              <w:left w:val="single" w:sz="1" w:space="0" w:color="AAAAAA"/>
+              <w:bottom w:val="single" w:sz="1" w:space="0" w:color="AAAAAA"/>
+              <w:right w:val="single" w:sz="1" w:space="0" w:color="AAAAAA"/>
+            </w:tcBorders>
+            <w:shd w:val="clear" w:color="auto" w:fill="EBF3FA"/>
+            <w:tcMar>
+              <w:top w:w="80" w:type="dxa"/>
+              <w:left w:w="120" w:type="dxa"/>
+              <w:bottom w:w="80" w:type="dxa"/>
+              <w:right w:w="120" w:type="dxa"/>
+            </w:tcMar>
+            <w:vAlign w:val="center"/>
+          </w:tcPr>
+          <w:p>
+            <w:pPr>
+              <w:jc w:val="center"/>
+            </w:pPr>
+            <w:r>
+              <w:rPr>
+                <w:b/>
+                <w:bCs/>
+                <w:color w:val="000000"/>
+                <w:sz w:val="20"/>
+                <w:szCs w:val="20"/>
+              </w:rPr>
+              <w:t>9</w:t>
+            </w:r>
+          </w:p>
+        </w:tc>
+        <w:tc>
+          <w:tcPr>
+            <w:tcW w:w="6860" w:type="dxa"/>
+            <w:tcBorders>
+              <w:top w:val="single" w:sz="1" w:space="0" w:color="AAAAAA"/>
+              <w:left w:val="single" w:sz="1" w:space="0" w:color="AAAAAA"/>
+              <w:bottom w:val="single" w:sz="1" w:space="0" w:color="AAAAAA"/>
+              <w:right w:val="single" w:sz="1" w:space="0" w:color="AAAAAA"/>
+            </w:tcBorders>
+            <w:shd w:val="clear" w:color="auto" w:fill="EBF3FA"/>
+            <w:tcMar>
+              <w:top w:w="80" w:type="dxa"/>
+              <w:left w:w="120" w:type="dxa"/>
+              <w:bottom w:w="80" w:type="dxa"/>
+              <w:right w:w="120" w:type="dxa"/>
+            </w:tcMar>
+            <w:vAlign w:val="center"/>
+          </w:tcPr>
+          <w:p>
+            <w:r>
+              <w:rPr>
+                <w:color w:val="000000"/>
+                <w:sz w:val="20"/>
+                <w:szCs w:val="20"/>
+              </w:rPr>
+              <w:t>Each member opens a PR targeting develop with a meaningful description; CI passes before merge.</w:t>
+            </w:r>
+            <w:r>
+              <w:rPr>
+                <w:color w:val="000000"/>
+                <w:sz w:val="20"/>
+                <w:szCs w:val="20"/>
+              </w:rPr>
+              <w:t xml:space="preserve"> </w:t>
+            </w:r>
+          </w:p>
+        </w:tc>
+        <w:tc>
+          <w:tcPr>
+            <w:tcW w:w="2000" w:type="dxa"/>
+            <w:tcBorders>
+              <w:top w:val="single" w:sz="1" w:space="0" w:color="AAAAAA"/>
+              <w:left w:val="single" w:sz="1" w:space="0" w:color="AAAAAA"/>
+              <w:bottom w:val="single" w:sz="1" w:space="0" w:color="AAAAAA"/>
+              <w:right w:val="single" w:sz="1" w:space="0" w:color="AAAAAA"/>
+            </w:tcBorders>
+            <w:shd w:val="clear" w:color="auto" w:fill="EBF3FA"/>
+            <w:tcMar>
+              <w:top w:w="80" w:type="dxa"/>
+              <w:left w:w="120" w:type="dxa"/>
+              <w:bottom w:w="80" w:type="dxa"/>
+              <w:right w:w="120" w:type="dxa"/>
+            </w:tcMar>
+            <w:vAlign w:val="center"/>
+          </w:tcPr>
+          <w:p>
+            <w:pPr>
+              <w:jc w:val="center"/>
+            </w:pPr>
+            <w:r>
+              <w:rPr>
+                <w:color w:val="000000"/>
+                <w:sz w:val="20"/>
+                <w:szCs w:val="20"/>
+              </w:rPr>
+              <w:t>6</w:t>
+            </w:r>
+          </w:p>
+        </w:tc>
+      </w:tr>
+      <w:tr>
+        <w:tc>
+          <w:tcPr>
+            <w:tcW w:w="7360" w:type="dxa"/>
+            <w:gridSpan w:val="2"/>
+            <w:tcBorders>
+              <w:top w:val="single" w:sz="1" w:space="0" w:color="AAAAAA"/>
+              <w:left w:val="single" w:sz="1" w:space="0" w:color="AAAAAA"/>
+              <w:bottom w:val="single" w:sz="1" w:space="0" w:color="AAAAAA"/>
+              <w:right w:val="single" w:sz="1" w:space="0" w:color="AAAAAA"/>
+            </w:tcBorders>
+            <w:shd w:val="clear" w:color="auto" w:fill="D5E8F0"/>
+            <w:tcMar>
+              <w:top w:w="80" w:type="dxa"/>
+              <w:left w:w="120" w:type="dxa"/>
+              <w:bottom w:w="80" w:type="dxa"/>
+              <w:right w:w="120" w:type="dxa"/>
+            </w:tcMar>
+          </w:tcPr>
+          <w:p>
+            <w:r>
+              <w:rPr>
+                <w:b/>
+                <w:bCs/>
                 <w:color w:val="1F3864"/>
                 <w:sz w:val="21"/>
                 <w:szCs w:val="21"/>
               </w:rPr>
-              <w:t>20 Marks</w:t>
-            </w:r>
-          </w:p>
-        </w:tc>
-      </w:tr>
-      <w:tr>
-        <w:tc>
-          <w:tcPr>
-            <w:tcW w:w="500" w:type="dxa"/>
-            <w:tcBorders>
-              <w:top w:val="single" w:sz="1" w:space="0" w:color="AAAAAA"/>
-              <w:left w:val="single" w:sz="1" w:space="0" w:color="AAAAAA"/>
-              <w:bottom w:val="single" w:sz="1" w:space="0" w:color="AAAAAA"/>
-              <w:right w:val="single" w:sz="1" w:space="0" w:color="AAAAAA"/>
-            </w:tcBorders>
-            <w:shd w:val="clear" w:color="auto" w:fill="EBF3FA"/>
-            <w:tcMar>
-              <w:top w:w="80" w:type="dxa"/>
-              <w:left w:w="120" w:type="dxa"/>
-              <w:bottom w:w="80" w:type="dxa"/>
-              <w:right w:w="120" w:type="dxa"/>
-            </w:tcMar>
-            <w:vAlign w:val="center"/>
+              <w:t>CI Pipelines – Build &amp; Push Docker Images (ci-dev, ci-staging, ci-prod)</w:t>
+            </w:r>
+          </w:p>
+        </w:tc>
+        <w:tc>
+          <w:tcPr>
+            <w:tcW w:w="2000" w:type="dxa"/>
+            <w:tcBorders>
+              <w:top w:val="single" w:sz="1" w:space="0" w:color="AAAAAA"/>
+              <w:left w:val="single" w:sz="1" w:space="0" w:color="AAAAAA"/>
+              <w:bottom w:val="single" w:sz="1" w:space="0" w:color="AAAAAA"/>
+              <w:right w:val="single" w:sz="1" w:space="0" w:color="AAAAAA"/>
+            </w:tcBorders>
+            <w:shd w:val="clear" w:color="auto" w:fill="D5E8F0"/>
+            <w:tcMar>
+              <w:top w:w="80" w:type="dxa"/>
+              <w:left w:w="120" w:type="dxa"/>
+              <w:bottom w:w="80" w:type="dxa"/>
+              <w:right w:w="120" w:type="dxa"/>
+            </w:tcMar>
           </w:tcPr>
           <w:p>
             <w:pPr>
@@ -11906,46 +11643,19 @@
               <w:rPr>
                 <w:b/>
                 <w:bCs/>
-                <w:color w:val="000000"/>
-                <w:sz w:val="20"/>
-                <w:szCs w:val="20"/>
-              </w:rPr>
-              <w:t>7</w:t>
-            </w:r>
-          </w:p>
-        </w:tc>
-        <w:tc>
-          <w:tcPr>
-            <w:tcW w:w="6860" w:type="dxa"/>
-            <w:tcBorders>
-              <w:top w:val="single" w:sz="1" w:space="0" w:color="AAAAAA"/>
-              <w:left w:val="single" w:sz="1" w:space="0" w:color="AAAAAA"/>
-              <w:bottom w:val="single" w:sz="1" w:space="0" w:color="AAAAAA"/>
-              <w:right w:val="single" w:sz="1" w:space="0" w:color="AAAAAA"/>
-            </w:tcBorders>
-            <w:shd w:val="clear" w:color="auto" w:fill="EBF3FA"/>
-            <w:tcMar>
-              <w:top w:w="80" w:type="dxa"/>
-              <w:left w:w="120" w:type="dxa"/>
-              <w:bottom w:w="80" w:type="dxa"/>
-              <w:right w:w="120" w:type="dxa"/>
-            </w:tcMar>
-            <w:vAlign w:val="center"/>
-          </w:tcPr>
-          <w:p>
-            <w:r>
-              <w:rPr>
-                <w:color w:val="000000"/>
-                <w:sz w:val="20"/>
-                <w:szCs w:val="20"/>
-              </w:rPr>
-              <w:t>Each member creates their feature branch using the correct naming convention (feature/&lt;username&gt;/&lt;page-name&gt;).</w:t>
-            </w:r>
-          </w:p>
-        </w:tc>
-        <w:tc>
-          <w:tcPr>
-            <w:tcW w:w="2000" w:type="dxa"/>
+                <w:color w:val="1F3864"/>
+                <w:sz w:val="21"/>
+                <w:szCs w:val="21"/>
+              </w:rPr>
+              <w:t>25 Marks</w:t>
+            </w:r>
+          </w:p>
+        </w:tc>
+      </w:tr>
+      <w:tr>
+        <w:tc>
+          <w:tcPr>
+            <w:tcW w:w="500" w:type="dxa"/>
             <w:tcBorders>
               <w:top w:val="single" w:sz="1" w:space="0" w:color="AAAAAA"/>
               <w:left w:val="single" w:sz="1" w:space="0" w:color="AAAAAA"/>
@@ -11967,26 +11677,55 @@
             </w:pPr>
             <w:r>
               <w:rPr>
-                <w:color w:val="000000"/>
-                <w:sz w:val="20"/>
-                <w:szCs w:val="20"/>
-              </w:rPr>
-              <w:t>4</w:t>
-            </w:r>
-          </w:p>
-        </w:tc>
-      </w:tr>
-      <w:tr>
-        <w:tc>
-          <w:tcPr>
-            <w:tcW w:w="500" w:type="dxa"/>
-            <w:tcBorders>
-              <w:top w:val="single" w:sz="1" w:space="0" w:color="AAAAAA"/>
-              <w:left w:val="single" w:sz="1" w:space="0" w:color="AAAAAA"/>
-              <w:bottom w:val="single" w:sz="1" w:space="0" w:color="AAAAAA"/>
-              <w:right w:val="single" w:sz="1" w:space="0" w:color="AAAAAA"/>
-            </w:tcBorders>
-            <w:shd w:val="clear" w:color="auto" w:fill="FFFFFF"/>
+                <w:b/>
+                <w:bCs/>
+                <w:color w:val="000000"/>
+                <w:sz w:val="20"/>
+                <w:szCs w:val="20"/>
+              </w:rPr>
+              <w:t>10</w:t>
+            </w:r>
+          </w:p>
+        </w:tc>
+        <w:tc>
+          <w:tcPr>
+            <w:tcW w:w="6860" w:type="dxa"/>
+            <w:tcBorders>
+              <w:top w:val="single" w:sz="1" w:space="0" w:color="AAAAAA"/>
+              <w:left w:val="single" w:sz="1" w:space="0" w:color="AAAAAA"/>
+              <w:bottom w:val="single" w:sz="1" w:space="0" w:color="AAAAAA"/>
+              <w:right w:val="single" w:sz="1" w:space="0" w:color="AAAAAA"/>
+            </w:tcBorders>
+            <w:shd w:val="clear" w:color="auto" w:fill="EBF3FA"/>
+            <w:tcMar>
+              <w:top w:w="80" w:type="dxa"/>
+              <w:left w:w="120" w:type="dxa"/>
+              <w:bottom w:w="80" w:type="dxa"/>
+              <w:right w:w="120" w:type="dxa"/>
+            </w:tcMar>
+            <w:vAlign w:val="center"/>
+          </w:tcPr>
+          <w:p>
+            <w:r>
+              <w:rPr>
+                <w:color w:val="000000"/>
+                <w:sz w:val="20"/>
+                <w:szCs w:val="20"/>
+              </w:rPr>
+              <w:t>ci-dev.yml: correct pull_request trigger targeting develop, all five mandatory steps present and correctly configured.</w:t>
+            </w:r>
+          </w:p>
+        </w:tc>
+        <w:tc>
+          <w:tcPr>
+            <w:tcW w:w="2000" w:type="dxa"/>
+            <w:tcBorders>
+              <w:top w:val="single" w:sz="1" w:space="0" w:color="AAAAAA"/>
+              <w:left w:val="single" w:sz="1" w:space="0" w:color="AAAAAA"/>
+              <w:bottom w:val="single" w:sz="1" w:space="0" w:color="AAAAAA"/>
+              <w:right w:val="single" w:sz="1" w:space="0" w:color="AAAAAA"/>
+            </w:tcBorders>
+            <w:shd w:val="clear" w:color="auto" w:fill="EBF3FA"/>
             <w:tcMar>
               <w:top w:w="80" w:type="dxa"/>
               <w:left w:w="120" w:type="dxa"/>
@@ -12001,8 +11740,6 @@
             </w:pPr>
             <w:r>
               <w:rPr>
-                <w:b/>
-                <w:bCs/>
                 <w:color w:val="000000"/>
                 <w:sz w:val="20"/>
                 <w:szCs w:val="20"/>
@@ -12011,46 +11748,11 @@
             </w:r>
           </w:p>
         </w:tc>
-        <w:tc>
-          <w:tcPr>
-            <w:tcW w:w="6860" w:type="dxa"/>
-            <w:tcBorders>
-              <w:top w:val="single" w:sz="1" w:space="0" w:color="AAAAAA"/>
-              <w:left w:val="single" w:sz="1" w:space="0" w:color="AAAAAA"/>
-              <w:bottom w:val="single" w:sz="1" w:space="0" w:color="AAAAAA"/>
-              <w:right w:val="single" w:sz="1" w:space="0" w:color="AAAAAA"/>
-            </w:tcBorders>
-            <w:shd w:val="clear" w:color="auto" w:fill="FFFFFF"/>
-            <w:tcMar>
-              <w:top w:w="80" w:type="dxa"/>
-              <w:left w:w="120" w:type="dxa"/>
-              <w:bottom w:w="80" w:type="dxa"/>
-              <w:right w:w="120" w:type="dxa"/>
-            </w:tcMar>
-            <w:vAlign w:val="center"/>
-          </w:tcPr>
-          <w:p>
-            <w:r>
-              <w:rPr>
-                <w:color w:val="000000"/>
-                <w:sz w:val="20"/>
-                <w:szCs w:val="20"/>
-              </w:rPr>
-              <w:t>Each member builds their assigned HTML page with complete, relevant content (no Lorem Ipsum), linked to</w:t>
-            </w:r>
-            <w:r>
-              <w:rPr>
-                <w:color w:val="000000"/>
-                <w:sz w:val="20"/>
-                <w:szCs w:val="20"/>
-              </w:rPr>
-              <w:t xml:space="preserve"> shared style.css, no JavaScript.</w:t>
-            </w:r>
-          </w:p>
-        </w:tc>
-        <w:tc>
-          <w:tcPr>
-            <w:tcW w:w="2000" w:type="dxa"/>
+      </w:tr>
+      <w:tr>
+        <w:tc>
+          <w:tcPr>
+            <w:tcW w:w="500" w:type="dxa"/>
             <w:tcBorders>
               <w:top w:val="single" w:sz="1" w:space="0" w:color="AAAAAA"/>
               <w:left w:val="single" w:sz="1" w:space="0" w:color="AAAAAA"/>
@@ -12072,26 +11774,55 @@
             </w:pPr>
             <w:r>
               <w:rPr>
-                <w:color w:val="000000"/>
-                <w:sz w:val="20"/>
-                <w:szCs w:val="20"/>
-              </w:rPr>
-              <w:t>10</w:t>
-            </w:r>
-          </w:p>
-        </w:tc>
-      </w:tr>
-      <w:tr>
-        <w:tc>
-          <w:tcPr>
-            <w:tcW w:w="500" w:type="dxa"/>
-            <w:tcBorders>
-              <w:top w:val="single" w:sz="1" w:space="0" w:color="AAAAAA"/>
-              <w:left w:val="single" w:sz="1" w:space="0" w:color="AAAAAA"/>
-              <w:bottom w:val="single" w:sz="1" w:space="0" w:color="AAAAAA"/>
-              <w:right w:val="single" w:sz="1" w:space="0" w:color="AAAAAA"/>
-            </w:tcBorders>
-            <w:shd w:val="clear" w:color="auto" w:fill="EBF3FA"/>
+                <w:b/>
+                <w:bCs/>
+                <w:color w:val="000000"/>
+                <w:sz w:val="20"/>
+                <w:szCs w:val="20"/>
+              </w:rPr>
+              <w:t>11</w:t>
+            </w:r>
+          </w:p>
+        </w:tc>
+        <w:tc>
+          <w:tcPr>
+            <w:tcW w:w="6860" w:type="dxa"/>
+            <w:tcBorders>
+              <w:top w:val="single" w:sz="1" w:space="0" w:color="AAAAAA"/>
+              <w:left w:val="single" w:sz="1" w:space="0" w:color="AAAAAA"/>
+              <w:bottom w:val="single" w:sz="1" w:space="0" w:color="AAAAAA"/>
+              <w:right w:val="single" w:sz="1" w:space="0" w:color="AAAAAA"/>
+            </w:tcBorders>
+            <w:shd w:val="clear" w:color="auto" w:fill="FFFFFF"/>
+            <w:tcMar>
+              <w:top w:w="80" w:type="dxa"/>
+              <w:left w:w="120" w:type="dxa"/>
+              <w:bottom w:w="80" w:type="dxa"/>
+              <w:right w:w="120" w:type="dxa"/>
+            </w:tcMar>
+            <w:vAlign w:val="center"/>
+          </w:tcPr>
+          <w:p>
+            <w:r>
+              <w:rPr>
+                <w:color w:val="000000"/>
+                <w:sz w:val="20"/>
+                <w:szCs w:val="20"/>
+              </w:rPr>
+              <w:t>ci-staging.yml: correct pull_request trigger targeting staging, environment-specific image tags (:staging-latest, :staging-&lt;sha&gt;), push to Docker Hub succeeds.</w:t>
+            </w:r>
+          </w:p>
+        </w:tc>
+        <w:tc>
+          <w:tcPr>
+            <w:tcW w:w="2000" w:type="dxa"/>
+            <w:tcBorders>
+              <w:top w:val="single" w:sz="1" w:space="0" w:color="AAAAAA"/>
+              <w:left w:val="single" w:sz="1" w:space="0" w:color="AAAAAA"/>
+              <w:bottom w:val="single" w:sz="1" w:space="0" w:color="AAAAAA"/>
+              <w:right w:val="single" w:sz="1" w:space="0" w:color="AAAAAA"/>
+            </w:tcBorders>
+            <w:shd w:val="clear" w:color="auto" w:fill="FFFFFF"/>
             <w:tcMar>
               <w:top w:w="80" w:type="dxa"/>
               <w:left w:w="120" w:type="dxa"/>
@@ -12106,56 +11837,19 @@
             </w:pPr>
             <w:r>
               <w:rPr>
-                <w:b/>
-                <w:bCs/>
-                <w:color w:val="000000"/>
-                <w:sz w:val="20"/>
-                <w:szCs w:val="20"/>
-              </w:rPr>
-              <w:t>9</w:t>
-            </w:r>
-          </w:p>
-        </w:tc>
-        <w:tc>
-          <w:tcPr>
-            <w:tcW w:w="6860" w:type="dxa"/>
-            <w:tcBorders>
-              <w:top w:val="single" w:sz="1" w:space="0" w:color="AAAAAA"/>
-              <w:left w:val="single" w:sz="1" w:space="0" w:color="AAAAAA"/>
-              <w:bottom w:val="single" w:sz="1" w:space="0" w:color="AAAAAA"/>
-              <w:right w:val="single" w:sz="1" w:space="0" w:color="AAAAAA"/>
-            </w:tcBorders>
-            <w:shd w:val="clear" w:color="auto" w:fill="EBF3FA"/>
-            <w:tcMar>
-              <w:top w:w="80" w:type="dxa"/>
-              <w:left w:w="120" w:type="dxa"/>
-              <w:bottom w:w="80" w:type="dxa"/>
-              <w:right w:w="120" w:type="dxa"/>
-            </w:tcMar>
-            <w:vAlign w:val="center"/>
-          </w:tcPr>
-          <w:p>
-            <w:r>
-              <w:rPr>
-                <w:color w:val="000000"/>
-                <w:sz w:val="20"/>
-                <w:szCs w:val="20"/>
-              </w:rPr>
-              <w:t>Each member opens a PR targeting develop with a meaningful description; CI passes before merge.</w:t>
-            </w:r>
-            <w:r>
-              <w:rPr>
-                <w:color w:val="000000"/>
-                <w:sz w:val="20"/>
-                <w:szCs w:val="20"/>
-              </w:rPr>
-              <w:t xml:space="preserve"> </w:t>
-            </w:r>
-          </w:p>
-        </w:tc>
-        <w:tc>
-          <w:tcPr>
-            <w:tcW w:w="2000" w:type="dxa"/>
+                <w:color w:val="000000"/>
+                <w:sz w:val="20"/>
+                <w:szCs w:val="20"/>
+              </w:rPr>
+              <w:t>8</w:t>
+            </w:r>
+          </w:p>
+        </w:tc>
+      </w:tr>
+      <w:tr>
+        <w:tc>
+          <w:tcPr>
+            <w:tcW w:w="500" w:type="dxa"/>
             <w:tcBorders>
               <w:top w:val="single" w:sz="1" w:space="0" w:color="AAAAAA"/>
               <w:left w:val="single" w:sz="1" w:space="0" w:color="AAAAAA"/>
@@ -12177,11 +11871,74 @@
             </w:pPr>
             <w:r>
               <w:rPr>
-                <w:color w:val="000000"/>
-                <w:sz w:val="20"/>
-                <w:szCs w:val="20"/>
-              </w:rPr>
-              <w:t>6</w:t>
+                <w:b/>
+                <w:bCs/>
+                <w:color w:val="000000"/>
+                <w:sz w:val="20"/>
+                <w:szCs w:val="20"/>
+              </w:rPr>
+              <w:t>12</w:t>
+            </w:r>
+          </w:p>
+        </w:tc>
+        <w:tc>
+          <w:tcPr>
+            <w:tcW w:w="6860" w:type="dxa"/>
+            <w:tcBorders>
+              <w:top w:val="single" w:sz="1" w:space="0" w:color="AAAAAA"/>
+              <w:left w:val="single" w:sz="1" w:space="0" w:color="AAAAAA"/>
+              <w:bottom w:val="single" w:sz="1" w:space="0" w:color="AAAAAA"/>
+              <w:right w:val="single" w:sz="1" w:space="0" w:color="AAAAAA"/>
+            </w:tcBorders>
+            <w:shd w:val="clear" w:color="auto" w:fill="EBF3FA"/>
+            <w:tcMar>
+              <w:top w:w="80" w:type="dxa"/>
+              <w:left w:w="120" w:type="dxa"/>
+              <w:bottom w:w="80" w:type="dxa"/>
+              <w:right w:w="120" w:type="dxa"/>
+            </w:tcMar>
+            <w:vAlign w:val="center"/>
+          </w:tcPr>
+          <w:p>
+            <w:r>
+              <w:rPr>
+                <w:color w:val="000000"/>
+                <w:sz w:val="20"/>
+                <w:szCs w:val="20"/>
+              </w:rPr>
+              <w:t>ci-prod.yml: correct pull_request trigger targeting main, environment-specific image tags (:prod-latest, :prod-&lt;sha&gt;), push to Docker Hub succeeds.</w:t>
+            </w:r>
+          </w:p>
+        </w:tc>
+        <w:tc>
+          <w:tcPr>
+            <w:tcW w:w="2000" w:type="dxa"/>
+            <w:tcBorders>
+              <w:top w:val="single" w:sz="1" w:space="0" w:color="AAAAAA"/>
+              <w:left w:val="single" w:sz="1" w:space="0" w:color="AAAAAA"/>
+              <w:bottom w:val="single" w:sz="1" w:space="0" w:color="AAAAAA"/>
+              <w:right w:val="single" w:sz="1" w:space="0" w:color="AAAAAA"/>
+            </w:tcBorders>
+            <w:shd w:val="clear" w:color="auto" w:fill="EBF3FA"/>
+            <w:tcMar>
+              <w:top w:w="80" w:type="dxa"/>
+              <w:left w:w="120" w:type="dxa"/>
+              <w:bottom w:w="80" w:type="dxa"/>
+              <w:right w:w="120" w:type="dxa"/>
+            </w:tcMar>
+            <w:vAlign w:val="center"/>
+          </w:tcPr>
+          <w:p>
+            <w:pPr>
+              <w:jc w:val="center"/>
+            </w:pPr>
+            <w:r>
+              <w:rPr>
+                <w:color w:val="000000"/>
+                <w:sz w:val="20"/>
+                <w:szCs w:val="20"/>
+              </w:rPr>
+              <w:t>9</w:t>
             </w:r>
           </w:p>
         </w:tc>
@@ -12214,7 +11971,7 @@
                 <w:sz w:val="21"/>
                 <w:szCs w:val="21"/>
               </w:rPr>
-              <w:t>CI Pipelines – Build &amp; Push Docker Images (ci-dev, ci-staging, ci-prod)</w:t>
+              <w:t>CD Pipelines – Automated Deployment to Render (cd-dev, cd-staging, cd-prod)</w:t>
             </w:r>
           </w:p>
         </w:tc>
@@ -12247,7 +12004,7 @@
                 <w:sz w:val="21"/>
                 <w:szCs w:val="21"/>
               </w:rPr>
-              <w:t>25 Marks</w:t>
+              <w:t>20 Marks</w:t>
             </w:r>
           </w:p>
         </w:tc>
@@ -12283,7 +12040,8 @@
                 <w:sz w:val="20"/>
                 <w:szCs w:val="20"/>
               </w:rPr>
-              <w:t>10</w:t>
+              <w:lastRenderedPageBreak/>
+              <w:t>13</w:t>
             </w:r>
           </w:p>
         </w:tc>
@@ -12312,15 +12070,7 @@
                 <w:sz w:val="20"/>
                 <w:szCs w:val="20"/>
               </w:rPr>
-              <w:t xml:space="preserve">ci-dev.yml: correct </w:t>
-            </w:r>
-            <w:r>
-              <w:rPr>
-                <w:color w:val="000000"/>
-                <w:sz w:val="20"/>
-                <w:szCs w:val="20"/>
-              </w:rPr>
-              <w:t>pull_request trigger targeting develop, all five mandatory steps present and correctly configured.</w:t>
+              <w:t>cd-dev.yml: correct push trigger on develop, declares environment: development, curl POST to RENDER_DEPLOY_HOOK_DEV_URL, echo confirmation.</w:t>
             </w:r>
           </w:p>
         </w:tc>
@@ -12352,7 +12102,7 @@
                 <w:sz w:val="20"/>
                 <w:szCs w:val="20"/>
               </w:rPr>
-              <w:t>8</w:t>
+              <w:t>6</w:t>
             </w:r>
           </w:p>
         </w:tc>
@@ -12388,7 +12138,7 @@
                 <w:sz w:val="20"/>
                 <w:szCs w:val="20"/>
               </w:rPr>
-              <w:t>11</w:t>
+              <w:t>14</w:t>
             </w:r>
           </w:p>
         </w:tc>
@@ -12417,15 +12167,7 @@
                 <w:sz w:val="20"/>
                 <w:szCs w:val="20"/>
               </w:rPr>
-              <w:t xml:space="preserve">ci-staging.yml: correct pull_request trigger targeting staging, environment-specific image tags (:staging-latest, :staging-&lt;sha&gt;), push to Docker Hub </w:t>
-            </w:r>
-            <w:r>
-              <w:rPr>
-                <w:color w:val="000000"/>
-                <w:sz w:val="20"/>
-                <w:szCs w:val="20"/>
-              </w:rPr>
-              <w:t>succeeds.</w:t>
+              <w:t>cd-staging.yml: correct push trigger on staging, declares environment: staging, curl POST to RENDER_DEPLOY_HOOK_STAGING_URL, echo confirmation.</w:t>
             </w:r>
           </w:p>
         </w:tc>
@@ -12457,7 +12199,7 @@
                 <w:sz w:val="20"/>
                 <w:szCs w:val="20"/>
               </w:rPr>
-              <w:t>8</w:t>
+              <w:t>7</w:t>
             </w:r>
           </w:p>
         </w:tc>
@@ -12493,7 +12235,7 @@
                 <w:sz w:val="20"/>
                 <w:szCs w:val="20"/>
               </w:rPr>
-              <w:t>12</w:t>
+              <w:t>15</w:t>
             </w:r>
           </w:p>
         </w:tc>
@@ -12522,7 +12264,7 @@
                 <w:sz w:val="20"/>
                 <w:szCs w:val="20"/>
               </w:rPr>
-              <w:t>ci-prod.yml: correct pull_request trigger targeting main, environment-specific image tags (:prod-latest, :prod-&lt;sha&gt;), push to Docker Hub succeeds.</w:t>
+              <w:t>cd-prod.yml: correct push trigger on main, declares environment: production, curl POST to RENDER_DEPLOY_HOOK_PROD_URL, echo confirmation. Live production PakVista on Render displays all five pages.</w:t>
             </w:r>
           </w:p>
         </w:tc>
@@ -12554,7 +12296,7 @@
                 <w:sz w:val="20"/>
                 <w:szCs w:val="20"/>
               </w:rPr>
-              <w:t>9</w:t>
+              <w:t>7</w:t>
             </w:r>
           </w:p>
         </w:tc>
@@ -12587,7 +12329,7 @@
                 <w:sz w:val="21"/>
                 <w:szCs w:val="21"/>
               </w:rPr>
-              <w:t>CD Pipelines – Automated Deployment to Render (cd-dev, cd-staging, cd-prod)</w:t>
+              <w:t>End-to-End Verification, Screenshots &amp; Reflection</w:t>
             </w:r>
           </w:p>
         </w:tc>
@@ -12620,7 +12362,7 @@
                 <w:sz w:val="21"/>
                 <w:szCs w:val="21"/>
               </w:rPr>
-              <w:t>20 Marks</w:t>
+              <w:t>10 Marks</w:t>
             </w:r>
           </w:p>
         </w:tc>
@@ -12656,8 +12398,7 @@
                 <w:sz w:val="20"/>
                 <w:szCs w:val="20"/>
               </w:rPr>
-              <w:lastRenderedPageBreak/>
-              <w:t>13</w:t>
+              <w:t>16</w:t>
             </w:r>
           </w:p>
         </w:tc>
@@ -12686,7 +12427,7 @@
                 <w:sz w:val="20"/>
                 <w:szCs w:val="20"/>
               </w:rPr>
-              <w:t>cd-dev.yml: correct push trigger on develop, declares environment: development, curl POST to RENDER_DEPLOY_HOOK_DEV_URL, echo confirmation.</w:t>
+              <w:t>Screenshots: all six workflow runs (CI + CD per environment), Docker Hub image tags, three live Render service URLs with all pages accessible.</w:t>
             </w:r>
           </w:p>
         </w:tc>
@@ -12718,7 +12459,7 @@
                 <w:sz w:val="20"/>
                 <w:szCs w:val="20"/>
               </w:rPr>
-              <w:t>6</w:t>
+              <w:t>5</w:t>
             </w:r>
           </w:p>
         </w:tc>
@@ -12754,7 +12495,7 @@
                 <w:sz w:val="20"/>
                 <w:szCs w:val="20"/>
               </w:rPr>
-              <w:t>14</w:t>
+              <w:t>17</w:t>
             </w:r>
           </w:p>
         </w:tc>
@@ -12783,380 +12524,7 @@
                 <w:sz w:val="20"/>
                 <w:szCs w:val="20"/>
               </w:rPr>
-              <w:t xml:space="preserve">cd-staging.yml: correct push trigger on staging, declares environment: staging, curl POST to </w:t>
-            </w:r>
-            <w:r>
-              <w:rPr>
-                <w:color w:val="000000"/>
-                <w:sz w:val="20"/>
-                <w:szCs w:val="20"/>
-              </w:rPr>
-              <w:t>RENDER_DEPLOY_HOOK_STAGING_URL, echo confirmation.</w:t>
-            </w:r>
-          </w:p>
-        </w:tc>
-        <w:tc>
-          <w:tcPr>
-            <w:tcW w:w="2000" w:type="dxa"/>
-            <w:tcBorders>
-              <w:top w:val="single" w:sz="1" w:space="0" w:color="AAAAAA"/>
-              <w:left w:val="single" w:sz="1" w:space="0" w:color="AAAAAA"/>
-              <w:bottom w:val="single" w:sz="1" w:space="0" w:color="AAAAAA"/>
-              <w:right w:val="single" w:sz="1" w:space="0" w:color="AAAAAA"/>
-            </w:tcBorders>
-            <w:shd w:val="clear" w:color="auto" w:fill="FFFFFF"/>
-            <w:tcMar>
-              <w:top w:w="80" w:type="dxa"/>
-              <w:left w:w="120" w:type="dxa"/>
-              <w:bottom w:w="80" w:type="dxa"/>
-              <w:right w:w="120" w:type="dxa"/>
-            </w:tcMar>
-            <w:vAlign w:val="center"/>
-          </w:tcPr>
-          <w:p>
-            <w:pPr>
-              <w:jc w:val="center"/>
-            </w:pPr>
-            <w:r>
-              <w:rPr>
-                <w:color w:val="000000"/>
-                <w:sz w:val="20"/>
-                <w:szCs w:val="20"/>
-              </w:rPr>
-              <w:t>7</w:t>
-            </w:r>
-          </w:p>
-        </w:tc>
-      </w:tr>
-      <w:tr>
-        <w:tc>
-          <w:tcPr>
-            <w:tcW w:w="500" w:type="dxa"/>
-            <w:tcBorders>
-              <w:top w:val="single" w:sz="1" w:space="0" w:color="AAAAAA"/>
-              <w:left w:val="single" w:sz="1" w:space="0" w:color="AAAAAA"/>
-              <w:bottom w:val="single" w:sz="1" w:space="0" w:color="AAAAAA"/>
-              <w:right w:val="single" w:sz="1" w:space="0" w:color="AAAAAA"/>
-            </w:tcBorders>
-            <w:shd w:val="clear" w:color="auto" w:fill="EBF3FA"/>
-            <w:tcMar>
-              <w:top w:w="80" w:type="dxa"/>
-              <w:left w:w="120" w:type="dxa"/>
-              <w:bottom w:w="80" w:type="dxa"/>
-              <w:right w:w="120" w:type="dxa"/>
-            </w:tcMar>
-            <w:vAlign w:val="center"/>
-          </w:tcPr>
-          <w:p>
-            <w:pPr>
-              <w:jc w:val="center"/>
-            </w:pPr>
-            <w:r>
-              <w:rPr>
-                <w:b/>
-                <w:bCs/>
-                <w:color w:val="000000"/>
-                <w:sz w:val="20"/>
-                <w:szCs w:val="20"/>
-              </w:rPr>
-              <w:t>15</w:t>
-            </w:r>
-          </w:p>
-        </w:tc>
-        <w:tc>
-          <w:tcPr>
-            <w:tcW w:w="6860" w:type="dxa"/>
-            <w:tcBorders>
-              <w:top w:val="single" w:sz="1" w:space="0" w:color="AAAAAA"/>
-              <w:left w:val="single" w:sz="1" w:space="0" w:color="AAAAAA"/>
-              <w:bottom w:val="single" w:sz="1" w:space="0" w:color="AAAAAA"/>
-              <w:right w:val="single" w:sz="1" w:space="0" w:color="AAAAAA"/>
-            </w:tcBorders>
-            <w:shd w:val="clear" w:color="auto" w:fill="EBF3FA"/>
-            <w:tcMar>
-              <w:top w:w="80" w:type="dxa"/>
-              <w:left w:w="120" w:type="dxa"/>
-              <w:bottom w:w="80" w:type="dxa"/>
-              <w:right w:w="120" w:type="dxa"/>
-            </w:tcMar>
-            <w:vAlign w:val="center"/>
-          </w:tcPr>
-          <w:p>
-            <w:r>
-              <w:rPr>
-                <w:color w:val="000000"/>
-                <w:sz w:val="20"/>
-                <w:szCs w:val="20"/>
-              </w:rPr>
-              <w:t>cd-prod.yml: correct push trigger on main, declares environment: production, curl POST to RENDER_DEPLOY_HOOK_PROD_URL, echo confirmation. Live production PakVista on Render displays all five pages.</w:t>
-            </w:r>
-          </w:p>
-        </w:tc>
-        <w:tc>
-          <w:tcPr>
-            <w:tcW w:w="2000" w:type="dxa"/>
-            <w:tcBorders>
-              <w:top w:val="single" w:sz="1" w:space="0" w:color="AAAAAA"/>
-              <w:left w:val="single" w:sz="1" w:space="0" w:color="AAAAAA"/>
-              <w:bottom w:val="single" w:sz="1" w:space="0" w:color="AAAAAA"/>
-              <w:right w:val="single" w:sz="1" w:space="0" w:color="AAAAAA"/>
-            </w:tcBorders>
-            <w:shd w:val="clear" w:color="auto" w:fill="EBF3FA"/>
-            <w:tcMar>
-              <w:top w:w="80" w:type="dxa"/>
-              <w:left w:w="120" w:type="dxa"/>
-              <w:bottom w:w="80" w:type="dxa"/>
-              <w:right w:w="120" w:type="dxa"/>
-            </w:tcMar>
-            <w:vAlign w:val="center"/>
-          </w:tcPr>
-          <w:p>
-            <w:pPr>
-              <w:jc w:val="center"/>
-            </w:pPr>
-            <w:r>
-              <w:rPr>
-                <w:color w:val="000000"/>
-                <w:sz w:val="20"/>
-                <w:szCs w:val="20"/>
-              </w:rPr>
-              <w:t>7</w:t>
-            </w:r>
-          </w:p>
-        </w:tc>
-      </w:tr>
-      <w:tr>
-        <w:tc>
-          <w:tcPr>
-            <w:tcW w:w="7360" w:type="dxa"/>
-            <w:gridSpan w:val="2"/>
-            <w:tcBorders>
-              <w:top w:val="single" w:sz="1" w:space="0" w:color="AAAAAA"/>
-              <w:left w:val="single" w:sz="1" w:space="0" w:color="AAAAAA"/>
-              <w:bottom w:val="single" w:sz="1" w:space="0" w:color="AAAAAA"/>
-              <w:right w:val="single" w:sz="1" w:space="0" w:color="AAAAAA"/>
-            </w:tcBorders>
-            <w:shd w:val="clear" w:color="auto" w:fill="D5E8F0"/>
-            <w:tcMar>
-              <w:top w:w="80" w:type="dxa"/>
-              <w:left w:w="120" w:type="dxa"/>
-              <w:bottom w:w="80" w:type="dxa"/>
-              <w:right w:w="120" w:type="dxa"/>
-            </w:tcMar>
-          </w:tcPr>
-          <w:p>
-            <w:r>
-              <w:rPr>
-                <w:b/>
-                <w:bCs/>
-                <w:color w:val="1F3864"/>
-                <w:sz w:val="21"/>
-                <w:szCs w:val="21"/>
-              </w:rPr>
-              <w:t>End-to-End Verification, Screenshots &amp; Reflection</w:t>
-            </w:r>
-          </w:p>
-        </w:tc>
-        <w:tc>
-          <w:tcPr>
-            <w:tcW w:w="2000" w:type="dxa"/>
-            <w:tcBorders>
-              <w:top w:val="single" w:sz="1" w:space="0" w:color="AAAAAA"/>
-              <w:left w:val="single" w:sz="1" w:space="0" w:color="AAAAAA"/>
-              <w:bottom w:val="single" w:sz="1" w:space="0" w:color="AAAAAA"/>
-              <w:right w:val="single" w:sz="1" w:space="0" w:color="AAAAAA"/>
-            </w:tcBorders>
-            <w:shd w:val="clear" w:color="auto" w:fill="D5E8F0"/>
-            <w:tcMar>
-              <w:top w:w="80" w:type="dxa"/>
-              <w:left w:w="120" w:type="dxa"/>
-              <w:bottom w:w="80" w:type="dxa"/>
-              <w:right w:w="120" w:type="dxa"/>
-            </w:tcMar>
-          </w:tcPr>
-          <w:p>
-            <w:pPr>
-              <w:jc w:val="center"/>
-            </w:pPr>
-            <w:r>
-              <w:rPr>
-                <w:b/>
-                <w:bCs/>
-                <w:color w:val="1F3864"/>
-                <w:sz w:val="21"/>
-                <w:szCs w:val="21"/>
-              </w:rPr>
-              <w:t>10 Marks</w:t>
-            </w:r>
-          </w:p>
-        </w:tc>
-      </w:tr>
-      <w:tr>
-        <w:tc>
-          <w:tcPr>
-            <w:tcW w:w="500" w:type="dxa"/>
-            <w:tcBorders>
-              <w:top w:val="single" w:sz="1" w:space="0" w:color="AAAAAA"/>
-              <w:left w:val="single" w:sz="1" w:space="0" w:color="AAAAAA"/>
-              <w:bottom w:val="single" w:sz="1" w:space="0" w:color="AAAAAA"/>
-              <w:right w:val="single" w:sz="1" w:space="0" w:color="AAAAAA"/>
-            </w:tcBorders>
-            <w:shd w:val="clear" w:color="auto" w:fill="EBF3FA"/>
-            <w:tcMar>
-              <w:top w:w="80" w:type="dxa"/>
-              <w:left w:w="120" w:type="dxa"/>
-              <w:bottom w:w="80" w:type="dxa"/>
-              <w:right w:w="120" w:type="dxa"/>
-            </w:tcMar>
-            <w:vAlign w:val="center"/>
-          </w:tcPr>
-          <w:p>
-            <w:pPr>
-              <w:jc w:val="center"/>
-            </w:pPr>
-            <w:r>
-              <w:rPr>
-                <w:b/>
-                <w:bCs/>
-                <w:color w:val="000000"/>
-                <w:sz w:val="20"/>
-                <w:szCs w:val="20"/>
-              </w:rPr>
-              <w:t>16</w:t>
-            </w:r>
-          </w:p>
-        </w:tc>
-        <w:tc>
-          <w:tcPr>
-            <w:tcW w:w="6860" w:type="dxa"/>
-            <w:tcBorders>
-              <w:top w:val="single" w:sz="1" w:space="0" w:color="AAAAAA"/>
-              <w:left w:val="single" w:sz="1" w:space="0" w:color="AAAAAA"/>
-              <w:bottom w:val="single" w:sz="1" w:space="0" w:color="AAAAAA"/>
-              <w:right w:val="single" w:sz="1" w:space="0" w:color="AAAAAA"/>
-            </w:tcBorders>
-            <w:shd w:val="clear" w:color="auto" w:fill="EBF3FA"/>
-            <w:tcMar>
-              <w:top w:w="80" w:type="dxa"/>
-              <w:left w:w="120" w:type="dxa"/>
-              <w:bottom w:w="80" w:type="dxa"/>
-              <w:right w:w="120" w:type="dxa"/>
-            </w:tcMar>
-            <w:vAlign w:val="center"/>
-          </w:tcPr>
-          <w:p>
-            <w:r>
-              <w:rPr>
-                <w:color w:val="000000"/>
-                <w:sz w:val="20"/>
-                <w:szCs w:val="20"/>
-              </w:rPr>
-              <w:t>Screenshots: all six workflow runs (CI + CD per environment), Docker Hub image tags, three live Render service URLs with all pages accessible.</w:t>
-            </w:r>
-          </w:p>
-        </w:tc>
-        <w:tc>
-          <w:tcPr>
-            <w:tcW w:w="2000" w:type="dxa"/>
-            <w:tcBorders>
-              <w:top w:val="single" w:sz="1" w:space="0" w:color="AAAAAA"/>
-              <w:left w:val="single" w:sz="1" w:space="0" w:color="AAAAAA"/>
-              <w:bottom w:val="single" w:sz="1" w:space="0" w:color="AAAAAA"/>
-              <w:right w:val="single" w:sz="1" w:space="0" w:color="AAAAAA"/>
-            </w:tcBorders>
-            <w:shd w:val="clear" w:color="auto" w:fill="EBF3FA"/>
-            <w:tcMar>
-              <w:top w:w="80" w:type="dxa"/>
-              <w:left w:w="120" w:type="dxa"/>
-              <w:bottom w:w="80" w:type="dxa"/>
-              <w:right w:w="120" w:type="dxa"/>
-            </w:tcMar>
-            <w:vAlign w:val="center"/>
-          </w:tcPr>
-          <w:p>
-            <w:pPr>
-              <w:jc w:val="center"/>
-            </w:pPr>
-            <w:r>
-              <w:rPr>
-                <w:color w:val="000000"/>
-                <w:sz w:val="20"/>
-                <w:szCs w:val="20"/>
-              </w:rPr>
-              <w:t>5</w:t>
-            </w:r>
-          </w:p>
-        </w:tc>
-      </w:tr>
-      <w:tr>
-        <w:tc>
-          <w:tcPr>
-            <w:tcW w:w="500" w:type="dxa"/>
-            <w:tcBorders>
-              <w:top w:val="single" w:sz="1" w:space="0" w:color="AAAAAA"/>
-              <w:left w:val="single" w:sz="1" w:space="0" w:color="AAAAAA"/>
-              <w:bottom w:val="single" w:sz="1" w:space="0" w:color="AAAAAA"/>
-              <w:right w:val="single" w:sz="1" w:space="0" w:color="AAAAAA"/>
-            </w:tcBorders>
-            <w:shd w:val="clear" w:color="auto" w:fill="FFFFFF"/>
-            <w:tcMar>
-              <w:top w:w="80" w:type="dxa"/>
-              <w:left w:w="120" w:type="dxa"/>
-              <w:bottom w:w="80" w:type="dxa"/>
-              <w:right w:w="120" w:type="dxa"/>
-            </w:tcMar>
-            <w:vAlign w:val="center"/>
-          </w:tcPr>
-          <w:p>
-            <w:pPr>
-              <w:jc w:val="center"/>
-            </w:pPr>
-            <w:r>
-              <w:rPr>
-                <w:b/>
-                <w:bCs/>
-                <w:color w:val="000000"/>
-                <w:sz w:val="20"/>
-                <w:szCs w:val="20"/>
-              </w:rPr>
-              <w:t>17</w:t>
-            </w:r>
-          </w:p>
-        </w:tc>
-        <w:tc>
-          <w:tcPr>
-            <w:tcW w:w="6860" w:type="dxa"/>
-            <w:tcBorders>
-              <w:top w:val="single" w:sz="1" w:space="0" w:color="AAAAAA"/>
-              <w:left w:val="single" w:sz="1" w:space="0" w:color="AAAAAA"/>
-              <w:bottom w:val="single" w:sz="1" w:space="0" w:color="AAAAAA"/>
-              <w:right w:val="single" w:sz="1" w:space="0" w:color="AAAAAA"/>
-            </w:tcBorders>
-            <w:shd w:val="clear" w:color="auto" w:fill="FFFFFF"/>
-            <w:tcMar>
-              <w:top w:w="80" w:type="dxa"/>
-              <w:left w:w="120" w:type="dxa"/>
-              <w:bottom w:w="80" w:type="dxa"/>
-              <w:right w:w="120" w:type="dxa"/>
-            </w:tcMar>
-            <w:vAlign w:val="center"/>
-          </w:tcPr>
-          <w:p>
-            <w:r>
-              <w:rPr>
-                <w:color w:val="000000"/>
-                <w:sz w:val="20"/>
-                <w:szCs w:val="20"/>
-              </w:rPr>
-              <w:t xml:space="preserve">Individual reflection (4–5 lines per </w:t>
-            </w:r>
-            <w:r>
-              <w:rPr>
-                <w:color w:val="000000"/>
-                <w:sz w:val="20"/>
-                <w:szCs w:val="20"/>
-              </w:rPr>
-              <w:t>member) on multi-environment CI/CD and their experience authoring a workflow file and an HTML page.</w:t>
+              <w:t>Individual reflection (4–5 lines per member) on multi-environment CI/CD and their experience authoring a workflow file and an HTML page.</w:t>
             </w:r>
           </w:p>
         </w:tc>
@@ -13303,13 +12671,7 @@
         <w:rPr>
           <w:color w:val="000000"/>
         </w:rPr>
-        <w:t xml:space="preserve">Completed Term Project document with all group details </w:t>
-      </w:r>
-      <w:r>
-        <w:rPr>
-          <w:color w:val="000000"/>
-        </w:rPr>
-        <w:t>filled in (Table 1), including each member's Assigned Workflow File and Assigned Page.</w:t>
+        <w:t>Completed Term Project document with all group details filled in (Table 1), including each member's Assigned Workflow File and Assigned Page.</w:t>
       </w:r>
     </w:p>
     <w:p>
@@ -13357,13 +12719,7 @@
         <w:rPr>
           <w:color w:val="000000"/>
         </w:rPr>
-        <w:t xml:space="preserve">Screenshot 1: GitHub </w:t>
-      </w:r>
-      <w:r>
-        <w:rPr>
-          <w:color w:val="000000"/>
-        </w:rPr>
-        <w:t>repository showing all three GitHub Environments (development, staging, production) with their respective secrets configured.</w:t>
+        <w:t>Screenshot 1: GitHub repository showing all three GitHub Environments (development, staging, production) with their respective secrets configured.</w:t>
       </w:r>
     </w:p>
     <w:p>
@@ -13379,13 +12735,7 @@
         <w:rPr>
           <w:color w:val="000000"/>
         </w:rPr>
-        <w:t>Screenshot 2: Each member's CI workflow run (ci-dev.yml) triggered by their individual PR – all steps green. One screenshot per me</w:t>
-      </w:r>
-      <w:r>
-        <w:rPr>
-          <w:color w:val="000000"/>
-        </w:rPr>
-        <w:t>mber or a combined view showing all members' runs.</w:t>
+        <w:t>Screenshot 2: Each member's CI workflow run (ci-dev.yml) triggered by their individual PR – all steps green. One screenshot per member or a combined view showing all members' runs.</w:t>
       </w:r>
     </w:p>
     <w:p>
@@ -13417,13 +12767,7 @@
         <w:rPr>
           <w:color w:val="000000"/>
         </w:rPr>
-        <w:t xml:space="preserve">Screenshot 4: All three </w:t>
-      </w:r>
-      <w:r>
-        <w:rPr>
-          <w:color w:val="000000"/>
-        </w:rPr>
-        <w:t>CD workflow runs (cd-dev.yml, cd-staging.yml, cd-prod.yml) – deploy step completed and confirmation echo visible.</w:t>
+        <w:t>Screenshot 4: All three CD workflow runs (cd-dev.yml, cd-staging.yml, cd-prod.yml) – deploy step completed and confirmation echo visible.</w:t>
       </w:r>
     </w:p>
     <w:p>
@@ -13439,13 +12783,7 @@
         <w:rPr>
           <w:color w:val="000000"/>
         </w:rPr>
-        <w:t xml:space="preserve">Screenshot 5: Live PakVista site on each of the three Render services showing all five pages are accessible (three screenshots total, one per </w:t>
-      </w:r>
-      <w:r>
-        <w:rPr>
-          <w:color w:val="000000"/>
-        </w:rPr>
-        <w:t>environment).</w:t>
+        <w:t>Screenshot 5: Live PakVista site on each of the three Render services showing all five pages are accessible (three screenshots total, one per environment).</w:t>
       </w:r>
     </w:p>
     <w:p>
@@ -13477,13 +12815,8 @@
         <w:rPr>
           <w:color w:val="000000"/>
         </w:rPr>
-        <w:t xml:space="preserve">Individual Reflection: Each team member must write 4–5 lines on what they learnt and any challenges they faced, especially regarding authoring a GitHub </w:t>
-      </w:r>
-      <w:r>
-        <w:rPr>
-          <w:color w:val="000000"/>
-        </w:rPr>
-        <w:t>Actions workflow file and building their HTML page.</w:t>
+        <w:lastRenderedPageBreak/>
+        <w:t>Individual Reflection: Each team member must write 4–5 lines on what they learnt and any challenges they faced, especially regarding authoring a GitHub Actions workflow file and building their HTML page.</w:t>
       </w:r>
     </w:p>
     <w:p/>
@@ -13626,17 +12959,7 @@
                 <w:sz w:val="20"/>
                 <w:szCs w:val="20"/>
               </w:rPr>
-              <w:t xml:space="preserve">GitHub Environments (development, staging, production) </w:t>
-            </w:r>
-            <w:r>
-              <w:rPr>
-                <w:b/>
-                <w:bCs/>
-                <w:color w:val="000000"/>
-                <w:sz w:val="20"/>
-                <w:szCs w:val="20"/>
-              </w:rPr>
-              <w:t>&amp; All Secrets</w:t>
+              <w:t>GitHub Environments (development, staging, production) &amp; All Secrets</w:t>
             </w:r>
           </w:p>
         </w:tc>
@@ -13825,17 +13148,7 @@
                 <w:sz w:val="20"/>
                 <w:szCs w:val="20"/>
               </w:rPr>
-              <w:t xml:space="preserve">CD Workflow </w:t>
-            </w:r>
-            <w:r>
-              <w:rPr>
-                <w:b/>
-                <w:bCs/>
-                <w:color w:val="000000"/>
-                <w:sz w:val="20"/>
-                <w:szCs w:val="20"/>
-              </w:rPr>
-              <w:t>Runs – All three environments triggered by push events</w:t>
+              <w:t>CD Workflow Runs – All three environments triggered by push events</w:t>
             </w:r>
           </w:p>
         </w:tc>
@@ -13991,8 +13304,61 @@
                 <w:sz w:val="20"/>
                 <w:szCs w:val="20"/>
               </w:rPr>
-              <w:t xml:space="preserve">[Paste screenshot </w:t>
-            </w:r>
+              <w:t>[Paste screenshot here]</w:t>
+            </w:r>
+          </w:p>
+        </w:tc>
+      </w:tr>
+      <w:tr>
+        <w:tc>
+          <w:tcPr>
+            <w:tcW w:w="3200" w:type="dxa"/>
+            <w:tcBorders>
+              <w:top w:val="single" w:sz="1" w:space="0" w:color="AAAAAA"/>
+              <w:left w:val="single" w:sz="1" w:space="0" w:color="AAAAAA"/>
+              <w:bottom w:val="single" w:sz="1" w:space="0" w:color="AAAAAA"/>
+              <w:right w:val="single" w:sz="1" w:space="0" w:color="AAAAAA"/>
+            </w:tcBorders>
+            <w:shd w:val="clear" w:color="auto" w:fill="EBF3FA"/>
+            <w:tcMar>
+              <w:top w:w="80" w:type="dxa"/>
+              <w:left w:w="120" w:type="dxa"/>
+              <w:bottom w:w="80" w:type="dxa"/>
+              <w:right w:w="120" w:type="dxa"/>
+            </w:tcMar>
+            <w:vAlign w:val="center"/>
+          </w:tcPr>
+          <w:p>
+            <w:r>
+              <w:rPr>
+                <w:b/>
+                <w:bCs/>
+                <w:color w:val="000000"/>
+                <w:sz w:val="20"/>
+                <w:szCs w:val="20"/>
+              </w:rPr>
+              <w:t>Live PakVista – Production Render Service (all 5 pages accessible)</w:t>
+            </w:r>
+          </w:p>
+        </w:tc>
+        <w:tc>
+          <w:tcPr>
+            <w:tcW w:w="6160" w:type="dxa"/>
+            <w:tcBorders>
+              <w:top w:val="single" w:sz="1" w:space="0" w:color="AAAAAA"/>
+              <w:left w:val="single" w:sz="1" w:space="0" w:color="AAAAAA"/>
+              <w:bottom w:val="single" w:sz="1" w:space="0" w:color="AAAAAA"/>
+              <w:right w:val="single" w:sz="1" w:space="0" w:color="AAAAAA"/>
+            </w:tcBorders>
+            <w:shd w:val="clear" w:color="auto" w:fill="EBF3FA"/>
+            <w:tcMar>
+              <w:top w:w="80" w:type="dxa"/>
+              <w:left w:w="120" w:type="dxa"/>
+              <w:bottom w:w="80" w:type="dxa"/>
+              <w:right w:w="120" w:type="dxa"/>
+            </w:tcMar>
+          </w:tcPr>
+          <w:p>
             <w:r>
               <w:rPr>
                 <w:i/>
@@ -14001,7 +13367,7 @@
                 <w:sz w:val="20"/>
                 <w:szCs w:val="20"/>
               </w:rPr>
-              <w:t>here]</w:t>
+              <w:t>[Paste screenshot here]</w:t>
             </w:r>
           </w:p>
         </w:tc>
@@ -14016,26 +13382,25 @@
               <w:bottom w:val="single" w:sz="1" w:space="0" w:color="AAAAAA"/>
               <w:right w:val="single" w:sz="1" w:space="0" w:color="AAAAAA"/>
             </w:tcBorders>
-            <w:shd w:val="clear" w:color="auto" w:fill="EBF3FA"/>
-            <w:tcMar>
-              <w:top w:w="80" w:type="dxa"/>
-              <w:left w:w="120" w:type="dxa"/>
-              <w:bottom w:w="80" w:type="dxa"/>
-              <w:right w:w="120" w:type="dxa"/>
-            </w:tcMar>
-            <w:vAlign w:val="center"/>
-          </w:tcPr>
-          <w:p>
-            <w:r>
-              <w:rPr>
-                <w:b/>
-                <w:bCs/>
-                <w:color w:val="000000"/>
-                <w:sz w:val="20"/>
-                <w:szCs w:val="20"/>
-              </w:rPr>
-              <w:lastRenderedPageBreak/>
-              <w:t>Live PakVista – Production Render Service (all 5 pages accessible)</w:t>
+            <w:shd w:val="clear" w:color="auto" w:fill="FFFFFF"/>
+            <w:tcMar>
+              <w:top w:w="80" w:type="dxa"/>
+              <w:left w:w="120" w:type="dxa"/>
+              <w:bottom w:w="80" w:type="dxa"/>
+              <w:right w:w="120" w:type="dxa"/>
+            </w:tcMar>
+            <w:vAlign w:val="center"/>
+          </w:tcPr>
+          <w:p>
+            <w:r>
+              <w:rPr>
+                <w:b/>
+                <w:bCs/>
+                <w:color w:val="000000"/>
+                <w:sz w:val="20"/>
+                <w:szCs w:val="20"/>
+              </w:rPr>
+              <w:t>Term Project .docx visible in GitHub Repository file listing</w:t>
             </w:r>
           </w:p>
         </w:tc>
@@ -14048,7 +13413,7 @@
               <w:bottom w:val="single" w:sz="1" w:space="0" w:color="AAAAAA"/>
               <w:right w:val="single" w:sz="1" w:space="0" w:color="AAAAAA"/>
             </w:tcBorders>
-            <w:shd w:val="clear" w:color="auto" w:fill="EBF3FA"/>
+            <w:shd w:val="clear" w:color="auto" w:fill="FFFFFF"/>
             <w:tcMar>
               <w:top w:w="80" w:type="dxa"/>
               <w:left w:w="120" w:type="dxa"/>
@@ -14070,69 +13435,6 @@
           </w:p>
         </w:tc>
       </w:tr>
-      <w:tr>
-        <w:tc>
-          <w:tcPr>
-            <w:tcW w:w="3200" w:type="dxa"/>
-            <w:tcBorders>
-              <w:top w:val="single" w:sz="1" w:space="0" w:color="AAAAAA"/>
-              <w:left w:val="single" w:sz="1" w:space="0" w:color="AAAAAA"/>
-              <w:bottom w:val="single" w:sz="1" w:space="0" w:color="AAAAAA"/>
-              <w:right w:val="single" w:sz="1" w:space="0" w:color="AAAAAA"/>
-            </w:tcBorders>
-            <w:shd w:val="clear" w:color="auto" w:fill="FFFFFF"/>
-            <w:tcMar>
-              <w:top w:w="80" w:type="dxa"/>
-              <w:left w:w="120" w:type="dxa"/>
-              <w:bottom w:w="80" w:type="dxa"/>
-              <w:right w:w="120" w:type="dxa"/>
-            </w:tcMar>
-            <w:vAlign w:val="center"/>
-          </w:tcPr>
-          <w:p>
-            <w:r>
-              <w:rPr>
-                <w:b/>
-                <w:bCs/>
-                <w:color w:val="000000"/>
-                <w:sz w:val="20"/>
-                <w:szCs w:val="20"/>
-              </w:rPr>
-              <w:t>Term Project .docx visible in GitHub Repository file listing</w:t>
-            </w:r>
-          </w:p>
-        </w:tc>
-        <w:tc>
-          <w:tcPr>
-            <w:tcW w:w="6160" w:type="dxa"/>
-            <w:tcBorders>
-              <w:top w:val="single" w:sz="1" w:space="0" w:color="AAAAAA"/>
-              <w:left w:val="single" w:sz="1" w:space="0" w:color="AAAAAA"/>
-              <w:bottom w:val="single" w:sz="1" w:space="0" w:color="AAAAAA"/>
-              <w:right w:val="single" w:sz="1" w:space="0" w:color="AAAAAA"/>
-            </w:tcBorders>
-            <w:shd w:val="clear" w:color="auto" w:fill="FFFFFF"/>
-            <w:tcMar>
-              <w:top w:w="80" w:type="dxa"/>
-              <w:left w:w="120" w:type="dxa"/>
-              <w:bottom w:w="80" w:type="dxa"/>
-              <w:right w:w="120" w:type="dxa"/>
-            </w:tcMar>
-          </w:tcPr>
-          <w:p>
-            <w:r>
-              <w:rPr>
-                <w:i/>
-                <w:iCs/>
-                <w:color w:val="595959"/>
-                <w:sz w:val="20"/>
-                <w:szCs w:val="20"/>
-              </w:rPr>
-              <w:t>[Paste screenshot here]</w:t>
-            </w:r>
-          </w:p>
-        </w:tc>
-      </w:tr>
     </w:tbl>
     <w:p/>
     <w:p>
@@ -14151,13 +13453,14 @@
         <w:rPr>
           <w:color w:val="000000"/>
         </w:rPr>
-        <w:t xml:space="preserve">Each team member must write 4–5 lines below </w:t>
+        <w:t xml:space="preserve">Each team member must write 4–5 lines below describing what they learnt during this Term Project, any challenges they encountered while authoring </w:t>
       </w:r>
       <w:r>
         <w:rPr>
           <w:color w:val="000000"/>
         </w:rPr>
-        <w:t>describing what they learnt during this Term Project, any challenges they encountered while authoring their workflow file and building their HTML page, and how they resolved those challenges.</w:t>
+        <w:lastRenderedPageBreak/>
+        <w:t>their workflow file and building their HTML page, and how they resolved those challenges.</w:t>
       </w:r>
     </w:p>
     <w:p/>
@@ -14187,15 +13490,7 @@
           <w:iCs/>
           <w:color w:val="595959"/>
         </w:rPr>
-        <w:t>[Write your 4–5 line refl</w:t>
-      </w:r>
-      <w:r>
-        <w:rPr>
-          <w:i/>
-          <w:iCs/>
-          <w:color w:val="595959"/>
-        </w:rPr>
-        <w:t>ection here]</w:t>
+        <w:t>[Write your 4–5 line reflection here]</w:t>
       </w:r>
     </w:p>
     <w:p/>
@@ -14299,15 +13594,7 @@
           <w:bCs/>
           <w:color w:val="2E75B6"/>
         </w:rPr>
-        <w:t xml:space="preserve">Member 5: </w:t>
-      </w:r>
-      <w:r>
-        <w:rPr>
-          <w:b/>
-          <w:bCs/>
-          <w:color w:val="2E75B6"/>
-        </w:rPr>
-        <w:t>[Student Name] – Reflection</w:t>
+        <w:t>Member 5: [Student Name] – Reflection</w:t>
       </w:r>
     </w:p>
     <w:p>
@@ -14349,13 +13636,7 @@
         <w:rPr>
           <w:color w:val="000000"/>
         </w:rPr>
-        <w:t>All technical work must align with the official documentation listed below. Students are expected to consult these resources while building their workflow</w:t>
-      </w:r>
-      <w:r>
-        <w:rPr>
-          <w:color w:val="000000"/>
-        </w:rPr>
-        <w:t xml:space="preserve"> files, Dockerfile, and HTML pages.</w:t>
+        <w:t>All technical work must align with the official documentation listed below. Students are expected to consult these resources while building their workflow files, Dockerfile, and HTML pages.</w:t>
       </w:r>
     </w:p>
     <w:p/>
@@ -14631,8 +13912,61 @@
                 <w:sz w:val="18"/>
                 <w:szCs w:val="18"/>
               </w:rPr>
-              <w:t>https://docs.github.com/en/actions/writing-workflows/choosing-what-your-workflow-does</w:t>
-            </w:r>
+              <w:t>https://docs.github.com/en/actions/writing-workflows/choosing-what-your-workflow-does/accessing-contextual-information-about-workflow-runs</w:t>
+            </w:r>
+          </w:p>
+        </w:tc>
+      </w:tr>
+      <w:tr>
+        <w:tc>
+          <w:tcPr>
+            <w:tcW w:w="3400" w:type="dxa"/>
+            <w:tcBorders>
+              <w:top w:val="single" w:sz="1" w:space="0" w:color="AAAAAA"/>
+              <w:left w:val="single" w:sz="1" w:space="0" w:color="AAAAAA"/>
+              <w:bottom w:val="single" w:sz="1" w:space="0" w:color="AAAAAA"/>
+              <w:right w:val="single" w:sz="1" w:space="0" w:color="AAAAAA"/>
+            </w:tcBorders>
+            <w:shd w:val="clear" w:color="auto" w:fill="FFFFFF"/>
+            <w:tcMar>
+              <w:top w:w="80" w:type="dxa"/>
+              <w:left w:w="120" w:type="dxa"/>
+              <w:bottom w:w="80" w:type="dxa"/>
+              <w:right w:w="120" w:type="dxa"/>
+            </w:tcMar>
+            <w:vAlign w:val="center"/>
+          </w:tcPr>
+          <w:p>
+            <w:r>
+              <w:rPr>
+                <w:b/>
+                <w:bCs/>
+                <w:color w:val="000000"/>
+                <w:sz w:val="20"/>
+                <w:szCs w:val="20"/>
+              </w:rPr>
+              <w:t>GitHub Actions – Encrypted Secrets</w:t>
+            </w:r>
+          </w:p>
+        </w:tc>
+        <w:tc>
+          <w:tcPr>
+            <w:tcW w:w="5960" w:type="dxa"/>
+            <w:tcBorders>
+              <w:top w:val="single" w:sz="1" w:space="0" w:color="AAAAAA"/>
+              <w:left w:val="single" w:sz="1" w:space="0" w:color="AAAAAA"/>
+              <w:bottom w:val="single" w:sz="1" w:space="0" w:color="AAAAAA"/>
+              <w:right w:val="single" w:sz="1" w:space="0" w:color="AAAAAA"/>
+            </w:tcBorders>
+            <w:shd w:val="clear" w:color="auto" w:fill="FFFFFF"/>
+            <w:tcMar>
+              <w:top w:w="80" w:type="dxa"/>
+              <w:left w:w="120" w:type="dxa"/>
+              <w:bottom w:w="80" w:type="dxa"/>
+              <w:right w:w="120" w:type="dxa"/>
+            </w:tcMar>
+          </w:tcPr>
+          <w:p>
             <w:r>
               <w:rPr>
                 <w:rFonts w:ascii="Courier New" w:eastAsia="Courier New" w:hAnsi="Courier New" w:cs="Courier New"/>
@@ -14640,7 +13974,7 @@
                 <w:sz w:val="18"/>
                 <w:szCs w:val="18"/>
               </w:rPr>
-              <w:t>/accessing-contextual-information-about-workflow-runs</w:t>
+              <w:t>https://docs.github.com/en/actions/security-guides/encrypted-secrets</w:t>
             </w:r>
           </w:p>
         </w:tc>
@@ -14655,25 +13989,25 @@
               <w:bottom w:val="single" w:sz="1" w:space="0" w:color="AAAAAA"/>
               <w:right w:val="single" w:sz="1" w:space="0" w:color="AAAAAA"/>
             </w:tcBorders>
-            <w:shd w:val="clear" w:color="auto" w:fill="FFFFFF"/>
-            <w:tcMar>
-              <w:top w:w="80" w:type="dxa"/>
-              <w:left w:w="120" w:type="dxa"/>
-              <w:bottom w:w="80" w:type="dxa"/>
-              <w:right w:w="120" w:type="dxa"/>
-            </w:tcMar>
-            <w:vAlign w:val="center"/>
-          </w:tcPr>
-          <w:p>
-            <w:r>
-              <w:rPr>
-                <w:b/>
-                <w:bCs/>
-                <w:color w:val="000000"/>
-                <w:sz w:val="20"/>
-                <w:szCs w:val="20"/>
-              </w:rPr>
-              <w:t>GitHub Actions – Encrypted Secrets</w:t>
+            <w:shd w:val="clear" w:color="auto" w:fill="EBF3FA"/>
+            <w:tcMar>
+              <w:top w:w="80" w:type="dxa"/>
+              <w:left w:w="120" w:type="dxa"/>
+              <w:bottom w:w="80" w:type="dxa"/>
+              <w:right w:w="120" w:type="dxa"/>
+            </w:tcMar>
+            <w:vAlign w:val="center"/>
+          </w:tcPr>
+          <w:p>
+            <w:r>
+              <w:rPr>
+                <w:b/>
+                <w:bCs/>
+                <w:color w:val="000000"/>
+                <w:sz w:val="20"/>
+                <w:szCs w:val="20"/>
+              </w:rPr>
+              <w:t>GitHub Actions – Environments for Deployment</w:t>
             </w:r>
           </w:p>
         </w:tc>
@@ -14686,7 +14020,7 @@
               <w:bottom w:val="single" w:sz="1" w:space="0" w:color="AAAAAA"/>
               <w:right w:val="single" w:sz="1" w:space="0" w:color="AAAAAA"/>
             </w:tcBorders>
-            <w:shd w:val="clear" w:color="auto" w:fill="FFFFFF"/>
+            <w:shd w:val="clear" w:color="auto" w:fill="EBF3FA"/>
             <w:tcMar>
               <w:top w:w="80" w:type="dxa"/>
               <w:left w:w="120" w:type="dxa"/>
@@ -14702,7 +14036,7 @@
                 <w:sz w:val="18"/>
                 <w:szCs w:val="18"/>
               </w:rPr>
-              <w:t>https://docs.github.com/en/actions/security-guides/encrypted-secrets</w:t>
+              <w:t>https://docs.github.com/en/actions/deployment/targeting-different-environments/using-environments-for-deployment</w:t>
             </w:r>
           </w:p>
         </w:tc>
@@ -14717,25 +14051,25 @@
               <w:bottom w:val="single" w:sz="1" w:space="0" w:color="AAAAAA"/>
               <w:right w:val="single" w:sz="1" w:space="0" w:color="AAAAAA"/>
             </w:tcBorders>
-            <w:shd w:val="clear" w:color="auto" w:fill="EBF3FA"/>
-            <w:tcMar>
-              <w:top w:w="80" w:type="dxa"/>
-              <w:left w:w="120" w:type="dxa"/>
-              <w:bottom w:w="80" w:type="dxa"/>
-              <w:right w:w="120" w:type="dxa"/>
-            </w:tcMar>
-            <w:vAlign w:val="center"/>
-          </w:tcPr>
-          <w:p>
-            <w:r>
-              <w:rPr>
-                <w:b/>
-                <w:bCs/>
-                <w:color w:val="000000"/>
-                <w:sz w:val="20"/>
-                <w:szCs w:val="20"/>
-              </w:rPr>
-              <w:t>GitHub Actions – Environments for Deployment</w:t>
+            <w:shd w:val="clear" w:color="auto" w:fill="FFFFFF"/>
+            <w:tcMar>
+              <w:top w:w="80" w:type="dxa"/>
+              <w:left w:w="120" w:type="dxa"/>
+              <w:bottom w:w="80" w:type="dxa"/>
+              <w:right w:w="120" w:type="dxa"/>
+            </w:tcMar>
+            <w:vAlign w:val="center"/>
+          </w:tcPr>
+          <w:p>
+            <w:r>
+              <w:rPr>
+                <w:b/>
+                <w:bCs/>
+                <w:color w:val="000000"/>
+                <w:sz w:val="20"/>
+                <w:szCs w:val="20"/>
+              </w:rPr>
+              <w:t>GitHub Actions – Branch Protection Rules</w:t>
             </w:r>
           </w:p>
         </w:tc>
@@ -14748,7 +14082,7 @@
               <w:bottom w:val="single" w:sz="1" w:space="0" w:color="AAAAAA"/>
               <w:right w:val="single" w:sz="1" w:space="0" w:color="AAAAAA"/>
             </w:tcBorders>
-            <w:shd w:val="clear" w:color="auto" w:fill="EBF3FA"/>
+            <w:shd w:val="clear" w:color="auto" w:fill="FFFFFF"/>
             <w:tcMar>
               <w:top w:w="80" w:type="dxa"/>
               <w:left w:w="120" w:type="dxa"/>
@@ -14764,7 +14098,7 @@
                 <w:sz w:val="18"/>
                 <w:szCs w:val="18"/>
               </w:rPr>
-              <w:t>https://docs.github.com/en/actions/deployment/targeting-different-environments/using-environments-for-deployment</w:t>
+              <w:t>https://docs.github.com/en/repositories/configuring-branches-and-merges-in-your-repository/managing-protected-branches/about-protected-branches</w:t>
             </w:r>
           </w:p>
         </w:tc>
@@ -14779,25 +14113,25 @@
               <w:bottom w:val="single" w:sz="1" w:space="0" w:color="AAAAAA"/>
               <w:right w:val="single" w:sz="1" w:space="0" w:color="AAAAAA"/>
             </w:tcBorders>
-            <w:shd w:val="clear" w:color="auto" w:fill="FFFFFF"/>
-            <w:tcMar>
-              <w:top w:w="80" w:type="dxa"/>
-              <w:left w:w="120" w:type="dxa"/>
-              <w:bottom w:w="80" w:type="dxa"/>
-              <w:right w:w="120" w:type="dxa"/>
-            </w:tcMar>
-            <w:vAlign w:val="center"/>
-          </w:tcPr>
-          <w:p>
-            <w:r>
-              <w:rPr>
-                <w:b/>
-                <w:bCs/>
-                <w:color w:val="000000"/>
-                <w:sz w:val="20"/>
-                <w:szCs w:val="20"/>
-              </w:rPr>
-              <w:t>GitHub Actions – Branch Protection Rules</w:t>
+            <w:shd w:val="clear" w:color="auto" w:fill="EBF3FA"/>
+            <w:tcMar>
+              <w:top w:w="80" w:type="dxa"/>
+              <w:left w:w="120" w:type="dxa"/>
+              <w:bottom w:w="80" w:type="dxa"/>
+              <w:right w:w="120" w:type="dxa"/>
+            </w:tcMar>
+            <w:vAlign w:val="center"/>
+          </w:tcPr>
+          <w:p>
+            <w:r>
+              <w:rPr>
+                <w:b/>
+                <w:bCs/>
+                <w:color w:val="000000"/>
+                <w:sz w:val="20"/>
+                <w:szCs w:val="20"/>
+              </w:rPr>
+              <w:t>actions/checkout@v4 (Official Action)</w:t>
             </w:r>
           </w:p>
         </w:tc>
@@ -14810,7 +14144,7 @@
               <w:bottom w:val="single" w:sz="1" w:space="0" w:color="AAAAAA"/>
               <w:right w:val="single" w:sz="1" w:space="0" w:color="AAAAAA"/>
             </w:tcBorders>
-            <w:shd w:val="clear" w:color="auto" w:fill="FFFFFF"/>
+            <w:shd w:val="clear" w:color="auto" w:fill="EBF3FA"/>
             <w:tcMar>
               <w:top w:w="80" w:type="dxa"/>
               <w:left w:w="120" w:type="dxa"/>
@@ -14826,7 +14160,7 @@
                 <w:sz w:val="18"/>
                 <w:szCs w:val="18"/>
               </w:rPr>
-              <w:t>https://docs.github.com/en/repositories/configuring-branches-and-merges-in-your-repository/managing-protected-branches/about-protected-branches</w:t>
+              <w:t>https://github.com/actions/checkout</w:t>
             </w:r>
           </w:p>
         </w:tc>
@@ -14841,25 +14175,25 @@
               <w:bottom w:val="single" w:sz="1" w:space="0" w:color="AAAAAA"/>
               <w:right w:val="single" w:sz="1" w:space="0" w:color="AAAAAA"/>
             </w:tcBorders>
-            <w:shd w:val="clear" w:color="auto" w:fill="EBF3FA"/>
-            <w:tcMar>
-              <w:top w:w="80" w:type="dxa"/>
-              <w:left w:w="120" w:type="dxa"/>
-              <w:bottom w:w="80" w:type="dxa"/>
-              <w:right w:w="120" w:type="dxa"/>
-            </w:tcMar>
-            <w:vAlign w:val="center"/>
-          </w:tcPr>
-          <w:p>
-            <w:r>
-              <w:rPr>
-                <w:b/>
-                <w:bCs/>
-                <w:color w:val="000000"/>
-                <w:sz w:val="20"/>
-                <w:szCs w:val="20"/>
-              </w:rPr>
-              <w:t>actions/checkout@v4 (Official Action)</w:t>
+            <w:shd w:val="clear" w:color="auto" w:fill="FFFFFF"/>
+            <w:tcMar>
+              <w:top w:w="80" w:type="dxa"/>
+              <w:left w:w="120" w:type="dxa"/>
+              <w:bottom w:w="80" w:type="dxa"/>
+              <w:right w:w="120" w:type="dxa"/>
+            </w:tcMar>
+            <w:vAlign w:val="center"/>
+          </w:tcPr>
+          <w:p>
+            <w:r>
+              <w:rPr>
+                <w:b/>
+                <w:bCs/>
+                <w:color w:val="000000"/>
+                <w:sz w:val="20"/>
+                <w:szCs w:val="20"/>
+              </w:rPr>
+              <w:t>docker/login-action@v3 (Official Docker Action)</w:t>
             </w:r>
           </w:p>
         </w:tc>
@@ -14872,7 +14206,7 @@
               <w:bottom w:val="single" w:sz="1" w:space="0" w:color="AAAAAA"/>
               <w:right w:val="single" w:sz="1" w:space="0" w:color="AAAAAA"/>
             </w:tcBorders>
-            <w:shd w:val="clear" w:color="auto" w:fill="EBF3FA"/>
+            <w:shd w:val="clear" w:color="auto" w:fill="FFFFFF"/>
             <w:tcMar>
               <w:top w:w="80" w:type="dxa"/>
               <w:left w:w="120" w:type="dxa"/>
@@ -14888,7 +14222,7 @@
                 <w:sz w:val="18"/>
                 <w:szCs w:val="18"/>
               </w:rPr>
-              <w:t>https://github.com/actions/checkout</w:t>
+              <w:t>https://github.com/docker/login-action</w:t>
             </w:r>
           </w:p>
         </w:tc>
@@ -14903,35 +14237,25 @@
               <w:bottom w:val="single" w:sz="1" w:space="0" w:color="AAAAAA"/>
               <w:right w:val="single" w:sz="1" w:space="0" w:color="AAAAAA"/>
             </w:tcBorders>
-            <w:shd w:val="clear" w:color="auto" w:fill="FFFFFF"/>
-            <w:tcMar>
-              <w:top w:w="80" w:type="dxa"/>
-              <w:left w:w="120" w:type="dxa"/>
-              <w:bottom w:w="80" w:type="dxa"/>
-              <w:right w:w="120" w:type="dxa"/>
-            </w:tcMar>
-            <w:vAlign w:val="center"/>
-          </w:tcPr>
-          <w:p>
-            <w:r>
-              <w:rPr>
-                <w:b/>
-                <w:bCs/>
-                <w:color w:val="000000"/>
-                <w:sz w:val="20"/>
-                <w:szCs w:val="20"/>
-              </w:rPr>
-              <w:t xml:space="preserve">docker/login-action@v3 (Official </w:t>
-            </w:r>
-            <w:r>
-              <w:rPr>
-                <w:b/>
-                <w:bCs/>
-                <w:color w:val="000000"/>
-                <w:sz w:val="20"/>
-                <w:szCs w:val="20"/>
-              </w:rPr>
-              <w:t>Docker Action)</w:t>
+            <w:shd w:val="clear" w:color="auto" w:fill="EBF3FA"/>
+            <w:tcMar>
+              <w:top w:w="80" w:type="dxa"/>
+              <w:left w:w="120" w:type="dxa"/>
+              <w:bottom w:w="80" w:type="dxa"/>
+              <w:right w:w="120" w:type="dxa"/>
+            </w:tcMar>
+            <w:vAlign w:val="center"/>
+          </w:tcPr>
+          <w:p>
+            <w:r>
+              <w:rPr>
+                <w:b/>
+                <w:bCs/>
+                <w:color w:val="000000"/>
+                <w:sz w:val="20"/>
+                <w:szCs w:val="20"/>
+              </w:rPr>
+              <w:t>docker/build-push-action@v5 (Official Docker Action)</w:t>
             </w:r>
           </w:p>
         </w:tc>
@@ -14944,7 +14268,7 @@
               <w:bottom w:val="single" w:sz="1" w:space="0" w:color="AAAAAA"/>
               <w:right w:val="single" w:sz="1" w:space="0" w:color="AAAAAA"/>
             </w:tcBorders>
-            <w:shd w:val="clear" w:color="auto" w:fill="FFFFFF"/>
+            <w:shd w:val="clear" w:color="auto" w:fill="EBF3FA"/>
             <w:tcMar>
               <w:top w:w="80" w:type="dxa"/>
               <w:left w:w="120" w:type="dxa"/>
@@ -14960,7 +14284,7 @@
                 <w:sz w:val="18"/>
                 <w:szCs w:val="18"/>
               </w:rPr>
-              <w:t>https://github.com/docker/login-action</w:t>
+              <w:t>https://github.com/docker/build-push-action</w:t>
             </w:r>
           </w:p>
         </w:tc>
@@ -14975,25 +14299,25 @@
               <w:bottom w:val="single" w:sz="1" w:space="0" w:color="AAAAAA"/>
               <w:right w:val="single" w:sz="1" w:space="0" w:color="AAAAAA"/>
             </w:tcBorders>
-            <w:shd w:val="clear" w:color="auto" w:fill="EBF3FA"/>
-            <w:tcMar>
-              <w:top w:w="80" w:type="dxa"/>
-              <w:left w:w="120" w:type="dxa"/>
-              <w:bottom w:w="80" w:type="dxa"/>
-              <w:right w:w="120" w:type="dxa"/>
-            </w:tcMar>
-            <w:vAlign w:val="center"/>
-          </w:tcPr>
-          <w:p>
-            <w:r>
-              <w:rPr>
-                <w:b/>
-                <w:bCs/>
-                <w:color w:val="000000"/>
-                <w:sz w:val="20"/>
-                <w:szCs w:val="20"/>
-              </w:rPr>
-              <w:t>docker/build-push-action@v5 (Official Docker Action)</w:t>
+            <w:shd w:val="clear" w:color="auto" w:fill="FFFFFF"/>
+            <w:tcMar>
+              <w:top w:w="80" w:type="dxa"/>
+              <w:left w:w="120" w:type="dxa"/>
+              <w:bottom w:w="80" w:type="dxa"/>
+              <w:right w:w="120" w:type="dxa"/>
+            </w:tcMar>
+            <w:vAlign w:val="center"/>
+          </w:tcPr>
+          <w:p>
+            <w:r>
+              <w:rPr>
+                <w:b/>
+                <w:bCs/>
+                <w:color w:val="000000"/>
+                <w:sz w:val="20"/>
+                <w:szCs w:val="20"/>
+              </w:rPr>
+              <w:t>docker/metadata-action@v5 (Official Docker Action)</w:t>
             </w:r>
           </w:p>
         </w:tc>
@@ -15006,7 +14330,7 @@
               <w:bottom w:val="single" w:sz="1" w:space="0" w:color="AAAAAA"/>
               <w:right w:val="single" w:sz="1" w:space="0" w:color="AAAAAA"/>
             </w:tcBorders>
-            <w:shd w:val="clear" w:color="auto" w:fill="EBF3FA"/>
+            <w:shd w:val="clear" w:color="auto" w:fill="FFFFFF"/>
             <w:tcMar>
               <w:top w:w="80" w:type="dxa"/>
               <w:left w:w="120" w:type="dxa"/>
@@ -15022,7 +14346,7 @@
                 <w:sz w:val="18"/>
                 <w:szCs w:val="18"/>
               </w:rPr>
-              <w:t>https://github.com/docker/build-push-action</w:t>
+              <w:t>https://github.com/docker/metadata-action</w:t>
             </w:r>
           </w:p>
         </w:tc>
@@ -15037,25 +14361,25 @@
               <w:bottom w:val="single" w:sz="1" w:space="0" w:color="AAAAAA"/>
               <w:right w:val="single" w:sz="1" w:space="0" w:color="AAAAAA"/>
             </w:tcBorders>
-            <w:shd w:val="clear" w:color="auto" w:fill="FFFFFF"/>
-            <w:tcMar>
-              <w:top w:w="80" w:type="dxa"/>
-              <w:left w:w="120" w:type="dxa"/>
-              <w:bottom w:w="80" w:type="dxa"/>
-              <w:right w:w="120" w:type="dxa"/>
-            </w:tcMar>
-            <w:vAlign w:val="center"/>
-          </w:tcPr>
-          <w:p>
-            <w:r>
-              <w:rPr>
-                <w:b/>
-                <w:bCs/>
-                <w:color w:val="000000"/>
-                <w:sz w:val="20"/>
-                <w:szCs w:val="20"/>
-              </w:rPr>
-              <w:t>docker/metadata-action@v5 (Official Docker Action)</w:t>
+            <w:shd w:val="clear" w:color="auto" w:fill="EBF3FA"/>
+            <w:tcMar>
+              <w:top w:w="80" w:type="dxa"/>
+              <w:left w:w="120" w:type="dxa"/>
+              <w:bottom w:w="80" w:type="dxa"/>
+              <w:right w:w="120" w:type="dxa"/>
+            </w:tcMar>
+            <w:vAlign w:val="center"/>
+          </w:tcPr>
+          <w:p>
+            <w:r>
+              <w:rPr>
+                <w:b/>
+                <w:bCs/>
+                <w:color w:val="000000"/>
+                <w:sz w:val="20"/>
+                <w:szCs w:val="20"/>
+              </w:rPr>
+              <w:t>Docker Hub – Repositories &amp; Access Tokens</w:t>
             </w:r>
           </w:p>
         </w:tc>
@@ -15068,7 +14392,7 @@
               <w:bottom w:val="single" w:sz="1" w:space="0" w:color="AAAAAA"/>
               <w:right w:val="single" w:sz="1" w:space="0" w:color="AAAAAA"/>
             </w:tcBorders>
-            <w:shd w:val="clear" w:color="auto" w:fill="FFFFFF"/>
+            <w:shd w:val="clear" w:color="auto" w:fill="EBF3FA"/>
             <w:tcMar>
               <w:top w:w="80" w:type="dxa"/>
               <w:left w:w="120" w:type="dxa"/>
@@ -15084,7 +14408,7 @@
                 <w:sz w:val="18"/>
                 <w:szCs w:val="18"/>
               </w:rPr>
-              <w:t>https://github.com/docker/metadata-action</w:t>
+              <w:t>https://docs.docker.com/docker-hub/ | https://docs.docker.com/security/for-developers/access-tokens/</w:t>
             </w:r>
           </w:p>
         </w:tc>
@@ -15099,35 +14423,25 @@
               <w:bottom w:val="single" w:sz="1" w:space="0" w:color="AAAAAA"/>
               <w:right w:val="single" w:sz="1" w:space="0" w:color="AAAAAA"/>
             </w:tcBorders>
-            <w:shd w:val="clear" w:color="auto" w:fill="EBF3FA"/>
-            <w:tcMar>
-              <w:top w:w="80" w:type="dxa"/>
-              <w:left w:w="120" w:type="dxa"/>
-              <w:bottom w:w="80" w:type="dxa"/>
-              <w:right w:w="120" w:type="dxa"/>
-            </w:tcMar>
-            <w:vAlign w:val="center"/>
-          </w:tcPr>
-          <w:p>
-            <w:r>
-              <w:rPr>
-                <w:b/>
-                <w:bCs/>
-                <w:color w:val="000000"/>
-                <w:sz w:val="20"/>
-                <w:szCs w:val="20"/>
-              </w:rPr>
-              <w:t xml:space="preserve">Docker </w:t>
-            </w:r>
-            <w:r>
-              <w:rPr>
-                <w:b/>
-                <w:bCs/>
-                <w:color w:val="000000"/>
-                <w:sz w:val="20"/>
-                <w:szCs w:val="20"/>
-              </w:rPr>
-              <w:t>Hub – Repositories &amp; Access Tokens</w:t>
+            <w:shd w:val="clear" w:color="auto" w:fill="FFFFFF"/>
+            <w:tcMar>
+              <w:top w:w="80" w:type="dxa"/>
+              <w:left w:w="120" w:type="dxa"/>
+              <w:bottom w:w="80" w:type="dxa"/>
+              <w:right w:w="120" w:type="dxa"/>
+            </w:tcMar>
+            <w:vAlign w:val="center"/>
+          </w:tcPr>
+          <w:p>
+            <w:r>
+              <w:rPr>
+                <w:b/>
+                <w:bCs/>
+                <w:color w:val="000000"/>
+                <w:sz w:val="20"/>
+                <w:szCs w:val="20"/>
+              </w:rPr>
+              <w:t>Docker Official nginx Image</w:t>
             </w:r>
           </w:p>
         </w:tc>
@@ -15140,7 +14454,7 @@
               <w:bottom w:val="single" w:sz="1" w:space="0" w:color="AAAAAA"/>
               <w:right w:val="single" w:sz="1" w:space="0" w:color="AAAAAA"/>
             </w:tcBorders>
-            <w:shd w:val="clear" w:color="auto" w:fill="EBF3FA"/>
+            <w:shd w:val="clear" w:color="auto" w:fill="FFFFFF"/>
             <w:tcMar>
               <w:top w:w="80" w:type="dxa"/>
               <w:left w:w="120" w:type="dxa"/>
@@ -15156,7 +14470,7 @@
                 <w:sz w:val="18"/>
                 <w:szCs w:val="18"/>
               </w:rPr>
-              <w:t>https://docs.docker.com/docker-hub/ | https://docs.docker.com/security/for-developers/access-tokens/</w:t>
+              <w:t>https://hub.docker.com/_/nginx</w:t>
             </w:r>
           </w:p>
         </w:tc>
@@ -15171,25 +14485,25 @@
               <w:bottom w:val="single" w:sz="1" w:space="0" w:color="AAAAAA"/>
               <w:right w:val="single" w:sz="1" w:space="0" w:color="AAAAAA"/>
             </w:tcBorders>
-            <w:shd w:val="clear" w:color="auto" w:fill="FFFFFF"/>
-            <w:tcMar>
-              <w:top w:w="80" w:type="dxa"/>
-              <w:left w:w="120" w:type="dxa"/>
-              <w:bottom w:w="80" w:type="dxa"/>
-              <w:right w:w="120" w:type="dxa"/>
-            </w:tcMar>
-            <w:vAlign w:val="center"/>
-          </w:tcPr>
-          <w:p>
-            <w:r>
-              <w:rPr>
-                <w:b/>
-                <w:bCs/>
-                <w:color w:val="000000"/>
-                <w:sz w:val="20"/>
-                <w:szCs w:val="20"/>
-              </w:rPr>
-              <w:t>Docker Official nginx Image</w:t>
+            <w:shd w:val="clear" w:color="auto" w:fill="EBF3FA"/>
+            <w:tcMar>
+              <w:top w:w="80" w:type="dxa"/>
+              <w:left w:w="120" w:type="dxa"/>
+              <w:bottom w:w="80" w:type="dxa"/>
+              <w:right w:w="120" w:type="dxa"/>
+            </w:tcMar>
+            <w:vAlign w:val="center"/>
+          </w:tcPr>
+          <w:p>
+            <w:r>
+              <w:rPr>
+                <w:b/>
+                <w:bCs/>
+                <w:color w:val="000000"/>
+                <w:sz w:val="20"/>
+                <w:szCs w:val="20"/>
+              </w:rPr>
+              <w:t>Dockerfile Reference</w:t>
             </w:r>
           </w:p>
         </w:tc>
@@ -15202,7 +14516,7 @@
               <w:bottom w:val="single" w:sz="1" w:space="0" w:color="AAAAAA"/>
               <w:right w:val="single" w:sz="1" w:space="0" w:color="AAAAAA"/>
             </w:tcBorders>
-            <w:shd w:val="clear" w:color="auto" w:fill="FFFFFF"/>
+            <w:shd w:val="clear" w:color="auto" w:fill="EBF3FA"/>
             <w:tcMar>
               <w:top w:w="80" w:type="dxa"/>
               <w:left w:w="120" w:type="dxa"/>
@@ -15218,7 +14532,7 @@
                 <w:sz w:val="18"/>
                 <w:szCs w:val="18"/>
               </w:rPr>
-              <w:t>https://hub.docker.com/_/nginx</w:t>
+              <w:t>https://docs.docker.com/reference/dockerfile/</w:t>
             </w:r>
           </w:p>
         </w:tc>
@@ -15233,25 +14547,25 @@
               <w:bottom w:val="single" w:sz="1" w:space="0" w:color="AAAAAA"/>
               <w:right w:val="single" w:sz="1" w:space="0" w:color="AAAAAA"/>
             </w:tcBorders>
-            <w:shd w:val="clear" w:color="auto" w:fill="EBF3FA"/>
-            <w:tcMar>
-              <w:top w:w="80" w:type="dxa"/>
-              <w:left w:w="120" w:type="dxa"/>
-              <w:bottom w:w="80" w:type="dxa"/>
-              <w:right w:w="120" w:type="dxa"/>
-            </w:tcMar>
-            <w:vAlign w:val="center"/>
-          </w:tcPr>
-          <w:p>
-            <w:r>
-              <w:rPr>
-                <w:b/>
-                <w:bCs/>
-                <w:color w:val="000000"/>
-                <w:sz w:val="20"/>
-                <w:szCs w:val="20"/>
-              </w:rPr>
-              <w:t>Dockerfile Reference</w:t>
+            <w:shd w:val="clear" w:color="auto" w:fill="FFFFFF"/>
+            <w:tcMar>
+              <w:top w:w="80" w:type="dxa"/>
+              <w:left w:w="120" w:type="dxa"/>
+              <w:bottom w:w="80" w:type="dxa"/>
+              <w:right w:w="120" w:type="dxa"/>
+            </w:tcMar>
+            <w:vAlign w:val="center"/>
+          </w:tcPr>
+          <w:p>
+            <w:r>
+              <w:rPr>
+                <w:b/>
+                <w:bCs/>
+                <w:color w:val="000000"/>
+                <w:sz w:val="20"/>
+                <w:szCs w:val="20"/>
+              </w:rPr>
+              <w:t>Render.com – Deploy Hooks</w:t>
             </w:r>
           </w:p>
         </w:tc>
@@ -15264,7 +14578,7 @@
               <w:bottom w:val="single" w:sz="1" w:space="0" w:color="AAAAAA"/>
               <w:right w:val="single" w:sz="1" w:space="0" w:color="AAAAAA"/>
             </w:tcBorders>
-            <w:shd w:val="clear" w:color="auto" w:fill="EBF3FA"/>
+            <w:shd w:val="clear" w:color="auto" w:fill="FFFFFF"/>
             <w:tcMar>
               <w:top w:w="80" w:type="dxa"/>
               <w:left w:w="120" w:type="dxa"/>
@@ -15280,7 +14594,7 @@
                 <w:sz w:val="18"/>
                 <w:szCs w:val="18"/>
               </w:rPr>
-              <w:t>https://docs.docker.com/reference/dockerfile/</w:t>
+              <w:t>https://docs.render.com/deploy-hooks</w:t>
             </w:r>
           </w:p>
         </w:tc>
@@ -15295,25 +14609,25 @@
               <w:bottom w:val="single" w:sz="1" w:space="0" w:color="AAAAAA"/>
               <w:right w:val="single" w:sz="1" w:space="0" w:color="AAAAAA"/>
             </w:tcBorders>
-            <w:shd w:val="clear" w:color="auto" w:fill="FFFFFF"/>
-            <w:tcMar>
-              <w:top w:w="80" w:type="dxa"/>
-              <w:left w:w="120" w:type="dxa"/>
-              <w:bottom w:w="80" w:type="dxa"/>
-              <w:right w:w="120" w:type="dxa"/>
-            </w:tcMar>
-            <w:vAlign w:val="center"/>
-          </w:tcPr>
-          <w:p>
-            <w:r>
-              <w:rPr>
-                <w:b/>
-                <w:bCs/>
-                <w:color w:val="000000"/>
-                <w:sz w:val="20"/>
-                <w:szCs w:val="20"/>
-              </w:rPr>
-              <w:t>Render.com – Deploy Hooks</w:t>
+            <w:shd w:val="clear" w:color="auto" w:fill="EBF3FA"/>
+            <w:tcMar>
+              <w:top w:w="80" w:type="dxa"/>
+              <w:left w:w="120" w:type="dxa"/>
+              <w:bottom w:w="80" w:type="dxa"/>
+              <w:right w:w="120" w:type="dxa"/>
+            </w:tcMar>
+            <w:vAlign w:val="center"/>
+          </w:tcPr>
+          <w:p>
+            <w:r>
+              <w:rPr>
+                <w:b/>
+                <w:bCs/>
+                <w:color w:val="000000"/>
+                <w:sz w:val="20"/>
+                <w:szCs w:val="20"/>
+              </w:rPr>
+              <w:t>Render.com – Docker Deploys</w:t>
             </w:r>
           </w:p>
         </w:tc>
@@ -15326,7 +14640,7 @@
               <w:bottom w:val="single" w:sz="1" w:space="0" w:color="AAAAAA"/>
               <w:right w:val="single" w:sz="1" w:space="0" w:color="AAAAAA"/>
             </w:tcBorders>
-            <w:shd w:val="clear" w:color="auto" w:fill="FFFFFF"/>
+            <w:shd w:val="clear" w:color="auto" w:fill="EBF3FA"/>
             <w:tcMar>
               <w:top w:w="80" w:type="dxa"/>
               <w:left w:w="120" w:type="dxa"/>
@@ -15342,7 +14656,7 @@
                 <w:sz w:val="18"/>
                 <w:szCs w:val="18"/>
               </w:rPr>
-              <w:t>https://docs.render.com/deploy-hooks</w:t>
+              <w:t>https://docs.render.com/docker</w:t>
             </w:r>
           </w:p>
         </w:tc>
@@ -15357,25 +14671,25 @@
               <w:bottom w:val="single" w:sz="1" w:space="0" w:color="AAAAAA"/>
               <w:right w:val="single" w:sz="1" w:space="0" w:color="AAAAAA"/>
             </w:tcBorders>
-            <w:shd w:val="clear" w:color="auto" w:fill="EBF3FA"/>
-            <w:tcMar>
-              <w:top w:w="80" w:type="dxa"/>
-              <w:left w:w="120" w:type="dxa"/>
-              <w:bottom w:w="80" w:type="dxa"/>
-              <w:right w:w="120" w:type="dxa"/>
-            </w:tcMar>
-            <w:vAlign w:val="center"/>
-          </w:tcPr>
-          <w:p>
-            <w:r>
-              <w:rPr>
-                <w:b/>
-                <w:bCs/>
-                <w:color w:val="000000"/>
-                <w:sz w:val="20"/>
-                <w:szCs w:val="20"/>
-              </w:rPr>
-              <w:t>Render.com – Docker Deploys</w:t>
+            <w:shd w:val="clear" w:color="auto" w:fill="FFFFFF"/>
+            <w:tcMar>
+              <w:top w:w="80" w:type="dxa"/>
+              <w:left w:w="120" w:type="dxa"/>
+              <w:bottom w:w="80" w:type="dxa"/>
+              <w:right w:w="120" w:type="dxa"/>
+            </w:tcMar>
+            <w:vAlign w:val="center"/>
+          </w:tcPr>
+          <w:p>
+            <w:r>
+              <w:rPr>
+                <w:b/>
+                <w:bCs/>
+                <w:color w:val="000000"/>
+                <w:sz w:val="20"/>
+                <w:szCs w:val="20"/>
+              </w:rPr>
+              <w:t>HTML5 Specification (WHATWG)</w:t>
             </w:r>
           </w:p>
         </w:tc>
@@ -15388,7 +14702,7 @@
               <w:bottom w:val="single" w:sz="1" w:space="0" w:color="AAAAAA"/>
               <w:right w:val="single" w:sz="1" w:space="0" w:color="AAAAAA"/>
             </w:tcBorders>
-            <w:shd w:val="clear" w:color="auto" w:fill="EBF3FA"/>
+            <w:shd w:val="clear" w:color="auto" w:fill="FFFFFF"/>
             <w:tcMar>
               <w:top w:w="80" w:type="dxa"/>
               <w:left w:w="120" w:type="dxa"/>
@@ -15404,7 +14718,7 @@
                 <w:sz w:val="18"/>
                 <w:szCs w:val="18"/>
               </w:rPr>
-              <w:t>https://docs.render.com/docker</w:t>
+              <w:t>https://html.spec.whatwg.org/</w:t>
             </w:r>
           </w:p>
         </w:tc>
@@ -15419,25 +14733,25 @@
               <w:bottom w:val="single" w:sz="1" w:space="0" w:color="AAAAAA"/>
               <w:right w:val="single" w:sz="1" w:space="0" w:color="AAAAAA"/>
             </w:tcBorders>
-            <w:shd w:val="clear" w:color="auto" w:fill="FFFFFF"/>
-            <w:tcMar>
-              <w:top w:w="80" w:type="dxa"/>
-              <w:left w:w="120" w:type="dxa"/>
-              <w:bottom w:w="80" w:type="dxa"/>
-              <w:right w:w="120" w:type="dxa"/>
-            </w:tcMar>
-            <w:vAlign w:val="center"/>
-          </w:tcPr>
-          <w:p>
-            <w:r>
-              <w:rPr>
-                <w:b/>
-                <w:bCs/>
-                <w:color w:val="000000"/>
-                <w:sz w:val="20"/>
-                <w:szCs w:val="20"/>
-              </w:rPr>
-              <w:t>HTML5 Specification (WHATWG)</w:t>
+            <w:shd w:val="clear" w:color="auto" w:fill="EBF3FA"/>
+            <w:tcMar>
+              <w:top w:w="80" w:type="dxa"/>
+              <w:left w:w="120" w:type="dxa"/>
+              <w:bottom w:w="80" w:type="dxa"/>
+              <w:right w:w="120" w:type="dxa"/>
+            </w:tcMar>
+            <w:vAlign w:val="center"/>
+          </w:tcPr>
+          <w:p>
+            <w:r>
+              <w:rPr>
+                <w:b/>
+                <w:bCs/>
+                <w:color w:val="000000"/>
+                <w:sz w:val="20"/>
+                <w:szCs w:val="20"/>
+              </w:rPr>
+              <w:t>MDN Web Docs – HTML Reference</w:t>
             </w:r>
           </w:p>
         </w:tc>
@@ -15450,7 +14764,7 @@
               <w:bottom w:val="single" w:sz="1" w:space="0" w:color="AAAAAA"/>
               <w:right w:val="single" w:sz="1" w:space="0" w:color="AAAAAA"/>
             </w:tcBorders>
-            <w:shd w:val="clear" w:color="auto" w:fill="FFFFFF"/>
+            <w:shd w:val="clear" w:color="auto" w:fill="EBF3FA"/>
             <w:tcMar>
               <w:top w:w="80" w:type="dxa"/>
               <w:left w:w="120" w:type="dxa"/>
@@ -15466,7 +14780,7 @@
                 <w:sz w:val="18"/>
                 <w:szCs w:val="18"/>
               </w:rPr>
-              <w:t>https://html.spec.whatwg.org/</w:t>
+              <w:t>https://developer.mozilla.org/en-US/docs/Web/HTML</w:t>
             </w:r>
           </w:p>
         </w:tc>
@@ -15481,35 +14795,26 @@
               <w:bottom w:val="single" w:sz="1" w:space="0" w:color="AAAAAA"/>
               <w:right w:val="single" w:sz="1" w:space="0" w:color="AAAAAA"/>
             </w:tcBorders>
-            <w:shd w:val="clear" w:color="auto" w:fill="EBF3FA"/>
-            <w:tcMar>
-              <w:top w:w="80" w:type="dxa"/>
-              <w:left w:w="120" w:type="dxa"/>
-              <w:bottom w:w="80" w:type="dxa"/>
-              <w:right w:w="120" w:type="dxa"/>
-            </w:tcMar>
-            <w:vAlign w:val="center"/>
-          </w:tcPr>
-          <w:p>
-            <w:r>
-              <w:rPr>
-                <w:b/>
-                <w:bCs/>
-                <w:color w:val="000000"/>
-                <w:sz w:val="20"/>
-                <w:szCs w:val="20"/>
-              </w:rPr>
-              <w:t xml:space="preserve">MDN Web Docs – HTML </w:t>
-            </w:r>
-            <w:r>
-              <w:rPr>
-                <w:b/>
-                <w:bCs/>
-                <w:color w:val="000000"/>
-                <w:sz w:val="20"/>
-                <w:szCs w:val="20"/>
-              </w:rPr>
-              <w:t>Reference</w:t>
+            <w:shd w:val="clear" w:color="auto" w:fill="FFFFFF"/>
+            <w:tcMar>
+              <w:top w:w="80" w:type="dxa"/>
+              <w:left w:w="120" w:type="dxa"/>
+              <w:bottom w:w="80" w:type="dxa"/>
+              <w:right w:w="120" w:type="dxa"/>
+            </w:tcMar>
+            <w:vAlign w:val="center"/>
+          </w:tcPr>
+          <w:p>
+            <w:r>
+              <w:rPr>
+                <w:b/>
+                <w:bCs/>
+                <w:color w:val="000000"/>
+                <w:sz w:val="20"/>
+                <w:szCs w:val="20"/>
+              </w:rPr>
+              <w:lastRenderedPageBreak/>
+              <w:t>MDN Web Docs – CSS Reference</w:t>
             </w:r>
           </w:p>
         </w:tc>
@@ -15522,7 +14827,7 @@
               <w:bottom w:val="single" w:sz="1" w:space="0" w:color="AAAAAA"/>
               <w:right w:val="single" w:sz="1" w:space="0" w:color="AAAAAA"/>
             </w:tcBorders>
-            <w:shd w:val="clear" w:color="auto" w:fill="EBF3FA"/>
+            <w:shd w:val="clear" w:color="auto" w:fill="FFFFFF"/>
             <w:tcMar>
               <w:top w:w="80" w:type="dxa"/>
               <w:left w:w="120" w:type="dxa"/>
@@ -15538,7 +14843,7 @@
                 <w:sz w:val="18"/>
                 <w:szCs w:val="18"/>
               </w:rPr>
-              <w:t>https://developer.mozilla.org/en-US/docs/Web/HTML</w:t>
+              <w:t>https://developer.mozilla.org/en-US/docs/Web/CSS</w:t>
             </w:r>
           </w:p>
         </w:tc>
@@ -15553,87 +14858,24 @@
               <w:bottom w:val="single" w:sz="1" w:space="0" w:color="AAAAAA"/>
               <w:right w:val="single" w:sz="1" w:space="0" w:color="AAAAAA"/>
             </w:tcBorders>
-            <w:shd w:val="clear" w:color="auto" w:fill="FFFFFF"/>
-            <w:tcMar>
-              <w:top w:w="80" w:type="dxa"/>
-              <w:left w:w="120" w:type="dxa"/>
-              <w:bottom w:w="80" w:type="dxa"/>
-              <w:right w:w="120" w:type="dxa"/>
-            </w:tcMar>
-            <w:vAlign w:val="center"/>
-          </w:tcPr>
-          <w:p>
-            <w:r>
-              <w:rPr>
-                <w:b/>
-                <w:bCs/>
-                <w:color w:val="000000"/>
-                <w:sz w:val="20"/>
-                <w:szCs w:val="20"/>
-              </w:rPr>
-              <w:t>MDN Web Docs – CSS Reference</w:t>
-            </w:r>
-          </w:p>
-        </w:tc>
-        <w:tc>
-          <w:tcPr>
-            <w:tcW w:w="5960" w:type="dxa"/>
-            <w:tcBorders>
-              <w:top w:val="single" w:sz="1" w:space="0" w:color="AAAAAA"/>
-              <w:left w:val="single" w:sz="1" w:space="0" w:color="AAAAAA"/>
-              <w:bottom w:val="single" w:sz="1" w:space="0" w:color="AAAAAA"/>
-              <w:right w:val="single" w:sz="1" w:space="0" w:color="AAAAAA"/>
-            </w:tcBorders>
-            <w:shd w:val="clear" w:color="auto" w:fill="FFFFFF"/>
-            <w:tcMar>
-              <w:top w:w="80" w:type="dxa"/>
-              <w:left w:w="120" w:type="dxa"/>
-              <w:bottom w:w="80" w:type="dxa"/>
-              <w:right w:w="120" w:type="dxa"/>
-            </w:tcMar>
-          </w:tcPr>
-          <w:p>
-            <w:r>
-              <w:rPr>
-                <w:rFonts w:ascii="Courier New" w:eastAsia="Courier New" w:hAnsi="Courier New" w:cs="Courier New"/>
-                <w:color w:val="2E75B6"/>
-                <w:sz w:val="18"/>
-                <w:szCs w:val="18"/>
-              </w:rPr>
-              <w:t>https://developer.mozilla.org/en-US/docs/Web/CSS</w:t>
-            </w:r>
-          </w:p>
-        </w:tc>
-      </w:tr>
-      <w:tr>
-        <w:tc>
-          <w:tcPr>
-            <w:tcW w:w="3400" w:type="dxa"/>
-            <w:tcBorders>
-              <w:top w:val="single" w:sz="1" w:space="0" w:color="AAAAAA"/>
-              <w:left w:val="single" w:sz="1" w:space="0" w:color="AAAAAA"/>
-              <w:bottom w:val="single" w:sz="1" w:space="0" w:color="AAAAAA"/>
-              <w:right w:val="single" w:sz="1" w:space="0" w:color="AAAAAA"/>
-            </w:tcBorders>
-            <w:shd w:val="clear" w:color="auto" w:fill="EBF3FA"/>
-            <w:tcMar>
-              <w:top w:w="80" w:type="dxa"/>
-              <w:left w:w="120" w:type="dxa"/>
-              <w:bottom w:w="80" w:type="dxa"/>
-              <w:right w:w="120" w:type="dxa"/>
-            </w:tcMar>
-            <w:vAlign w:val="center"/>
-          </w:tcPr>
-          <w:p>
-            <w:r>
-              <w:rPr>
-                <w:b/>
-                <w:bCs/>
-                <w:color w:val="000000"/>
-                <w:sz w:val="20"/>
-                <w:szCs w:val="20"/>
-              </w:rPr>
-              <w:lastRenderedPageBreak/>
+            <w:shd w:val="clear" w:color="auto" w:fill="EBF3FA"/>
+            <w:tcMar>
+              <w:top w:w="80" w:type="dxa"/>
+              <w:left w:w="120" w:type="dxa"/>
+              <w:bottom w:w="80" w:type="dxa"/>
+              <w:right w:w="120" w:type="dxa"/>
+            </w:tcMar>
+            <w:vAlign w:val="center"/>
+          </w:tcPr>
+          <w:p>
+            <w:r>
+              <w:rPr>
+                <w:b/>
+                <w:bCs/>
+                <w:color w:val="000000"/>
+                <w:sz w:val="20"/>
+                <w:szCs w:val="20"/>
+              </w:rPr>
               <w:t>CSS Custom Properties (Variables)</w:t>
             </w:r>
           </w:p>
@@ -15683,7 +14925,7 @@
 </file>
 
 <file path=word/endnotes.xml><?xml version="1.0" encoding="utf-8"?>
-<w:endnotes xmlns:wpc="http://schemas.microsoft.com/office/word/2010/wordprocessingCanvas" xmlns:cx="http://schemas.microsoft.com/office/drawing/2014/chartex" xmlns:mc="http://schemas.openxmlformats.org/markup-compatibility/2006" xmlns:o="urn:schemas-microsoft-com:office:office" xmlns:r="http://schemas.openxmlformats.org/officeDocument/2006/relationships" xmlns:m="http://schemas.openxmlformats.org/officeDocument/2006/math" xmlns:v="urn:schemas-microsoft-com:vml" xmlns:wp14="http://schemas.microsoft.com/office/word/2010/wordprocessingDrawing" xmlns:wp="http://schemas.openxmlformats.org/drawingml/2006/wordprocessingDrawing" xmlns:w10="urn:schemas-microsoft-com:office:word" xmlns:w="http://schemas.openxmlformats.org/wordprocessingml/2006/main" xmlns:w14="http://schemas.microsoft.com/office/word/2010/wordml" xmlns:w15="http://schemas.microsoft.com/office/word/2012/wordml" xmlns:w16se="http://schemas.microsoft.com/office/word/2015/wordml/symex" xmlns:wpg="http://schemas.microsoft.com/office/word/2010/wordprocessingGroup" xmlns:wpi="http://schemas.microsoft.com/office/word/2010/wordprocessingInk" xmlns:wne="http://schemas.microsoft.com/office/word/2006/wordml" xmlns:wps="http://schemas.microsoft.com/office/word/2010/wordprocessingShape" mc:Ignorable="w14 w15 w16se wp14">
+<w:endnotes xmlns:wpc="http://schemas.microsoft.com/office/word/2010/wordprocessingCanvas" xmlns:cx="http://schemas.microsoft.com/office/drawing/2014/chartex" xmlns:cx1="http://schemas.microsoft.com/office/drawing/2015/9/8/chartex" xmlns:mc="http://schemas.openxmlformats.org/markup-compatibility/2006" xmlns:o="urn:schemas-microsoft-com:office:office" xmlns:r="http://schemas.openxmlformats.org/officeDocument/2006/relationships" xmlns:m="http://schemas.openxmlformats.org/officeDocument/2006/math" xmlns:v="urn:schemas-microsoft-com:vml" xmlns:wp14="http://schemas.microsoft.com/office/word/2010/wordprocessingDrawing" xmlns:wp="http://schemas.openxmlformats.org/drawingml/2006/wordprocessingDrawing" xmlns:w10="urn:schemas-microsoft-com:office:word" xmlns:w="http://schemas.openxmlformats.org/wordprocessingml/2006/main" xmlns:w14="http://schemas.microsoft.com/office/word/2010/wordml" xmlns:w15="http://schemas.microsoft.com/office/word/2012/wordml" xmlns:w16se="http://schemas.microsoft.com/office/word/2015/wordml/symex" xmlns:wpg="http://schemas.microsoft.com/office/word/2010/wordprocessingGroup" xmlns:wpi="http://schemas.microsoft.com/office/word/2010/wordprocessingInk" xmlns:wne="http://schemas.microsoft.com/office/word/2006/wordml" xmlns:wps="http://schemas.microsoft.com/office/word/2010/wordprocessingShape" mc:Ignorable="w14 w15 w16se wp14">
   <w:endnote w:type="separator" w:id="-1">
     <w:p>
       <w:r>
@@ -15697,12 +14939,15 @@
         <w:continuationSeparator/>
       </w:r>
     </w:p>
+  </w:endnote>
+  <w:endnote w:type="continuationNotice" w:id="1">
+    <w:p/>
   </w:endnote>
 </w:endnotes>
 </file>
 
 <file path=word/footer1.xml><?xml version="1.0" encoding="utf-8"?>
-<w:ftr xmlns:wpc="http://schemas.microsoft.com/office/word/2010/wordprocessingCanvas" xmlns:cx="http://schemas.microsoft.com/office/drawing/2014/chartex" xmlns:mc="http://schemas.openxmlformats.org/markup-compatibility/2006" xmlns:o="urn:schemas-microsoft-com:office:office" xmlns:r="http://schemas.openxmlformats.org/officeDocument/2006/relationships" xmlns:m="http://schemas.openxmlformats.org/officeDocument/2006/math" xmlns:v="urn:schemas-microsoft-com:vml" xmlns:wp14="http://schemas.microsoft.com/office/word/2010/wordprocessingDrawing" xmlns:wp="http://schemas.openxmlformats.org/drawingml/2006/wordprocessingDrawing" xmlns:w10="urn:schemas-microsoft-com:office:word" xmlns:w="http://schemas.openxmlformats.org/wordprocessingml/2006/main" xmlns:w14="http://schemas.microsoft.com/office/word/2010/wordml" xmlns:w15="http://schemas.microsoft.com/office/word/2012/wordml" xmlns:w16se="http://schemas.microsoft.com/office/word/2015/wordml/symex" xmlns:wpg="http://schemas.microsoft.com/office/word/2010/wordprocessingGroup" xmlns:wpi="http://schemas.microsoft.com/office/word/2010/wordprocessingInk" xmlns:wne="http://schemas.microsoft.com/office/word/2006/wordml" xmlns:wps="http://schemas.microsoft.com/office/word/2010/wordprocessingShape" mc:Ignorable="w14 w15 w16se wp14">
+<w:ftr xmlns:wpc="http://schemas.microsoft.com/office/word/2010/wordprocessingCanvas" xmlns:cx="http://schemas.microsoft.com/office/drawing/2014/chartex" xmlns:cx1="http://schemas.microsoft.com/office/drawing/2015/9/8/chartex" xmlns:mc="http://schemas.openxmlformats.org/markup-compatibility/2006" xmlns:o="urn:schemas-microsoft-com:office:office" xmlns:r="http://schemas.openxmlformats.org/officeDocument/2006/relationships" xmlns:m="http://schemas.openxmlformats.org/officeDocument/2006/math" xmlns:v="urn:schemas-microsoft-com:vml" xmlns:wp14="http://schemas.microsoft.com/office/word/2010/wordprocessingDrawing" xmlns:wp="http://schemas.openxmlformats.org/drawingml/2006/wordprocessingDrawing" xmlns:w10="urn:schemas-microsoft-com:office:word" xmlns:w="http://schemas.openxmlformats.org/wordprocessingml/2006/main" xmlns:w14="http://schemas.microsoft.com/office/word/2010/wordml" xmlns:w15="http://schemas.microsoft.com/office/word/2012/wordml" xmlns:w16se="http://schemas.microsoft.com/office/word/2015/wordml/symex" xmlns:wpg="http://schemas.microsoft.com/office/word/2010/wordprocessingGroup" xmlns:wpi="http://schemas.microsoft.com/office/word/2010/wordprocessingInk" xmlns:wne="http://schemas.microsoft.com/office/word/2006/wordml" xmlns:wps="http://schemas.microsoft.com/office/word/2010/wordprocessingShape" mc:Ignorable="w14 w15 w16se wp14">
   <w:p>
     <w:pPr>
       <w:pBdr>
@@ -15760,7 +15005,7 @@
         <w:sz w:val="18"/>
         <w:szCs w:val="18"/>
       </w:rPr>
-      <w:t>20</w:t>
+      <w:t>1</w:t>
     </w:r>
     <w:r>
       <w:rPr>
@@ -15809,7 +15054,7 @@
         <w:sz w:val="18"/>
         <w:szCs w:val="18"/>
       </w:rPr>
-      <w:t>20</w:t>
+      <w:t>28</w:t>
     </w:r>
     <w:r>
       <w:rPr>
@@ -15824,7 +15069,7 @@
 </file>
 
 <file path=word/footnotes.xml><?xml version="1.0" encoding="utf-8"?>
-<w:footnotes xmlns:wpc="http://schemas.microsoft.com/office/word/2010/wordprocessingCanvas" xmlns:cx="http://schemas.microsoft.com/office/drawing/2014/chartex" xmlns:mc="http://schemas.openxmlformats.org/markup-compatibility/2006" xmlns:o="urn:schemas-microsoft-com:office:office" xmlns:r="http://schemas.openxmlformats.org/officeDocument/2006/relationships" xmlns:m="http://schemas.openxmlformats.org/officeDocument/2006/math" xmlns:v="urn:schemas-microsoft-com:vml" xmlns:wp14="http://schemas.microsoft.com/office/word/2010/wordprocessingDrawing" xmlns:wp="http://schemas.openxmlformats.org/drawingml/2006/wordprocessingDrawing" xmlns:w10="urn:schemas-microsoft-com:office:word" xmlns:w="http://schemas.openxmlformats.org/wordprocessingml/2006/main" xmlns:w14="http://schemas.microsoft.com/office/word/2010/wordml" xmlns:w15="http://schemas.microsoft.com/office/word/2012/wordml" xmlns:w16se="http://schemas.microsoft.com/office/word/2015/wordml/symex" xmlns:wpg="http://schemas.microsoft.com/office/word/2010/wordprocessingGroup" xmlns:wpi="http://schemas.microsoft.com/office/word/2010/wordprocessingInk" xmlns:wne="http://schemas.microsoft.com/office/word/2006/wordml" xmlns:wps="http://schemas.microsoft.com/office/word/2010/wordprocessingShape" mc:Ignorable="w14 w15 w16se wp14">
+<w:footnotes xmlns:wpc="http://schemas.microsoft.com/office/word/2010/wordprocessingCanvas" xmlns:cx="http://schemas.microsoft.com/office/drawing/2014/chartex" xmlns:cx1="http://schemas.microsoft.com/office/drawing/2015/9/8/chartex" xmlns:mc="http://schemas.openxmlformats.org/markup-compatibility/2006" xmlns:o="urn:schemas-microsoft-com:office:office" xmlns:r="http://schemas.openxmlformats.org/officeDocument/2006/relationships" xmlns:m="http://schemas.openxmlformats.org/officeDocument/2006/math" xmlns:v="urn:schemas-microsoft-com:vml" xmlns:wp14="http://schemas.microsoft.com/office/word/2010/wordprocessingDrawing" xmlns:wp="http://schemas.openxmlformats.org/drawingml/2006/wordprocessingDrawing" xmlns:w10="urn:schemas-microsoft-com:office:word" xmlns:w="http://schemas.openxmlformats.org/wordprocessingml/2006/main" xmlns:w14="http://schemas.microsoft.com/office/word/2010/wordml" xmlns:w15="http://schemas.microsoft.com/office/word/2012/wordml" xmlns:w16se="http://schemas.microsoft.com/office/word/2015/wordml/symex" xmlns:wpg="http://schemas.microsoft.com/office/word/2010/wordprocessingGroup" xmlns:wpi="http://schemas.microsoft.com/office/word/2010/wordprocessingInk" xmlns:wne="http://schemas.microsoft.com/office/word/2006/wordml" xmlns:wps="http://schemas.microsoft.com/office/word/2010/wordprocessingShape" mc:Ignorable="w14 w15 w16se wp14">
   <w:footnote w:type="separator" w:id="-1">
     <w:p>
       <w:r>
@@ -15838,12 +15083,15 @@
         <w:continuationSeparator/>
       </w:r>
     </w:p>
+  </w:footnote>
+  <w:footnote w:type="continuationNotice" w:id="1">
+    <w:p/>
   </w:footnote>
 </w:footnotes>
 </file>
 
 <file path=word/header1.xml><?xml version="1.0" encoding="utf-8"?>
-<w:hdr xmlns:wpc="http://schemas.microsoft.com/office/word/2010/wordprocessingCanvas" xmlns:cx="http://schemas.microsoft.com/office/drawing/2014/chartex" xmlns:mc="http://schemas.openxmlformats.org/markup-compatibility/2006" xmlns:o="urn:schemas-microsoft-com:office:office" xmlns:r="http://schemas.openxmlformats.org/officeDocument/2006/relationships" xmlns:m="http://schemas.openxmlformats.org/officeDocument/2006/math" xmlns:v="urn:schemas-microsoft-com:vml" xmlns:wp14="http://schemas.microsoft.com/office/word/2010/wordprocessingDrawing" xmlns:wp="http://schemas.openxmlformats.org/drawingml/2006/wordprocessingDrawing" xmlns:w10="urn:schemas-microsoft-com:office:word" xmlns:w="http://schemas.openxmlformats.org/wordprocessingml/2006/main" xmlns:w14="http://schemas.microsoft.com/office/word/2010/wordml" xmlns:w15="http://schemas.microsoft.com/office/word/2012/wordml" xmlns:w16se="http://schemas.microsoft.com/office/word/2015/wordml/symex" xmlns:wpg="http://schemas.microsoft.com/office/word/2010/wordprocessingGroup" xmlns:wpi="http://schemas.microsoft.com/office/word/2010/wordprocessingInk" xmlns:wne="http://schemas.microsoft.com/office/word/2006/wordml" xmlns:wps="http://schemas.microsoft.com/office/word/2010/wordprocessingShape" mc:Ignorable="w14 w15 w16se wp14">
+<w:hdr xmlns:wpc="http://schemas.microsoft.com/office/word/2010/wordprocessingCanvas" xmlns:cx="http://schemas.microsoft.com/office/drawing/2014/chartex" xmlns:cx1="http://schemas.microsoft.com/office/drawing/2015/9/8/chartex" xmlns:mc="http://schemas.openxmlformats.org/markup-compatibility/2006" xmlns:o="urn:schemas-microsoft-com:office:office" xmlns:r="http://schemas.openxmlformats.org/officeDocument/2006/relationships" xmlns:m="http://schemas.openxmlformats.org/officeDocument/2006/math" xmlns:v="urn:schemas-microsoft-com:vml" xmlns:wp14="http://schemas.microsoft.com/office/word/2010/wordprocessingDrawing" xmlns:wp="http://schemas.openxmlformats.org/drawingml/2006/wordprocessingDrawing" xmlns:w10="urn:schemas-microsoft-com:office:word" xmlns:w="http://schemas.openxmlformats.org/wordprocessingml/2006/main" xmlns:w14="http://schemas.microsoft.com/office/word/2010/wordml" xmlns:w15="http://schemas.microsoft.com/office/word/2012/wordml" xmlns:w16se="http://schemas.microsoft.com/office/word/2015/wordml/symex" xmlns:wpg="http://schemas.microsoft.com/office/word/2010/wordprocessingGroup" xmlns:wpi="http://schemas.microsoft.com/office/word/2010/wordprocessingInk" xmlns:wne="http://schemas.microsoft.com/office/word/2006/wordml" xmlns:wps="http://schemas.microsoft.com/office/word/2010/wordprocessingShape" mc:Ignorable="w14 w15 w16se wp14">
   <w:p>
     <w:pPr>
       <w:pBdr>
@@ -15877,7 +15125,7 @@
 </file>
 
 <file path=word/numbering.xml><?xml version="1.0" encoding="utf-8"?>
-<w:numbering xmlns:wpc="http://schemas.microsoft.com/office/word/2010/wordprocessingCanvas" xmlns:cx="http://schemas.microsoft.com/office/drawing/2014/chartex" xmlns:mc="http://schemas.openxmlformats.org/markup-compatibility/2006" xmlns:o="urn:schemas-microsoft-com:office:office" xmlns:r="http://schemas.openxmlformats.org/officeDocument/2006/relationships" xmlns:m="http://schemas.openxmlformats.org/officeDocument/2006/math" xmlns:v="urn:schemas-microsoft-com:vml" xmlns:wp14="http://schemas.microsoft.com/office/word/2010/wordprocessingDrawing" xmlns:wp="http://schemas.openxmlformats.org/drawingml/2006/wordprocessingDrawing" xmlns:w10="urn:schemas-microsoft-com:office:word" xmlns:w="http://schemas.openxmlformats.org/wordprocessingml/2006/main" xmlns:w14="http://schemas.microsoft.com/office/word/2010/wordml" xmlns:w15="http://schemas.microsoft.com/office/word/2012/wordml" xmlns:w16se="http://schemas.microsoft.com/office/word/2015/wordml/symex" xmlns:wpg="http://schemas.microsoft.com/office/word/2010/wordprocessingGroup" xmlns:wpi="http://schemas.microsoft.com/office/word/2010/wordprocessingInk" xmlns:wne="http://schemas.microsoft.com/office/word/2006/wordml" xmlns:wps="http://schemas.microsoft.com/office/word/2010/wordprocessingShape" mc:Ignorable="w14 w15 w16se wp14">
+<w:numbering xmlns:wpc="http://schemas.microsoft.com/office/word/2010/wordprocessingCanvas" xmlns:cx="http://schemas.microsoft.com/office/drawing/2014/chartex" xmlns:cx1="http://schemas.microsoft.com/office/drawing/2015/9/8/chartex" xmlns:mc="http://schemas.openxmlformats.org/markup-compatibility/2006" xmlns:o="urn:schemas-microsoft-com:office:office" xmlns:r="http://schemas.openxmlformats.org/officeDocument/2006/relationships" xmlns:m="http://schemas.openxmlformats.org/officeDocument/2006/math" xmlns:v="urn:schemas-microsoft-com:vml" xmlns:wp14="http://schemas.microsoft.com/office/word/2010/wordprocessingDrawing" xmlns:wp="http://schemas.openxmlformats.org/drawingml/2006/wordprocessingDrawing" xmlns:w10="urn:schemas-microsoft-com:office:word" xmlns:w="http://schemas.openxmlformats.org/wordprocessingml/2006/main" xmlns:w14="http://schemas.microsoft.com/office/word/2010/wordml" xmlns:w15="http://schemas.microsoft.com/office/word/2012/wordml" xmlns:w16se="http://schemas.microsoft.com/office/word/2015/wordml/symex" xmlns:wpg="http://schemas.microsoft.com/office/word/2010/wordprocessingGroup" xmlns:wpi="http://schemas.microsoft.com/office/word/2010/wordprocessingInk" xmlns:wne="http://schemas.microsoft.com/office/word/2006/wordml" xmlns:wps="http://schemas.microsoft.com/office/word/2010/wordprocessingShape" mc:Ignorable="w14 w15 w16se wp14">
   <w:abstractNum w:abstractNumId="0" w15:restartNumberingAfterBreak="0">
     <w:nsid w:val="0C5F5D60"/>
     <w:multiLevelType w:val="hybridMultilevel"/>
@@ -16537,7 +15785,7 @@
     <w:lsdException w:name="Medium Shading 2 Accent 1" w:uiPriority="64"/>
     <w:lsdException w:name="Medium List 1 Accent 1" w:uiPriority="65"/>
     <w:lsdException w:name="Revision" w:semiHidden="1"/>
-    <w:lsdException w:name="List Paragraph" w:uiPriority="34" w:qFormat="1"/>
+    <w:lsdException w:name="List Paragraph" w:uiPriority="0" w:qFormat="1"/>
     <w:lsdException w:name="Quote" w:uiPriority="29" w:qFormat="1"/>
     <w:lsdException w:name="Intense Quote" w:uiPriority="30" w:qFormat="1"/>
     <w:lsdException w:name="Medium List 2 Accent 1" w:uiPriority="66"/>

</xml_diff>

<commit_message>
Revert "promoting staging branch"
</commit_message>
<xml_diff>
--- a/DF_TermProject_Spring2026.docx
+++ b/DF_TermProject_Spring2026.docx
@@ -1,6 +1,6 @@
 
 <file path=word/document.xml><?xml version="1.0" encoding="utf-8"?>
-<w:document xmlns:wpc="http://schemas.microsoft.com/office/word/2010/wordprocessingCanvas" xmlns:mc="http://schemas.openxmlformats.org/markup-compatibility/2006" xmlns:o="urn:schemas-microsoft-com:office:office" xmlns:r="http://schemas.openxmlformats.org/officeDocument/2006/relationships" xmlns:m="http://schemas.openxmlformats.org/officeDocument/2006/math" xmlns:v="urn:schemas-microsoft-com:vml" xmlns:wp14="http://schemas.microsoft.com/office/word/2010/wordprocessingDrawing" xmlns:wp="http://schemas.openxmlformats.org/drawingml/2006/wordprocessingDrawing" xmlns:w10="urn:schemas-microsoft-com:office:word" xmlns:w="http://schemas.openxmlformats.org/wordprocessingml/2006/main" xmlns:w14="http://schemas.microsoft.com/office/word/2010/wordml" xmlns:w15="http://schemas.microsoft.com/office/word/2012/wordml" xmlns:wpg="http://schemas.microsoft.com/office/word/2010/wordprocessingGroup" xmlns:wpi="http://schemas.microsoft.com/office/word/2010/wordprocessingInk" xmlns:wne="http://schemas.microsoft.com/office/word/2006/wordml" xmlns:wps="http://schemas.microsoft.com/office/word/2010/wordprocessingShape" mc:Ignorable="w14 w15 wp14">
+<w:document xmlns:wpc="http://schemas.microsoft.com/office/word/2010/wordprocessingCanvas" xmlns:cx="http://schemas.microsoft.com/office/drawing/2014/chartex" xmlns:cx1="http://schemas.microsoft.com/office/drawing/2015/9/8/chartex" xmlns:cx2="http://schemas.microsoft.com/office/drawing/2015/10/21/chartex" xmlns:cx3="http://schemas.microsoft.com/office/drawing/2016/5/9/chartex" xmlns:cx4="http://schemas.microsoft.com/office/drawing/2016/5/10/chartex" xmlns:cx5="http://schemas.microsoft.com/office/drawing/2016/5/11/chartex" xmlns:cx6="http://schemas.microsoft.com/office/drawing/2016/5/12/chartex" xmlns:cx7="http://schemas.microsoft.com/office/drawing/2016/5/13/chartex" xmlns:cx8="http://schemas.microsoft.com/office/drawing/2016/5/14/chartex" xmlns:mc="http://schemas.openxmlformats.org/markup-compatibility/2006" xmlns:aink="http://schemas.microsoft.com/office/drawing/2016/ink" xmlns:am3d="http://schemas.microsoft.com/office/drawing/2017/model3d" xmlns:o="urn:schemas-microsoft-com:office:office" xmlns:oel="http://schemas.microsoft.com/office/2019/extlst" xmlns:r="http://schemas.openxmlformats.org/officeDocument/2006/relationships" xmlns:m="http://schemas.openxmlformats.org/officeDocument/2006/math" xmlns:v="urn:schemas-microsoft-com:vml" xmlns:wp14="http://schemas.microsoft.com/office/word/2010/wordprocessingDrawing" xmlns:wp="http://schemas.openxmlformats.org/drawingml/2006/wordprocessingDrawing" xmlns:w10="urn:schemas-microsoft-com:office:word" xmlns:w="http://schemas.openxmlformats.org/wordprocessingml/2006/main" xmlns:w14="http://schemas.microsoft.com/office/word/2010/wordml" xmlns:w15="http://schemas.microsoft.com/office/word/2012/wordml" xmlns:w16cex="http://schemas.microsoft.com/office/word/2018/wordml/cex" xmlns:w16cid="http://schemas.microsoft.com/office/word/2016/wordml/cid" xmlns:w16="http://schemas.microsoft.com/office/word/2018/wordml" xmlns:w16du="http://schemas.microsoft.com/office/word/2023/wordml/word16du" xmlns:w16sdtdh="http://schemas.microsoft.com/office/word/2020/wordml/sdtdatahash" xmlns:w16sdtfl="http://schemas.microsoft.com/office/word/2024/wordml/sdtformatlock" xmlns:w16se="http://schemas.microsoft.com/office/word/2015/wordml/symex" xmlns:wpg="http://schemas.microsoft.com/office/word/2010/wordprocessingGroup" xmlns:wpi="http://schemas.microsoft.com/office/word/2010/wordprocessingInk" xmlns:wne="http://schemas.microsoft.com/office/word/2006/wordml" xmlns:wps="http://schemas.microsoft.com/office/word/2010/wordprocessingShape" mc:Ignorable="w14 w15 w16se w16cid w16 w16cex w16sdtdh w16sdtfl w16du wp14">
   <w:body>
     <w:p>
       <w:pPr>
@@ -428,7 +428,7 @@
     <w:p/>
     <w:tbl>
       <w:tblPr>
-        <w:tblW w:w="10078" w:type="dxa"/>
+        <w:tblW w:w="8900" w:type="dxa"/>
         <w:tblBorders>
           <w:top w:val="single" w:sz="4" w:space="0" w:color="auto"/>
           <w:left w:val="single" w:sz="4" w:space="0" w:color="auto"/>
@@ -444,26 +444,26 @@
         <w:tblLook w:val="04A0" w:firstRow="1" w:lastRow="0" w:firstColumn="1" w:lastColumn="0" w:noHBand="0" w:noVBand="1"/>
       </w:tblPr>
       <w:tblGrid>
-        <w:gridCol w:w="415"/>
-        <w:gridCol w:w="1044"/>
-        <w:gridCol w:w="1466"/>
-        <w:gridCol w:w="1409"/>
-        <w:gridCol w:w="980"/>
-        <w:gridCol w:w="980"/>
-        <w:gridCol w:w="2557"/>
-        <w:gridCol w:w="1227"/>
+        <w:gridCol w:w="452"/>
+        <w:gridCol w:w="985"/>
+        <w:gridCol w:w="1208"/>
+        <w:gridCol w:w="1663"/>
+        <w:gridCol w:w="1141"/>
+        <w:gridCol w:w="1141"/>
+        <w:gridCol w:w="974"/>
+        <w:gridCol w:w="1441"/>
       </w:tblGrid>
       <w:tr>
         <w:tc>
           <w:tcPr>
-            <w:tcW w:w="443" w:type="dxa"/>
-            <w:tcBorders>
-              <w:top w:val="single" w:sz="1" w:space="0" w:color="AAAAAA"/>
-              <w:left w:val="single" w:sz="1" w:space="0" w:color="AAAAAA"/>
-              <w:bottom w:val="single" w:sz="1" w:space="0" w:color="AAAAAA"/>
-              <w:right w:val="single" w:sz="1" w:space="0" w:color="AAAAAA"/>
-            </w:tcBorders>
-            <w:shd w:val="clear" w:color="auto" w:fill="1F3864" w:themeFill="accent1" w:themeFillShade="80"/>
+            <w:tcW w:w="500" w:type="dxa"/>
+            <w:tcBorders>
+              <w:top w:val="single" w:sz="1" w:space="0" w:color="AAAAAA"/>
+              <w:left w:val="single" w:sz="1" w:space="0" w:color="AAAAAA"/>
+              <w:bottom w:val="single" w:sz="1" w:space="0" w:color="AAAAAA"/>
+              <w:right w:val="single" w:sz="1" w:space="0" w:color="AAAAAA"/>
+            </w:tcBorders>
+            <w:shd w:val="clear" w:color="auto" w:fill="1F3864"/>
             <w:tcMar>
               <w:top w:w="80" w:type="dxa"/>
               <w:left w:w="120" w:type="dxa"/>
@@ -490,14 +490,14 @@
         </w:tc>
         <w:tc>
           <w:tcPr>
-            <w:tcW w:w="1180" w:type="dxa"/>
-            <w:tcBorders>
-              <w:top w:val="single" w:sz="1" w:space="0" w:color="AAAAAA"/>
-              <w:left w:val="single" w:sz="1" w:space="0" w:color="AAAAAA"/>
-              <w:bottom w:val="single" w:sz="1" w:space="0" w:color="AAAAAA"/>
-              <w:right w:val="single" w:sz="1" w:space="0" w:color="AAAAAA"/>
-            </w:tcBorders>
-            <w:shd w:val="clear" w:color="auto" w:fill="1F3864" w:themeFill="accent1" w:themeFillShade="80"/>
+            <w:tcW w:w="1400" w:type="dxa"/>
+            <w:tcBorders>
+              <w:top w:val="single" w:sz="1" w:space="0" w:color="AAAAAA"/>
+              <w:left w:val="single" w:sz="1" w:space="0" w:color="AAAAAA"/>
+              <w:bottom w:val="single" w:sz="1" w:space="0" w:color="AAAAAA"/>
+              <w:right w:val="single" w:sz="1" w:space="0" w:color="AAAAAA"/>
+            </w:tcBorders>
+            <w:shd w:val="clear" w:color="auto" w:fill="1F3864"/>
             <w:tcMar>
               <w:top w:w="80" w:type="dxa"/>
               <w:left w:w="120" w:type="dxa"/>
@@ -524,14 +524,14 @@
         </w:tc>
         <w:tc>
           <w:tcPr>
-            <w:tcW w:w="1263" w:type="dxa"/>
-            <w:tcBorders>
-              <w:top w:val="single" w:sz="1" w:space="0" w:color="AAAAAA"/>
-              <w:left w:val="single" w:sz="1" w:space="0" w:color="AAAAAA"/>
-              <w:bottom w:val="single" w:sz="1" w:space="0" w:color="AAAAAA"/>
-              <w:right w:val="single" w:sz="1" w:space="0" w:color="AAAAAA"/>
-            </w:tcBorders>
-            <w:shd w:val="clear" w:color="auto" w:fill="1F3864" w:themeFill="accent1" w:themeFillShade="80"/>
+            <w:tcW w:w="1400" w:type="dxa"/>
+            <w:tcBorders>
+              <w:top w:val="single" w:sz="1" w:space="0" w:color="AAAAAA"/>
+              <w:left w:val="single" w:sz="1" w:space="0" w:color="AAAAAA"/>
+              <w:bottom w:val="single" w:sz="1" w:space="0" w:color="AAAAAA"/>
+              <w:right w:val="single" w:sz="1" w:space="0" w:color="AAAAAA"/>
+            </w:tcBorders>
+            <w:shd w:val="clear" w:color="auto" w:fill="1F3864"/>
             <w:tcMar>
               <w:top w:w="80" w:type="dxa"/>
               <w:left w:w="120" w:type="dxa"/>
@@ -558,14 +558,14 @@
         </w:tc>
         <w:tc>
           <w:tcPr>
-            <w:tcW w:w="1607" w:type="dxa"/>
-            <w:tcBorders>
-              <w:top w:val="single" w:sz="1" w:space="0" w:color="AAAAAA"/>
-              <w:left w:val="single" w:sz="1" w:space="0" w:color="AAAAAA"/>
-              <w:bottom w:val="single" w:sz="1" w:space="0" w:color="AAAAAA"/>
-              <w:right w:val="single" w:sz="1" w:space="0" w:color="AAAAAA"/>
-            </w:tcBorders>
-            <w:shd w:val="clear" w:color="auto" w:fill="1F3864" w:themeFill="accent1" w:themeFillShade="80"/>
+            <w:tcW w:w="1100" w:type="dxa"/>
+            <w:tcBorders>
+              <w:top w:val="single" w:sz="1" w:space="0" w:color="AAAAAA"/>
+              <w:left w:val="single" w:sz="1" w:space="0" w:color="AAAAAA"/>
+              <w:bottom w:val="single" w:sz="1" w:space="0" w:color="AAAAAA"/>
+              <w:right w:val="single" w:sz="1" w:space="0" w:color="AAAAAA"/>
+            </w:tcBorders>
+            <w:shd w:val="clear" w:color="auto" w:fill="1F3864"/>
             <w:tcMar>
               <w:top w:w="80" w:type="dxa"/>
               <w:left w:w="120" w:type="dxa"/>
@@ -592,14 +592,14 @@
         </w:tc>
         <w:tc>
           <w:tcPr>
-            <w:tcW w:w="1106" w:type="dxa"/>
-            <w:tcBorders>
-              <w:top w:val="single" w:sz="1" w:space="0" w:color="AAAAAA"/>
-              <w:left w:val="single" w:sz="1" w:space="0" w:color="AAAAAA"/>
-              <w:bottom w:val="single" w:sz="1" w:space="0" w:color="AAAAAA"/>
-              <w:right w:val="single" w:sz="1" w:space="0" w:color="AAAAAA"/>
-            </w:tcBorders>
-            <w:shd w:val="clear" w:color="auto" w:fill="1F3864" w:themeFill="accent1" w:themeFillShade="80"/>
+            <w:tcW w:w="1200" w:type="dxa"/>
+            <w:tcBorders>
+              <w:top w:val="single" w:sz="1" w:space="0" w:color="AAAAAA"/>
+              <w:left w:val="single" w:sz="1" w:space="0" w:color="AAAAAA"/>
+              <w:bottom w:val="single" w:sz="1" w:space="0" w:color="AAAAAA"/>
+              <w:right w:val="single" w:sz="1" w:space="0" w:color="AAAAAA"/>
+            </w:tcBorders>
+            <w:shd w:val="clear" w:color="auto" w:fill="1F3864"/>
             <w:tcMar>
               <w:top w:w="80" w:type="dxa"/>
               <w:left w:w="120" w:type="dxa"/>
@@ -626,14 +626,14 @@
         </w:tc>
         <w:tc>
           <w:tcPr>
-            <w:tcW w:w="1106" w:type="dxa"/>
-            <w:tcBorders>
-              <w:top w:val="single" w:sz="1" w:space="0" w:color="AAAAAA"/>
-              <w:left w:val="single" w:sz="1" w:space="0" w:color="AAAAAA"/>
-              <w:bottom w:val="single" w:sz="1" w:space="0" w:color="AAAAAA"/>
-              <w:right w:val="single" w:sz="1" w:space="0" w:color="AAAAAA"/>
-            </w:tcBorders>
-            <w:shd w:val="clear" w:color="auto" w:fill="1F3864" w:themeFill="accent1" w:themeFillShade="80"/>
+            <w:tcW w:w="1200" w:type="dxa"/>
+            <w:tcBorders>
+              <w:top w:val="single" w:sz="1" w:space="0" w:color="AAAAAA"/>
+              <w:left w:val="single" w:sz="1" w:space="0" w:color="AAAAAA"/>
+              <w:bottom w:val="single" w:sz="1" w:space="0" w:color="AAAAAA"/>
+              <w:right w:val="single" w:sz="1" w:space="0" w:color="AAAAAA"/>
+            </w:tcBorders>
+            <w:shd w:val="clear" w:color="auto" w:fill="1F3864"/>
             <w:tcMar>
               <w:top w:w="80" w:type="dxa"/>
               <w:left w:w="120" w:type="dxa"/>
@@ -660,14 +660,14 @@
         </w:tc>
         <w:tc>
           <w:tcPr>
-            <w:tcW w:w="1979" w:type="dxa"/>
-            <w:tcBorders>
-              <w:top w:val="single" w:sz="1" w:space="0" w:color="AAAAAA"/>
-              <w:left w:val="single" w:sz="1" w:space="0" w:color="AAAAAA"/>
-              <w:bottom w:val="single" w:sz="1" w:space="0" w:color="AAAAAA"/>
-              <w:right w:val="single" w:sz="1" w:space="0" w:color="AAAAAA"/>
-            </w:tcBorders>
-            <w:shd w:val="clear" w:color="auto" w:fill="1F3864" w:themeFill="accent1" w:themeFillShade="80"/>
+            <w:tcW w:w="1200" w:type="dxa"/>
+            <w:tcBorders>
+              <w:top w:val="single" w:sz="1" w:space="0" w:color="AAAAAA"/>
+              <w:left w:val="single" w:sz="1" w:space="0" w:color="AAAAAA"/>
+              <w:bottom w:val="single" w:sz="1" w:space="0" w:color="AAAAAA"/>
+              <w:right w:val="single" w:sz="1" w:space="0" w:color="AAAAAA"/>
+            </w:tcBorders>
+            <w:shd w:val="clear" w:color="auto" w:fill="1F3864"/>
             <w:tcMar>
               <w:top w:w="80" w:type="dxa"/>
               <w:left w:w="120" w:type="dxa"/>
@@ -694,14 +694,14 @@
         </w:tc>
         <w:tc>
           <w:tcPr>
-            <w:tcW w:w="1394" w:type="dxa"/>
-            <w:tcBorders>
-              <w:top w:val="single" w:sz="1" w:space="0" w:color="AAAAAA"/>
-              <w:left w:val="single" w:sz="1" w:space="0" w:color="AAAAAA"/>
-              <w:bottom w:val="single" w:sz="1" w:space="0" w:color="AAAAAA"/>
-              <w:right w:val="single" w:sz="1" w:space="0" w:color="AAAAAA"/>
-            </w:tcBorders>
-            <w:shd w:val="clear" w:color="auto" w:fill="1F3864" w:themeFill="accent1" w:themeFillShade="80"/>
+            <w:tcW w:w="900" w:type="dxa"/>
+            <w:tcBorders>
+              <w:top w:val="single" w:sz="1" w:space="0" w:color="AAAAAA"/>
+              <w:left w:val="single" w:sz="1" w:space="0" w:color="AAAAAA"/>
+              <w:bottom w:val="single" w:sz="1" w:space="0" w:color="AAAAAA"/>
+              <w:right w:val="single" w:sz="1" w:space="0" w:color="AAAAAA"/>
+            </w:tcBorders>
+            <w:shd w:val="clear" w:color="auto" w:fill="1F3864"/>
             <w:tcMar>
               <w:top w:w="80" w:type="dxa"/>
               <w:left w:w="120" w:type="dxa"/>
@@ -730,206 +730,169 @@
       <w:tr>
         <w:tc>
           <w:tcPr>
-            <w:tcW w:w="443" w:type="dxa"/>
-            <w:tcBorders>
-              <w:top w:val="single" w:sz="1" w:space="0" w:color="AAAAAA"/>
-              <w:left w:val="single" w:sz="1" w:space="0" w:color="AAAAAA"/>
-              <w:bottom w:val="single" w:sz="1" w:space="0" w:color="AAAAAA"/>
-              <w:right w:val="single" w:sz="1" w:space="0" w:color="AAAAAA"/>
-            </w:tcBorders>
-            <w:shd w:val="clear" w:color="auto" w:fill="FFFFFF" w:themeFill="background1"/>
-            <w:tcMar>
-              <w:top w:w="80" w:type="dxa"/>
-              <w:left w:w="120" w:type="dxa"/>
-              <w:bottom w:w="80" w:type="dxa"/>
-              <w:right w:w="120" w:type="dxa"/>
-            </w:tcMar>
-            <w:vAlign w:val="center"/>
-          </w:tcPr>
-          <w:p>
-            <w:r>
-              <w:t>1</w:t>
-            </w:r>
-          </w:p>
-        </w:tc>
-        <w:tc>
-          <w:tcPr>
-            <w:tcW w:w="1180" w:type="dxa"/>
-            <w:tcBorders>
-              <w:top w:val="single" w:sz="1" w:space="0" w:color="AAAAAA"/>
-              <w:left w:val="single" w:sz="1" w:space="0" w:color="AAAAAA"/>
-              <w:bottom w:val="single" w:sz="1" w:space="0" w:color="AAAAAA"/>
-              <w:right w:val="single" w:sz="1" w:space="0" w:color="AAAAAA"/>
-            </w:tcBorders>
-            <w:shd w:val="clear" w:color="auto" w:fill="FFFFFF" w:themeFill="background1"/>
-            <w:tcMar>
-              <w:top w:w="80" w:type="dxa"/>
-              <w:left w:w="120" w:type="dxa"/>
-              <w:bottom w:w="80" w:type="dxa"/>
-              <w:right w:w="120" w:type="dxa"/>
-            </w:tcMar>
-            <w:vAlign w:val="center"/>
-          </w:tcPr>
-          <w:p>
-            <w:r>
-              <w:t>AbdulAziz</w:t>
-            </w:r>
-          </w:p>
-        </w:tc>
-        <w:tc>
-          <w:tcPr>
-            <w:tcW w:w="1263" w:type="dxa"/>
-            <w:tcBorders>
-              <w:top w:val="single" w:sz="1" w:space="0" w:color="AAAAAA"/>
-              <w:left w:val="single" w:sz="1" w:space="0" w:color="AAAAAA"/>
-              <w:bottom w:val="single" w:sz="1" w:space="0" w:color="AAAAAA"/>
-              <w:right w:val="single" w:sz="1" w:space="0" w:color="AAAAAA"/>
-            </w:tcBorders>
-            <w:shd w:val="clear" w:color="auto" w:fill="FFFFFF" w:themeFill="background1"/>
-            <w:tcMar>
-              <w:top w:w="80" w:type="dxa"/>
-              <w:left w:w="120" w:type="dxa"/>
-              <w:bottom w:w="80" w:type="dxa"/>
-              <w:right w:w="120" w:type="dxa"/>
-            </w:tcMar>
-            <w:vAlign w:val="center"/>
-          </w:tcPr>
-          <w:p>
-            <w:r>
-              <w:t>Aziz6587-cell</w:t>
-            </w:r>
-          </w:p>
-        </w:tc>
-        <w:tc>
-          <w:tcPr>
-            <w:tcW w:w="1607" w:type="dxa"/>
-            <w:tcBorders>
-              <w:top w:val="single" w:sz="1" w:space="0" w:color="AAAAAA"/>
-              <w:left w:val="single" w:sz="1" w:space="0" w:color="AAAAAA"/>
-              <w:bottom w:val="single" w:sz="1" w:space="0" w:color="AAAAAA"/>
-              <w:right w:val="single" w:sz="1" w:space="0" w:color="AAAAAA"/>
-            </w:tcBorders>
-            <w:shd w:val="clear" w:color="auto" w:fill="FFFFFF" w:themeFill="background1"/>
-            <w:tcMar>
-              <w:top w:w="80" w:type="dxa"/>
-              <w:left w:w="120" w:type="dxa"/>
-              <w:bottom w:w="80" w:type="dxa"/>
-              <w:right w:w="120" w:type="dxa"/>
-            </w:tcMar>
-            <w:vAlign w:val="center"/>
-          </w:tcPr>
-          <w:p>
-            <w:r>
-              <w:t>Lead</w:t>
-            </w:r>
-          </w:p>
-        </w:tc>
-        <w:tc>
-          <w:tcPr>
-            <w:tcW w:w="1106" w:type="dxa"/>
-            <w:tcBorders>
-              <w:top w:val="single" w:sz="1" w:space="0" w:color="AAAAAA"/>
-              <w:left w:val="single" w:sz="1" w:space="0" w:color="AAAAAA"/>
-              <w:bottom w:val="single" w:sz="1" w:space="0" w:color="AAAAAA"/>
-              <w:right w:val="single" w:sz="1" w:space="0" w:color="AAAAAA"/>
-            </w:tcBorders>
-            <w:shd w:val="clear" w:color="auto" w:fill="FFFFFF" w:themeFill="background1"/>
-            <w:tcMar>
-              <w:top w:w="80" w:type="dxa"/>
-              <w:left w:w="120" w:type="dxa"/>
-              <w:bottom w:w="80" w:type="dxa"/>
-              <w:right w:w="120" w:type="dxa"/>
-            </w:tcMar>
-            <w:vAlign w:val="center"/>
-          </w:tcPr>
-          <w:p>
-            <w:r>
-              <w:t>ci-dev</w:t>
-            </w:r>
-          </w:p>
-          <w:p>
-            <w:r>
-              <w:t>cd-prod</w:t>
-            </w:r>
-          </w:p>
-        </w:tc>
-        <w:tc>
-          <w:tcPr>
-            <w:tcW w:w="1106" w:type="dxa"/>
-            <w:tcBorders>
-              <w:top w:val="single" w:sz="1" w:space="0" w:color="AAAAAA"/>
-              <w:left w:val="single" w:sz="1" w:space="0" w:color="AAAAAA"/>
-              <w:bottom w:val="single" w:sz="1" w:space="0" w:color="AAAAAA"/>
-              <w:right w:val="single" w:sz="1" w:space="0" w:color="AAAAAA"/>
-            </w:tcBorders>
-            <w:shd w:val="clear" w:color="auto" w:fill="FFFFFF" w:themeFill="background1"/>
-            <w:tcMar>
-              <w:top w:w="80" w:type="dxa"/>
-              <w:left w:w="120" w:type="dxa"/>
-              <w:bottom w:w="80" w:type="dxa"/>
-              <w:right w:w="120" w:type="dxa"/>
-            </w:tcMar>
-            <w:vAlign w:val="center"/>
-          </w:tcPr>
-          <w:p>
-            <w:r>
-              <w:t>index</w:t>
-            </w:r>
-          </w:p>
-        </w:tc>
-        <w:tc>
-          <w:tcPr>
-            <w:tcW w:w="1979" w:type="dxa"/>
-            <w:tcBorders>
-              <w:top w:val="single" w:sz="1" w:space="0" w:color="AAAAAA"/>
-              <w:left w:val="single" w:sz="1" w:space="0" w:color="AAAAAA"/>
-              <w:bottom w:val="single" w:sz="1" w:space="0" w:color="AAAAAA"/>
-              <w:right w:val="single" w:sz="1" w:space="0" w:color="AAAAAA"/>
-            </w:tcBorders>
-            <w:shd w:val="clear" w:color="auto" w:fill="FFFFFF" w:themeFill="background1"/>
-            <w:tcMar>
-              <w:top w:w="80" w:type="dxa"/>
-              <w:left w:w="120" w:type="dxa"/>
-              <w:bottom w:w="80" w:type="dxa"/>
-              <w:right w:w="120" w:type="dxa"/>
-            </w:tcMar>
-            <w:vAlign w:val="center"/>
-          </w:tcPr>
-          <w:p>
-            <w:r>
-              <w:t>features/aziz6587-cell/index</w:t>
-            </w:r>
-          </w:p>
-        </w:tc>
-        <w:tc>
-          <w:tcPr>
-            <w:tcW w:w="1394" w:type="dxa"/>
-            <w:tcBorders>
-              <w:top w:val="single" w:sz="1" w:space="0" w:color="AAAAAA"/>
-              <w:left w:val="single" w:sz="1" w:space="0" w:color="AAAAAA"/>
-              <w:bottom w:val="single" w:sz="1" w:space="0" w:color="AAAAAA"/>
-              <w:right w:val="single" w:sz="1" w:space="0" w:color="AAAAAA"/>
-            </w:tcBorders>
-            <w:shd w:val="clear" w:color="auto" w:fill="FFFFFF" w:themeFill="background1"/>
-            <w:tcMar>
-              <w:top w:w="80" w:type="dxa"/>
-              <w:left w:w="120" w:type="dxa"/>
-              <w:bottom w:w="80" w:type="dxa"/>
-              <w:right w:w="120" w:type="dxa"/>
-            </w:tcMar>
-            <w:vAlign w:val="center"/>
-          </w:tcPr>
-          <w:p>
-            <w:r>
-              <w:t>N</w:t>
-            </w:r>
-          </w:p>
+            <w:tcW w:w="500" w:type="dxa"/>
+            <w:tcBorders>
+              <w:top w:val="single" w:sz="1" w:space="0" w:color="AAAAAA"/>
+              <w:left w:val="single" w:sz="1" w:space="0" w:color="AAAAAA"/>
+              <w:bottom w:val="single" w:sz="1" w:space="0" w:color="AAAAAA"/>
+              <w:right w:val="single" w:sz="1" w:space="0" w:color="AAAAAA"/>
+            </w:tcBorders>
+            <w:shd w:val="clear" w:color="auto" w:fill="FFFFFF"/>
+            <w:tcMar>
+              <w:top w:w="80" w:type="dxa"/>
+              <w:left w:w="120" w:type="dxa"/>
+              <w:bottom w:w="80" w:type="dxa"/>
+              <w:right w:w="120" w:type="dxa"/>
+            </w:tcMar>
+            <w:vAlign w:val="center"/>
+          </w:tcPr>
+          <w:p/>
+        </w:tc>
+        <w:tc>
+          <w:tcPr>
+            <w:tcW w:w="1400" w:type="dxa"/>
+            <w:tcBorders>
+              <w:top w:val="single" w:sz="1" w:space="0" w:color="AAAAAA"/>
+              <w:left w:val="single" w:sz="1" w:space="0" w:color="AAAAAA"/>
+              <w:bottom w:val="single" w:sz="1" w:space="0" w:color="AAAAAA"/>
+              <w:right w:val="single" w:sz="1" w:space="0" w:color="AAAAAA"/>
+            </w:tcBorders>
+            <w:shd w:val="clear" w:color="auto" w:fill="FFFFFF"/>
+            <w:tcMar>
+              <w:top w:w="80" w:type="dxa"/>
+              <w:left w:w="120" w:type="dxa"/>
+              <w:bottom w:w="80" w:type="dxa"/>
+              <w:right w:w="120" w:type="dxa"/>
+            </w:tcMar>
+            <w:vAlign w:val="center"/>
+          </w:tcPr>
+          <w:p/>
+        </w:tc>
+        <w:tc>
+          <w:tcPr>
+            <w:tcW w:w="1400" w:type="dxa"/>
+            <w:tcBorders>
+              <w:top w:val="single" w:sz="1" w:space="0" w:color="AAAAAA"/>
+              <w:left w:val="single" w:sz="1" w:space="0" w:color="AAAAAA"/>
+              <w:bottom w:val="single" w:sz="1" w:space="0" w:color="AAAAAA"/>
+              <w:right w:val="single" w:sz="1" w:space="0" w:color="AAAAAA"/>
+            </w:tcBorders>
+            <w:shd w:val="clear" w:color="auto" w:fill="FFFFFF"/>
+            <w:tcMar>
+              <w:top w:w="80" w:type="dxa"/>
+              <w:left w:w="120" w:type="dxa"/>
+              <w:bottom w:w="80" w:type="dxa"/>
+              <w:right w:w="120" w:type="dxa"/>
+            </w:tcMar>
+            <w:vAlign w:val="center"/>
+          </w:tcPr>
+          <w:p/>
+        </w:tc>
+        <w:tc>
+          <w:tcPr>
+            <w:tcW w:w="1100" w:type="dxa"/>
+            <w:tcBorders>
+              <w:top w:val="single" w:sz="1" w:space="0" w:color="AAAAAA"/>
+              <w:left w:val="single" w:sz="1" w:space="0" w:color="AAAAAA"/>
+              <w:bottom w:val="single" w:sz="1" w:space="0" w:color="AAAAAA"/>
+              <w:right w:val="single" w:sz="1" w:space="0" w:color="AAAAAA"/>
+            </w:tcBorders>
+            <w:shd w:val="clear" w:color="auto" w:fill="FFFFFF"/>
+            <w:tcMar>
+              <w:top w:w="80" w:type="dxa"/>
+              <w:left w:w="120" w:type="dxa"/>
+              <w:bottom w:w="80" w:type="dxa"/>
+              <w:right w:w="120" w:type="dxa"/>
+            </w:tcMar>
+            <w:vAlign w:val="center"/>
+          </w:tcPr>
+          <w:p/>
+        </w:tc>
+        <w:tc>
+          <w:tcPr>
+            <w:tcW w:w="1200" w:type="dxa"/>
+            <w:tcBorders>
+              <w:top w:val="single" w:sz="1" w:space="0" w:color="AAAAAA"/>
+              <w:left w:val="single" w:sz="1" w:space="0" w:color="AAAAAA"/>
+              <w:bottom w:val="single" w:sz="1" w:space="0" w:color="AAAAAA"/>
+              <w:right w:val="single" w:sz="1" w:space="0" w:color="AAAAAA"/>
+            </w:tcBorders>
+            <w:shd w:val="clear" w:color="auto" w:fill="FFFFFF"/>
+            <w:tcMar>
+              <w:top w:w="80" w:type="dxa"/>
+              <w:left w:w="120" w:type="dxa"/>
+              <w:bottom w:w="80" w:type="dxa"/>
+              <w:right w:w="120" w:type="dxa"/>
+            </w:tcMar>
+            <w:vAlign w:val="center"/>
+          </w:tcPr>
+          <w:p/>
+        </w:tc>
+        <w:tc>
+          <w:tcPr>
+            <w:tcW w:w="1200" w:type="dxa"/>
+            <w:tcBorders>
+              <w:top w:val="single" w:sz="1" w:space="0" w:color="AAAAAA"/>
+              <w:left w:val="single" w:sz="1" w:space="0" w:color="AAAAAA"/>
+              <w:bottom w:val="single" w:sz="1" w:space="0" w:color="AAAAAA"/>
+              <w:right w:val="single" w:sz="1" w:space="0" w:color="AAAAAA"/>
+            </w:tcBorders>
+            <w:shd w:val="clear" w:color="auto" w:fill="FFFFFF"/>
+            <w:tcMar>
+              <w:top w:w="80" w:type="dxa"/>
+              <w:left w:w="120" w:type="dxa"/>
+              <w:bottom w:w="80" w:type="dxa"/>
+              <w:right w:w="120" w:type="dxa"/>
+            </w:tcMar>
+            <w:vAlign w:val="center"/>
+          </w:tcPr>
+          <w:p/>
+        </w:tc>
+        <w:tc>
+          <w:tcPr>
+            <w:tcW w:w="1200" w:type="dxa"/>
+            <w:tcBorders>
+              <w:top w:val="single" w:sz="1" w:space="0" w:color="AAAAAA"/>
+              <w:left w:val="single" w:sz="1" w:space="0" w:color="AAAAAA"/>
+              <w:bottom w:val="single" w:sz="1" w:space="0" w:color="AAAAAA"/>
+              <w:right w:val="single" w:sz="1" w:space="0" w:color="AAAAAA"/>
+            </w:tcBorders>
+            <w:shd w:val="clear" w:color="auto" w:fill="FFFFFF"/>
+            <w:tcMar>
+              <w:top w:w="80" w:type="dxa"/>
+              <w:left w:w="120" w:type="dxa"/>
+              <w:bottom w:w="80" w:type="dxa"/>
+              <w:right w:w="120" w:type="dxa"/>
+            </w:tcMar>
+            <w:vAlign w:val="center"/>
+          </w:tcPr>
+          <w:p/>
+        </w:tc>
+        <w:tc>
+          <w:tcPr>
+            <w:tcW w:w="900" w:type="dxa"/>
+            <w:tcBorders>
+              <w:top w:val="single" w:sz="1" w:space="0" w:color="AAAAAA"/>
+              <w:left w:val="single" w:sz="1" w:space="0" w:color="AAAAAA"/>
+              <w:bottom w:val="single" w:sz="1" w:space="0" w:color="AAAAAA"/>
+              <w:right w:val="single" w:sz="1" w:space="0" w:color="AAAAAA"/>
+            </w:tcBorders>
+            <w:shd w:val="clear" w:color="auto" w:fill="FFFFFF"/>
+            <w:tcMar>
+              <w:top w:w="80" w:type="dxa"/>
+              <w:left w:w="120" w:type="dxa"/>
+              <w:bottom w:w="80" w:type="dxa"/>
+              <w:right w:w="120" w:type="dxa"/>
+            </w:tcMar>
+            <w:vAlign w:val="center"/>
+          </w:tcPr>
+          <w:p/>
         </w:tc>
       </w:tr>
       <w:tr>
         <w:tc>
           <w:tcPr>
-            <w:tcW w:w="443" w:type="dxa"/>
+            <w:tcW w:w="500" w:type="dxa"/>
             <w:tcBorders>
               <w:top w:val="single" w:sz="1" w:space="0" w:color="AAAAAA"/>
               <w:left w:val="single" w:sz="1" w:space="0" w:color="AAAAAA"/>
@@ -949,195 +912,156 @@
         </w:tc>
         <w:tc>
           <w:tcPr>
-            <w:tcW w:w="1180" w:type="dxa"/>
-            <w:tcBorders>
-              <w:top w:val="single" w:sz="1" w:space="0" w:color="AAAAAA"/>
-              <w:left w:val="single" w:sz="1" w:space="0" w:color="AAAAAA"/>
-              <w:bottom w:val="single" w:sz="1" w:space="0" w:color="AAAAAA"/>
-              <w:right w:val="single" w:sz="1" w:space="0" w:color="AAAAAA"/>
-            </w:tcBorders>
-            <w:shd w:val="clear" w:color="auto" w:fill="EBF3FA"/>
-            <w:tcMar>
-              <w:top w:w="80" w:type="dxa"/>
-              <w:left w:w="120" w:type="dxa"/>
-              <w:bottom w:w="80" w:type="dxa"/>
-              <w:right w:w="120" w:type="dxa"/>
-            </w:tcMar>
-            <w:vAlign w:val="center"/>
-          </w:tcPr>
-          <w:p>
-            <w:r>
-              <w:t>Haris Mahmood</w:t>
-            </w:r>
-          </w:p>
-        </w:tc>
-        <w:tc>
-          <w:tcPr>
-            <w:tcW w:w="1263" w:type="dxa"/>
-            <w:tcBorders>
-              <w:top w:val="single" w:sz="1" w:space="0" w:color="AAAAAA"/>
-              <w:left w:val="single" w:sz="1" w:space="0" w:color="AAAAAA"/>
-              <w:bottom w:val="single" w:sz="1" w:space="0" w:color="AAAAAA"/>
-              <w:right w:val="single" w:sz="1" w:space="0" w:color="AAAAAA"/>
-            </w:tcBorders>
-            <w:shd w:val="clear" w:color="auto" w:fill="EBF3FA"/>
-            <w:tcMar>
-              <w:top w:w="80" w:type="dxa"/>
-              <w:left w:w="120" w:type="dxa"/>
-              <w:bottom w:w="80" w:type="dxa"/>
-              <w:right w:w="120" w:type="dxa"/>
-            </w:tcMar>
-            <w:vAlign w:val="center"/>
-          </w:tcPr>
-          <w:p>
-            <w:r>
-              <w:t>Notharry0</w:t>
-            </w:r>
-          </w:p>
-        </w:tc>
-        <w:tc>
-          <w:tcPr>
-            <w:tcW w:w="1607" w:type="dxa"/>
-            <w:tcBorders>
-              <w:top w:val="single" w:sz="1" w:space="0" w:color="AAAAAA"/>
-              <w:left w:val="single" w:sz="1" w:space="0" w:color="AAAAAA"/>
-              <w:bottom w:val="single" w:sz="1" w:space="0" w:color="AAAAAA"/>
-              <w:right w:val="single" w:sz="1" w:space="0" w:color="AAAAAA"/>
-            </w:tcBorders>
-            <w:shd w:val="clear" w:color="auto" w:fill="EBF3FA"/>
-            <w:tcMar>
-              <w:top w:w="80" w:type="dxa"/>
-              <w:left w:w="120" w:type="dxa"/>
-              <w:bottom w:w="80" w:type="dxa"/>
-              <w:right w:w="120" w:type="dxa"/>
-            </w:tcMar>
-            <w:vAlign w:val="center"/>
-          </w:tcPr>
-          <w:p>
-            <w:r>
-              <w:t>memBer</w:t>
-            </w:r>
-          </w:p>
-        </w:tc>
-        <w:tc>
-          <w:tcPr>
-            <w:tcW w:w="1106" w:type="dxa"/>
-            <w:tcBorders>
-              <w:top w:val="single" w:sz="1" w:space="0" w:color="AAAAAA"/>
-              <w:left w:val="single" w:sz="1" w:space="0" w:color="AAAAAA"/>
-              <w:bottom w:val="single" w:sz="1" w:space="0" w:color="AAAAAA"/>
-              <w:right w:val="single" w:sz="1" w:space="0" w:color="AAAAAA"/>
-            </w:tcBorders>
-            <w:shd w:val="clear" w:color="auto" w:fill="EBF3FA"/>
-            <w:tcMar>
-              <w:top w:w="80" w:type="dxa"/>
-              <w:left w:w="120" w:type="dxa"/>
-              <w:bottom w:w="80" w:type="dxa"/>
-              <w:right w:w="120" w:type="dxa"/>
-            </w:tcMar>
-            <w:vAlign w:val="center"/>
-          </w:tcPr>
-          <w:p>
-            <w:r>
-              <w:t xml:space="preserve">Ci_ </w:t>
-            </w:r>
-            <w:r>
-              <w:t>staging</w:t>
-            </w:r>
-          </w:p>
-        </w:tc>
-        <w:tc>
-          <w:tcPr>
-            <w:tcW w:w="1106" w:type="dxa"/>
-            <w:tcBorders>
-              <w:top w:val="single" w:sz="1" w:space="0" w:color="AAAAAA"/>
-              <w:left w:val="single" w:sz="1" w:space="0" w:color="AAAAAA"/>
-              <w:bottom w:val="single" w:sz="1" w:space="0" w:color="AAAAAA"/>
-              <w:right w:val="single" w:sz="1" w:space="0" w:color="AAAAAA"/>
-            </w:tcBorders>
-            <w:shd w:val="clear" w:color="auto" w:fill="EBF3FA"/>
-            <w:tcMar>
-              <w:top w:w="80" w:type="dxa"/>
-              <w:left w:w="120" w:type="dxa"/>
-              <w:bottom w:w="80" w:type="dxa"/>
-              <w:right w:w="120" w:type="dxa"/>
-            </w:tcMar>
-            <w:vAlign w:val="center"/>
-          </w:tcPr>
-          <w:p>
-            <w:r>
-              <w:t>karachi</w:t>
-            </w:r>
-          </w:p>
-        </w:tc>
-        <w:tc>
-          <w:tcPr>
-            <w:tcW w:w="1979" w:type="dxa"/>
-            <w:tcBorders>
-              <w:top w:val="single" w:sz="1" w:space="0" w:color="AAAAAA"/>
-              <w:left w:val="single" w:sz="1" w:space="0" w:color="AAAAAA"/>
-              <w:bottom w:val="single" w:sz="1" w:space="0" w:color="AAAAAA"/>
-              <w:right w:val="single" w:sz="1" w:space="0" w:color="AAAAAA"/>
-            </w:tcBorders>
-            <w:shd w:val="clear" w:color="auto" w:fill="EBF3FA"/>
-            <w:tcMar>
-              <w:top w:w="80" w:type="dxa"/>
-              <w:left w:w="120" w:type="dxa"/>
-              <w:bottom w:w="80" w:type="dxa"/>
-              <w:right w:w="120" w:type="dxa"/>
-            </w:tcMar>
-            <w:vAlign w:val="center"/>
-          </w:tcPr>
-          <w:p>
-            <w:r>
-              <w:rPr>
-                <w:rFonts w:ascii="Lucida Console" w:hAnsi="Lucida Console" w:cs="Lucida Console"/>
-                <w:color w:val="00A89A"/>
-                <w:sz w:val="18"/>
-                <w:szCs w:val="18"/>
-              </w:rPr>
-              <w:t>features/notharry0/karachi</w:t>
-            </w:r>
-          </w:p>
-        </w:tc>
-        <w:tc>
-          <w:tcPr>
-            <w:tcW w:w="1394" w:type="dxa"/>
-            <w:tcBorders>
-              <w:top w:val="single" w:sz="1" w:space="0" w:color="AAAAAA"/>
-              <w:left w:val="single" w:sz="1" w:space="0" w:color="AAAAAA"/>
-              <w:bottom w:val="single" w:sz="1" w:space="0" w:color="AAAAAA"/>
-              <w:right w:val="single" w:sz="1" w:space="0" w:color="AAAAAA"/>
-            </w:tcBorders>
-            <w:shd w:val="clear" w:color="auto" w:fill="EBF3FA"/>
-            <w:tcMar>
-              <w:top w:w="80" w:type="dxa"/>
-              <w:left w:w="120" w:type="dxa"/>
-              <w:bottom w:w="80" w:type="dxa"/>
-              <w:right w:w="120" w:type="dxa"/>
-            </w:tcMar>
-            <w:vAlign w:val="center"/>
-          </w:tcPr>
-          <w:p>
-            <w:r>
-              <w:t>N</w:t>
-            </w:r>
-            <w:bookmarkStart w:id="0" w:name="_GoBack"/>
-            <w:bookmarkEnd w:id="0"/>
-          </w:p>
+            <w:tcW w:w="1400" w:type="dxa"/>
+            <w:tcBorders>
+              <w:top w:val="single" w:sz="1" w:space="0" w:color="AAAAAA"/>
+              <w:left w:val="single" w:sz="1" w:space="0" w:color="AAAAAA"/>
+              <w:bottom w:val="single" w:sz="1" w:space="0" w:color="AAAAAA"/>
+              <w:right w:val="single" w:sz="1" w:space="0" w:color="AAAAAA"/>
+            </w:tcBorders>
+            <w:shd w:val="clear" w:color="auto" w:fill="EBF3FA"/>
+            <w:tcMar>
+              <w:top w:w="80" w:type="dxa"/>
+              <w:left w:w="120" w:type="dxa"/>
+              <w:bottom w:w="80" w:type="dxa"/>
+              <w:right w:w="120" w:type="dxa"/>
+            </w:tcMar>
+            <w:vAlign w:val="center"/>
+          </w:tcPr>
+          <w:p/>
+        </w:tc>
+        <w:tc>
+          <w:tcPr>
+            <w:tcW w:w="1400" w:type="dxa"/>
+            <w:tcBorders>
+              <w:top w:val="single" w:sz="1" w:space="0" w:color="AAAAAA"/>
+              <w:left w:val="single" w:sz="1" w:space="0" w:color="AAAAAA"/>
+              <w:bottom w:val="single" w:sz="1" w:space="0" w:color="AAAAAA"/>
+              <w:right w:val="single" w:sz="1" w:space="0" w:color="AAAAAA"/>
+            </w:tcBorders>
+            <w:shd w:val="clear" w:color="auto" w:fill="EBF3FA"/>
+            <w:tcMar>
+              <w:top w:w="80" w:type="dxa"/>
+              <w:left w:w="120" w:type="dxa"/>
+              <w:bottom w:w="80" w:type="dxa"/>
+              <w:right w:w="120" w:type="dxa"/>
+            </w:tcMar>
+            <w:vAlign w:val="center"/>
+          </w:tcPr>
+          <w:p/>
+        </w:tc>
+        <w:tc>
+          <w:tcPr>
+            <w:tcW w:w="1100" w:type="dxa"/>
+            <w:tcBorders>
+              <w:top w:val="single" w:sz="1" w:space="0" w:color="AAAAAA"/>
+              <w:left w:val="single" w:sz="1" w:space="0" w:color="AAAAAA"/>
+              <w:bottom w:val="single" w:sz="1" w:space="0" w:color="AAAAAA"/>
+              <w:right w:val="single" w:sz="1" w:space="0" w:color="AAAAAA"/>
+            </w:tcBorders>
+            <w:shd w:val="clear" w:color="auto" w:fill="EBF3FA"/>
+            <w:tcMar>
+              <w:top w:w="80" w:type="dxa"/>
+              <w:left w:w="120" w:type="dxa"/>
+              <w:bottom w:w="80" w:type="dxa"/>
+              <w:right w:w="120" w:type="dxa"/>
+            </w:tcMar>
+            <w:vAlign w:val="center"/>
+          </w:tcPr>
+          <w:p/>
+        </w:tc>
+        <w:tc>
+          <w:tcPr>
+            <w:tcW w:w="1200" w:type="dxa"/>
+            <w:tcBorders>
+              <w:top w:val="single" w:sz="1" w:space="0" w:color="AAAAAA"/>
+              <w:left w:val="single" w:sz="1" w:space="0" w:color="AAAAAA"/>
+              <w:bottom w:val="single" w:sz="1" w:space="0" w:color="AAAAAA"/>
+              <w:right w:val="single" w:sz="1" w:space="0" w:color="AAAAAA"/>
+            </w:tcBorders>
+            <w:shd w:val="clear" w:color="auto" w:fill="EBF3FA"/>
+            <w:tcMar>
+              <w:top w:w="80" w:type="dxa"/>
+              <w:left w:w="120" w:type="dxa"/>
+              <w:bottom w:w="80" w:type="dxa"/>
+              <w:right w:w="120" w:type="dxa"/>
+            </w:tcMar>
+            <w:vAlign w:val="center"/>
+          </w:tcPr>
+          <w:p/>
+        </w:tc>
+        <w:tc>
+          <w:tcPr>
+            <w:tcW w:w="1200" w:type="dxa"/>
+            <w:tcBorders>
+              <w:top w:val="single" w:sz="1" w:space="0" w:color="AAAAAA"/>
+              <w:left w:val="single" w:sz="1" w:space="0" w:color="AAAAAA"/>
+              <w:bottom w:val="single" w:sz="1" w:space="0" w:color="AAAAAA"/>
+              <w:right w:val="single" w:sz="1" w:space="0" w:color="AAAAAA"/>
+            </w:tcBorders>
+            <w:shd w:val="clear" w:color="auto" w:fill="EBF3FA"/>
+            <w:tcMar>
+              <w:top w:w="80" w:type="dxa"/>
+              <w:left w:w="120" w:type="dxa"/>
+              <w:bottom w:w="80" w:type="dxa"/>
+              <w:right w:w="120" w:type="dxa"/>
+            </w:tcMar>
+            <w:vAlign w:val="center"/>
+          </w:tcPr>
+          <w:p/>
+        </w:tc>
+        <w:tc>
+          <w:tcPr>
+            <w:tcW w:w="1200" w:type="dxa"/>
+            <w:tcBorders>
+              <w:top w:val="single" w:sz="1" w:space="0" w:color="AAAAAA"/>
+              <w:left w:val="single" w:sz="1" w:space="0" w:color="AAAAAA"/>
+              <w:bottom w:val="single" w:sz="1" w:space="0" w:color="AAAAAA"/>
+              <w:right w:val="single" w:sz="1" w:space="0" w:color="AAAAAA"/>
+            </w:tcBorders>
+            <w:shd w:val="clear" w:color="auto" w:fill="EBF3FA"/>
+            <w:tcMar>
+              <w:top w:w="80" w:type="dxa"/>
+              <w:left w:w="120" w:type="dxa"/>
+              <w:bottom w:w="80" w:type="dxa"/>
+              <w:right w:w="120" w:type="dxa"/>
+            </w:tcMar>
+            <w:vAlign w:val="center"/>
+          </w:tcPr>
+          <w:p/>
+        </w:tc>
+        <w:tc>
+          <w:tcPr>
+            <w:tcW w:w="900" w:type="dxa"/>
+            <w:tcBorders>
+              <w:top w:val="single" w:sz="1" w:space="0" w:color="AAAAAA"/>
+              <w:left w:val="single" w:sz="1" w:space="0" w:color="AAAAAA"/>
+              <w:bottom w:val="single" w:sz="1" w:space="0" w:color="AAAAAA"/>
+              <w:right w:val="single" w:sz="1" w:space="0" w:color="AAAAAA"/>
+            </w:tcBorders>
+            <w:shd w:val="clear" w:color="auto" w:fill="EBF3FA"/>
+            <w:tcMar>
+              <w:top w:w="80" w:type="dxa"/>
+              <w:left w:w="120" w:type="dxa"/>
+              <w:bottom w:w="80" w:type="dxa"/>
+              <w:right w:w="120" w:type="dxa"/>
+            </w:tcMar>
+            <w:vAlign w:val="center"/>
+          </w:tcPr>
+          <w:p/>
         </w:tc>
       </w:tr>
       <w:tr>
         <w:tc>
           <w:tcPr>
-            <w:tcW w:w="443" w:type="dxa"/>
-            <w:tcBorders>
-              <w:top w:val="single" w:sz="1" w:space="0" w:color="AAAAAA"/>
-              <w:left w:val="single" w:sz="1" w:space="0" w:color="AAAAAA"/>
-              <w:bottom w:val="single" w:sz="1" w:space="0" w:color="AAAAAA"/>
-              <w:right w:val="single" w:sz="1" w:space="0" w:color="AAAAAA"/>
-            </w:tcBorders>
-            <w:shd w:val="clear" w:color="auto" w:fill="FFFFFF" w:themeFill="background1"/>
+            <w:tcW w:w="500" w:type="dxa"/>
+            <w:tcBorders>
+              <w:top w:val="single" w:sz="1" w:space="0" w:color="AAAAAA"/>
+              <w:left w:val="single" w:sz="1" w:space="0" w:color="AAAAAA"/>
+              <w:bottom w:val="single" w:sz="1" w:space="0" w:color="AAAAAA"/>
+              <w:right w:val="single" w:sz="1" w:space="0" w:color="AAAAAA"/>
+            </w:tcBorders>
+            <w:shd w:val="clear" w:color="auto" w:fill="FFFFFF"/>
             <w:tcMar>
               <w:top w:w="80" w:type="dxa"/>
               <w:left w:w="120" w:type="dxa"/>
@@ -1150,14 +1074,14 @@
         </w:tc>
         <w:tc>
           <w:tcPr>
-            <w:tcW w:w="1180" w:type="dxa"/>
-            <w:tcBorders>
-              <w:top w:val="single" w:sz="1" w:space="0" w:color="AAAAAA"/>
-              <w:left w:val="single" w:sz="1" w:space="0" w:color="AAAAAA"/>
-              <w:bottom w:val="single" w:sz="1" w:space="0" w:color="AAAAAA"/>
-              <w:right w:val="single" w:sz="1" w:space="0" w:color="AAAAAA"/>
-            </w:tcBorders>
-            <w:shd w:val="clear" w:color="auto" w:fill="FFFFFF" w:themeFill="background1"/>
+            <w:tcW w:w="1400" w:type="dxa"/>
+            <w:tcBorders>
+              <w:top w:val="single" w:sz="1" w:space="0" w:color="AAAAAA"/>
+              <w:left w:val="single" w:sz="1" w:space="0" w:color="AAAAAA"/>
+              <w:bottom w:val="single" w:sz="1" w:space="0" w:color="AAAAAA"/>
+              <w:right w:val="single" w:sz="1" w:space="0" w:color="AAAAAA"/>
+            </w:tcBorders>
+            <w:shd w:val="clear" w:color="auto" w:fill="FFFFFF"/>
             <w:tcMar>
               <w:top w:w="80" w:type="dxa"/>
               <w:left w:w="120" w:type="dxa"/>
@@ -1170,14 +1094,14 @@
         </w:tc>
         <w:tc>
           <w:tcPr>
-            <w:tcW w:w="1263" w:type="dxa"/>
-            <w:tcBorders>
-              <w:top w:val="single" w:sz="1" w:space="0" w:color="AAAAAA"/>
-              <w:left w:val="single" w:sz="1" w:space="0" w:color="AAAAAA"/>
-              <w:bottom w:val="single" w:sz="1" w:space="0" w:color="AAAAAA"/>
-              <w:right w:val="single" w:sz="1" w:space="0" w:color="AAAAAA"/>
-            </w:tcBorders>
-            <w:shd w:val="clear" w:color="auto" w:fill="FFFFFF" w:themeFill="background1"/>
+            <w:tcW w:w="1400" w:type="dxa"/>
+            <w:tcBorders>
+              <w:top w:val="single" w:sz="1" w:space="0" w:color="AAAAAA"/>
+              <w:left w:val="single" w:sz="1" w:space="0" w:color="AAAAAA"/>
+              <w:bottom w:val="single" w:sz="1" w:space="0" w:color="AAAAAA"/>
+              <w:right w:val="single" w:sz="1" w:space="0" w:color="AAAAAA"/>
+            </w:tcBorders>
+            <w:shd w:val="clear" w:color="auto" w:fill="FFFFFF"/>
             <w:tcMar>
               <w:top w:w="80" w:type="dxa"/>
               <w:left w:w="120" w:type="dxa"/>
@@ -1190,14 +1114,14 @@
         </w:tc>
         <w:tc>
           <w:tcPr>
-            <w:tcW w:w="1607" w:type="dxa"/>
-            <w:tcBorders>
-              <w:top w:val="single" w:sz="1" w:space="0" w:color="AAAAAA"/>
-              <w:left w:val="single" w:sz="1" w:space="0" w:color="AAAAAA"/>
-              <w:bottom w:val="single" w:sz="1" w:space="0" w:color="AAAAAA"/>
-              <w:right w:val="single" w:sz="1" w:space="0" w:color="AAAAAA"/>
-            </w:tcBorders>
-            <w:shd w:val="clear" w:color="auto" w:fill="FFFFFF" w:themeFill="background1"/>
+            <w:tcW w:w="1100" w:type="dxa"/>
+            <w:tcBorders>
+              <w:top w:val="single" w:sz="1" w:space="0" w:color="AAAAAA"/>
+              <w:left w:val="single" w:sz="1" w:space="0" w:color="AAAAAA"/>
+              <w:bottom w:val="single" w:sz="1" w:space="0" w:color="AAAAAA"/>
+              <w:right w:val="single" w:sz="1" w:space="0" w:color="AAAAAA"/>
+            </w:tcBorders>
+            <w:shd w:val="clear" w:color="auto" w:fill="FFFFFF"/>
             <w:tcMar>
               <w:top w:w="80" w:type="dxa"/>
               <w:left w:w="120" w:type="dxa"/>
@@ -1210,14 +1134,14 @@
         </w:tc>
         <w:tc>
           <w:tcPr>
-            <w:tcW w:w="1106" w:type="dxa"/>
-            <w:tcBorders>
-              <w:top w:val="single" w:sz="1" w:space="0" w:color="AAAAAA"/>
-              <w:left w:val="single" w:sz="1" w:space="0" w:color="AAAAAA"/>
-              <w:bottom w:val="single" w:sz="1" w:space="0" w:color="AAAAAA"/>
-              <w:right w:val="single" w:sz="1" w:space="0" w:color="AAAAAA"/>
-            </w:tcBorders>
-            <w:shd w:val="clear" w:color="auto" w:fill="FFFFFF" w:themeFill="background1"/>
+            <w:tcW w:w="1200" w:type="dxa"/>
+            <w:tcBorders>
+              <w:top w:val="single" w:sz="1" w:space="0" w:color="AAAAAA"/>
+              <w:left w:val="single" w:sz="1" w:space="0" w:color="AAAAAA"/>
+              <w:bottom w:val="single" w:sz="1" w:space="0" w:color="AAAAAA"/>
+              <w:right w:val="single" w:sz="1" w:space="0" w:color="AAAAAA"/>
+            </w:tcBorders>
+            <w:shd w:val="clear" w:color="auto" w:fill="FFFFFF"/>
             <w:tcMar>
               <w:top w:w="80" w:type="dxa"/>
               <w:left w:w="120" w:type="dxa"/>
@@ -1230,14 +1154,14 @@
         </w:tc>
         <w:tc>
           <w:tcPr>
-            <w:tcW w:w="1106" w:type="dxa"/>
-            <w:tcBorders>
-              <w:top w:val="single" w:sz="1" w:space="0" w:color="AAAAAA"/>
-              <w:left w:val="single" w:sz="1" w:space="0" w:color="AAAAAA"/>
-              <w:bottom w:val="single" w:sz="1" w:space="0" w:color="AAAAAA"/>
-              <w:right w:val="single" w:sz="1" w:space="0" w:color="AAAAAA"/>
-            </w:tcBorders>
-            <w:shd w:val="clear" w:color="auto" w:fill="FFFFFF" w:themeFill="background1"/>
+            <w:tcW w:w="1200" w:type="dxa"/>
+            <w:tcBorders>
+              <w:top w:val="single" w:sz="1" w:space="0" w:color="AAAAAA"/>
+              <w:left w:val="single" w:sz="1" w:space="0" w:color="AAAAAA"/>
+              <w:bottom w:val="single" w:sz="1" w:space="0" w:color="AAAAAA"/>
+              <w:right w:val="single" w:sz="1" w:space="0" w:color="AAAAAA"/>
+            </w:tcBorders>
+            <w:shd w:val="clear" w:color="auto" w:fill="FFFFFF"/>
             <w:tcMar>
               <w:top w:w="80" w:type="dxa"/>
               <w:left w:w="120" w:type="dxa"/>
@@ -1250,14 +1174,14 @@
         </w:tc>
         <w:tc>
           <w:tcPr>
-            <w:tcW w:w="1979" w:type="dxa"/>
-            <w:tcBorders>
-              <w:top w:val="single" w:sz="1" w:space="0" w:color="AAAAAA"/>
-              <w:left w:val="single" w:sz="1" w:space="0" w:color="AAAAAA"/>
-              <w:bottom w:val="single" w:sz="1" w:space="0" w:color="AAAAAA"/>
-              <w:right w:val="single" w:sz="1" w:space="0" w:color="AAAAAA"/>
-            </w:tcBorders>
-            <w:shd w:val="clear" w:color="auto" w:fill="FFFFFF" w:themeFill="background1"/>
+            <w:tcW w:w="1200" w:type="dxa"/>
+            <w:tcBorders>
+              <w:top w:val="single" w:sz="1" w:space="0" w:color="AAAAAA"/>
+              <w:left w:val="single" w:sz="1" w:space="0" w:color="AAAAAA"/>
+              <w:bottom w:val="single" w:sz="1" w:space="0" w:color="AAAAAA"/>
+              <w:right w:val="single" w:sz="1" w:space="0" w:color="AAAAAA"/>
+            </w:tcBorders>
+            <w:shd w:val="clear" w:color="auto" w:fill="FFFFFF"/>
             <w:tcMar>
               <w:top w:w="80" w:type="dxa"/>
               <w:left w:w="120" w:type="dxa"/>
@@ -1270,14 +1194,14 @@
         </w:tc>
         <w:tc>
           <w:tcPr>
-            <w:tcW w:w="1394" w:type="dxa"/>
-            <w:tcBorders>
-              <w:top w:val="single" w:sz="1" w:space="0" w:color="AAAAAA"/>
-              <w:left w:val="single" w:sz="1" w:space="0" w:color="AAAAAA"/>
-              <w:bottom w:val="single" w:sz="1" w:space="0" w:color="AAAAAA"/>
-              <w:right w:val="single" w:sz="1" w:space="0" w:color="AAAAAA"/>
-            </w:tcBorders>
-            <w:shd w:val="clear" w:color="auto" w:fill="FFFFFF" w:themeFill="background1"/>
+            <w:tcW w:w="900" w:type="dxa"/>
+            <w:tcBorders>
+              <w:top w:val="single" w:sz="1" w:space="0" w:color="AAAAAA"/>
+              <w:left w:val="single" w:sz="1" w:space="0" w:color="AAAAAA"/>
+              <w:bottom w:val="single" w:sz="1" w:space="0" w:color="AAAAAA"/>
+              <w:right w:val="single" w:sz="1" w:space="0" w:color="AAAAAA"/>
+            </w:tcBorders>
+            <w:shd w:val="clear" w:color="auto" w:fill="FFFFFF"/>
             <w:tcMar>
               <w:top w:w="80" w:type="dxa"/>
               <w:left w:w="120" w:type="dxa"/>
@@ -1292,389 +1216,325 @@
       <w:tr>
         <w:tc>
           <w:tcPr>
-            <w:tcW w:w="443" w:type="dxa"/>
-            <w:tcBorders>
-              <w:top w:val="single" w:sz="1" w:space="0" w:color="AAAAAA"/>
-              <w:left w:val="single" w:sz="1" w:space="0" w:color="AAAAAA"/>
-              <w:bottom w:val="single" w:sz="1" w:space="0" w:color="AAAAAA"/>
-              <w:right w:val="single" w:sz="1" w:space="0" w:color="AAAAAA"/>
-            </w:tcBorders>
-            <w:shd w:val="clear" w:color="auto" w:fill="EBF3FA"/>
-            <w:tcMar>
-              <w:top w:w="80" w:type="dxa"/>
-              <w:left w:w="120" w:type="dxa"/>
-              <w:bottom w:w="80" w:type="dxa"/>
-              <w:right w:w="120" w:type="dxa"/>
-            </w:tcMar>
-            <w:vAlign w:val="center"/>
-          </w:tcPr>
-          <w:p>
-            <w:r>
-              <w:t>4</w:t>
-            </w:r>
-          </w:p>
-        </w:tc>
-        <w:tc>
-          <w:tcPr>
-            <w:tcW w:w="1180" w:type="dxa"/>
-            <w:tcBorders>
-              <w:top w:val="single" w:sz="1" w:space="0" w:color="AAAAAA"/>
-              <w:left w:val="single" w:sz="1" w:space="0" w:color="AAAAAA"/>
-              <w:bottom w:val="single" w:sz="1" w:space="0" w:color="AAAAAA"/>
-              <w:right w:val="single" w:sz="1" w:space="0" w:color="AAAAAA"/>
-            </w:tcBorders>
-            <w:shd w:val="clear" w:color="auto" w:fill="EBF3FA"/>
-            <w:tcMar>
-              <w:top w:w="80" w:type="dxa"/>
-              <w:left w:w="120" w:type="dxa"/>
-              <w:bottom w:w="80" w:type="dxa"/>
-              <w:right w:w="120" w:type="dxa"/>
-            </w:tcMar>
-            <w:vAlign w:val="center"/>
-          </w:tcPr>
-          <w:p>
-            <w:r>
-              <w:t>Arslan Ali</w:t>
-            </w:r>
-          </w:p>
-        </w:tc>
-        <w:tc>
-          <w:tcPr>
-            <w:tcW w:w="1263" w:type="dxa"/>
-            <w:tcBorders>
-              <w:top w:val="single" w:sz="1" w:space="0" w:color="AAAAAA"/>
-              <w:left w:val="single" w:sz="1" w:space="0" w:color="AAAAAA"/>
-              <w:bottom w:val="single" w:sz="1" w:space="0" w:color="AAAAAA"/>
-              <w:right w:val="single" w:sz="1" w:space="0" w:color="AAAAAA"/>
-            </w:tcBorders>
-            <w:shd w:val="clear" w:color="auto" w:fill="EBF3FA"/>
-            <w:tcMar>
-              <w:top w:w="80" w:type="dxa"/>
-              <w:left w:w="120" w:type="dxa"/>
-              <w:bottom w:w="80" w:type="dxa"/>
-              <w:right w:w="120" w:type="dxa"/>
-            </w:tcMar>
-            <w:vAlign w:val="center"/>
-          </w:tcPr>
-          <w:p>
-            <w:r>
-              <w:t>ali0arslan8</w:t>
-            </w:r>
-          </w:p>
-        </w:tc>
-        <w:tc>
-          <w:tcPr>
-            <w:tcW w:w="1607" w:type="dxa"/>
-            <w:tcBorders>
-              <w:top w:val="single" w:sz="1" w:space="0" w:color="AAAAAA"/>
-              <w:left w:val="single" w:sz="1" w:space="0" w:color="AAAAAA"/>
-              <w:bottom w:val="single" w:sz="1" w:space="0" w:color="AAAAAA"/>
-              <w:right w:val="single" w:sz="1" w:space="0" w:color="AAAAAA"/>
-            </w:tcBorders>
-            <w:shd w:val="clear" w:color="auto" w:fill="EBF3FA"/>
-            <w:tcMar>
-              <w:top w:w="80" w:type="dxa"/>
-              <w:left w:w="120" w:type="dxa"/>
-              <w:bottom w:w="80" w:type="dxa"/>
-              <w:right w:w="120" w:type="dxa"/>
-            </w:tcMar>
-            <w:vAlign w:val="center"/>
-          </w:tcPr>
-          <w:p>
-            <w:r>
-              <w:t>member</w:t>
-            </w:r>
-          </w:p>
-        </w:tc>
-        <w:tc>
-          <w:tcPr>
-            <w:tcW w:w="1106" w:type="dxa"/>
-            <w:tcBorders>
-              <w:top w:val="single" w:sz="1" w:space="0" w:color="AAAAAA"/>
-              <w:left w:val="single" w:sz="1" w:space="0" w:color="AAAAAA"/>
-              <w:bottom w:val="single" w:sz="1" w:space="0" w:color="AAAAAA"/>
-              <w:right w:val="single" w:sz="1" w:space="0" w:color="AAAAAA"/>
-            </w:tcBorders>
-            <w:shd w:val="clear" w:color="auto" w:fill="EBF3FA"/>
-            <w:tcMar>
-              <w:top w:w="80" w:type="dxa"/>
-              <w:left w:w="120" w:type="dxa"/>
-              <w:bottom w:w="80" w:type="dxa"/>
-              <w:right w:w="120" w:type="dxa"/>
-            </w:tcMar>
-            <w:vAlign w:val="center"/>
-          </w:tcPr>
-          <w:p>
-            <w:r>
-              <w:t>cd-dev</w:t>
-            </w:r>
-          </w:p>
-        </w:tc>
-        <w:tc>
-          <w:tcPr>
-            <w:tcW w:w="1106" w:type="dxa"/>
-            <w:tcBorders>
-              <w:top w:val="single" w:sz="1" w:space="0" w:color="AAAAAA"/>
-              <w:left w:val="single" w:sz="1" w:space="0" w:color="AAAAAA"/>
-              <w:bottom w:val="single" w:sz="1" w:space="0" w:color="AAAAAA"/>
-              <w:right w:val="single" w:sz="1" w:space="0" w:color="AAAAAA"/>
-            </w:tcBorders>
-            <w:shd w:val="clear" w:color="auto" w:fill="EBF3FA"/>
-            <w:tcMar>
-              <w:top w:w="80" w:type="dxa"/>
-              <w:left w:w="120" w:type="dxa"/>
-              <w:bottom w:w="80" w:type="dxa"/>
-              <w:right w:w="120" w:type="dxa"/>
-            </w:tcMar>
-            <w:vAlign w:val="center"/>
-          </w:tcPr>
-          <w:p>
-            <w:r>
-              <w:t>lahore</w:t>
-            </w:r>
-          </w:p>
-        </w:tc>
-        <w:tc>
-          <w:tcPr>
-            <w:tcW w:w="1979" w:type="dxa"/>
-            <w:tcBorders>
-              <w:top w:val="single" w:sz="1" w:space="0" w:color="AAAAAA"/>
-              <w:left w:val="single" w:sz="1" w:space="0" w:color="AAAAAA"/>
-              <w:bottom w:val="single" w:sz="1" w:space="0" w:color="AAAAAA"/>
-              <w:right w:val="single" w:sz="1" w:space="0" w:color="AAAAAA"/>
-            </w:tcBorders>
-            <w:shd w:val="clear" w:color="auto" w:fill="EBF3FA"/>
-            <w:tcMar>
-              <w:top w:w="80" w:type="dxa"/>
-              <w:left w:w="120" w:type="dxa"/>
-              <w:bottom w:w="80" w:type="dxa"/>
-              <w:right w:w="120" w:type="dxa"/>
-            </w:tcMar>
-            <w:vAlign w:val="center"/>
-          </w:tcPr>
-          <w:p>
-            <w:r>
-              <w:t>Feature/ali0arslan8/lahore</w:t>
-            </w:r>
-          </w:p>
-        </w:tc>
-        <w:tc>
-          <w:tcPr>
-            <w:tcW w:w="1394" w:type="dxa"/>
-            <w:tcBorders>
-              <w:top w:val="single" w:sz="1" w:space="0" w:color="AAAAAA"/>
-              <w:left w:val="single" w:sz="1" w:space="0" w:color="AAAAAA"/>
-              <w:bottom w:val="single" w:sz="1" w:space="0" w:color="AAAAAA"/>
-              <w:right w:val="single" w:sz="1" w:space="0" w:color="AAAAAA"/>
-            </w:tcBorders>
-            <w:shd w:val="clear" w:color="auto" w:fill="EBF3FA"/>
-            <w:tcMar>
-              <w:top w:w="80" w:type="dxa"/>
-              <w:left w:w="120" w:type="dxa"/>
-              <w:bottom w:w="80" w:type="dxa"/>
-              <w:right w:w="120" w:type="dxa"/>
-            </w:tcMar>
-            <w:vAlign w:val="center"/>
-          </w:tcPr>
-          <w:p>
-            <w:r>
-              <w:t>n</w:t>
-            </w:r>
-          </w:p>
+            <w:tcW w:w="500" w:type="dxa"/>
+            <w:tcBorders>
+              <w:top w:val="single" w:sz="1" w:space="0" w:color="AAAAAA"/>
+              <w:left w:val="single" w:sz="1" w:space="0" w:color="AAAAAA"/>
+              <w:bottom w:val="single" w:sz="1" w:space="0" w:color="AAAAAA"/>
+              <w:right w:val="single" w:sz="1" w:space="0" w:color="AAAAAA"/>
+            </w:tcBorders>
+            <w:shd w:val="clear" w:color="auto" w:fill="EBF3FA"/>
+            <w:tcMar>
+              <w:top w:w="80" w:type="dxa"/>
+              <w:left w:w="120" w:type="dxa"/>
+              <w:bottom w:w="80" w:type="dxa"/>
+              <w:right w:w="120" w:type="dxa"/>
+            </w:tcMar>
+            <w:vAlign w:val="center"/>
+          </w:tcPr>
+          <w:p/>
+        </w:tc>
+        <w:tc>
+          <w:tcPr>
+            <w:tcW w:w="1400" w:type="dxa"/>
+            <w:tcBorders>
+              <w:top w:val="single" w:sz="1" w:space="0" w:color="AAAAAA"/>
+              <w:left w:val="single" w:sz="1" w:space="0" w:color="AAAAAA"/>
+              <w:bottom w:val="single" w:sz="1" w:space="0" w:color="AAAAAA"/>
+              <w:right w:val="single" w:sz="1" w:space="0" w:color="AAAAAA"/>
+            </w:tcBorders>
+            <w:shd w:val="clear" w:color="auto" w:fill="EBF3FA"/>
+            <w:tcMar>
+              <w:top w:w="80" w:type="dxa"/>
+              <w:left w:w="120" w:type="dxa"/>
+              <w:bottom w:w="80" w:type="dxa"/>
+              <w:right w:w="120" w:type="dxa"/>
+            </w:tcMar>
+            <w:vAlign w:val="center"/>
+          </w:tcPr>
+          <w:p/>
+        </w:tc>
+        <w:tc>
+          <w:tcPr>
+            <w:tcW w:w="1400" w:type="dxa"/>
+            <w:tcBorders>
+              <w:top w:val="single" w:sz="1" w:space="0" w:color="AAAAAA"/>
+              <w:left w:val="single" w:sz="1" w:space="0" w:color="AAAAAA"/>
+              <w:bottom w:val="single" w:sz="1" w:space="0" w:color="AAAAAA"/>
+              <w:right w:val="single" w:sz="1" w:space="0" w:color="AAAAAA"/>
+            </w:tcBorders>
+            <w:shd w:val="clear" w:color="auto" w:fill="EBF3FA"/>
+            <w:tcMar>
+              <w:top w:w="80" w:type="dxa"/>
+              <w:left w:w="120" w:type="dxa"/>
+              <w:bottom w:w="80" w:type="dxa"/>
+              <w:right w:w="120" w:type="dxa"/>
+            </w:tcMar>
+            <w:vAlign w:val="center"/>
+          </w:tcPr>
+          <w:p/>
+        </w:tc>
+        <w:tc>
+          <w:tcPr>
+            <w:tcW w:w="1100" w:type="dxa"/>
+            <w:tcBorders>
+              <w:top w:val="single" w:sz="1" w:space="0" w:color="AAAAAA"/>
+              <w:left w:val="single" w:sz="1" w:space="0" w:color="AAAAAA"/>
+              <w:bottom w:val="single" w:sz="1" w:space="0" w:color="AAAAAA"/>
+              <w:right w:val="single" w:sz="1" w:space="0" w:color="AAAAAA"/>
+            </w:tcBorders>
+            <w:shd w:val="clear" w:color="auto" w:fill="EBF3FA"/>
+            <w:tcMar>
+              <w:top w:w="80" w:type="dxa"/>
+              <w:left w:w="120" w:type="dxa"/>
+              <w:bottom w:w="80" w:type="dxa"/>
+              <w:right w:w="120" w:type="dxa"/>
+            </w:tcMar>
+            <w:vAlign w:val="center"/>
+          </w:tcPr>
+          <w:p/>
+        </w:tc>
+        <w:tc>
+          <w:tcPr>
+            <w:tcW w:w="1200" w:type="dxa"/>
+            <w:tcBorders>
+              <w:top w:val="single" w:sz="1" w:space="0" w:color="AAAAAA"/>
+              <w:left w:val="single" w:sz="1" w:space="0" w:color="AAAAAA"/>
+              <w:bottom w:val="single" w:sz="1" w:space="0" w:color="AAAAAA"/>
+              <w:right w:val="single" w:sz="1" w:space="0" w:color="AAAAAA"/>
+            </w:tcBorders>
+            <w:shd w:val="clear" w:color="auto" w:fill="EBF3FA"/>
+            <w:tcMar>
+              <w:top w:w="80" w:type="dxa"/>
+              <w:left w:w="120" w:type="dxa"/>
+              <w:bottom w:w="80" w:type="dxa"/>
+              <w:right w:w="120" w:type="dxa"/>
+            </w:tcMar>
+            <w:vAlign w:val="center"/>
+          </w:tcPr>
+          <w:p/>
+        </w:tc>
+        <w:tc>
+          <w:tcPr>
+            <w:tcW w:w="1200" w:type="dxa"/>
+            <w:tcBorders>
+              <w:top w:val="single" w:sz="1" w:space="0" w:color="AAAAAA"/>
+              <w:left w:val="single" w:sz="1" w:space="0" w:color="AAAAAA"/>
+              <w:bottom w:val="single" w:sz="1" w:space="0" w:color="AAAAAA"/>
+              <w:right w:val="single" w:sz="1" w:space="0" w:color="AAAAAA"/>
+            </w:tcBorders>
+            <w:shd w:val="clear" w:color="auto" w:fill="EBF3FA"/>
+            <w:tcMar>
+              <w:top w:w="80" w:type="dxa"/>
+              <w:left w:w="120" w:type="dxa"/>
+              <w:bottom w:w="80" w:type="dxa"/>
+              <w:right w:w="120" w:type="dxa"/>
+            </w:tcMar>
+            <w:vAlign w:val="center"/>
+          </w:tcPr>
+          <w:p/>
+        </w:tc>
+        <w:tc>
+          <w:tcPr>
+            <w:tcW w:w="1200" w:type="dxa"/>
+            <w:tcBorders>
+              <w:top w:val="single" w:sz="1" w:space="0" w:color="AAAAAA"/>
+              <w:left w:val="single" w:sz="1" w:space="0" w:color="AAAAAA"/>
+              <w:bottom w:val="single" w:sz="1" w:space="0" w:color="AAAAAA"/>
+              <w:right w:val="single" w:sz="1" w:space="0" w:color="AAAAAA"/>
+            </w:tcBorders>
+            <w:shd w:val="clear" w:color="auto" w:fill="EBF3FA"/>
+            <w:tcMar>
+              <w:top w:w="80" w:type="dxa"/>
+              <w:left w:w="120" w:type="dxa"/>
+              <w:bottom w:w="80" w:type="dxa"/>
+              <w:right w:w="120" w:type="dxa"/>
+            </w:tcMar>
+            <w:vAlign w:val="center"/>
+          </w:tcPr>
+          <w:p/>
+        </w:tc>
+        <w:tc>
+          <w:tcPr>
+            <w:tcW w:w="900" w:type="dxa"/>
+            <w:tcBorders>
+              <w:top w:val="single" w:sz="1" w:space="0" w:color="AAAAAA"/>
+              <w:left w:val="single" w:sz="1" w:space="0" w:color="AAAAAA"/>
+              <w:bottom w:val="single" w:sz="1" w:space="0" w:color="AAAAAA"/>
+              <w:right w:val="single" w:sz="1" w:space="0" w:color="AAAAAA"/>
+            </w:tcBorders>
+            <w:shd w:val="clear" w:color="auto" w:fill="EBF3FA"/>
+            <w:tcMar>
+              <w:top w:w="80" w:type="dxa"/>
+              <w:left w:w="120" w:type="dxa"/>
+              <w:bottom w:w="80" w:type="dxa"/>
+              <w:right w:w="120" w:type="dxa"/>
+            </w:tcMar>
+            <w:vAlign w:val="center"/>
+          </w:tcPr>
+          <w:p/>
         </w:tc>
       </w:tr>
       <w:tr>
         <w:tc>
           <w:tcPr>
-            <w:tcW w:w="443" w:type="dxa"/>
-            <w:tcBorders>
-              <w:top w:val="single" w:sz="1" w:space="0" w:color="AAAAAA"/>
-              <w:left w:val="single" w:sz="1" w:space="0" w:color="AAAAAA"/>
-              <w:bottom w:val="single" w:sz="1" w:space="0" w:color="AAAAAA"/>
-              <w:right w:val="single" w:sz="1" w:space="0" w:color="AAAAAA"/>
-            </w:tcBorders>
-            <w:shd w:val="clear" w:color="auto" w:fill="FFFFFF" w:themeFill="background1"/>
-            <w:tcMar>
-              <w:top w:w="80" w:type="dxa"/>
-              <w:left w:w="120" w:type="dxa"/>
-              <w:bottom w:w="80" w:type="dxa"/>
-              <w:right w:w="120" w:type="dxa"/>
-            </w:tcMar>
-            <w:vAlign w:val="center"/>
-          </w:tcPr>
-          <w:p>
-            <w:r>
-              <w:t>5</w:t>
-            </w:r>
-          </w:p>
-        </w:tc>
-        <w:tc>
-          <w:tcPr>
-            <w:tcW w:w="1180" w:type="dxa"/>
-            <w:tcBorders>
-              <w:top w:val="single" w:sz="1" w:space="0" w:color="AAAAAA"/>
-              <w:left w:val="single" w:sz="1" w:space="0" w:color="AAAAAA"/>
-              <w:bottom w:val="single" w:sz="1" w:space="0" w:color="AAAAAA"/>
-              <w:right w:val="single" w:sz="1" w:space="0" w:color="AAAAAA"/>
-            </w:tcBorders>
-            <w:shd w:val="clear" w:color="auto" w:fill="FFFFFF" w:themeFill="background1"/>
-            <w:tcMar>
-              <w:top w:w="80" w:type="dxa"/>
-              <w:left w:w="120" w:type="dxa"/>
-              <w:bottom w:w="80" w:type="dxa"/>
-              <w:right w:w="120" w:type="dxa"/>
-            </w:tcMar>
-            <w:vAlign w:val="center"/>
-          </w:tcPr>
-          <w:p>
-            <w:r>
-              <w:t>M.Usama</w:t>
-            </w:r>
-          </w:p>
-        </w:tc>
-        <w:tc>
-          <w:tcPr>
-            <w:tcW w:w="1263" w:type="dxa"/>
-            <w:tcBorders>
-              <w:top w:val="single" w:sz="1" w:space="0" w:color="AAAAAA"/>
-              <w:left w:val="single" w:sz="1" w:space="0" w:color="AAAAAA"/>
-              <w:bottom w:val="single" w:sz="1" w:space="0" w:color="AAAAAA"/>
-              <w:right w:val="single" w:sz="1" w:space="0" w:color="AAAAAA"/>
-            </w:tcBorders>
-            <w:shd w:val="clear" w:color="auto" w:fill="FFFFFF" w:themeFill="background1"/>
-            <w:tcMar>
-              <w:top w:w="80" w:type="dxa"/>
-              <w:left w:w="120" w:type="dxa"/>
-              <w:bottom w:w="80" w:type="dxa"/>
-              <w:right w:w="120" w:type="dxa"/>
-            </w:tcMar>
-            <w:vAlign w:val="center"/>
-          </w:tcPr>
-          <w:p>
-            <w:r>
-              <w:t>Usamaucp243-blip</w:t>
-            </w:r>
-          </w:p>
-        </w:tc>
-        <w:tc>
-          <w:tcPr>
-            <w:tcW w:w="1607" w:type="dxa"/>
-            <w:tcBorders>
-              <w:top w:val="single" w:sz="1" w:space="0" w:color="AAAAAA"/>
-              <w:left w:val="single" w:sz="1" w:space="0" w:color="AAAAAA"/>
-              <w:bottom w:val="single" w:sz="1" w:space="0" w:color="AAAAAA"/>
-              <w:right w:val="single" w:sz="1" w:space="0" w:color="AAAAAA"/>
-            </w:tcBorders>
-            <w:shd w:val="clear" w:color="auto" w:fill="FFFFFF" w:themeFill="background1"/>
-            <w:tcMar>
-              <w:top w:w="80" w:type="dxa"/>
-              <w:left w:w="120" w:type="dxa"/>
-              <w:bottom w:w="80" w:type="dxa"/>
-              <w:right w:w="120" w:type="dxa"/>
-            </w:tcMar>
-            <w:vAlign w:val="center"/>
-          </w:tcPr>
-          <w:p>
-            <w:r>
-              <w:t>member</w:t>
-            </w:r>
-          </w:p>
-        </w:tc>
-        <w:tc>
-          <w:tcPr>
-            <w:tcW w:w="1106" w:type="dxa"/>
-            <w:tcBorders>
-              <w:top w:val="single" w:sz="1" w:space="0" w:color="AAAAAA"/>
-              <w:left w:val="single" w:sz="1" w:space="0" w:color="AAAAAA"/>
-              <w:bottom w:val="single" w:sz="1" w:space="0" w:color="AAAAAA"/>
-              <w:right w:val="single" w:sz="1" w:space="0" w:color="AAAAAA"/>
-            </w:tcBorders>
-            <w:shd w:val="clear" w:color="auto" w:fill="FFFFFF" w:themeFill="background1"/>
-            <w:tcMar>
-              <w:top w:w="80" w:type="dxa"/>
-              <w:left w:w="120" w:type="dxa"/>
-              <w:bottom w:w="80" w:type="dxa"/>
-              <w:right w:w="120" w:type="dxa"/>
-            </w:tcMar>
-            <w:vAlign w:val="center"/>
-          </w:tcPr>
-          <w:p>
-            <w:r>
-              <w:t>cd-staging</w:t>
-            </w:r>
-          </w:p>
-        </w:tc>
-        <w:tc>
-          <w:tcPr>
-            <w:tcW w:w="1106" w:type="dxa"/>
-            <w:tcBorders>
-              <w:top w:val="single" w:sz="1" w:space="0" w:color="AAAAAA"/>
-              <w:left w:val="single" w:sz="1" w:space="0" w:color="AAAAAA"/>
-              <w:bottom w:val="single" w:sz="1" w:space="0" w:color="AAAAAA"/>
-              <w:right w:val="single" w:sz="1" w:space="0" w:color="AAAAAA"/>
-            </w:tcBorders>
-            <w:shd w:val="clear" w:color="auto" w:fill="FFFFFF" w:themeFill="background1"/>
-            <w:tcMar>
-              <w:top w:w="80" w:type="dxa"/>
-              <w:left w:w="120" w:type="dxa"/>
-              <w:bottom w:w="80" w:type="dxa"/>
-              <w:right w:w="120" w:type="dxa"/>
-            </w:tcMar>
-            <w:vAlign w:val="center"/>
-          </w:tcPr>
-          <w:p>
-            <w:r>
-              <w:t>hunza</w:t>
-            </w:r>
-          </w:p>
-        </w:tc>
-        <w:tc>
-          <w:tcPr>
-            <w:tcW w:w="1979" w:type="dxa"/>
-            <w:tcBorders>
-              <w:top w:val="single" w:sz="1" w:space="0" w:color="AAAAAA"/>
-              <w:left w:val="single" w:sz="1" w:space="0" w:color="AAAAAA"/>
-              <w:bottom w:val="single" w:sz="1" w:space="0" w:color="AAAAAA"/>
-              <w:right w:val="single" w:sz="1" w:space="0" w:color="AAAAAA"/>
-            </w:tcBorders>
-            <w:shd w:val="clear" w:color="auto" w:fill="FFFFFF" w:themeFill="background1"/>
-            <w:tcMar>
-              <w:top w:w="80" w:type="dxa"/>
-              <w:left w:w="120" w:type="dxa"/>
-              <w:bottom w:w="80" w:type="dxa"/>
-              <w:right w:w="120" w:type="dxa"/>
-            </w:tcMar>
-            <w:vAlign w:val="center"/>
-          </w:tcPr>
-          <w:p>
-            <w:r>
-              <w:t>Feature/usamaucp243-blip/hunza</w:t>
-            </w:r>
-          </w:p>
-        </w:tc>
-        <w:tc>
-          <w:tcPr>
-            <w:tcW w:w="1394" w:type="dxa"/>
-            <w:tcBorders>
-              <w:top w:val="single" w:sz="1" w:space="0" w:color="AAAAAA"/>
-              <w:left w:val="single" w:sz="1" w:space="0" w:color="AAAAAA"/>
-              <w:bottom w:val="single" w:sz="1" w:space="0" w:color="AAAAAA"/>
-              <w:right w:val="single" w:sz="1" w:space="0" w:color="AAAAAA"/>
-            </w:tcBorders>
-            <w:shd w:val="clear" w:color="auto" w:fill="FFFFFF" w:themeFill="background1"/>
-            <w:tcMar>
-              <w:top w:w="80" w:type="dxa"/>
-              <w:left w:w="120" w:type="dxa"/>
-              <w:bottom w:w="80" w:type="dxa"/>
-              <w:right w:w="120" w:type="dxa"/>
-            </w:tcMar>
-            <w:vAlign w:val="center"/>
-          </w:tcPr>
-          <w:p>
-            <w:r>
-              <w:t>N</w:t>
-            </w:r>
-          </w:p>
+            <w:tcW w:w="500" w:type="dxa"/>
+            <w:tcBorders>
+              <w:top w:val="single" w:sz="1" w:space="0" w:color="AAAAAA"/>
+              <w:left w:val="single" w:sz="1" w:space="0" w:color="AAAAAA"/>
+              <w:bottom w:val="single" w:sz="1" w:space="0" w:color="AAAAAA"/>
+              <w:right w:val="single" w:sz="1" w:space="0" w:color="AAAAAA"/>
+            </w:tcBorders>
+            <w:shd w:val="clear" w:color="auto" w:fill="FFFFFF"/>
+            <w:tcMar>
+              <w:top w:w="80" w:type="dxa"/>
+              <w:left w:w="120" w:type="dxa"/>
+              <w:bottom w:w="80" w:type="dxa"/>
+              <w:right w:w="120" w:type="dxa"/>
+            </w:tcMar>
+            <w:vAlign w:val="center"/>
+          </w:tcPr>
+          <w:p/>
+        </w:tc>
+        <w:tc>
+          <w:tcPr>
+            <w:tcW w:w="1400" w:type="dxa"/>
+            <w:tcBorders>
+              <w:top w:val="single" w:sz="1" w:space="0" w:color="AAAAAA"/>
+              <w:left w:val="single" w:sz="1" w:space="0" w:color="AAAAAA"/>
+              <w:bottom w:val="single" w:sz="1" w:space="0" w:color="AAAAAA"/>
+              <w:right w:val="single" w:sz="1" w:space="0" w:color="AAAAAA"/>
+            </w:tcBorders>
+            <w:shd w:val="clear" w:color="auto" w:fill="FFFFFF"/>
+            <w:tcMar>
+              <w:top w:w="80" w:type="dxa"/>
+              <w:left w:w="120" w:type="dxa"/>
+              <w:bottom w:w="80" w:type="dxa"/>
+              <w:right w:w="120" w:type="dxa"/>
+            </w:tcMar>
+            <w:vAlign w:val="center"/>
+          </w:tcPr>
+          <w:p/>
+        </w:tc>
+        <w:tc>
+          <w:tcPr>
+            <w:tcW w:w="1400" w:type="dxa"/>
+            <w:tcBorders>
+              <w:top w:val="single" w:sz="1" w:space="0" w:color="AAAAAA"/>
+              <w:left w:val="single" w:sz="1" w:space="0" w:color="AAAAAA"/>
+              <w:bottom w:val="single" w:sz="1" w:space="0" w:color="AAAAAA"/>
+              <w:right w:val="single" w:sz="1" w:space="0" w:color="AAAAAA"/>
+            </w:tcBorders>
+            <w:shd w:val="clear" w:color="auto" w:fill="FFFFFF"/>
+            <w:tcMar>
+              <w:top w:w="80" w:type="dxa"/>
+              <w:left w:w="120" w:type="dxa"/>
+              <w:bottom w:w="80" w:type="dxa"/>
+              <w:right w:w="120" w:type="dxa"/>
+            </w:tcMar>
+            <w:vAlign w:val="center"/>
+          </w:tcPr>
+          <w:p/>
+        </w:tc>
+        <w:tc>
+          <w:tcPr>
+            <w:tcW w:w="1100" w:type="dxa"/>
+            <w:tcBorders>
+              <w:top w:val="single" w:sz="1" w:space="0" w:color="AAAAAA"/>
+              <w:left w:val="single" w:sz="1" w:space="0" w:color="AAAAAA"/>
+              <w:bottom w:val="single" w:sz="1" w:space="0" w:color="AAAAAA"/>
+              <w:right w:val="single" w:sz="1" w:space="0" w:color="AAAAAA"/>
+            </w:tcBorders>
+            <w:shd w:val="clear" w:color="auto" w:fill="FFFFFF"/>
+            <w:tcMar>
+              <w:top w:w="80" w:type="dxa"/>
+              <w:left w:w="120" w:type="dxa"/>
+              <w:bottom w:w="80" w:type="dxa"/>
+              <w:right w:w="120" w:type="dxa"/>
+            </w:tcMar>
+            <w:vAlign w:val="center"/>
+          </w:tcPr>
+          <w:p/>
+        </w:tc>
+        <w:tc>
+          <w:tcPr>
+            <w:tcW w:w="1200" w:type="dxa"/>
+            <w:tcBorders>
+              <w:top w:val="single" w:sz="1" w:space="0" w:color="AAAAAA"/>
+              <w:left w:val="single" w:sz="1" w:space="0" w:color="AAAAAA"/>
+              <w:bottom w:val="single" w:sz="1" w:space="0" w:color="AAAAAA"/>
+              <w:right w:val="single" w:sz="1" w:space="0" w:color="AAAAAA"/>
+            </w:tcBorders>
+            <w:shd w:val="clear" w:color="auto" w:fill="FFFFFF"/>
+            <w:tcMar>
+              <w:top w:w="80" w:type="dxa"/>
+              <w:left w:w="120" w:type="dxa"/>
+              <w:bottom w:w="80" w:type="dxa"/>
+              <w:right w:w="120" w:type="dxa"/>
+            </w:tcMar>
+            <w:vAlign w:val="center"/>
+          </w:tcPr>
+          <w:p/>
+        </w:tc>
+        <w:tc>
+          <w:tcPr>
+            <w:tcW w:w="1200" w:type="dxa"/>
+            <w:tcBorders>
+              <w:top w:val="single" w:sz="1" w:space="0" w:color="AAAAAA"/>
+              <w:left w:val="single" w:sz="1" w:space="0" w:color="AAAAAA"/>
+              <w:bottom w:val="single" w:sz="1" w:space="0" w:color="AAAAAA"/>
+              <w:right w:val="single" w:sz="1" w:space="0" w:color="AAAAAA"/>
+            </w:tcBorders>
+            <w:shd w:val="clear" w:color="auto" w:fill="FFFFFF"/>
+            <w:tcMar>
+              <w:top w:w="80" w:type="dxa"/>
+              <w:left w:w="120" w:type="dxa"/>
+              <w:bottom w:w="80" w:type="dxa"/>
+              <w:right w:w="120" w:type="dxa"/>
+            </w:tcMar>
+            <w:vAlign w:val="center"/>
+          </w:tcPr>
+          <w:p/>
+        </w:tc>
+        <w:tc>
+          <w:tcPr>
+            <w:tcW w:w="1200" w:type="dxa"/>
+            <w:tcBorders>
+              <w:top w:val="single" w:sz="1" w:space="0" w:color="AAAAAA"/>
+              <w:left w:val="single" w:sz="1" w:space="0" w:color="AAAAAA"/>
+              <w:bottom w:val="single" w:sz="1" w:space="0" w:color="AAAAAA"/>
+              <w:right w:val="single" w:sz="1" w:space="0" w:color="AAAAAA"/>
+            </w:tcBorders>
+            <w:shd w:val="clear" w:color="auto" w:fill="FFFFFF"/>
+            <w:tcMar>
+              <w:top w:w="80" w:type="dxa"/>
+              <w:left w:w="120" w:type="dxa"/>
+              <w:bottom w:w="80" w:type="dxa"/>
+              <w:right w:w="120" w:type="dxa"/>
+            </w:tcMar>
+            <w:vAlign w:val="center"/>
+          </w:tcPr>
+          <w:p/>
+        </w:tc>
+        <w:tc>
+          <w:tcPr>
+            <w:tcW w:w="900" w:type="dxa"/>
+            <w:tcBorders>
+              <w:top w:val="single" w:sz="1" w:space="0" w:color="AAAAAA"/>
+              <w:left w:val="single" w:sz="1" w:space="0" w:color="AAAAAA"/>
+              <w:bottom w:val="single" w:sz="1" w:space="0" w:color="AAAAAA"/>
+              <w:right w:val="single" w:sz="1" w:space="0" w:color="AAAAAA"/>
+            </w:tcBorders>
+            <w:shd w:val="clear" w:color="auto" w:fill="FFFFFF"/>
+            <w:tcMar>
+              <w:top w:w="80" w:type="dxa"/>
+              <w:left w:w="120" w:type="dxa"/>
+              <w:bottom w:w="80" w:type="dxa"/>
+              <w:right w:w="120" w:type="dxa"/>
+            </w:tcMar>
+            <w:vAlign w:val="center"/>
+          </w:tcPr>
+          <w:p/>
         </w:tc>
       </w:tr>
     </w:tbl>
@@ -2011,6 +1871,7 @@
                 <w:sz w:val="20"/>
                 <w:szCs w:val="20"/>
               </w:rPr>
+              <w:lastRenderedPageBreak/>
               <w:t>Development</w:t>
             </w:r>
           </w:p>
@@ -3526,7 +3387,16 @@
                 <w:sz w:val="20"/>
                 <w:szCs w:val="20"/>
               </w:rPr>
-              <w:t xml:space="preserve"> HTML &amp; CSS Linting, Building with Parcel,</w:t>
+              <w:t xml:space="preserve"> HTML &amp; CSS Linting, Building with </w:t>
+            </w:r>
+            <w:r>
+              <w:rPr>
+                <w:color w:val="000000"/>
+                <w:sz w:val="20"/>
+                <w:szCs w:val="20"/>
+              </w:rPr>
+              <w:lastRenderedPageBreak/>
+              <w:t>Parcel,</w:t>
             </w:r>
             <w:r>
               <w:rPr>
@@ -3570,6 +3440,7 @@
                 <w:sz w:val="20"/>
                 <w:szCs w:val="20"/>
               </w:rPr>
+              <w:lastRenderedPageBreak/>
               <w:t>2</w:t>
             </w:r>
           </w:p>
@@ -4498,7 +4369,6 @@
           <w:sz w:val="19"/>
           <w:szCs w:val="19"/>
         </w:rPr>
-        <w:lastRenderedPageBreak/>
         <w:t>Feature Branch → PR to develop → ci-dev.yml builds &amp; pushes :dev-latest → PR merged → push on develop → cd-dev.yml deploys to pakvista-dev on Render → Live PakVista Development updated.</w:t>
       </w:r>
     </w:p>
@@ -15000,7 +14870,7 @@
 </file>
 
 <file path=word/endnotes.xml><?xml version="1.0" encoding="utf-8"?>
-<w:endnotes xmlns:wpc="http://schemas.microsoft.com/office/word/2010/wordprocessingCanvas" xmlns:mc="http://schemas.openxmlformats.org/markup-compatibility/2006" xmlns:o="urn:schemas-microsoft-com:office:office" xmlns:r="http://schemas.openxmlformats.org/officeDocument/2006/relationships" xmlns:m="http://schemas.openxmlformats.org/officeDocument/2006/math" xmlns:v="urn:schemas-microsoft-com:vml" xmlns:wp14="http://schemas.microsoft.com/office/word/2010/wordprocessingDrawing" xmlns:wp="http://schemas.openxmlformats.org/drawingml/2006/wordprocessingDrawing" xmlns:w10="urn:schemas-microsoft-com:office:word" xmlns:w="http://schemas.openxmlformats.org/wordprocessingml/2006/main" xmlns:w14="http://schemas.microsoft.com/office/word/2010/wordml" xmlns:w15="http://schemas.microsoft.com/office/word/2012/wordml" xmlns:wpg="http://schemas.microsoft.com/office/word/2010/wordprocessingGroup" xmlns:wpi="http://schemas.microsoft.com/office/word/2010/wordprocessingInk" xmlns:wne="http://schemas.microsoft.com/office/word/2006/wordml" xmlns:wps="http://schemas.microsoft.com/office/word/2010/wordprocessingShape" mc:Ignorable="w14 w15 wp14">
+<w:endnotes xmlns:wpc="http://schemas.microsoft.com/office/word/2010/wordprocessingCanvas" xmlns:cx="http://schemas.microsoft.com/office/drawing/2014/chartex" xmlns:cx1="http://schemas.microsoft.com/office/drawing/2015/9/8/chartex" xmlns:cx2="http://schemas.microsoft.com/office/drawing/2015/10/21/chartex" xmlns:cx3="http://schemas.microsoft.com/office/drawing/2016/5/9/chartex" xmlns:cx4="http://schemas.microsoft.com/office/drawing/2016/5/10/chartex" xmlns:cx5="http://schemas.microsoft.com/office/drawing/2016/5/11/chartex" xmlns:cx6="http://schemas.microsoft.com/office/drawing/2016/5/12/chartex" xmlns:cx7="http://schemas.microsoft.com/office/drawing/2016/5/13/chartex" xmlns:cx8="http://schemas.microsoft.com/office/drawing/2016/5/14/chartex" xmlns:mc="http://schemas.openxmlformats.org/markup-compatibility/2006" xmlns:aink="http://schemas.microsoft.com/office/drawing/2016/ink" xmlns:am3d="http://schemas.microsoft.com/office/drawing/2017/model3d" xmlns:o="urn:schemas-microsoft-com:office:office" xmlns:oel="http://schemas.microsoft.com/office/2019/extlst" xmlns:r="http://schemas.openxmlformats.org/officeDocument/2006/relationships" xmlns:m="http://schemas.openxmlformats.org/officeDocument/2006/math" xmlns:v="urn:schemas-microsoft-com:vml" xmlns:wp14="http://schemas.microsoft.com/office/word/2010/wordprocessingDrawing" xmlns:wp="http://schemas.openxmlformats.org/drawingml/2006/wordprocessingDrawing" xmlns:w10="urn:schemas-microsoft-com:office:word" xmlns:w="http://schemas.openxmlformats.org/wordprocessingml/2006/main" xmlns:w14="http://schemas.microsoft.com/office/word/2010/wordml" xmlns:w15="http://schemas.microsoft.com/office/word/2012/wordml" xmlns:w16cex="http://schemas.microsoft.com/office/word/2018/wordml/cex" xmlns:w16cid="http://schemas.microsoft.com/office/word/2016/wordml/cid" xmlns:w16="http://schemas.microsoft.com/office/word/2018/wordml" xmlns:w16du="http://schemas.microsoft.com/office/word/2023/wordml/word16du" xmlns:w16sdtdh="http://schemas.microsoft.com/office/word/2020/wordml/sdtdatahash" xmlns:w16sdtfl="http://schemas.microsoft.com/office/word/2024/wordml/sdtformatlock" xmlns:w16se="http://schemas.microsoft.com/office/word/2015/wordml/symex" xmlns:wpg="http://schemas.microsoft.com/office/word/2010/wordprocessingGroup" xmlns:wpi="http://schemas.microsoft.com/office/word/2010/wordprocessingInk" xmlns:wne="http://schemas.microsoft.com/office/word/2006/wordml" xmlns:wps="http://schemas.microsoft.com/office/word/2010/wordprocessingShape" mc:Ignorable="w14 w15 w16se w16cid w16 w16cex w16sdtdh w16sdtfl w16du wp14">
   <w:endnote w:type="separator" w:id="-1">
     <w:p>
       <w:r>
@@ -15014,15 +14884,12 @@
         <w:continuationSeparator/>
       </w:r>
     </w:p>
-  </w:endnote>
-  <w:endnote w:type="continuationNotice" w:id="1">
-    <w:p/>
   </w:endnote>
 </w:endnotes>
 </file>
 
 <file path=word/footer1.xml><?xml version="1.0" encoding="utf-8"?>
-<w:ftr xmlns:wpc="http://schemas.microsoft.com/office/word/2010/wordprocessingCanvas" xmlns:mc="http://schemas.openxmlformats.org/markup-compatibility/2006" xmlns:o="urn:schemas-microsoft-com:office:office" xmlns:r="http://schemas.openxmlformats.org/officeDocument/2006/relationships" xmlns:m="http://schemas.openxmlformats.org/officeDocument/2006/math" xmlns:v="urn:schemas-microsoft-com:vml" xmlns:wp14="http://schemas.microsoft.com/office/word/2010/wordprocessingDrawing" xmlns:wp="http://schemas.openxmlformats.org/drawingml/2006/wordprocessingDrawing" xmlns:w10="urn:schemas-microsoft-com:office:word" xmlns:w="http://schemas.openxmlformats.org/wordprocessingml/2006/main" xmlns:w14="http://schemas.microsoft.com/office/word/2010/wordml" xmlns:w15="http://schemas.microsoft.com/office/word/2012/wordml" xmlns:wpg="http://schemas.microsoft.com/office/word/2010/wordprocessingGroup" xmlns:wpi="http://schemas.microsoft.com/office/word/2010/wordprocessingInk" xmlns:wne="http://schemas.microsoft.com/office/word/2006/wordml" xmlns:wps="http://schemas.microsoft.com/office/word/2010/wordprocessingShape" mc:Ignorable="w14 w15 wp14">
+<w:ftr xmlns:wpc="http://schemas.microsoft.com/office/word/2010/wordprocessingCanvas" xmlns:cx="http://schemas.microsoft.com/office/drawing/2014/chartex" xmlns:cx1="http://schemas.microsoft.com/office/drawing/2015/9/8/chartex" xmlns:cx2="http://schemas.microsoft.com/office/drawing/2015/10/21/chartex" xmlns:cx3="http://schemas.microsoft.com/office/drawing/2016/5/9/chartex" xmlns:cx4="http://schemas.microsoft.com/office/drawing/2016/5/10/chartex" xmlns:cx5="http://schemas.microsoft.com/office/drawing/2016/5/11/chartex" xmlns:cx6="http://schemas.microsoft.com/office/drawing/2016/5/12/chartex" xmlns:cx7="http://schemas.microsoft.com/office/drawing/2016/5/13/chartex" xmlns:cx8="http://schemas.microsoft.com/office/drawing/2016/5/14/chartex" xmlns:mc="http://schemas.openxmlformats.org/markup-compatibility/2006" xmlns:aink="http://schemas.microsoft.com/office/drawing/2016/ink" xmlns:am3d="http://schemas.microsoft.com/office/drawing/2017/model3d" xmlns:o="urn:schemas-microsoft-com:office:office" xmlns:oel="http://schemas.microsoft.com/office/2019/extlst" xmlns:r="http://schemas.openxmlformats.org/officeDocument/2006/relationships" xmlns:m="http://schemas.openxmlformats.org/officeDocument/2006/math" xmlns:v="urn:schemas-microsoft-com:vml" xmlns:wp14="http://schemas.microsoft.com/office/word/2010/wordprocessingDrawing" xmlns:wp="http://schemas.openxmlformats.org/drawingml/2006/wordprocessingDrawing" xmlns:w10="urn:schemas-microsoft-com:office:word" xmlns:w="http://schemas.openxmlformats.org/wordprocessingml/2006/main" xmlns:w14="http://schemas.microsoft.com/office/word/2010/wordml" xmlns:w15="http://schemas.microsoft.com/office/word/2012/wordml" xmlns:w16cex="http://schemas.microsoft.com/office/word/2018/wordml/cex" xmlns:w16cid="http://schemas.microsoft.com/office/word/2016/wordml/cid" xmlns:w16="http://schemas.microsoft.com/office/word/2018/wordml" xmlns:w16du="http://schemas.microsoft.com/office/word/2023/wordml/word16du" xmlns:w16sdtdh="http://schemas.microsoft.com/office/word/2020/wordml/sdtdatahash" xmlns:w16sdtfl="http://schemas.microsoft.com/office/word/2024/wordml/sdtformatlock" xmlns:w16se="http://schemas.microsoft.com/office/word/2015/wordml/symex" xmlns:wpg="http://schemas.microsoft.com/office/word/2010/wordprocessingGroup" xmlns:wpi="http://schemas.microsoft.com/office/word/2010/wordprocessingInk" xmlns:wne="http://schemas.microsoft.com/office/word/2006/wordml" xmlns:wps="http://schemas.microsoft.com/office/word/2010/wordprocessingShape" mc:Ignorable="w14 w15 w16se w16cid w16 w16cex w16sdtdh w16sdtfl w16du wp14">
   <w:p>
     <w:pPr>
       <w:pBdr>
@@ -15080,7 +14947,7 @@
         <w:sz w:val="18"/>
         <w:szCs w:val="18"/>
       </w:rPr>
-      <w:t>21</w:t>
+      <w:t>1</w:t>
     </w:r>
     <w:r>
       <w:rPr>
@@ -15129,7 +14996,7 @@
         <w:sz w:val="18"/>
         <w:szCs w:val="18"/>
       </w:rPr>
-      <w:t>21</w:t>
+      <w:t>2</w:t>
     </w:r>
     <w:r>
       <w:rPr>
@@ -15144,7 +15011,7 @@
 </file>
 
 <file path=word/footnotes.xml><?xml version="1.0" encoding="utf-8"?>
-<w:footnotes xmlns:wpc="http://schemas.microsoft.com/office/word/2010/wordprocessingCanvas" xmlns:mc="http://schemas.openxmlformats.org/markup-compatibility/2006" xmlns:o="urn:schemas-microsoft-com:office:office" xmlns:r="http://schemas.openxmlformats.org/officeDocument/2006/relationships" xmlns:m="http://schemas.openxmlformats.org/officeDocument/2006/math" xmlns:v="urn:schemas-microsoft-com:vml" xmlns:wp14="http://schemas.microsoft.com/office/word/2010/wordprocessingDrawing" xmlns:wp="http://schemas.openxmlformats.org/drawingml/2006/wordprocessingDrawing" xmlns:w10="urn:schemas-microsoft-com:office:word" xmlns:w="http://schemas.openxmlformats.org/wordprocessingml/2006/main" xmlns:w14="http://schemas.microsoft.com/office/word/2010/wordml" xmlns:w15="http://schemas.microsoft.com/office/word/2012/wordml" xmlns:wpg="http://schemas.microsoft.com/office/word/2010/wordprocessingGroup" xmlns:wpi="http://schemas.microsoft.com/office/word/2010/wordprocessingInk" xmlns:wne="http://schemas.microsoft.com/office/word/2006/wordml" xmlns:wps="http://schemas.microsoft.com/office/word/2010/wordprocessingShape" mc:Ignorable="w14 w15 wp14">
+<w:footnotes xmlns:wpc="http://schemas.microsoft.com/office/word/2010/wordprocessingCanvas" xmlns:cx="http://schemas.microsoft.com/office/drawing/2014/chartex" xmlns:cx1="http://schemas.microsoft.com/office/drawing/2015/9/8/chartex" xmlns:cx2="http://schemas.microsoft.com/office/drawing/2015/10/21/chartex" xmlns:cx3="http://schemas.microsoft.com/office/drawing/2016/5/9/chartex" xmlns:cx4="http://schemas.microsoft.com/office/drawing/2016/5/10/chartex" xmlns:cx5="http://schemas.microsoft.com/office/drawing/2016/5/11/chartex" xmlns:cx6="http://schemas.microsoft.com/office/drawing/2016/5/12/chartex" xmlns:cx7="http://schemas.microsoft.com/office/drawing/2016/5/13/chartex" xmlns:cx8="http://schemas.microsoft.com/office/drawing/2016/5/14/chartex" xmlns:mc="http://schemas.openxmlformats.org/markup-compatibility/2006" xmlns:aink="http://schemas.microsoft.com/office/drawing/2016/ink" xmlns:am3d="http://schemas.microsoft.com/office/drawing/2017/model3d" xmlns:o="urn:schemas-microsoft-com:office:office" xmlns:oel="http://schemas.microsoft.com/office/2019/extlst" xmlns:r="http://schemas.openxmlformats.org/officeDocument/2006/relationships" xmlns:m="http://schemas.openxmlformats.org/officeDocument/2006/math" xmlns:v="urn:schemas-microsoft-com:vml" xmlns:wp14="http://schemas.microsoft.com/office/word/2010/wordprocessingDrawing" xmlns:wp="http://schemas.openxmlformats.org/drawingml/2006/wordprocessingDrawing" xmlns:w10="urn:schemas-microsoft-com:office:word" xmlns:w="http://schemas.openxmlformats.org/wordprocessingml/2006/main" xmlns:w14="http://schemas.microsoft.com/office/word/2010/wordml" xmlns:w15="http://schemas.microsoft.com/office/word/2012/wordml" xmlns:w16cex="http://schemas.microsoft.com/office/word/2018/wordml/cex" xmlns:w16cid="http://schemas.microsoft.com/office/word/2016/wordml/cid" xmlns:w16="http://schemas.microsoft.com/office/word/2018/wordml" xmlns:w16du="http://schemas.microsoft.com/office/word/2023/wordml/word16du" xmlns:w16sdtdh="http://schemas.microsoft.com/office/word/2020/wordml/sdtdatahash" xmlns:w16sdtfl="http://schemas.microsoft.com/office/word/2024/wordml/sdtformatlock" xmlns:w16se="http://schemas.microsoft.com/office/word/2015/wordml/symex" xmlns:wpg="http://schemas.microsoft.com/office/word/2010/wordprocessingGroup" xmlns:wpi="http://schemas.microsoft.com/office/word/2010/wordprocessingInk" xmlns:wne="http://schemas.microsoft.com/office/word/2006/wordml" xmlns:wps="http://schemas.microsoft.com/office/word/2010/wordprocessingShape" mc:Ignorable="w14 w15 w16se w16cid w16 w16cex w16sdtdh w16sdtfl w16du wp14">
   <w:footnote w:type="separator" w:id="-1">
     <w:p>
       <w:r>
@@ -15158,15 +15025,12 @@
         <w:continuationSeparator/>
       </w:r>
     </w:p>
-  </w:footnote>
-  <w:footnote w:type="continuationNotice" w:id="1">
-    <w:p/>
   </w:footnote>
 </w:footnotes>
 </file>
 
 <file path=word/header1.xml><?xml version="1.0" encoding="utf-8"?>
-<w:hdr xmlns:wpc="http://schemas.microsoft.com/office/word/2010/wordprocessingCanvas" xmlns:mc="http://schemas.openxmlformats.org/markup-compatibility/2006" xmlns:o="urn:schemas-microsoft-com:office:office" xmlns:r="http://schemas.openxmlformats.org/officeDocument/2006/relationships" xmlns:m="http://schemas.openxmlformats.org/officeDocument/2006/math" xmlns:v="urn:schemas-microsoft-com:vml" xmlns:wp14="http://schemas.microsoft.com/office/word/2010/wordprocessingDrawing" xmlns:wp="http://schemas.openxmlformats.org/drawingml/2006/wordprocessingDrawing" xmlns:w10="urn:schemas-microsoft-com:office:word" xmlns:w="http://schemas.openxmlformats.org/wordprocessingml/2006/main" xmlns:w14="http://schemas.microsoft.com/office/word/2010/wordml" xmlns:w15="http://schemas.microsoft.com/office/word/2012/wordml" xmlns:wpg="http://schemas.microsoft.com/office/word/2010/wordprocessingGroup" xmlns:wpi="http://schemas.microsoft.com/office/word/2010/wordprocessingInk" xmlns:wne="http://schemas.microsoft.com/office/word/2006/wordml" xmlns:wps="http://schemas.microsoft.com/office/word/2010/wordprocessingShape" mc:Ignorable="w14 w15 wp14">
+<w:hdr xmlns:wpc="http://schemas.microsoft.com/office/word/2010/wordprocessingCanvas" xmlns:cx="http://schemas.microsoft.com/office/drawing/2014/chartex" xmlns:cx1="http://schemas.microsoft.com/office/drawing/2015/9/8/chartex" xmlns:cx2="http://schemas.microsoft.com/office/drawing/2015/10/21/chartex" xmlns:cx3="http://schemas.microsoft.com/office/drawing/2016/5/9/chartex" xmlns:cx4="http://schemas.microsoft.com/office/drawing/2016/5/10/chartex" xmlns:cx5="http://schemas.microsoft.com/office/drawing/2016/5/11/chartex" xmlns:cx6="http://schemas.microsoft.com/office/drawing/2016/5/12/chartex" xmlns:cx7="http://schemas.microsoft.com/office/drawing/2016/5/13/chartex" xmlns:cx8="http://schemas.microsoft.com/office/drawing/2016/5/14/chartex" xmlns:mc="http://schemas.openxmlformats.org/markup-compatibility/2006" xmlns:aink="http://schemas.microsoft.com/office/drawing/2016/ink" xmlns:am3d="http://schemas.microsoft.com/office/drawing/2017/model3d" xmlns:o="urn:schemas-microsoft-com:office:office" xmlns:oel="http://schemas.microsoft.com/office/2019/extlst" xmlns:r="http://schemas.openxmlformats.org/officeDocument/2006/relationships" xmlns:m="http://schemas.openxmlformats.org/officeDocument/2006/math" xmlns:v="urn:schemas-microsoft-com:vml" xmlns:wp14="http://schemas.microsoft.com/office/word/2010/wordprocessingDrawing" xmlns:wp="http://schemas.openxmlformats.org/drawingml/2006/wordprocessingDrawing" xmlns:w10="urn:schemas-microsoft-com:office:word" xmlns:w="http://schemas.openxmlformats.org/wordprocessingml/2006/main" xmlns:w14="http://schemas.microsoft.com/office/word/2010/wordml" xmlns:w15="http://schemas.microsoft.com/office/word/2012/wordml" xmlns:w16cex="http://schemas.microsoft.com/office/word/2018/wordml/cex" xmlns:w16cid="http://schemas.microsoft.com/office/word/2016/wordml/cid" xmlns:w16="http://schemas.microsoft.com/office/word/2018/wordml" xmlns:w16du="http://schemas.microsoft.com/office/word/2023/wordml/word16du" xmlns:w16sdtdh="http://schemas.microsoft.com/office/word/2020/wordml/sdtdatahash" xmlns:w16sdtfl="http://schemas.microsoft.com/office/word/2024/wordml/sdtformatlock" xmlns:w16se="http://schemas.microsoft.com/office/word/2015/wordml/symex" xmlns:wpg="http://schemas.microsoft.com/office/word/2010/wordprocessingGroup" xmlns:wpi="http://schemas.microsoft.com/office/word/2010/wordprocessingInk" xmlns:wne="http://schemas.microsoft.com/office/word/2006/wordml" xmlns:wps="http://schemas.microsoft.com/office/word/2010/wordprocessingShape" mc:Ignorable="w14 w15 w16se w16cid w16 w16cex w16sdtdh w16sdtfl w16du wp14">
   <w:p>
     <w:pPr>
       <w:pBdr>
@@ -15200,7 +15064,7 @@
 </file>
 
 <file path=word/numbering.xml><?xml version="1.0" encoding="utf-8"?>
-<w:numbering xmlns:wpc="http://schemas.microsoft.com/office/word/2010/wordprocessingCanvas" xmlns:mc="http://schemas.openxmlformats.org/markup-compatibility/2006" xmlns:o="urn:schemas-microsoft-com:office:office" xmlns:r="http://schemas.openxmlformats.org/officeDocument/2006/relationships" xmlns:m="http://schemas.openxmlformats.org/officeDocument/2006/math" xmlns:v="urn:schemas-microsoft-com:vml" xmlns:wp14="http://schemas.microsoft.com/office/word/2010/wordprocessingDrawing" xmlns:wp="http://schemas.openxmlformats.org/drawingml/2006/wordprocessingDrawing" xmlns:w10="urn:schemas-microsoft-com:office:word" xmlns:w="http://schemas.openxmlformats.org/wordprocessingml/2006/main" xmlns:w14="http://schemas.microsoft.com/office/word/2010/wordml" xmlns:w15="http://schemas.microsoft.com/office/word/2012/wordml" xmlns:wpg="http://schemas.microsoft.com/office/word/2010/wordprocessingGroup" xmlns:wpi="http://schemas.microsoft.com/office/word/2010/wordprocessingInk" xmlns:wne="http://schemas.microsoft.com/office/word/2006/wordml" xmlns:wps="http://schemas.microsoft.com/office/word/2010/wordprocessingShape" mc:Ignorable="w14 w15 wp14">
+<w:numbering xmlns:wpc="http://schemas.microsoft.com/office/word/2010/wordprocessingCanvas" xmlns:cx="http://schemas.microsoft.com/office/drawing/2014/chartex" xmlns:cx1="http://schemas.microsoft.com/office/drawing/2015/9/8/chartex" xmlns:cx2="http://schemas.microsoft.com/office/drawing/2015/10/21/chartex" xmlns:cx3="http://schemas.microsoft.com/office/drawing/2016/5/9/chartex" xmlns:cx4="http://schemas.microsoft.com/office/drawing/2016/5/10/chartex" xmlns:cx5="http://schemas.microsoft.com/office/drawing/2016/5/11/chartex" xmlns:cx6="http://schemas.microsoft.com/office/drawing/2016/5/12/chartex" xmlns:cx7="http://schemas.microsoft.com/office/drawing/2016/5/13/chartex" xmlns:cx8="http://schemas.microsoft.com/office/drawing/2016/5/14/chartex" xmlns:mc="http://schemas.openxmlformats.org/markup-compatibility/2006" xmlns:aink="http://schemas.microsoft.com/office/drawing/2016/ink" xmlns:am3d="http://schemas.microsoft.com/office/drawing/2017/model3d" xmlns:o="urn:schemas-microsoft-com:office:office" xmlns:oel="http://schemas.microsoft.com/office/2019/extlst" xmlns:r="http://schemas.openxmlformats.org/officeDocument/2006/relationships" xmlns:m="http://schemas.openxmlformats.org/officeDocument/2006/math" xmlns:v="urn:schemas-microsoft-com:vml" xmlns:wp14="http://schemas.microsoft.com/office/word/2010/wordprocessingDrawing" xmlns:wp="http://schemas.openxmlformats.org/drawingml/2006/wordprocessingDrawing" xmlns:w10="urn:schemas-microsoft-com:office:word" xmlns:w="http://schemas.openxmlformats.org/wordprocessingml/2006/main" xmlns:w14="http://schemas.microsoft.com/office/word/2010/wordml" xmlns:w15="http://schemas.microsoft.com/office/word/2012/wordml" xmlns:w16cex="http://schemas.microsoft.com/office/word/2018/wordml/cex" xmlns:w16cid="http://schemas.microsoft.com/office/word/2016/wordml/cid" xmlns:w16="http://schemas.microsoft.com/office/word/2018/wordml" xmlns:w16du="http://schemas.microsoft.com/office/word/2023/wordml/word16du" xmlns:w16sdtdh="http://schemas.microsoft.com/office/word/2020/wordml/sdtdatahash" xmlns:w16sdtfl="http://schemas.microsoft.com/office/word/2024/wordml/sdtformatlock" xmlns:w16se="http://schemas.microsoft.com/office/word/2015/wordml/symex" xmlns:wpg="http://schemas.microsoft.com/office/word/2010/wordprocessingGroup" xmlns:wpi="http://schemas.microsoft.com/office/word/2010/wordprocessingInk" xmlns:wne="http://schemas.microsoft.com/office/word/2006/wordml" xmlns:wps="http://schemas.microsoft.com/office/word/2010/wordprocessingShape" mc:Ignorable="w14 w15 w16se w16cid w16 w16cex w16sdtdh w16sdtfl w16du wp14">
   <w:abstractNum w:abstractNumId="0" w15:restartNumberingAfterBreak="0">
     <w:nsid w:val="0C5F5D60"/>
     <w:multiLevelType w:val="hybridMultilevel"/>
@@ -15631,44 +15495,44 @@
       <w:lvlJc w:val="left"/>
     </w:lvl>
   </w:abstractNum>
-  <w:num w:numId="1">
+  <w:num w:numId="1" w16cid:durableId="2117942478">
     <w:abstractNumId w:val="4"/>
     <w:lvlOverride w:ilvl="0">
       <w:startOverride w:val="1"/>
     </w:lvlOverride>
   </w:num>
-  <w:num w:numId="2">
+  <w:num w:numId="2" w16cid:durableId="83378792">
     <w:abstractNumId w:val="0"/>
     <w:lvlOverride w:ilvl="0">
       <w:startOverride w:val="1"/>
     </w:lvlOverride>
   </w:num>
-  <w:num w:numId="3">
+  <w:num w:numId="3" w16cid:durableId="109058998">
     <w:abstractNumId w:val="2"/>
     <w:lvlOverride w:ilvl="0">
       <w:startOverride w:val="1"/>
     </w:lvlOverride>
   </w:num>
-  <w:num w:numId="4">
+  <w:num w:numId="4" w16cid:durableId="1097016307">
     <w:abstractNumId w:val="0"/>
   </w:num>
-  <w:num w:numId="5">
+  <w:num w:numId="5" w16cid:durableId="148984198">
     <w:abstractNumId w:val="6"/>
   </w:num>
-  <w:num w:numId="6">
+  <w:num w:numId="6" w16cid:durableId="1898860815">
     <w:abstractNumId w:val="1"/>
   </w:num>
-  <w:num w:numId="7">
+  <w:num w:numId="7" w16cid:durableId="2025783913">
     <w:abstractNumId w:val="5"/>
   </w:num>
-  <w:num w:numId="8">
+  <w:num w:numId="8" w16cid:durableId="1904019393">
     <w:abstractNumId w:val="3"/>
   </w:num>
 </w:numbering>
 </file>
 
 <file path=word/styles.xml><?xml version="1.0" encoding="utf-8"?>
-<w:styles xmlns:mc="http://schemas.openxmlformats.org/markup-compatibility/2006" xmlns:r="http://schemas.openxmlformats.org/officeDocument/2006/relationships" xmlns:w="http://schemas.openxmlformats.org/wordprocessingml/2006/main" xmlns:w14="http://schemas.microsoft.com/office/word/2010/wordml" xmlns:w15="http://schemas.microsoft.com/office/word/2012/wordml" mc:Ignorable="w14 w15">
+<w:styles xmlns:mc="http://schemas.openxmlformats.org/markup-compatibility/2006" xmlns:r="http://schemas.openxmlformats.org/officeDocument/2006/relationships" xmlns:w="http://schemas.openxmlformats.org/wordprocessingml/2006/main" xmlns:w14="http://schemas.microsoft.com/office/word/2010/wordml" xmlns:w15="http://schemas.microsoft.com/office/word/2012/wordml" xmlns:w16cex="http://schemas.microsoft.com/office/word/2018/wordml/cex" xmlns:w16cid="http://schemas.microsoft.com/office/word/2016/wordml/cid" xmlns:w16="http://schemas.microsoft.com/office/word/2018/wordml" xmlns:w16du="http://schemas.microsoft.com/office/word/2023/wordml/word16du" xmlns:w16sdtdh="http://schemas.microsoft.com/office/word/2020/wordml/sdtdatahash" xmlns:w16sdtfl="http://schemas.microsoft.com/office/word/2024/wordml/sdtformatlock" xmlns:w16se="http://schemas.microsoft.com/office/word/2015/wordml/symex" mc:Ignorable="w14 w15 w16se w16cid w16 w16cex w16sdtdh w16sdtfl w16du">
   <w:docDefaults>
     <w:rPrDefault>
       <w:rPr>
@@ -15680,7 +15544,7 @@
     </w:rPrDefault>
     <w:pPrDefault/>
   </w:docDefaults>
-  <w:latentStyles w:defLockedState="0" w:defUIPriority="99" w:defSemiHidden="0" w:defUnhideWhenUsed="0" w:defQFormat="0" w:count="371">
+  <w:latentStyles w:defLockedState="0" w:defUIPriority="99" w:defSemiHidden="0" w:defUnhideWhenUsed="0" w:defQFormat="0" w:count="376">
     <w:lsdException w:name="Normal" w:uiPriority="0" w:qFormat="1"/>
     <w:lsdException w:name="heading 1" w:uiPriority="9" w:qFormat="1"/>
     <w:lsdException w:name="heading 2" w:semiHidden="1" w:uiPriority="9" w:unhideWhenUsed="1" w:qFormat="1"/>
@@ -15860,7 +15724,7 @@
     <w:lsdException w:name="Medium Shading 2 Accent 1" w:uiPriority="64"/>
     <w:lsdException w:name="Medium List 1 Accent 1" w:uiPriority="65"/>
     <w:lsdException w:name="Revision" w:semiHidden="1"/>
-    <w:lsdException w:name="List Paragraph" w:uiPriority="0" w:qFormat="1"/>
+    <w:lsdException w:name="List Paragraph" w:uiPriority="34" w:qFormat="1"/>
     <w:lsdException w:name="Quote" w:uiPriority="29" w:qFormat="1"/>
     <w:lsdException w:name="Intense Quote" w:uiPriority="30" w:qFormat="1"/>
     <w:lsdException w:name="Medium List 2 Accent 1" w:uiPriority="66"/>
@@ -16052,6 +15916,11 @@
     <w:lsdException w:name="List Table 5 Dark Accent 6" w:uiPriority="50"/>
     <w:lsdException w:name="List Table 6 Colorful Accent 6" w:uiPriority="51"/>
     <w:lsdException w:name="List Table 7 Colorful Accent 6" w:uiPriority="52"/>
+    <w:lsdException w:name="Mention" w:semiHidden="1" w:unhideWhenUsed="1"/>
+    <w:lsdException w:name="Smart Hyperlink" w:semiHidden="1" w:unhideWhenUsed="1"/>
+    <w:lsdException w:name="Hashtag" w:semiHidden="1" w:unhideWhenUsed="1"/>
+    <w:lsdException w:name="Unresolved Mention" w:semiHidden="1" w:unhideWhenUsed="1"/>
+    <w:lsdException w:name="Smart Link" w:semiHidden="1" w:unhideWhenUsed="1"/>
   </w:latentStyles>
   <w:style w:type="paragraph" w:default="1" w:styleId="Normal">
     <w:name w:val="Normal"/>

</xml_diff>